<commit_message>
Ticket 15 (writing, first draft): chapter 3 in rad.md, Slika 3.1 and 3.2, two bib entries; measured ~5.8 pp, awaiting user's tightening
</commit_message>
<xml_diff>
--- a/Tema 3. - Replikacija i distribuirana konzistentnost u MySQL/rad.docx
+++ b/Tema 3. - Replikacija i distribuirana konzistentnost u MySQL/rad.docx
@@ -1569,38 +1569,113 @@
     </w:p>
     <w:bookmarkEnd w:id="17"/>
     <w:bookmarkEnd w:id="18"/>
-    <w:bookmarkStart w:id="44" w:name="bibliography"/>
+    <w:bookmarkStart w:id="32" w:name="binarni-log-gtid-i-asinhrona-replikacija"/>
     <w:p>
       <w:pPr>
         <w:pStyle w:val="Heading1"/>
       </w:pPr>
       <w:r>
-        <w:t xml:space="preserve">Reference</w:t>
-      </w:r>
-    </w:p>
-    <w:bookmarkStart w:id="43" w:name="refs"/>
-    <w:bookmarkStart w:id="20" w:name="ref-lamport1978"/>
-    <w:p>
-      <w:pPr>
-        <w:pStyle w:val="Bibliography"/>
-      </w:pPr>
-      <w:r>
-        <w:t xml:space="preserve">[1]</w:t>
-      </w:r>
-      <w:r>
-        <w:t xml:space="preserve"> </w:t>
-      </w:r>
-      <w:r>
-        <w:t xml:space="preserve">	</w:t>
-      </w:r>
-      <w:r>
-        <w:t xml:space="preserve">L. Lamport,</w:t>
-      </w:r>
-      <w:r>
-        <w:t xml:space="preserve"> </w:t>
-      </w:r>
-      <w:r>
-        <w:t xml:space="preserve">“Time, clocks, and the ordering of events in a distributed system,”</w:t>
+        <w:t xml:space="preserve">3. Binarni log, GTID i asinhrona replikacija</w:t>
+      </w:r>
+    </w:p>
+    <w:p>
+      <w:pPr>
+        <w:pStyle w:val="FirstParagraph"/>
+      </w:pPr>
+      <w:r>
+        <w:t xml:space="preserve">Replikacija u MySQL-u ne prenosi stanje baze, već zapis o promenama. Izvor svaku komitovanu</w:t>
+      </w:r>
+      <w:r>
+        <w:t xml:space="preserve"> </w:t>
+      </w:r>
+      <w:r>
+        <w:t xml:space="preserve">transakciju upisuje u binarni log (binary log), a replika te zapise preuzima i izvršava nad</w:t>
+      </w:r>
+      <w:r>
+        <w:t xml:space="preserve"> </w:t>
+      </w:r>
+      <w:r>
+        <w:t xml:space="preserve">sopstvenom kopijom podataka. Priručnik binarnom logu pripisuje dve namene: na izvoru on je zapis</w:t>
+      </w:r>
+      <w:r>
+        <w:t xml:space="preserve"> </w:t>
+      </w:r>
+      <w:r>
+        <w:t xml:space="preserve">promena koje se šalju replikama, koje te transakcije reprodukuju i time prave iste izmene podataka</w:t>
+      </w:r>
+      <w:r>
+        <w:t xml:space="preserve"> </w:t>
+      </w:r>
+      <w:r>
+        <w:t xml:space="preserve">kao izvor, a posle vraćanja rezervne kopije služi za oporavak baze do željenog trenutka</w:t>
+      </w:r>
+      <w:r>
+        <w:t xml:space="preserve"> </w:t>
+      </w:r>
+      <w:r>
+        <w:t xml:space="preserve">[11]</w:t>
+      </w:r>
+      <w:r>
+        <w:t xml:space="preserve">. Da bi replika ponavljanjem loga stigla u isto stanje kao izvor, moraju da važe tri</w:t>
+      </w:r>
+      <w:r>
+        <w:t xml:space="preserve"> </w:t>
+      </w:r>
+      <w:r>
+        <w:t xml:space="preserve">uslova: obe strane polaze od istog početnog stanja, primenjuju iste promene i primenjuju ih istim</w:t>
+      </w:r>
+      <w:r>
+        <w:t xml:space="preserve"> </w:t>
+      </w:r>
+      <w:r>
+        <w:t xml:space="preserve">redosledom. Redosled obezbeđuje sam log, jer se transakcija upisuje u binarni log pre nego što se</w:t>
+      </w:r>
+      <w:r>
+        <w:t xml:space="preserve"> </w:t>
+      </w:r>
+      <w:r>
+        <w:t xml:space="preserve">oslobode njena zaključavanja, pa log, prema priručniku, sledi redosled komitovanja</w:t>
+      </w:r>
+      <w:r>
+        <w:t xml:space="preserve"> </w:t>
+      </w:r>
+      <w:r>
+        <w:t xml:space="preserve">[11]</w:t>
+      </w:r>
+      <w:r>
+        <w:t xml:space="preserve">.</w:t>
+      </w:r>
+      <w:r>
+        <w:t xml:space="preserve"> </w:t>
+      </w:r>
+      <w:r>
+        <w:t xml:space="preserve">Ovo poglavlje prati jednu transakciju od komitovanja na izvoru do primene na replici i redom</w:t>
+      </w:r>
+      <w:r>
+        <w:t xml:space="preserve"> </w:t>
+      </w:r>
+      <w:r>
+        <w:t xml:space="preserve">odgovara na četiri pitanja: šta se tačno upisuje u log, kada je upis postojan, kako replika zna</w:t>
+      </w:r>
+      <w:r>
+        <w:t xml:space="preserve"> </w:t>
+      </w:r>
+      <w:r>
+        <w:t xml:space="preserve">dokle je stigla i kada klijent dobija potvrdu.</w:t>
+      </w:r>
+    </w:p>
+    <w:p>
+      <w:pPr>
+        <w:pStyle w:val="BodyText"/>
+      </w:pPr>
+      <w:r>
+        <w:t xml:space="preserve">Od ovog poglavlja uloge čvorova nazivaju se onako kako ih naziva sam MySQL: čvor čiji se binarni log</w:t>
+      </w:r>
+      <w:r>
+        <w:t xml:space="preserve"> </w:t>
+      </w:r>
+      <w:r>
+        <w:t xml:space="preserve">šalje drugima je izvor (source), a čvor koji taj log primenjuje je replika (replica). Termini</w:t>
       </w:r>
       <w:r>
         <w:t xml:space="preserve"> </w:t>
@@ -1610,6 +1685,1957 @@
           <w:i/>
           <w:iCs/>
         </w:rPr>
+        <w:t xml:space="preserve">leader</w:t>
+      </w:r>
+      <w:r>
+        <w:t xml:space="preserve"> </w:t>
+      </w:r>
+      <w:r>
+        <w:t xml:space="preserve">i</w:t>
+      </w:r>
+      <w:r>
+        <w:t xml:space="preserve"> </w:t>
+      </w:r>
+      <w:r>
+        <w:rPr>
+          <w:i/>
+          <w:iCs/>
+        </w:rPr>
+        <w:t xml:space="preserve">follower</w:t>
+      </w:r>
+      <w:r>
+        <w:t xml:space="preserve"> </w:t>
+      </w:r>
+      <w:r>
+        <w:t xml:space="preserve">iz drugog poglavlja opisuju iste uloge, ali ih dokumentacija koja se u</w:t>
+      </w:r>
+      <w:r>
+        <w:t xml:space="preserve"> </w:t>
+      </w:r>
+      <w:r>
+        <w:t xml:space="preserve">nastavku citira ne koristi. Tim koji razvija MySQL naziv izvor obrazlaže time da je asinhrona</w:t>
+      </w:r>
+      <w:r>
+        <w:t xml:space="preserve"> </w:t>
+      </w:r>
+      <w:r>
+        <w:t xml:space="preserve">replikacija tok promena: svaka konfiguracija replikacije ima svoj izvor, ali taj naziv ne određuje</w:t>
+      </w:r>
+      <w:r>
+        <w:t xml:space="preserve"> </w:t>
+      </w:r>
+      <w:r>
+        <w:t xml:space="preserve">kakvu ulogu server ima u celoj arhitekturi, što je važno kod lančane ili dvosmerne replikacije</w:t>
+      </w:r>
+      <w:r>
+        <w:t xml:space="preserve"> </w:t>
+      </w:r>
+      <w:r>
+        <w:t xml:space="preserve">[15]</w:t>
+      </w:r>
+      <w:r>
+        <w:t xml:space="preserve">.</w:t>
+      </w:r>
+      <w:r>
+        <w:rPr>
+          <w:rStyle w:val="FootnoteReference"/>
+        </w:rPr>
+        <w:footnoteReference w:id="19"/>
+      </w:r>
+      <w:r>
+        <w:t xml:space="preserve"> </w:t>
+      </w:r>
+      <w:r>
+        <w:t xml:space="preserve">Sva merenja u ovom i narednim poglavljima izvedena su na tri instance servera</w:t>
+      </w:r>
+      <w:r>
+        <w:t xml:space="preserve"> </w:t>
+      </w:r>
+      <w:r>
+        <w:t xml:space="preserve">MySQL 8.4.11 pokrenute na jednom računaru, na portovima 3307, 3308 i 3309, koje se u nastavku</w:t>
+      </w:r>
+      <w:r>
+        <w:t xml:space="preserve"> </w:t>
+      </w:r>
+      <w:r>
+        <w:t xml:space="preserve">nazivaju node1, node2 i node3. Izvor je node1, a node2 i node3 su njegove replike; na sve tri</w:t>
+      </w:r>
+      <w:r>
+        <w:t xml:space="preserve"> </w:t>
+      </w:r>
+      <w:r>
+        <w:t xml:space="preserve">instance uključeni su GTID-ovi i podrazumevani format zapisa</w:t>
+      </w:r>
+      <w:r>
+        <w:t xml:space="preserve"> </w:t>
+      </w:r>
+      <w:r>
+        <w:rPr>
+          <w:rStyle w:val="VerbatimChar"/>
+        </w:rPr>
+        <w:t xml:space="preserve">ROW</w:t>
+      </w:r>
+      <w:r>
+        <w:t xml:space="preserve">. Kao primer služi baza</w:t>
+      </w:r>
+      <w:r>
+        <w:t xml:space="preserve"> </w:t>
+      </w:r>
+      <w:r>
+        <w:t xml:space="preserve">poliklinika, sa tabelama pacijenata, pregleda i računa, kojoj je dodata pomoćna tabela</w:t>
+      </w:r>
+      <w:r>
+        <w:t xml:space="preserve"> </w:t>
+      </w:r>
+      <w:r>
+        <w:rPr>
+          <w:rStyle w:val="VerbatimChar"/>
+        </w:rPr>
+        <w:t xml:space="preserve">heartbeat</w:t>
+      </w:r>
+      <w:r>
+        <w:t xml:space="preserve"> </w:t>
+      </w:r>
+      <w:r>
+        <w:t xml:space="preserve">za merenje kašnjenja.</w:t>
+      </w:r>
+    </w:p>
+    <w:bookmarkStart w:id="20" w:name="binarni-log-i-formati-zapisa"/>
+    <w:p>
+      <w:pPr>
+        <w:pStyle w:val="Heading2"/>
+      </w:pPr>
+      <w:r>
+        <w:t xml:space="preserve">Binarni log i formati zapisa</w:t>
+      </w:r>
+    </w:p>
+    <w:p>
+      <w:pPr>
+        <w:pStyle w:val="FirstParagraph"/>
+      </w:pPr>
+      <w:r>
+        <w:t xml:space="preserve">Binarni log se može voditi u tri formata, a razlika među njima je u tome da li se upisuje uzrok</w:t>
+      </w:r>
+      <w:r>
+        <w:t xml:space="preserve"> </w:t>
+      </w:r>
+      <w:r>
+        <w:t xml:space="preserve">promene ili njena posledica. U formatu</w:t>
+      </w:r>
+      <w:r>
+        <w:t xml:space="preserve"> </w:t>
+      </w:r>
+      <w:r>
+        <w:rPr>
+          <w:rStyle w:val="VerbatimChar"/>
+        </w:rPr>
+        <w:t xml:space="preserve">STATEMENT</w:t>
+      </w:r>
+      <w:r>
+        <w:t xml:space="preserve"> </w:t>
+      </w:r>
+      <w:r>
+        <w:t xml:space="preserve">izvor upisuje sam SQL iskaz, a replika ga ponovo</w:t>
+      </w:r>
+      <w:r>
+        <w:t xml:space="preserve"> </w:t>
+      </w:r>
+      <w:r>
+        <w:t xml:space="preserve">izvršava; to je upisivanje iskaza (statement-based logging). U formatu</w:t>
+      </w:r>
+      <w:r>
+        <w:t xml:space="preserve"> </w:t>
+      </w:r>
+      <w:r>
+        <w:rPr>
+          <w:rStyle w:val="VerbatimChar"/>
+        </w:rPr>
+        <w:t xml:space="preserve">ROW</w:t>
+      </w:r>
+      <w:r>
+        <w:t xml:space="preserve"> </w:t>
+      </w:r>
+      <w:r>
+        <w:t xml:space="preserve">izvor upisuje događaje</w:t>
+      </w:r>
+      <w:r>
+        <w:t xml:space="preserve"> </w:t>
+      </w:r>
+      <w:r>
+        <w:t xml:space="preserve">koji opisuju kako su se promenili pojedinačni redovi tabele, a replika te promene kopira; to je</w:t>
+      </w:r>
+      <w:r>
+        <w:t xml:space="preserve"> </w:t>
+      </w:r>
+      <w:r>
+        <w:t xml:space="preserve">upisivanje redova (row-based logging), koje je podrazumevani način rada. Format</w:t>
+      </w:r>
+      <w:r>
+        <w:t xml:space="preserve"> </w:t>
+      </w:r>
+      <w:r>
+        <w:rPr>
+          <w:rStyle w:val="VerbatimChar"/>
+        </w:rPr>
+        <w:t xml:space="preserve">MIXED</w:t>
+      </w:r>
+      <w:r>
+        <w:t xml:space="preserve"> </w:t>
+      </w:r>
+      <w:r>
+        <w:t xml:space="preserve">podrazumevano</w:t>
+      </w:r>
+      <w:r>
+        <w:t xml:space="preserve"> </w:t>
+      </w:r>
+      <w:r>
+        <w:t xml:space="preserve">upisuje iskaze, a u određenim slučajevima automatski prelazi na upisivanje redova</w:t>
+      </w:r>
+      <w:r>
+        <w:t xml:space="preserve"> </w:t>
+      </w:r>
+      <w:r>
+        <w:t xml:space="preserve">[11]</w:t>
+      </w:r>
+      <w:r>
+        <w:t xml:space="preserve">.</w:t>
+      </w:r>
+      <w:r>
+        <w:t xml:space="preserve"> </w:t>
+      </w:r>
+      <w:r>
+        <w:t xml:space="preserve">Upisivanje iskaza je kompaktnije, jer iskaz koji menja hiljadu redova u logu ostaje jedan iskaz, dok</w:t>
+      </w:r>
+      <w:r>
+        <w:t xml:space="preserve"> </w:t>
+      </w:r>
+      <w:r>
+        <w:t xml:space="preserve">upisivanje redova beleži svaki izmenjeni red i zato može da proizvede znatno više podataka</w:t>
+      </w:r>
+      <w:r>
+        <w:t xml:space="preserve"> </w:t>
+      </w:r>
+      <w:r>
+        <w:t xml:space="preserve">[11]</w:t>
+      </w:r>
+      <w:r>
+        <w:t xml:space="preserve">. Pravac razvoja je ipak jasan: menjanje formata zastarelo je još u verziji 8.0, a</w:t>
+      </w:r>
+      <w:r>
+        <w:t xml:space="preserve"> </w:t>
+      </w:r>
+      <w:r>
+        <w:t xml:space="preserve">priručnik najavljuje da će promenljiva</w:t>
+      </w:r>
+      <w:r>
+        <w:t xml:space="preserve"> </w:t>
+      </w:r>
+      <w:r>
+        <w:rPr>
+          <w:rStyle w:val="VerbatimChar"/>
+        </w:rPr>
+        <w:t xml:space="preserve">binlog_format</w:t>
+      </w:r>
+      <w:r>
+        <w:t xml:space="preserve"> </w:t>
+      </w:r>
+      <w:r>
+        <w:t xml:space="preserve">biti uklonjena i da će upisivanje redova</w:t>
+      </w:r>
+      <w:r>
+        <w:t xml:space="preserve"> </w:t>
+      </w:r>
+      <w:r>
+        <w:t xml:space="preserve">postati jedini format</w:t>
+      </w:r>
+      <w:r>
+        <w:t xml:space="preserve"> </w:t>
+      </w:r>
+      <w:r>
+        <w:t xml:space="preserve">[11]</w:t>
+      </w:r>
+      <w:r>
+        <w:t xml:space="preserve">.</w:t>
+      </w:r>
+    </w:p>
+    <w:bookmarkEnd w:id="20"/>
+    <w:bookmarkStart w:id="24" w:name="nesigurni-iskazi"/>
+    <w:p>
+      <w:pPr>
+        <w:pStyle w:val="Heading2"/>
+      </w:pPr>
+      <w:r>
+        <w:t xml:space="preserve">Nesigurni iskazi</w:t>
+      </w:r>
+    </w:p>
+    <w:p>
+      <w:pPr>
+        <w:pStyle w:val="FirstParagraph"/>
+      </w:pPr>
+      <w:r>
+        <w:t xml:space="preserve">Upisivanje iskaza oslanja se na pretpostavku da isti iskaz nad istim podacima daje isti rezultat,</w:t>
+      </w:r>
+      <w:r>
+        <w:t xml:space="preserve"> </w:t>
+      </w:r>
+      <w:r>
+        <w:t xml:space="preserve">odnosno da je promena deterministička. Iskaz za koji to ne važi naziva se nesiguran iskaz (unsafe</w:t>
+      </w:r>
+      <w:r>
+        <w:t xml:space="preserve"> </w:t>
+      </w:r>
+      <w:r>
+        <w:t xml:space="preserve">statement): njegov rezultat ne zavisi samo od podataka, pa replika koja ga ponovi može da stigne u</w:t>
+      </w:r>
+      <w:r>
+        <w:t xml:space="preserve"> </w:t>
+      </w:r>
+      <w:r>
+        <w:t xml:space="preserve">drugačije stanje od izvora. Priručnik kao primer navodi iskaze</w:t>
+      </w:r>
+      <w:r>
+        <w:t xml:space="preserve"> </w:t>
+      </w:r>
+      <w:r>
+        <w:rPr>
+          <w:rStyle w:val="VerbatimChar"/>
+        </w:rPr>
+        <w:t xml:space="preserve">UPDATE</w:t>
+      </w:r>
+      <w:r>
+        <w:t xml:space="preserve"> </w:t>
+      </w:r>
+      <w:r>
+        <w:t xml:space="preserve">i</w:t>
+      </w:r>
+      <w:r>
+        <w:t xml:space="preserve"> </w:t>
+      </w:r>
+      <w:r>
+        <w:rPr>
+          <w:rStyle w:val="VerbatimChar"/>
+        </w:rPr>
+        <w:t xml:space="preserve">DELETE</w:t>
+      </w:r>
+      <w:r>
+        <w:t xml:space="preserve"> </w:t>
+      </w:r>
+      <w:r>
+        <w:t xml:space="preserve">sa klauzulom</w:t>
+      </w:r>
+      <w:r>
+        <w:t xml:space="preserve"> </w:t>
+      </w:r>
+      <w:r>
+        <w:rPr>
+          <w:rStyle w:val="VerbatimChar"/>
+        </w:rPr>
+        <w:t xml:space="preserve">LIMIT</w:t>
+      </w:r>
+      <w:r>
+        <w:t xml:space="preserve"> </w:t>
+      </w:r>
+      <w:r>
+        <w:t xml:space="preserve">bez</w:t>
+      </w:r>
+      <w:r>
+        <w:t xml:space="preserve"> </w:t>
+      </w:r>
+      <w:r>
+        <w:rPr>
+          <w:rStyle w:val="VerbatimChar"/>
+        </w:rPr>
+        <w:t xml:space="preserve">ORDER BY</w:t>
+      </w:r>
+      <w:r>
+        <w:t xml:space="preserve">, jer redosled redova na koje iskaz deluje nije definisan</w:t>
+      </w:r>
+      <w:r>
+        <w:t xml:space="preserve"> </w:t>
+      </w:r>
+      <w:r>
+        <w:t xml:space="preserve">[11]</w:t>
+      </w:r>
+      <w:r>
+        <w:t xml:space="preserve">.</w:t>
+      </w:r>
+      <w:r>
+        <w:t xml:space="preserve"> </w:t>
+      </w:r>
+      <w:r>
+        <w:t xml:space="preserve">Sličan je slučaj funkcije</w:t>
+      </w:r>
+      <w:r>
+        <w:t xml:space="preserve"> </w:t>
+      </w:r>
+      <w:r>
+        <w:rPr>
+          <w:rStyle w:val="VerbatimChar"/>
+        </w:rPr>
+        <w:t xml:space="preserve">SYSDATE()</w:t>
+      </w:r>
+      <w:r>
+        <w:t xml:space="preserve">, dok je funkcija</w:t>
+      </w:r>
+      <w:r>
+        <w:t xml:space="preserve"> </w:t>
+      </w:r>
+      <w:r>
+        <w:rPr>
+          <w:rStyle w:val="VerbatimChar"/>
+        </w:rPr>
+        <w:t xml:space="preserve">NOW()</w:t>
+      </w:r>
+      <w:r>
+        <w:t xml:space="preserve"> </w:t>
+      </w:r>
+      <w:r>
+        <w:t xml:space="preserve">bezbedna: binarni log uz iskaz čuva i</w:t>
+      </w:r>
+      <w:r>
+        <w:t xml:space="preserve"> </w:t>
+      </w:r>
+      <w:r>
+        <w:t xml:space="preserve">vremensku oznaku, pa replika dobija vrednost koju je funkcija vratila na izvoru, a</w:t>
+      </w:r>
+      <w:r>
+        <w:t xml:space="preserve"> </w:t>
+      </w:r>
+      <w:r>
+        <w:rPr>
+          <w:rStyle w:val="VerbatimChar"/>
+        </w:rPr>
+        <w:t xml:space="preserve">SYSDATE()</w:t>
+      </w:r>
+      <w:r>
+        <w:t xml:space="preserve"> </w:t>
+      </w:r>
+      <w:r>
+        <w:t xml:space="preserve">tu</w:t>
+      </w:r>
+      <w:r>
+        <w:t xml:space="preserve"> </w:t>
+      </w:r>
+      <w:r>
+        <w:t xml:space="preserve">oznaku zanemaruje</w:t>
+      </w:r>
+      <w:r>
+        <w:t xml:space="preserve"> </w:t>
+      </w:r>
+      <w:r>
+        <w:t xml:space="preserve">[11]</w:t>
+      </w:r>
+      <w:r>
+        <w:t xml:space="preserve">. Kada naiđe na nesiguran iskaz, server u formatu</w:t>
+      </w:r>
+      <w:r>
+        <w:t xml:space="preserve"> </w:t>
+      </w:r>
+      <w:r>
+        <w:rPr>
+          <w:rStyle w:val="VerbatimChar"/>
+        </w:rPr>
+        <w:t xml:space="preserve">STATEMENT</w:t>
+      </w:r>
+      <w:r>
+        <w:t xml:space="preserve"> </w:t>
+      </w:r>
+      <w:r>
+        <w:t xml:space="preserve">izdaje upozorenje, a u formatu</w:t>
+      </w:r>
+      <w:r>
+        <w:t xml:space="preserve"> </w:t>
+      </w:r>
+      <w:r>
+        <w:rPr>
+          <w:rStyle w:val="VerbatimChar"/>
+        </w:rPr>
+        <w:t xml:space="preserve">MIXED</w:t>
+      </w:r>
+      <w:r>
+        <w:t xml:space="preserve"> </w:t>
+      </w:r>
+      <w:r>
+        <w:t xml:space="preserve">takav iskaz automatski upisuje kao redove</w:t>
+      </w:r>
+      <w:r>
+        <w:t xml:space="preserve"> </w:t>
+      </w:r>
+      <w:r>
+        <w:t xml:space="preserve">[11]</w:t>
+      </w:r>
+      <w:r>
+        <w:t xml:space="preserve">.</w:t>
+      </w:r>
+    </w:p>
+    <w:p>
+      <w:pPr>
+        <w:pStyle w:val="BodyText"/>
+      </w:pPr>
+      <w:r>
+        <w:t xml:space="preserve">Slika 3.2 prikazuje ovu razliku na bazi poliklinika. Iskaz koji dva neplaćena računa za koje je</w:t>
+      </w:r>
+      <w:r>
+        <w:t xml:space="preserve"> </w:t>
+      </w:r>
+      <w:r>
+        <w:rPr>
+          <w:rStyle w:val="VerbatimChar"/>
+        </w:rPr>
+        <w:t xml:space="preserve">tenant_id = 1</w:t>
+      </w:r>
+      <w:r>
+        <w:t xml:space="preserve"> </w:t>
+      </w:r>
+      <w:r>
+        <w:t xml:space="preserve">označava kao plaćena sadrži</w:t>
+      </w:r>
+      <w:r>
+        <w:t xml:space="preserve"> </w:t>
+      </w:r>
+      <w:r>
+        <w:rPr>
+          <w:rStyle w:val="VerbatimChar"/>
+        </w:rPr>
+        <w:t xml:space="preserve">LIMIT 2</w:t>
+      </w:r>
+      <w:r>
+        <w:t xml:space="preserve"> </w:t>
+      </w:r>
+      <w:r>
+        <w:t xml:space="preserve">bez</w:t>
+      </w:r>
+      <w:r>
+        <w:t xml:space="preserve"> </w:t>
+      </w:r>
+      <w:r>
+        <w:rPr>
+          <w:rStyle w:val="VerbatimChar"/>
+        </w:rPr>
+        <w:t xml:space="preserve">ORDER BY</w:t>
+      </w:r>
+      <w:r>
+        <w:t xml:space="preserve">, pa ne određuje koja dva računa</w:t>
+      </w:r>
+      <w:r>
+        <w:t xml:space="preserve"> </w:t>
+      </w:r>
+      <w:r>
+        <w:t xml:space="preserve">menja. U formatu</w:t>
+      </w:r>
+      <w:r>
+        <w:t xml:space="preserve"> </w:t>
+      </w:r>
+      <w:r>
+        <w:rPr>
+          <w:rStyle w:val="VerbatimChar"/>
+        </w:rPr>
+        <w:t xml:space="preserve">STATEMENT</w:t>
+      </w:r>
+      <w:r>
+        <w:t xml:space="preserve"> </w:t>
+      </w:r>
+      <w:r>
+        <w:t xml:space="preserve">server pri izvršavanju izdaje upozorenje 1592 i navodi da skup</w:t>
+      </w:r>
+      <w:r>
+        <w:t xml:space="preserve"> </w:t>
+      </w:r>
+      <w:r>
+        <w:t xml:space="preserve">obuhvaćenih redova nije moguće predvideti. U formatu</w:t>
+      </w:r>
+      <w:r>
+        <w:t xml:space="preserve"> </w:t>
+      </w:r>
+      <w:r>
+        <w:rPr>
+          <w:rStyle w:val="VerbatimChar"/>
+        </w:rPr>
+        <w:t xml:space="preserve">ROW</w:t>
+      </w:r>
+      <w:r>
+        <w:t xml:space="preserve"> </w:t>
+      </w:r>
+      <w:r>
+        <w:t xml:space="preserve">u logu ne ostaje nikakav trag klauzule</w:t>
+      </w:r>
+      <w:r>
+        <w:t xml:space="preserve"> </w:t>
+      </w:r>
+      <w:r>
+        <w:rPr>
+          <w:rStyle w:val="VerbatimChar"/>
+        </w:rPr>
+        <w:t xml:space="preserve">LIMIT</w:t>
+      </w:r>
+      <w:r>
+        <w:t xml:space="preserve">, već samo dva izmenjena reda, svaki sa slikom pre i posle izmene: računi 11 i 18, kojima se</w:t>
+      </w:r>
+      <w:r>
+        <w:t xml:space="preserve"> </w:t>
+      </w:r>
+      <w:r>
+        <w:t xml:space="preserve">kolona</w:t>
+      </w:r>
+      <w:r>
+        <w:t xml:space="preserve"> </w:t>
+      </w:r>
+      <w:r>
+        <w:rPr>
+          <w:rStyle w:val="VerbatimChar"/>
+        </w:rPr>
+        <w:t xml:space="preserve">paid_status</w:t>
+      </w:r>
+      <w:r>
+        <w:t xml:space="preserve"> </w:t>
+      </w:r>
+      <w:r>
+        <w:t xml:space="preserve">menja iz vrednosti</w:t>
+      </w:r>
+      <w:r>
+        <w:t xml:space="preserve"> </w:t>
+      </w:r>
+      <w:r>
+        <w:rPr>
+          <w:rStyle w:val="VerbatimChar"/>
+        </w:rPr>
+        <w:t xml:space="preserve">unpaid</w:t>
+      </w:r>
+      <w:r>
+        <w:t xml:space="preserve"> </w:t>
+      </w:r>
+      <w:r>
+        <w:t xml:space="preserve">u</w:t>
+      </w:r>
+      <w:r>
+        <w:t xml:space="preserve"> </w:t>
+      </w:r>
+      <w:r>
+        <w:rPr>
+          <w:rStyle w:val="VerbatimChar"/>
+        </w:rPr>
+        <w:t xml:space="preserve">paid</w:t>
+      </w:r>
+      <w:r>
+        <w:t xml:space="preserve">. Replika zato ne bira redove, već primenjuje</w:t>
+      </w:r>
+      <w:r>
+        <w:t xml:space="preserve"> </w:t>
+      </w:r>
+      <w:r>
+        <w:t xml:space="preserve">izbor koji je izvor već napravio. Upisivanje redova problem nedeterminizma ne rešava tako što ga</w:t>
+      </w:r>
+      <w:r>
+        <w:t xml:space="preserve"> </w:t>
+      </w:r>
+      <w:r>
+        <w:t xml:space="preserve">uklanja, već tako što izbor ostavlja izvoru, a replici šalje samo njegov ishod.</w:t>
+      </w:r>
+    </w:p>
+    <w:p>
+      <w:pPr>
+        <w:pStyle w:val="CaptionedFigure"/>
+      </w:pPr>
+      <w:r>
+        <w:drawing>
+          <wp:inline>
+            <wp:extent cx="5177790" cy="3172665"/>
+            <wp:effectExtent b="0" l="0" r="0" t="0"/>
+            <wp:docPr descr="Slika 3.2: Isti nesiguran iskaz u dva formata binarnog loga, izvršen na izvoru (node1). U formatu STATEMENT server upozorava da skup redova nije predvidiv; u formatu ROW log beleži upravo izmenjene redove, sa slikom pre (WHERE) i posle (SET) izmene. Ispis alata mysqlbinlog sažet je na jedan red po slici reda." title="" id="22" name="Picture"/>
+            <a:graphic>
+              <a:graphicData uri="http://schemas.openxmlformats.org/drawingml/2006/picture">
+                <pic:pic>
+                  <pic:nvPicPr>
+                    <pic:cNvPr descr="figures/03-binlog-02-nesiguran-iskaz.png" id="23" name="Picture"/>
+                    <pic:cNvPicPr>
+                      <a:picLocks noChangeArrowheads="1" noChangeAspect="1"/>
+                    </pic:cNvPicPr>
+                  </pic:nvPicPr>
+                  <pic:blipFill>
+                    <a:blip r:embed="rId21"/>
+                    <a:stretch>
+                      <a:fillRect/>
+                    </a:stretch>
+                  </pic:blipFill>
+                  <pic:spPr bwMode="auto">
+                    <a:xfrm>
+                      <a:off x="0" y="0"/>
+                      <a:ext cx="5177790" cy="3172665"/>
+                    </a:xfrm>
+                    <a:prstGeom prst="rect">
+                      <a:avLst/>
+                    </a:prstGeom>
+                    <a:noFill/>
+                    <a:ln w="9525">
+                      <a:noFill/>
+                      <a:headEnd/>
+                      <a:tailEnd/>
+                    </a:ln>
+                  </pic:spPr>
+                </pic:pic>
+              </a:graphicData>
+            </a:graphic>
+          </wp:inline>
+        </w:drawing>
+      </w:r>
+    </w:p>
+    <w:p>
+      <w:pPr>
+        <w:pStyle w:val="ImageCaption"/>
+      </w:pPr>
+      <w:r>
+        <w:t xml:space="preserve">Slika 3.2: Isti nesiguran iskaz u dva formata binarnog loga, izvršen na izvoru (node1). U formatu STATEMENT server upozorava da skup redova nije predvidiv; u formatu ROW log beleži upravo izmenjene redove, sa slikom pre (WHERE) i posle (SET) izmene. Ispis alata mysqlbinlog sažet je na jedan red po slici reda.</w:t>
+      </w:r>
+    </w:p>
+    <w:bookmarkEnd w:id="24"/>
+    <w:bookmarkStart w:id="25" w:name="X2c0a4a398aa458fe147bd7c2a777a48b730de7f"/>
+    <w:p>
+      <w:pPr>
+        <w:pStyle w:val="Heading2"/>
+      </w:pPr>
+      <w:r>
+        <w:t xml:space="preserve">Postojanost: dva loga i dvofazno komitovanje</w:t>
+      </w:r>
+    </w:p>
+    <w:p>
+      <w:pPr>
+        <w:pStyle w:val="FirstParagraph"/>
+      </w:pPr>
+      <w:r>
+        <w:t xml:space="preserve">Potvrda da je transakcija komitovana ima smisla samo ako transakcija preživi pad sistema, a to zavisi</w:t>
+      </w:r>
+      <w:r>
+        <w:t xml:space="preserve"> </w:t>
+      </w:r>
+      <w:r>
+        <w:t xml:space="preserve">od toga kada log zaista stigne na disk. Upis u datoteku najpre dospeva u keš operativnog sistema, u</w:t>
+      </w:r>
+      <w:r>
+        <w:t xml:space="preserve"> </w:t>
+      </w:r>
+      <w:r>
+        <w:t xml:space="preserve">radnoj memoriji, a na stabilnu memoriju stiže tek kada ga operativni sistem sam prenese ili kada</w:t>
+      </w:r>
+      <w:r>
+        <w:t xml:space="preserve"> </w:t>
+      </w:r>
+      <w:r>
+        <w:t xml:space="preserve">proces to izričito zatraži pozivom</w:t>
+      </w:r>
+      <w:r>
+        <w:t xml:space="preserve"> </w:t>
+      </w:r>
+      <w:r>
+        <w:rPr>
+          <w:rStyle w:val="VerbatimChar"/>
+        </w:rPr>
+        <w:t xml:space="preserve">fsync()</w:t>
+      </w:r>
+      <w:r>
+        <w:t xml:space="preserve">, čiji je ekvivalent na Windowsu</w:t>
+      </w:r>
+      <w:r>
+        <w:t xml:space="preserve"> </w:t>
+      </w:r>
+      <w:r>
+        <w:rPr>
+          <w:rStyle w:val="VerbatimChar"/>
+        </w:rPr>
+        <w:t xml:space="preserve">FlushFileBuffers</w:t>
+      </w:r>
+      <w:r>
+        <w:t xml:space="preserve">;</w:t>
+      </w:r>
+      <w:r>
+        <w:t xml:space="preserve"> </w:t>
+      </w:r>
+      <w:r>
+        <w:t xml:space="preserve">priručnik upravo tako opisuje rad binarnog loga kada server sinhronizaciju prepusti operativnom</w:t>
+      </w:r>
+      <w:r>
+        <w:t xml:space="preserve"> </w:t>
+      </w:r>
+      <w:r>
+        <w:t xml:space="preserve">sistemu</w:t>
+      </w:r>
+      <w:r>
+        <w:t xml:space="preserve"> </w:t>
+      </w:r>
+      <w:r>
+        <w:t xml:space="preserve">[11]</w:t>
+      </w:r>
+      <w:r>
+        <w:t xml:space="preserve">. Zato se razlikuju dva događaja: pad procesa</w:t>
+      </w:r>
+      <w:r>
+        <w:t xml:space="preserve"> </w:t>
+      </w:r>
+      <w:r>
+        <w:rPr>
+          <w:rStyle w:val="VerbatimChar"/>
+        </w:rPr>
+        <w:t xml:space="preserve">mysqld</w:t>
+      </w:r>
+      <w:r>
+        <w:t xml:space="preserve">, pri kome ono što je</w:t>
+      </w:r>
+      <w:r>
+        <w:t xml:space="preserve"> </w:t>
+      </w:r>
+      <w:r>
+        <w:t xml:space="preserve">već predato operativnom sistemu ostaje sačuvano, i pad operativnog sistema ili nestanak napajanja,</w:t>
+      </w:r>
+      <w:r>
+        <w:t xml:space="preserve"> </w:t>
+      </w:r>
+      <w:r>
+        <w:t xml:space="preserve">pri kome se gubi i sadržaj keša. InnoDB postojanost obezbeđuje tehnikom write-ahead logging (WAL):</w:t>
+      </w:r>
+      <w:r>
+        <w:t xml:space="preserve"> </w:t>
+      </w:r>
+      <w:r>
+        <w:t xml:space="preserve">pre izmene stranica sa podacima opis izmene upisuje se u redo log, koji priručnik opisuje kao</w:t>
+      </w:r>
+      <w:r>
+        <w:t xml:space="preserve"> </w:t>
+      </w:r>
+      <w:r>
+        <w:t xml:space="preserve">strukturu na disku koja se pri oporavku posle pada koristi da ispravi podatke koje su upisale</w:t>
+      </w:r>
+      <w:r>
+        <w:t xml:space="preserve"> </w:t>
+      </w:r>
+      <w:r>
+        <w:t xml:space="preserve">nedovršene transakcije</w:t>
+      </w:r>
+      <w:r>
+        <w:t xml:space="preserve"> </w:t>
+      </w:r>
+      <w:r>
+        <w:t xml:space="preserve">[11]</w:t>
+      </w:r>
+      <w:r>
+        <w:t xml:space="preserve">. Redo log se samo dopisuje</w:t>
+      </w:r>
+      <w:r>
+        <w:t xml:space="preserve"> </w:t>
+      </w:r>
+      <w:r>
+        <w:t xml:space="preserve">[11]</w:t>
+      </w:r>
+      <w:r>
+        <w:t xml:space="preserve">, pa je jedna</w:t>
+      </w:r>
+      <w:r>
+        <w:t xml:space="preserve"> </w:t>
+      </w:r>
+      <w:r>
+        <w:t xml:space="preserve">sinhronizacija loga pri komitovanju jeftinija od upisa svih izmenjenih stranica, koje mogu da se</w:t>
+      </w:r>
+      <w:r>
+        <w:t xml:space="preserve"> </w:t>
+      </w:r>
+      <w:r>
+        <w:t xml:space="preserve">upišu kasnije.</w:t>
+      </w:r>
+    </w:p>
+    <w:p>
+      <w:pPr>
+        <w:pStyle w:val="BodyText"/>
+      </w:pPr>
+      <w:r>
+        <w:t xml:space="preserve">MySQL, međutim, istu transakciju beleži u dva loga. Redo log pripada mehanizmu skladištenja (storage</w:t>
+      </w:r>
+      <w:r>
+        <w:t xml:space="preserve"> </w:t>
+      </w:r>
+      <w:r>
+        <w:t xml:space="preserve">engine) InnoDB i služi njegovom oporavku, dok binarni log vodi serverski sloj, iznad motora, i on</w:t>
+      </w:r>
+      <w:r>
+        <w:t xml:space="preserve"> </w:t>
+      </w:r>
+      <w:r>
+        <w:t xml:space="preserve">služi replikaciji. Da binarni log ne zavisi od motora vidi se po tome što priručnik dozvoljava da se</w:t>
+      </w:r>
+      <w:r>
+        <w:t xml:space="preserve"> </w:t>
+      </w:r>
+      <w:r>
+        <w:t xml:space="preserve">izmene InnoDB tabele na izvoru repliciraju u MyISAM tabelu na replici</w:t>
+      </w:r>
+      <w:r>
+        <w:t xml:space="preserve"> </w:t>
+      </w:r>
+      <w:r>
+        <w:t xml:space="preserve">[11]</w:t>
+      </w:r>
+      <w:r>
+        <w:t xml:space="preserve">. Dva</w:t>
+      </w:r>
+      <w:r>
+        <w:t xml:space="preserve"> </w:t>
+      </w:r>
+      <w:r>
+        <w:t xml:space="preserve">nezavisna upisa otvaraju opasnost koja kod jednog loga ne postoji. Ako transakcija posle pada ostane</w:t>
+      </w:r>
+      <w:r>
+        <w:t xml:space="preserve"> </w:t>
+      </w:r>
+      <w:r>
+        <w:t xml:space="preserve">u redo logu, a ne i u binarnom logu, izvor je ima, a replike je nikada neće dobiti; ako je obrnuto,</w:t>
+      </w:r>
+      <w:r>
+        <w:t xml:space="preserve"> </w:t>
+      </w:r>
+      <w:r>
+        <w:t xml:space="preserve">replike je primenjuju, a izvor ju je izgubio. U oba slučaja izvor i replike trajno se razilaze, a</w:t>
+      </w:r>
+      <w:r>
+        <w:t xml:space="preserve"> </w:t>
+      </w:r>
+      <w:r>
+        <w:t xml:space="preserve">nijedan čvor ne prijavljuje grešku.</w:t>
+      </w:r>
+    </w:p>
+    <w:p>
+      <w:pPr>
+        <w:pStyle w:val="BodyText"/>
+      </w:pPr>
+      <w:r>
+        <w:t xml:space="preserve">MySQL ovu opasnost otklanja internim dvofaznim komitovanjem (two-phase commit) između motora InnoDB i</w:t>
+      </w:r>
+      <w:r>
+        <w:t xml:space="preserve"> </w:t>
+      </w:r>
+      <w:r>
+        <w:t xml:space="preserve">binarnog loga, koje je u verziji 8.4 uvek uključeno</w:t>
+      </w:r>
+      <w:r>
+        <w:t xml:space="preserve"> </w:t>
+      </w:r>
+      <w:r>
+        <w:t xml:space="preserve">[11]</w:t>
+      </w:r>
+      <w:r>
+        <w:t xml:space="preserve">. U prvoj fazi, pripremi</w:t>
+      </w:r>
+      <w:r>
+        <w:t xml:space="preserve"> </w:t>
+      </w:r>
+      <w:r>
+        <w:t xml:space="preserve">(prepare), InnoDB transakciju upisuje u redo log kao pripremljenu; zatim se transakcija upisuje u</w:t>
+      </w:r>
+      <w:r>
+        <w:t xml:space="preserve"> </w:t>
+      </w:r>
+      <w:r>
+        <w:t xml:space="preserve">binarni log i on se sinhronizuje na disk, a tek tada InnoDB transakciju komituje</w:t>
+      </w:r>
+      <w:r>
+        <w:t xml:space="preserve"> </w:t>
+      </w:r>
+      <w:r>
+        <w:t xml:space="preserve">[11]</w:t>
+      </w:r>
+      <w:r>
+        <w:t xml:space="preserve">.</w:t>
+      </w:r>
+      <w:r>
+        <w:t xml:space="preserve"> </w:t>
+      </w:r>
+      <w:r>
+        <w:t xml:space="preserve">Odluku o ishodu time donosi binarni log: transakcija je komitovana onog trenutka kada je postojano</w:t>
+      </w:r>
+      <w:r>
+        <w:t xml:space="preserve"> </w:t>
+      </w:r>
+      <w:r>
+        <w:t xml:space="preserve">upisana u njega. Iz toga neposredno sledi pravilo oporavka. Posle pada server pregleda poslednju</w:t>
+      </w:r>
+      <w:r>
+        <w:t xml:space="preserve"> </w:t>
+      </w:r>
+      <w:r>
+        <w:t xml:space="preserve">datoteku binarnog loga, nalaže InnoDB-u da dovrši sve pripremljene transakcije koje su uspešno</w:t>
+      </w:r>
+      <w:r>
+        <w:t xml:space="preserve"> </w:t>
+      </w:r>
+      <w:r>
+        <w:t xml:space="preserve">upisane u binarni log i skraćuje binarni log do poslednje ispravne pozicije, tako da log tačno</w:t>
+      </w:r>
+      <w:r>
+        <w:t xml:space="preserve"> </w:t>
+      </w:r>
+      <w:r>
+        <w:t xml:space="preserve">odražava sadržaj InnoDB tabela, a replika ne dobija transakciju koja je na izvoru poništena</w:t>
+      </w:r>
+      <w:r>
+        <w:t xml:space="preserve"> </w:t>
+      </w:r>
+      <w:r>
+        <w:t xml:space="preserve">[11]</w:t>
+      </w:r>
+      <w:r>
+        <w:t xml:space="preserve">. Pripremljena transakcija se, dakle, ne poništava uvek. Redo log izgleda isto bez</w:t>
+      </w:r>
+      <w:r>
+        <w:t xml:space="preserve"> </w:t>
+      </w:r>
+      <w:r>
+        <w:t xml:space="preserve">obzira na to da li je pad nastupio pre ili posle upisa u binarni log, pa o sudbini pripremljene</w:t>
+      </w:r>
+      <w:r>
+        <w:t xml:space="preserve"> </w:t>
+      </w:r>
+      <w:r>
+        <w:t xml:space="preserve">transakcije može da presudi samo binarni log.</w:t>
+      </w:r>
+    </w:p>
+    <w:p>
+      <w:pPr>
+        <w:pStyle w:val="BodyText"/>
+      </w:pPr>
+      <w:r>
+        <w:t xml:space="preserve">Koliko je ova zaštita stvarno jaka, zavisi od dve promenljive, od kojih svaka za jedan od dva loga</w:t>
+      </w:r>
+      <w:r>
+        <w:t xml:space="preserve"> </w:t>
+      </w:r>
+      <w:r>
+        <w:t xml:space="preserve">odgovara na isto pitanje: da li se log pri komitovanju sinhronizuje na disk. Za binarni log to je</w:t>
+      </w:r>
+      <w:r>
+        <w:t xml:space="preserve"> </w:t>
+      </w:r>
+      <w:r>
+        <w:rPr>
+          <w:rStyle w:val="VerbatimChar"/>
+        </w:rPr>
+        <w:t xml:space="preserve">sync_binlog</w:t>
+      </w:r>
+      <w:r>
+        <w:t xml:space="preserve">. Vrednost 1 sinhronizuje ga pre komitovanja, a vrednost 0 sinhronizaciju prepušta</w:t>
+      </w:r>
+      <w:r>
+        <w:t xml:space="preserve"> </w:t>
+      </w:r>
+      <w:r>
+        <w:t xml:space="preserve">operativnom sistemu, pa posle pada operativnog sistema ili nestanka napajanja server može imati</w:t>
+      </w:r>
+      <w:r>
+        <w:t xml:space="preserve"> </w:t>
+      </w:r>
+      <w:r>
+        <w:t xml:space="preserve">komitovane transakcije kojih nema u binarnom logu</w:t>
+      </w:r>
+      <w:r>
+        <w:t xml:space="preserve"> </w:t>
+      </w:r>
+      <w:r>
+        <w:t xml:space="preserve">[11]</w:t>
+      </w:r>
+      <w:r>
+        <w:t xml:space="preserve">. Za redo log to je</w:t>
+      </w:r>
+      <w:r>
+        <w:t xml:space="preserve"> </w:t>
+      </w:r>
+      <w:r>
+        <w:rPr>
+          <w:rStyle w:val="VerbatimChar"/>
+        </w:rPr>
+        <w:t xml:space="preserve">innodb_flush_log_at_trx_commit</w:t>
+      </w:r>
+      <w:r>
+        <w:t xml:space="preserve">. Vrednost 1, neophodna za punu usklađenost sa svojstvima ACID,</w:t>
+      </w:r>
+      <w:r>
+        <w:t xml:space="preserve"> </w:t>
+      </w:r>
+      <w:r>
+        <w:t xml:space="preserve">upisuje i sinhronizuje log pri svakom komitovanju; vrednost 2 upisuje ga pri komitovanju, a</w:t>
+      </w:r>
+      <w:r>
+        <w:t xml:space="preserve"> </w:t>
+      </w:r>
+      <w:r>
+        <w:t xml:space="preserve">sinhronizuje jednom u sekundi; vrednost 0 ga i upisuje i sinhronizuje jednom u sekundi</w:t>
+      </w:r>
+      <w:r>
+        <w:t xml:space="preserve"> </w:t>
+      </w:r>
+      <w:r>
+        <w:t xml:space="preserve">[11]</w:t>
+      </w:r>
+      <w:r>
+        <w:t xml:space="preserve">. Iz razlike između upisa i sinhronizacije sledi zaključak koji priručnik ne navodi</w:t>
+      </w:r>
+      <w:r>
+        <w:t xml:space="preserve"> </w:t>
+      </w:r>
+      <w:r>
+        <w:t xml:space="preserve">doslovno, već se izvodi: uz vrednosti 2 i</w:t>
+      </w:r>
+      <w:r>
+        <w:t xml:space="preserve"> </w:t>
+      </w:r>
+      <w:r>
+        <w:rPr>
+          <w:rStyle w:val="VerbatimChar"/>
+        </w:rPr>
+        <w:t xml:space="preserve">sync_binlog = 0</w:t>
+      </w:r>
+      <w:r>
+        <w:t xml:space="preserve"> </w:t>
+      </w:r>
+      <w:r>
+        <w:t xml:space="preserve">pad samog procesa</w:t>
+      </w:r>
+      <w:r>
+        <w:t xml:space="preserve"> </w:t>
+      </w:r>
+      <w:r>
+        <w:rPr>
+          <w:rStyle w:val="VerbatimChar"/>
+        </w:rPr>
+        <w:t xml:space="preserve">mysqld</w:t>
+      </w:r>
+      <w:r>
+        <w:t xml:space="preserve"> </w:t>
+      </w:r>
+      <w:r>
+        <w:t xml:space="preserve">ne gubi</w:t>
+      </w:r>
+      <w:r>
+        <w:t xml:space="preserve"> </w:t>
+      </w:r>
+      <w:r>
+        <w:t xml:space="preserve">komitovane transakcije, jer su oba loga već predata operativnom sistemu, dok ih pad operativnog</w:t>
+      </w:r>
+      <w:r>
+        <w:t xml:space="preserve"> </w:t>
+      </w:r>
+      <w:r>
+        <w:t xml:space="preserve">sistema gubi. Najopasnija je kombinacija u kojoj je binarni log sinhronizovan, a redo log nije:</w:t>
+      </w:r>
+      <w:r>
+        <w:t xml:space="preserve"> </w:t>
+      </w:r>
+      <w:r>
+        <w:t xml:space="preserve">posle nestanka napajanja binarni log sadrži transakciju čija je priprema izgubljena iz redo loga, pa</w:t>
+      </w:r>
+      <w:r>
+        <w:t xml:space="preserve"> </w:t>
+      </w:r>
+      <w:r>
+        <w:t xml:space="preserve">je replike imaju, a izvor ne. I ovo je izveden zaključak, a opisuje upravo razilaženje koje je</w:t>
+      </w:r>
+      <w:r>
+        <w:t xml:space="preserve"> </w:t>
+      </w:r>
+      <w:r>
+        <w:t xml:space="preserve">dvofazno komitovanje trebalo da spreči. Za najveću postojanost i konzistentnost priručnik zato</w:t>
+      </w:r>
+      <w:r>
+        <w:t xml:space="preserve"> </w:t>
+      </w:r>
+      <w:r>
+        <w:t xml:space="preserve">preporučuje vrednosti</w:t>
+      </w:r>
+      <w:r>
+        <w:t xml:space="preserve"> </w:t>
+      </w:r>
+      <w:r>
+        <w:rPr>
+          <w:rStyle w:val="VerbatimChar"/>
+        </w:rPr>
+        <w:t xml:space="preserve">sync_binlog = 1</w:t>
+      </w:r>
+      <w:r>
+        <w:t xml:space="preserve"> </w:t>
+      </w:r>
+      <w:r>
+        <w:t xml:space="preserve">i</w:t>
+      </w:r>
+      <w:r>
+        <w:t xml:space="preserve"> </w:t>
+      </w:r>
+      <w:r>
+        <w:rPr>
+          <w:rStyle w:val="VerbatimChar"/>
+        </w:rPr>
+        <w:t xml:space="preserve">innodb_flush_log_at_trx_commit = 1</w:t>
+      </w:r>
+      <w:r>
+        <w:t xml:space="preserve">, uz upozorenje da ni</w:t>
+      </w:r>
+      <w:r>
+        <w:t xml:space="preserve"> </w:t>
+      </w:r>
+      <w:r>
+        <w:t xml:space="preserve">one nisu garancija na operativnim sistemima i diskovima koji na zahtev za sinhronizaciju odgovaraju</w:t>
+      </w:r>
+      <w:r>
+        <w:t xml:space="preserve"> </w:t>
+      </w:r>
+      <w:r>
+        <w:t xml:space="preserve">da je obavljena, iako nije</w:t>
+      </w:r>
+      <w:r>
+        <w:t xml:space="preserve"> </w:t>
+      </w:r>
+      <w:r>
+        <w:t xml:space="preserve">[11]</w:t>
+      </w:r>
+      <w:r>
+        <w:t xml:space="preserve">.</w:t>
+      </w:r>
+    </w:p>
+    <w:p>
+      <w:pPr>
+        <w:pStyle w:val="BodyText"/>
+      </w:pPr>
+      <w:r>
+        <w:t xml:space="preserve">Cena sinhronizacije vidi se i na topologiji ovog rada. Na izvoru je izvršeno po sto jednorednih</w:t>
+      </w:r>
+      <w:r>
+        <w:t xml:space="preserve"> </w:t>
+      </w:r>
+      <w:r>
+        <w:t xml:space="preserve">transakcija sa vrednostima 1 i 1, jednom uz binarni log, a jednom uz upisivanje u binarni log</w:t>
+      </w:r>
+      <w:r>
+        <w:t xml:space="preserve"> </w:t>
+      </w:r>
+      <w:r>
+        <w:t xml:space="preserve">isključeno za tu sesiju (</w:t>
+      </w:r>
+      <w:r>
+        <w:rPr>
+          <w:rStyle w:val="VerbatimChar"/>
+        </w:rPr>
+        <w:t xml:space="preserve">sql_log_bin = 0</w:t>
+      </w:r>
+      <w:r>
+        <w:t xml:space="preserve">). Uz binarni log redo log se sinhronizovao po dva puta po</w:t>
+      </w:r>
+      <w:r>
+        <w:t xml:space="preserve"> </w:t>
+      </w:r>
+      <w:r>
+        <w:t xml:space="preserve">transakciji, a bez njega nešto više od jednom, dok je komitovanje uz binarni log trajalo približno</w:t>
+      </w:r>
+      <w:r>
+        <w:t xml:space="preserve"> </w:t>
+      </w:r>
+      <w:r>
+        <w:t xml:space="preserve">dva i po puta duže. Rezultat je u skladu sa time da se pri dvofaznom komitovanju redo log</w:t>
+      </w:r>
+      <w:r>
+        <w:t xml:space="preserve"> </w:t>
+      </w:r>
+      <w:r>
+        <w:t xml:space="preserve">sinhronizuje i u pripremi i pri komitovanju, ali taj unutrašnji raspored sinhronizacija nije</w:t>
+      </w:r>
+      <w:r>
+        <w:t xml:space="preserve"> </w:t>
+      </w:r>
+      <w:r>
+        <w:t xml:space="preserve">potvrđen u dokumentaciji, pa se ovde navodi samo kao merenje, izvedeno pod Windowsom na verziji</w:t>
+      </w:r>
+      <w:r>
+        <w:t xml:space="preserve"> </w:t>
+      </w:r>
+      <w:r>
+        <w:t xml:space="preserve">8.4.11. Sa vrednošću 2 za redo log broj sinhronizacija pao je gotovo na nulu. Isti izbor između</w:t>
+      </w:r>
+      <w:r>
+        <w:t xml:space="preserve"> </w:t>
+      </w:r>
+      <w:r>
+        <w:t xml:space="preserve">postojanosti i vremena odziva, proširen semisinhronom replikacijom, sistematski se meri u četvrtom</w:t>
+      </w:r>
+      <w:r>
+        <w:t xml:space="preserve"> </w:t>
+      </w:r>
+      <w:r>
+        <w:t xml:space="preserve">poglavlju.</w:t>
+      </w:r>
+    </w:p>
+    <w:bookmarkEnd w:id="25"/>
+    <w:bookmarkStart w:id="26" w:name="gtid-i-automatsko-pozicioniranje"/>
+    <w:p>
+      <w:pPr>
+        <w:pStyle w:val="Heading2"/>
+      </w:pPr>
+      <w:r>
+        <w:t xml:space="preserve">GTID i automatsko pozicioniranje</w:t>
+      </w:r>
+    </w:p>
+    <w:p>
+      <w:pPr>
+        <w:pStyle w:val="FirstParagraph"/>
+      </w:pPr>
+      <w:r>
+        <w:t xml:space="preserve">Replika mora da zna dokle je u logu izvora stigla, da bi posle prekida veze nastavila od prave</w:t>
+      </w:r>
+      <w:r>
+        <w:t xml:space="preserve"> </w:t>
+      </w:r>
+      <w:r>
+        <w:t xml:space="preserve">transakcije. Tradicionalni način je par koji čine ime datoteke binarnog loga i pozicija u njoj, ali</w:t>
+      </w:r>
+      <w:r>
+        <w:t xml:space="preserve"> </w:t>
+      </w:r>
+      <w:r>
+        <w:t xml:space="preserve">taj par je adresa u logu jednog servera, a ne ime transakcije. Na topologiji ovog rada jedna</w:t>
+      </w:r>
+      <w:r>
+        <w:t xml:space="preserve"> </w:t>
+      </w:r>
+      <w:r>
+        <w:t xml:space="preserve">transakcija upisana na izvoru završava se u datoteci</w:t>
+      </w:r>
+      <w:r>
+        <w:t xml:space="preserve"> </w:t>
+      </w:r>
+      <w:r>
+        <w:rPr>
+          <w:rStyle w:val="VerbatimChar"/>
+        </w:rPr>
+        <w:t xml:space="preserve">node1-bin.000008</w:t>
+      </w:r>
+      <w:r>
+        <w:t xml:space="preserve"> </w:t>
+      </w:r>
+      <w:r>
+        <w:t xml:space="preserve">na poziciji 640, a ista</w:t>
+      </w:r>
+      <w:r>
+        <w:t xml:space="preserve"> </w:t>
+      </w:r>
+      <w:r>
+        <w:t xml:space="preserve">transakcija na replici node3 u datoteci</w:t>
+      </w:r>
+      <w:r>
+        <w:t xml:space="preserve"> </w:t>
+      </w:r>
+      <w:r>
+        <w:rPr>
+          <w:rStyle w:val="VerbatimChar"/>
+        </w:rPr>
+        <w:t xml:space="preserve">node3-bin.000010</w:t>
+      </w:r>
+      <w:r>
+        <w:t xml:space="preserve"> </w:t>
+      </w:r>
+      <w:r>
+        <w:t xml:space="preserve">na poziciji 630, jer svaki server vodi</w:t>
+      </w:r>
+      <w:r>
+        <w:t xml:space="preserve"> </w:t>
+      </w:r>
+      <w:r>
+        <w:t xml:space="preserve">sopstveni log sa sopstvenim zapisima. Globalni identifikator transakcije (GTID) to rešava tako što</w:t>
+      </w:r>
+      <w:r>
+        <w:t xml:space="preserve"> </w:t>
+      </w:r>
+      <w:r>
+        <w:t xml:space="preserve">transakciji daje ime koje putuje sa njom. GTID se dodeljuje pri komitovanju na izvoru, jedinstven je</w:t>
+      </w:r>
+      <w:r>
+        <w:t xml:space="preserve"> </w:t>
+      </w:r>
+      <w:r>
+        <w:t xml:space="preserve">u celoj topologiji i ima oblik</w:t>
+      </w:r>
+      <w:r>
+        <w:t xml:space="preserve"> </w:t>
+      </w:r>
+      <w:r>
+        <w:rPr>
+          <w:rStyle w:val="VerbatimChar"/>
+        </w:rPr>
+        <w:t xml:space="preserve">source_id:transaction_id</w:t>
+      </w:r>
+      <w:r>
+        <w:t xml:space="preserve">, gde je prvi deo obično</w:t>
+      </w:r>
+      <w:r>
+        <w:t xml:space="preserve"> </w:t>
+      </w:r>
+      <w:r>
+        <w:rPr>
+          <w:rStyle w:val="VerbatimChar"/>
+        </w:rPr>
+        <w:t xml:space="preserve">server_uuid</w:t>
+      </w:r>
+      <w:r>
+        <w:t xml:space="preserve"> </w:t>
+      </w:r>
+      <w:r>
+        <w:t xml:space="preserve">izvora, a drugi redni broj transakcije na njemu</w:t>
+      </w:r>
+      <w:r>
+        <w:t xml:space="preserve"> </w:t>
+      </w:r>
+      <w:r>
+        <w:t xml:space="preserve">[11]</w:t>
+      </w:r>
+      <w:r>
+        <w:t xml:space="preserve">. Replicirana transakcija zadržava</w:t>
+      </w:r>
+      <w:r>
+        <w:t xml:space="preserve"> </w:t>
+      </w:r>
+      <w:r>
+        <w:t xml:space="preserve">GTID koji je dobila na izvoru, a server preskače svaku transakciju čiji je GTID već izvršio, pa se</w:t>
+      </w:r>
+      <w:r>
+        <w:t xml:space="preserve"> </w:t>
+      </w:r>
+      <w:r>
+        <w:t xml:space="preserve">transakcija na jednom serveru primenjuje najviše jednom</w:t>
+      </w:r>
+      <w:r>
+        <w:t xml:space="preserve"> </w:t>
+      </w:r>
+      <w:r>
+        <w:t xml:space="preserve">[11]</w:t>
+      </w:r>
+      <w:r>
+        <w:t xml:space="preserve">. Opisana transakcija na oba</w:t>
+      </w:r>
+      <w:r>
+        <w:t xml:space="preserve"> </w:t>
+      </w:r>
+      <w:r>
+        <w:t xml:space="preserve">servera nosi isti GTID, sa rednim brojem 16854.</w:t>
+      </w:r>
+    </w:p>
+    <w:p>
+      <w:pPr>
+        <w:pStyle w:val="BodyText"/>
+      </w:pPr>
+      <w:r>
+        <w:t xml:space="preserve">GTID-ovi menjaju i način na koji se replika povezuje sa izvorom. Uz opciju</w:t>
+      </w:r>
+      <w:r>
+        <w:t xml:space="preserve"> </w:t>
+      </w:r>
+      <w:r>
+        <w:rPr>
+          <w:rStyle w:val="VerbatimChar"/>
+        </w:rPr>
+        <w:t xml:space="preserve">SOURCE_AUTO_POSITION = 1</w:t>
+      </w:r>
+      <w:r>
+        <w:t xml:space="preserve"> </w:t>
+      </w:r>
+      <w:r>
+        <w:t xml:space="preserve">naredbe</w:t>
+      </w:r>
+      <w:r>
+        <w:t xml:space="preserve"> </w:t>
+      </w:r>
+      <w:r>
+        <w:rPr>
+          <w:rStyle w:val="VerbatimChar"/>
+        </w:rPr>
+        <w:t xml:space="preserve">CHANGE REPLICATION SOURCE TO</w:t>
+      </w:r>
+      <w:r>
+        <w:t xml:space="preserve"> </w:t>
+      </w:r>
+      <w:r>
+        <w:t xml:space="preserve">replika ne navodi ni datoteku ni</w:t>
+      </w:r>
+      <w:r>
+        <w:t xml:space="preserve"> </w:t>
+      </w:r>
+      <w:r>
+        <w:t xml:space="preserve">poziciju, već pri povezivanju šalje skup GTID-ova koje je već primila ili izvršila, a izvor joj šalje</w:t>
+      </w:r>
+      <w:r>
+        <w:t xml:space="preserve"> </w:t>
+      </w:r>
+      <w:r>
+        <w:t xml:space="preserve">sve transakcije iz svog binarnog loga čiji GTID nije u tom skupu</w:t>
+      </w:r>
+      <w:r>
+        <w:t xml:space="preserve"> </w:t>
+      </w:r>
+      <w:r>
+        <w:t xml:space="preserve">[11]</w:t>
+      </w:r>
+      <w:r>
+        <w:t xml:space="preserve">. Automatsko</w:t>
+      </w:r>
+      <w:r>
+        <w:t xml:space="preserve"> </w:t>
+      </w:r>
+      <w:r>
+        <w:t xml:space="preserve">pozicioniranje je, dakle, razlika dva skupa, a ne traženje adrese. Obe replike u topologiji ovog</w:t>
+      </w:r>
+      <w:r>
+        <w:t xml:space="preserve"> </w:t>
+      </w:r>
+      <w:r>
+        <w:t xml:space="preserve">rada pokrenute su upravo tako, od praznog skupa, pa su celu istoriju izvora dobile iz njegovog</w:t>
+      </w:r>
+      <w:r>
+        <w:t xml:space="preserve"> </w:t>
+      </w:r>
+      <w:r>
+        <w:t xml:space="preserve">binarnog loga. Priručnik navodi da su GTID-ovi uvedeni da pojednostave upravljanje replikacijom, a</w:t>
+      </w:r>
+      <w:r>
+        <w:t xml:space="preserve"> </w:t>
+      </w:r>
+      <w:r>
+        <w:t xml:space="preserve">posebno failover (preuzimanje uloge izvora nakon otkaza)</w:t>
+      </w:r>
+      <w:r>
+        <w:t xml:space="preserve"> </w:t>
+      </w:r>
+      <w:r>
+        <w:t xml:space="preserve">[11]</w:t>
+      </w:r>
+      <w:r>
+        <w:t xml:space="preserve">. Pojednostavljeno je</w:t>
+      </w:r>
+      <w:r>
+        <w:t xml:space="preserve"> </w:t>
+      </w:r>
+      <w:r>
+        <w:t xml:space="preserve">pozicioniranje, a ne odluka: prema priručniku, kada izvor otkaže, operater bira repliku koja postaje</w:t>
+      </w:r>
+      <w:r>
+        <w:t xml:space="preserve"> </w:t>
+      </w:r>
+      <w:r>
+        <w:t xml:space="preserve">novi izvor i ostale replike na nju preusmerava naredbom</w:t>
+      </w:r>
+      <w:r>
+        <w:t xml:space="preserve"> </w:t>
+      </w:r>
+      <w:r>
+        <w:rPr>
+          <w:rStyle w:val="VerbatimChar"/>
+        </w:rPr>
+        <w:t xml:space="preserve">CHANGE REPLICATION SOURCE TO</w:t>
+      </w:r>
+      <w:r>
+        <w:t xml:space="preserve"> </w:t>
+      </w:r>
+      <w:r>
+        <w:t xml:space="preserve">[11]</w:t>
+      </w:r>
+      <w:r>
+        <w:t xml:space="preserve">. Mehanizmi koji tu odluku donose automatski predmet su petog i šestog poglavlja.</w:t>
+      </w:r>
+    </w:p>
+    <w:bookmarkEnd w:id="26"/>
+    <w:bookmarkStart w:id="30" w:name="niti-replikacije-i-mesto-kašnjenja"/>
+    <w:p>
+      <w:pPr>
+        <w:pStyle w:val="Heading2"/>
+      </w:pPr>
+      <w:r>
+        <w:t xml:space="preserve">Niti replikacije i mesto kašnjenja</w:t>
+      </w:r>
+    </w:p>
+    <w:p>
+      <w:pPr>
+        <w:pStyle w:val="FirstParagraph"/>
+      </w:pPr>
+      <w:r>
+        <w:t xml:space="preserve">Put transakcije od izvora do podataka replike prikazan je na slici 3.1 i prolazi kroz tri vrste</w:t>
+      </w:r>
+      <w:r>
+        <w:t xml:space="preserve"> </w:t>
+      </w:r>
+      <w:r>
+        <w:t xml:space="preserve">niti. Na izvoru, za svaku povezanu repliku, po jedna nit koja šalje log (binlog dump thread) čita</w:t>
+      </w:r>
+      <w:r>
+        <w:t xml:space="preserve"> </w:t>
+      </w:r>
+      <w:r>
+        <w:t xml:space="preserve">binarni log i šalje njegov sadržaj replici. Na replici nit prijema (receiver thread) prima te</w:t>
+      </w:r>
+      <w:r>
+        <w:t xml:space="preserve"> </w:t>
+      </w:r>
+      <w:r>
+        <w:t xml:space="preserve">događaje i kopira ih u lokalne datoteke koje čine relay log. Relay log zatim čita koordinator</w:t>
+      </w:r>
+      <w:r>
+        <w:t xml:space="preserve"> </w:t>
+      </w:r>
+      <w:r>
+        <w:t xml:space="preserve">primene, koji transakcije raspoređuje nitima primene (applier threads); u verziji 8.4 replika</w:t>
+      </w:r>
+      <w:r>
+        <w:t xml:space="preserve"> </w:t>
+      </w:r>
+      <w:r>
+        <w:t xml:space="preserve">podrazumevano ima četiri niti primene</w:t>
+      </w:r>
+      <w:r>
+        <w:t xml:space="preserve"> </w:t>
+      </w:r>
+      <w:r>
+        <w:t xml:space="preserve">[11]</w:t>
+      </w:r>
+      <w:r>
+        <w:t xml:space="preserve">. Uz podrazumevanu vrednost</w:t>
+      </w:r>
+      <w:r>
+        <w:t xml:space="preserve"> </w:t>
+      </w:r>
+      <w:r>
+        <w:rPr>
+          <w:rStyle w:val="VerbatimChar"/>
+        </w:rPr>
+        <w:t xml:space="preserve">replica_preserve_commit_order = ON</w:t>
+      </w:r>
+      <w:r>
+        <w:t xml:space="preserve"> </w:t>
+      </w:r>
+      <w:r>
+        <w:t xml:space="preserve">niti primene komituju transakcije istim redosledom kojim se</w:t>
+      </w:r>
+      <w:r>
+        <w:t xml:space="preserve"> </w:t>
+      </w:r>
+      <w:r>
+        <w:t xml:space="preserve">nalaze u relay logu, pa replika, uz ograničenja koja priručnik navodi, zadržava istu istoriju</w:t>
+      </w:r>
+      <w:r>
+        <w:t xml:space="preserve"> </w:t>
+      </w:r>
+      <w:r>
+        <w:t xml:space="preserve">transakcija kao izvor</w:t>
+      </w:r>
+      <w:r>
+        <w:t xml:space="preserve"> </w:t>
+      </w:r>
+      <w:r>
+        <w:t xml:space="preserve">[11]</w:t>
+      </w:r>
+      <w:r>
+        <w:t xml:space="preserve">. Na topologiji ovog rada izvor ima dve niti koje šalju log,</w:t>
+      </w:r>
+      <w:r>
+        <w:t xml:space="preserve"> </w:t>
+      </w:r>
+      <w:r>
+        <w:t xml:space="preserve">po jednu za svaku repliku, a replika node3 nit prijema, koordinator i četiri niti primene.</w:t>
+      </w:r>
+    </w:p>
+    <w:p>
+      <w:pPr>
+        <w:pStyle w:val="CaptionedFigure"/>
+      </w:pPr>
+      <w:r>
+        <w:drawing>
+          <wp:inline>
+            <wp:extent cx="5177790" cy="2615312"/>
+            <wp:effectExtent b="0" l="0" r="0" t="0"/>
+            <wp:docPr descr="Slika 3.1: Put transakcije pri asinhronoj replikaciji. Klijent dobija potvrdu čim izvor transakciju komituje, bez čekanja replike; nit koja šalje log zatim prenosi događaje replici, gde ih nit prijema upisuje u relay log, a niti primene izvršavaju." title="" id="28" name="Picture"/>
+            <a:graphic>
+              <a:graphicData uri="http://schemas.openxmlformats.org/drawingml/2006/picture">
+                <pic:pic>
+                  <pic:nvPicPr>
+                    <pic:cNvPr descr="figures/03-binlog-01-tok-replikacije.png" id="29" name="Picture"/>
+                    <pic:cNvPicPr>
+                      <a:picLocks noChangeArrowheads="1" noChangeAspect="1"/>
+                    </pic:cNvPicPr>
+                  </pic:nvPicPr>
+                  <pic:blipFill>
+                    <a:blip r:embed="rId27"/>
+                    <a:stretch>
+                      <a:fillRect/>
+                    </a:stretch>
+                  </pic:blipFill>
+                  <pic:spPr bwMode="auto">
+                    <a:xfrm>
+                      <a:off x="0" y="0"/>
+                      <a:ext cx="5177790" cy="2615312"/>
+                    </a:xfrm>
+                    <a:prstGeom prst="rect">
+                      <a:avLst/>
+                    </a:prstGeom>
+                    <a:noFill/>
+                    <a:ln w="9525">
+                      <a:noFill/>
+                      <a:headEnd/>
+                      <a:tailEnd/>
+                    </a:ln>
+                  </pic:spPr>
+                </pic:pic>
+              </a:graphicData>
+            </a:graphic>
+          </wp:inline>
+        </w:drawing>
+      </w:r>
+    </w:p>
+    <w:p>
+      <w:pPr>
+        <w:pStyle w:val="ImageCaption"/>
+      </w:pPr>
+      <w:r>
+        <w:t xml:space="preserve">Slika 3.1: Put transakcije pri asinhronoj replikaciji. Klijent dobija potvrdu čim izvor transakciju komituje, bez čekanja replike; nit koja šalje log zatim prenosi događaje replici, gde ih nit prijema upisuje u relay log, a niti primene izvršavaju.</w:t>
+      </w:r>
+    </w:p>
+    <w:p>
+      <w:pPr>
+        <w:pStyle w:val="BodyText"/>
+      </w:pPr>
+      <w:r>
+        <w:t xml:space="preserve">Podela posla između niti objašnjava gde nastaje kašnjenje replikacije (replication lag). Nit prijema</w:t>
+      </w:r>
+      <w:r>
+        <w:t xml:space="preserve"> </w:t>
+      </w:r>
+      <w:r>
+        <w:t xml:space="preserve">samo kopira bajtove, dok niti primene moraju da izvrše transakcije koje je na izvoru istovremeno</w:t>
+      </w:r>
+      <w:r>
+        <w:t xml:space="preserve"> </w:t>
+      </w:r>
+      <w:r>
+        <w:t xml:space="preserve">izvršavalo mnogo sesija, pa je primena po pravilu sporija od prijema. To pokazuje i merenje na</w:t>
+      </w:r>
+      <w:r>
+        <w:t xml:space="preserve"> </w:t>
+      </w:r>
+      <w:r>
+        <w:t xml:space="preserve">topologiji ovog rada. Kada je izvor u naletu upisao četiri hiljade jednorednih transakcija, a</w:t>
+      </w:r>
+      <w:r>
+        <w:t xml:space="preserve"> </w:t>
+      </w:r>
+      <w:r>
+        <w:t xml:space="preserve">replika node2 imala samo jednu nit primene, relay log je prestao da raste posle približno tri</w:t>
+      </w:r>
+      <w:r>
+        <w:t xml:space="preserve"> </w:t>
+      </w:r>
+      <w:r>
+        <w:t xml:space="preserve">sekunde, dok je kašnjenje primene nastavilo da raste i posle deset sekundi. Nit prijema je tada već</w:t>
+      </w:r>
+      <w:r>
+        <w:t xml:space="preserve"> </w:t>
+      </w:r>
+      <w:r>
+        <w:t xml:space="preserve">imala ceo nalet, a zaostajala je samo primena. Kašnjenje se, dakle, gomila iza relay loga, a ne u</w:t>
+      </w:r>
+      <w:r>
+        <w:t xml:space="preserve"> </w:t>
+      </w:r>
+      <w:r>
+        <w:t xml:space="preserve">mreži, i to je polazište sedmog poglavlja, koje se bavi merenjem kašnjenja i skaliranjem čitanja.</w:t>
+      </w:r>
+    </w:p>
+    <w:bookmarkEnd w:id="30"/>
+    <w:bookmarkStart w:id="31" w:name="asinhrona-potvrda"/>
+    <w:p>
+      <w:pPr>
+        <w:pStyle w:val="Heading2"/>
+      </w:pPr>
+      <w:r>
+        <w:t xml:space="preserve">Asinhrona potvrda</w:t>
+      </w:r>
+    </w:p>
+    <w:p>
+      <w:pPr>
+        <w:pStyle w:val="FirstParagraph"/>
+      </w:pPr>
+      <w:r>
+        <w:t xml:space="preserve">Ostaje pitanje kada klijent dobija potvrdu. Replikacija u MySQL-u je podrazumevano asinhrona</w:t>
+      </w:r>
+      <w:r>
+        <w:t xml:space="preserve"> </w:t>
+      </w:r>
+      <w:r>
+        <w:t xml:space="preserve">[11]</w:t>
+      </w:r>
+      <w:r>
+        <w:t xml:space="preserve">: izvor transakciju komituje i klijentu vraća potvrdu, a da nijedna replika ne mora</w:t>
+      </w:r>
+      <w:r>
+        <w:t xml:space="preserve"> </w:t>
+      </w:r>
+      <w:r>
+        <w:t xml:space="preserve">da je primi, dok je nit koja šalje log prenosi nezavisno od toga. Posledica se vidi na slici 3.1:</w:t>
+      </w:r>
+      <w:r>
+        <w:t xml:space="preserve"> </w:t>
+      </w:r>
+      <w:r>
+        <w:t xml:space="preserve">između potvrde klijentu i prijema na replici postoji prozor u kome komitovana transakcija postoji</w:t>
+      </w:r>
+      <w:r>
+        <w:t xml:space="preserve"> </w:t>
+      </w:r>
+      <w:r>
+        <w:t xml:space="preserve">samo na izvoru. Ako izvor u tom prozoru trajno otkaže, na primer zbog kvara diska, replike</w:t>
+      </w:r>
+      <w:r>
+        <w:t xml:space="preserve"> </w:t>
+      </w:r>
+      <w:r>
+        <w:t xml:space="preserve">transakciju nikada neće dobiti, jer događaje dobijaju isključivo od niti koja na izvoru šalje log, a</w:t>
+      </w:r>
+      <w:r>
+        <w:t xml:space="preserve"> </w:t>
+      </w:r>
+      <w:r>
+        <w:t xml:space="preserve">ne čitanjem njegovih datoteka. Klijent je, međutim, već dobio potvrdu za upis koji više ne postoji ni</w:t>
+      </w:r>
+      <w:r>
+        <w:t xml:space="preserve"> </w:t>
+      </w:r>
+      <w:r>
+        <w:t xml:space="preserve">na jednom čvoru. Postojanost iz prethodnih odeljaka tu ne pomaže, jer štiti transakciju samo na</w:t>
+      </w:r>
+      <w:r>
+        <w:t xml:space="preserve"> </w:t>
+      </w:r>
+      <w:r>
+        <w:t xml:space="preserve">disku izvora. Kada se jedna od replika zatim unapredi u izvor, sistem se vraća u stanje starije od</w:t>
+      </w:r>
+      <w:r>
+        <w:t xml:space="preserve"> </w:t>
+      </w:r>
+      <w:r>
+        <w:t xml:space="preserve">potvrđenog upisa, što je upravo ono što stroga konzistentnost iz drugog poglavlja zabranjuje.</w:t>
+      </w:r>
+    </w:p>
+    <w:p>
+      <w:pPr>
+        <w:pStyle w:val="BodyText"/>
+      </w:pPr>
+      <w:r>
+        <w:t xml:space="preserve">U terminima PACELC-a asinhrona replikacija na drugo pitanje odgovara bez zadrške: dok mreža radi,</w:t>
+      </w:r>
+      <w:r>
+        <w:t xml:space="preserve"> </w:t>
+      </w:r>
+      <w:r>
+        <w:t xml:space="preserve">komitovanje ne čeka druge čvorove, pa se bira latencija. Cenu plaćaju klijenti koji čitaju sa</w:t>
+      </w:r>
+      <w:r>
+        <w:t xml:space="preserve"> </w:t>
+      </w:r>
+      <w:r>
+        <w:t xml:space="preserve">replika, a pri otkazu izvora i sami potvrđeni upisi. Mehanizam pritom ostaje isti bez obzira na</w:t>
+      </w:r>
+      <w:r>
+        <w:t xml:space="preserve"> </w:t>
+      </w:r>
+      <w:r>
+        <w:t xml:space="preserve">podešavanja: izvor uvek isporučuje binarni log, a format zapisa i promenljive</w:t>
+      </w:r>
+      <w:r>
+        <w:t xml:space="preserve"> </w:t>
+      </w:r>
+      <w:r>
+        <w:rPr>
+          <w:rStyle w:val="VerbatimChar"/>
+        </w:rPr>
+        <w:t xml:space="preserve">sync_binlog</w:t>
+      </w:r>
+      <w:r>
+        <w:t xml:space="preserve"> </w:t>
+      </w:r>
+      <w:r>
+        <w:t xml:space="preserve">i</w:t>
+      </w:r>
+      <w:r>
+        <w:t xml:space="preserve"> </w:t>
+      </w:r>
+      <w:r>
+        <w:rPr>
+          <w:rStyle w:val="VerbatimChar"/>
+        </w:rPr>
+        <w:t xml:space="preserve">innodb_flush_log_at_trx_commit</w:t>
+      </w:r>
+      <w:r>
+        <w:t xml:space="preserve"> </w:t>
+      </w:r>
+      <w:r>
+        <w:t xml:space="preserve">određuju samo šta je u logu i koliko je on postojan na samom</w:t>
+      </w:r>
+      <w:r>
+        <w:t xml:space="preserve"> </w:t>
+      </w:r>
+      <w:r>
+        <w:t xml:space="preserve">izvoru. Ono što se menja nije log, već trenutak u kome pisac dobija potvrdu, a asinhrona replikacija</w:t>
+      </w:r>
+      <w:r>
+        <w:t xml:space="preserve"> </w:t>
+      </w:r>
+      <w:r>
+        <w:t xml:space="preserve">taj trenutak postavlja najranije što je moguće. Četvrto poglavlje ga pomera, uvodeći semisinhronu</w:t>
+      </w:r>
+      <w:r>
+        <w:t xml:space="preserve"> </w:t>
+      </w:r>
+      <w:r>
+        <w:t xml:space="preserve">replikaciju, u kojoj izvor pre potvrde čeka da bar jedna replika primi transakciju.</w:t>
+      </w:r>
+    </w:p>
+    <w:bookmarkEnd w:id="31"/>
+    <w:bookmarkEnd w:id="32"/>
+    <w:bookmarkStart w:id="62" w:name="bibliography"/>
+    <w:p>
+      <w:pPr>
+        <w:pStyle w:val="Heading1"/>
+      </w:pPr>
+      <w:r>
+        <w:t xml:space="preserve">Reference</w:t>
+      </w:r>
+    </w:p>
+    <w:bookmarkStart w:id="61" w:name="refs"/>
+    <w:bookmarkStart w:id="34" w:name="ref-lamport1978"/>
+    <w:p>
+      <w:pPr>
+        <w:pStyle w:val="Bibliography"/>
+      </w:pPr>
+      <w:r>
+        <w:t xml:space="preserve">[1]</w:t>
+      </w:r>
+      <w:r>
+        <w:t xml:space="preserve"> </w:t>
+      </w:r>
+      <w:r>
+        <w:t xml:space="preserve">	</w:t>
+      </w:r>
+      <w:r>
+        <w:t xml:space="preserve">L. Lamport,</w:t>
+      </w:r>
+      <w:r>
+        <w:t xml:space="preserve"> </w:t>
+      </w:r>
+      <w:r>
+        <w:t xml:space="preserve">“Time, clocks, and the ordering of events in a distributed system,”</w:t>
+      </w:r>
+      <w:r>
+        <w:t xml:space="preserve"> </w:t>
+      </w:r>
+      <w:r>
+        <w:rPr>
+          <w:i/>
+          <w:iCs/>
+        </w:rPr>
         <w:t xml:space="preserve">Communications of the ACM</w:t>
       </w:r>
       <w:r>
@@ -1618,7 +3644,7 @@
       <w:r>
         <w:t xml:space="preserve"> </w:t>
       </w:r>
-      <w:hyperlink r:id="rId19">
+      <w:hyperlink r:id="rId33">
         <w:r>
           <w:rPr>
             <w:rStyle w:val="Hyperlink"/>
@@ -1630,8 +3656,8 @@
         <w:t xml:space="preserve">.</w:t>
       </w:r>
     </w:p>
-    <w:bookmarkEnd w:id="20"/>
-    <w:bookmarkStart w:id="22" w:name="ref-gilbert2002"/>
+    <w:bookmarkEnd w:id="34"/>
+    <w:bookmarkStart w:id="36" w:name="ref-gilbert2002"/>
     <w:p>
       <w:pPr>
         <w:pStyle w:val="Bibliography"/>
@@ -1670,7 +3696,7 @@
       <w:r>
         <w:t xml:space="preserve"> </w:t>
       </w:r>
-      <w:hyperlink r:id="rId21">
+      <w:hyperlink r:id="rId35">
         <w:r>
           <w:rPr>
             <w:rStyle w:val="Hyperlink"/>
@@ -1682,8 +3708,8 @@
         <w:t xml:space="preserve">.</w:t>
       </w:r>
     </w:p>
-    <w:bookmarkEnd w:id="22"/>
-    <w:bookmarkStart w:id="24" w:name="ref-herlihy1990"/>
+    <w:bookmarkEnd w:id="36"/>
+    <w:bookmarkStart w:id="38" w:name="ref-herlihy1990"/>
     <w:p>
       <w:pPr>
         <w:pStyle w:val="Bibliography"/>
@@ -1722,7 +3748,7 @@
       <w:r>
         <w:t xml:space="preserve"> </w:t>
       </w:r>
-      <w:hyperlink r:id="rId23">
+      <w:hyperlink r:id="rId37">
         <w:r>
           <w:rPr>
             <w:rStyle w:val="Hyperlink"/>
@@ -1734,8 +3760,8 @@
         <w:t xml:space="preserve">.</w:t>
       </w:r>
     </w:p>
-    <w:bookmarkEnd w:id="24"/>
-    <w:bookmarkStart w:id="26" w:name="ref-vogels2008"/>
+    <w:bookmarkEnd w:id="38"/>
+    <w:bookmarkStart w:id="40" w:name="ref-vogels2008"/>
     <w:p>
       <w:pPr>
         <w:pStyle w:val="Bibliography"/>
@@ -1774,7 +3800,7 @@
       <w:r>
         <w:t xml:space="preserve"> </w:t>
       </w:r>
-      <w:hyperlink r:id="rId25">
+      <w:hyperlink r:id="rId39">
         <w:r>
           <w:rPr>
             <w:rStyle w:val="Hyperlink"/>
@@ -1786,8 +3812,8 @@
         <w:t xml:space="preserve">.</w:t>
       </w:r>
     </w:p>
-    <w:bookmarkEnd w:id="26"/>
-    <w:bookmarkStart w:id="28" w:name="ref-terry1994"/>
+    <w:bookmarkEnd w:id="40"/>
+    <w:bookmarkStart w:id="42" w:name="ref-terry1994"/>
     <w:p>
       <w:pPr>
         <w:pStyle w:val="Bibliography"/>
@@ -1832,7 +3858,7 @@
       <w:r>
         <w:t xml:space="preserve"> </w:t>
       </w:r>
-      <w:hyperlink r:id="rId27">
+      <w:hyperlink r:id="rId41">
         <w:r>
           <w:rPr>
             <w:rStyle w:val="Hyperlink"/>
@@ -1844,8 +3870,8 @@
         <w:t xml:space="preserve">.</w:t>
       </w:r>
     </w:p>
-    <w:bookmarkEnd w:id="28"/>
-    <w:bookmarkStart w:id="29" w:name="ref-brewer2000"/>
+    <w:bookmarkEnd w:id="42"/>
+    <w:bookmarkStart w:id="43" w:name="ref-brewer2000"/>
     <w:p>
       <w:pPr>
         <w:pStyle w:val="Bibliography"/>
@@ -1888,8 +3914,8 @@
         <w:t xml:space="preserve">, Jul. 2000.</w:t>
       </w:r>
     </w:p>
-    <w:bookmarkEnd w:id="29"/>
-    <w:bookmarkStart w:id="31" w:name="ref-brewer2012"/>
+    <w:bookmarkEnd w:id="43"/>
+    <w:bookmarkStart w:id="45" w:name="ref-brewer2012"/>
     <w:p>
       <w:pPr>
         <w:pStyle w:val="Bibliography"/>
@@ -1949,7 +3975,7 @@
       <w:r>
         <w:t xml:space="preserve"> </w:t>
       </w:r>
-      <w:hyperlink r:id="rId30">
+      <w:hyperlink r:id="rId44">
         <w:r>
           <w:rPr>
             <w:rStyle w:val="Hyperlink"/>
@@ -1961,8 +3987,8 @@
         <w:t xml:space="preserve">.</w:t>
       </w:r>
     </w:p>
-    <w:bookmarkEnd w:id="31"/>
-    <w:bookmarkStart w:id="33" w:name="ref-abadi2012"/>
+    <w:bookmarkEnd w:id="45"/>
+    <w:bookmarkStart w:id="47" w:name="ref-abadi2012"/>
     <w:p>
       <w:pPr>
         <w:pStyle w:val="Bibliography"/>
@@ -2013,7 +4039,7 @@
       <w:r>
         <w:t xml:space="preserve"> </w:t>
       </w:r>
-      <w:hyperlink r:id="rId32">
+      <w:hyperlink r:id="rId46">
         <w:r>
           <w:rPr>
             <w:rStyle w:val="Hyperlink"/>
@@ -2025,8 +4051,8 @@
         <w:t xml:space="preserve">.</w:t>
       </w:r>
     </w:p>
-    <w:bookmarkEnd w:id="33"/>
-    <w:bookmarkStart w:id="34" w:name="ref-kleppmann2017"/>
+    <w:bookmarkEnd w:id="47"/>
+    <w:bookmarkStart w:id="48" w:name="ref-kleppmann2017"/>
     <w:p>
       <w:pPr>
         <w:pStyle w:val="Bibliography"/>
@@ -2057,8 +4083,8 @@
         <w:t xml:space="preserve">. Sebastopol, CA, USA: O’Reilly Media, 2017.</w:t>
       </w:r>
     </w:p>
-    <w:bookmarkEnd w:id="34"/>
-    <w:bookmarkStart w:id="36" w:name="ref-decandia2007"/>
+    <w:bookmarkEnd w:id="48"/>
+    <w:bookmarkStart w:id="50" w:name="ref-decandia2007"/>
     <w:p>
       <w:pPr>
         <w:pStyle w:val="Bibliography"/>
@@ -2116,7 +4142,7 @@
       <w:r>
         <w:t xml:space="preserve"> </w:t>
       </w:r>
-      <w:hyperlink r:id="rId35">
+      <w:hyperlink r:id="rId49">
         <w:r>
           <w:rPr>
             <w:rStyle w:val="Hyperlink"/>
@@ -2128,8 +4154,8 @@
         <w:t xml:space="preserve">.</w:t>
       </w:r>
     </w:p>
-    <w:bookmarkEnd w:id="36"/>
-    <w:bookmarkStart w:id="38" w:name="ref-mysql84refman"/>
+    <w:bookmarkEnd w:id="50"/>
+    <w:bookmarkStart w:id="52" w:name="ref-mysql84refman"/>
     <w:p>
       <w:pPr>
         <w:pStyle w:val="Bibliography"/>
@@ -2164,7 +4190,7 @@
       <w:r>
         <w:t xml:space="preserve"> </w:t>
       </w:r>
-      <w:hyperlink r:id="rId37">
+      <w:hyperlink r:id="rId51">
         <w:r>
           <w:rPr>
             <w:rStyle w:val="Hyperlink"/>
@@ -2176,8 +4202,8 @@
         <w:t xml:space="preserve">, 2024.</w:t>
       </w:r>
     </w:p>
-    <w:bookmarkEnd w:id="38"/>
-    <w:bookmarkStart w:id="40" w:name="ref-mysqlshell84"/>
+    <w:bookmarkEnd w:id="52"/>
+    <w:bookmarkStart w:id="54" w:name="ref-mysqlshell84"/>
     <w:p>
       <w:pPr>
         <w:pStyle w:val="Bibliography"/>
@@ -2212,7 +4238,7 @@
       <w:r>
         <w:t xml:space="preserve"> </w:t>
       </w:r>
-      <w:hyperlink r:id="rId39">
+      <w:hyperlink r:id="rId53">
         <w:r>
           <w:rPr>
             <w:rStyle w:val="Hyperlink"/>
@@ -2224,8 +4250,8 @@
         <w:t xml:space="preserve">, 2024.</w:t>
       </w:r>
     </w:p>
-    <w:bookmarkEnd w:id="40"/>
-    <w:bookmarkStart w:id="41" w:name="ref-lamport2001"/>
+    <w:bookmarkEnd w:id="54"/>
+    <w:bookmarkStart w:id="55" w:name="ref-lamport2001"/>
     <w:p>
       <w:pPr>
         <w:pStyle w:val="Bibliography"/>
@@ -2262,8 +4288,8 @@
         <w:t xml:space="preserve">, vol. 32, no. 4, pp. 51–58, Dec. 2001.</w:t>
       </w:r>
     </w:p>
-    <w:bookmarkEnd w:id="41"/>
-    <w:bookmarkStart w:id="42" w:name="ref-ongaro2014"/>
+    <w:bookmarkEnd w:id="55"/>
+    <w:bookmarkStart w:id="56" w:name="ref-ongaro2014"/>
     <w:p>
       <w:pPr>
         <w:pStyle w:val="Bibliography"/>
@@ -2306,9 +4332,132 @@
         <w:t xml:space="preserve">, Philadelphia, PA, USA: USENIX Association, Jun. 2014, pp. 305–320.</w:t>
       </w:r>
     </w:p>
-    <w:bookmarkEnd w:id="42"/>
-    <w:bookmarkEnd w:id="43"/>
-    <w:bookmarkEnd w:id="44"/>
+    <w:bookmarkEnd w:id="56"/>
+    <w:bookmarkStart w:id="58" w:name="ref-gryp2020"/>
+    <w:p>
+      <w:pPr>
+        <w:pStyle w:val="Bibliography"/>
+      </w:pPr>
+      <w:r>
+        <w:t xml:space="preserve">[15]</w:t>
+      </w:r>
+      <w:r>
+        <w:t xml:space="preserve"> </w:t>
+      </w:r>
+      <w:r>
+        <w:t xml:space="preserve">	</w:t>
+      </w:r>
+      <w:r>
+        <w:t xml:space="preserve">K. Gryp,</w:t>
+      </w:r>
+      <w:r>
+        <w:t xml:space="preserve"> </w:t>
+      </w:r>
+      <w:r>
+        <w:t xml:space="preserve">“</w:t>
+      </w:r>
+      <w:r>
+        <w:t xml:space="preserve">MySQL</w:t>
+      </w:r>
+      <w:r>
+        <w:t xml:space="preserve"> </w:t>
+      </w:r>
+      <w:r>
+        <w:t xml:space="preserve">terminology updates.”</w:t>
+      </w:r>
+      <w:r>
+        <w:t xml:space="preserve"> </w:t>
+      </w:r>
+      <w:r>
+        <w:t xml:space="preserve">MySQL Blog Archive,</w:t>
+      </w:r>
+      <w:r>
+        <w:t xml:space="preserve"> </w:t>
+      </w:r>
+      <w:hyperlink r:id="rId57">
+        <w:r>
+          <w:rPr>
+            <w:rStyle w:val="Hyperlink"/>
+          </w:rPr>
+          <w:t xml:space="preserve">https://dev.mysql.com/blog-archive/mysql-terminology-updates/</w:t>
+        </w:r>
+      </w:hyperlink>
+      <w:r>
+        <w:t xml:space="preserve">, Jul. 2020.</w:t>
+      </w:r>
+    </w:p>
+    <w:bookmarkEnd w:id="58"/>
+    <w:bookmarkStart w:id="60" w:name="ref-mysql84relnotes"/>
+    <w:p>
+      <w:pPr>
+        <w:pStyle w:val="Bibliography"/>
+      </w:pPr>
+      <w:r>
+        <w:t xml:space="preserve">[16]</w:t>
+      </w:r>
+      <w:r>
+        <w:t xml:space="preserve"> </w:t>
+      </w:r>
+      <w:r>
+        <w:t xml:space="preserve">	</w:t>
+      </w:r>
+      <w:r>
+        <w:t xml:space="preserve">Oracle Corporation,</w:t>
+      </w:r>
+      <w:r>
+        <w:t xml:space="preserve"> </w:t>
+      </w:r>
+      <w:r>
+        <w:t xml:space="preserve">“Changes in</w:t>
+      </w:r>
+      <w:r>
+        <w:t xml:space="preserve"> </w:t>
+      </w:r>
+      <w:r>
+        <w:t xml:space="preserve">MySQL</w:t>
+      </w:r>
+      <w:r>
+        <w:t xml:space="preserve"> </w:t>
+      </w:r>
+      <w:r>
+        <w:t xml:space="preserve">8.4.0 (2024-04-30,</w:t>
+      </w:r>
+      <w:r>
+        <w:t xml:space="preserve"> </w:t>
+      </w:r>
+      <w:r>
+        <w:t xml:space="preserve">LTS</w:t>
+      </w:r>
+      <w:r>
+        <w:t xml:space="preserve"> </w:t>
+      </w:r>
+      <w:r>
+        <w:t xml:space="preserve">release).”</w:t>
+      </w:r>
+      <w:r>
+        <w:t xml:space="preserve"> </w:t>
+      </w:r>
+      <w:r>
+        <w:t xml:space="preserve">MySQL 8.4 Release Notes,</w:t>
+      </w:r>
+      <w:r>
+        <w:t xml:space="preserve"> </w:t>
+      </w:r>
+      <w:hyperlink r:id="rId59">
+        <w:r>
+          <w:rPr>
+            <w:rStyle w:val="Hyperlink"/>
+          </w:rPr>
+          <w:t xml:space="preserve">https://dev.mysql.com/doc/relnotes/mysql/8.4/en/news-8-4-0.html</w:t>
+        </w:r>
+      </w:hyperlink>
+      <w:r>
+        <w:t xml:space="preserve">, 2024.</w:t>
+      </w:r>
+    </w:p>
+    <w:bookmarkEnd w:id="60"/>
+    <w:bookmarkEnd w:id="61"/>
+    <w:bookmarkEnd w:id="62"/>
     <w:sectPr>
       <w:pgSz w:h="16838" w:w="11906"/>
       <w:pgMar w:bottom="1417" w:footer="708" w:gutter="0" w:header="708" w:left="1417" w:right="1417" w:top="1417"/>
@@ -2337,6 +4486,79 @@
     <w:p>
       <w:r>
         <w:separator/>
+      </w:r>
+    </w:p>
+  </w:footnote>
+  <w:footnote w:id="19">
+    <w:p>
+      <w:pPr>
+        <w:pStyle w:val="FootnoteText"/>
+      </w:pPr>
+      <w:r>
+        <w:rPr>
+          <w:rStyle w:val="FootnoteReference"/>
+        </w:rPr>
+        <w:footnoteRef/>
+      </w:r>
+      <w:r>
+        <w:t xml:space="preserve"> </w:t>
+      </w:r>
+      <w:r>
+        <w:t xml:space="preserve">Starija dokumentacija i veći deo literature ove uloge nazivaju master i slave. MySQL je</w:t>
+      </w:r>
+      <w:r>
+        <w:t xml:space="preserve"> </w:t>
+      </w:r>
+      <w:r>
+        <w:t xml:space="preserve">zamenu tih termina započeo 2020. godine</w:t>
+      </w:r>
+      <w:r>
+        <w:t xml:space="preserve"> </w:t>
+      </w:r>
+      <w:r>
+        <w:t xml:space="preserve">[15]</w:t>
+      </w:r>
+      <w:r>
+        <w:t xml:space="preserve">, a u verziji 8.4.0 uklonjene su i naredbe koje</w:t>
+      </w:r>
+      <w:r>
+        <w:t xml:space="preserve"> </w:t>
+      </w:r>
+      <w:r>
+        <w:t xml:space="preserve">su ih koristile, pa je, na primer, naredba</w:t>
+      </w:r>
+      <w:r>
+        <w:t xml:space="preserve"> </w:t>
+      </w:r>
+      <w:r>
+        <w:rPr>
+          <w:rStyle w:val="VerbatimChar"/>
+        </w:rPr>
+        <w:t xml:space="preserve">SHOW MASTER STATUS</w:t>
+      </w:r>
+      <w:r>
+        <w:t xml:space="preserve"> </w:t>
+      </w:r>
+      <w:r>
+        <w:t xml:space="preserve">zamenjena naredbom</w:t>
+      </w:r>
+      <w:r>
+        <w:t xml:space="preserve"> </w:t>
+      </w:r>
+      <w:r>
+        <w:rPr>
+          <w:rStyle w:val="VerbatimChar"/>
+        </w:rPr>
+        <w:t xml:space="preserve">SHOW BINARY LOG STATUS</w:t>
+      </w:r>
+      <w:r>
+        <w:t xml:space="preserve"> </w:t>
+      </w:r>
+      <w:r>
+        <w:t xml:space="preserve">[16]</w:t>
+      </w:r>
+      <w:r>
+        <w:t xml:space="preserve">. U ovom radu stari termini se dalje ne koriste.</w:t>
       </w:r>
     </w:p>
   </w:footnote>

</xml_diff>

<commit_message>
Tema 3: re-export rad.docx with bordered tables
</commit_message>
<xml_diff>
--- a/Tema 3. - Replikacija i distribuirana konzistentnost u MySQL/rad.docx
+++ b/Tema 3. - Replikacija i distribuirana konzistentnost u MySQL/rad.docx
@@ -4660,18 +4660,27 @@
     <w:qFormat/>
     <w:tblPr>
       <w:tblInd w:type="dxa" w:w="0"/>
+      <w:tblBorders>
+        <w:top w:val="single" w:sz="4" w:space="0" w:color="808080"/>
+        <w:left w:val="single" w:sz="4" w:space="0" w:color="808080"/>
+        <w:bottom w:val="single" w:sz="4" w:space="0" w:color="808080"/>
+        <w:right w:val="single" w:sz="4" w:space="0" w:color="808080"/>
+        <w:insideH w:val="single" w:sz="4" w:space="0" w:color="808080"/>
+        <w:insideV w:val="single" w:sz="4" w:space="0" w:color="808080"/>
+      </w:tblBorders>
       <w:tblCellMar>
-        <w:top w:type="dxa" w:w="0"/>
+        <w:top w:w="40" w:type="dxa"/>
         <w:left w:type="dxa" w:w="108"/>
-        <w:bottom w:type="dxa" w:w="0"/>
+        <w:bottom w:w="40" w:type="dxa"/>
         <w:right w:type="dxa" w:w="108"/>
       </w:tblCellMar>
     </w:tblPr>
     <w:tblStylePr w:type="firstRow">
+      <w:rPr>
+        <w:b/>
+      </w:rPr>
       <w:tcPr>
-        <w:tcBorders>
-          <w:bottom w:val="single"/>
-        </w:tcBorders>
+        <w:shd w:val="clear" w:color="auto" w:fill="EDEDED"/>
         <w:vAlign w:val="bottom"/>
       </w:tcPr>
     </w:tblStylePr>

</xml_diff>

<commit_message>
Tema 3: re-export rad.docx (plain title-page block, bordered tables)
</commit_message>
<xml_diff>
--- a/Tema 3. - Replikacija i distribuirana konzistentnost u MySQL/rad.docx
+++ b/Tema 3. - Replikacija i distribuirana konzistentnost u MySQL/rad.docx
@@ -132,6 +132,7 @@
     </w:p>
     <w:tbl>
       <w:tblPr>
+        <w:tblStyle w:val="LayoutTable"/>
         <w:tblW w:w="9360" w:type="dxa"/>
         <w:jc w:val="center"/>
         <w:tblBorders>
@@ -5060,6 +5061,15 @@
     <w:rPr>
       <w:shd w:val="clear" w:fill="f8f8f8"/>
     </w:rPr>
+  </w:style>
+  <w:style w:type="table" w:customStyle="1" w:styleId="LayoutTable">
+    <w:name w:val="Layout Table"/>
+    <w:tblPr>
+      <w:tblCellMar>
+        <w:left w:w="108" w:type="dxa"/>
+        <w:right w:w="108" w:type="dxa"/>
+      </w:tblCellMar>
+    </w:tblPr>
   </w:style>
 </w:styles>
 </file>

</xml_diff>

<commit_message>
Ticket 16 closed: chapter 4 (semisync) in rad.md, Slika 4.1, Tabela 4.1, 5.7.2 relnotes bib entry; measured 3.0 pp
</commit_message>
<xml_diff>
--- a/Tema 3. - Replikacija i distribuirana konzistentnost u MySQL/rad.docx
+++ b/Tema 3. - Replikacija i distribuirana konzistentnost u MySQL/rad.docx
@@ -3063,17 +3063,1365 @@
     </w:p>
     <w:bookmarkEnd w:id="40"/>
     <w:bookmarkEnd w:id="41"/>
-    <w:bookmarkStart w:id="71" w:name="bibliography"/>
+    <w:bookmarkStart w:id="49" w:name="X782b4738495dd902f8503bc4d8b959795d10b83"/>
     <w:p>
       <w:pPr>
         <w:pStyle w:val="Heading1"/>
       </w:pPr>
       <w:r>
+        <w:t xml:space="preserve">4. Semisinhrona replikacija i značenje potvrde</w:t>
+      </w:r>
+    </w:p>
+    <w:p>
+      <w:pPr>
+        <w:pStyle w:val="FirstParagraph"/>
+      </w:pPr>
+      <w:r>
+        <w:t xml:space="preserve">Semisinhrona replikacija pomera trenutak potvrde: pre nego što klijentu vrati odgovor, izvor čeka</w:t>
+      </w:r>
+      <w:r>
+        <w:t xml:space="preserve"> </w:t>
+      </w:r>
+      <w:r>
+        <w:t xml:space="preserve">da bar jedna replika potvrdi prijem transakcije</w:t>
+      </w:r>
+      <w:r>
+        <w:t xml:space="preserve"> </w:t>
+      </w:r>
+      <w:r>
+        <w:t xml:space="preserve">[11]</w:t>
+      </w:r>
+      <w:r>
+        <w:t xml:space="preserve">. Lako ju je pročitati kao</w:t>
+      </w:r>
+      <w:r>
+        <w:t xml:space="preserve"> </w:t>
+      </w:r>
+      <w:r>
+        <w:t xml:space="preserve">podešavanje brzine, a ovo poglavlje pokazuje da je reč o odluci o konzistentnosti, polazeći od</w:t>
+      </w:r>
+      <w:r>
+        <w:t xml:space="preserve"> </w:t>
+      </w:r>
+      <w:r>
+        <w:t xml:space="preserve">pitanja šta potvrda (acknowledgement) zapravo obećava. Replika potvrđuje prijem tek pošto događaje</w:t>
+      </w:r>
+      <w:r>
+        <w:t xml:space="preserve"> </w:t>
+      </w:r>
+      <w:r>
+        <w:t xml:space="preserve">upiše u relay log i sinhronizuje ga na disk</w:t>
+      </w:r>
+      <w:r>
+        <w:t xml:space="preserve"> </w:t>
+      </w:r>
+      <w:r>
+        <w:t xml:space="preserve">[11]</w:t>
+      </w:r>
+      <w:r>
+        <w:t xml:space="preserve">. Potvrda, dakle, znači da transakcija</w:t>
+      </w:r>
+      <w:r>
+        <w:t xml:space="preserve"> </w:t>
+      </w:r>
+      <w:r>
+        <w:t xml:space="preserve">postoji na disku još jednog čvora, a ne da ju je replika primenila, pa čitanje sa replike i posle</w:t>
+      </w:r>
+      <w:r>
+        <w:t xml:space="preserve"> </w:t>
+      </w:r>
+      <w:r>
+        <w:t xml:space="preserve">potvrde može da vrati staru vrednost.</w:t>
+      </w:r>
+    </w:p>
+    <w:p>
+      <w:pPr>
+        <w:pStyle w:val="BodyText"/>
+      </w:pPr>
+      <w:r>
+        <w:t xml:space="preserve">U verziji 8.4 semisinhronu replikaciju ostvaruju dva dodatka (plugin), jedan na izvoru i jedan na</w:t>
+      </w:r>
+      <w:r>
+        <w:t xml:space="preserve"> </w:t>
+      </w:r>
+      <w:r>
+        <w:t xml:space="preserve">replici, koji se instaliraju naredbom</w:t>
+      </w:r>
+      <w:r>
+        <w:t xml:space="preserve"> </w:t>
+      </w:r>
+      <w:r>
+        <w:rPr>
+          <w:rStyle w:val="VerbatimChar"/>
+        </w:rPr>
+        <w:t xml:space="preserve">INSTALL PLUGIN</w:t>
+      </w:r>
+      <w:r>
+        <w:t xml:space="preserve">; na Windowsu su to biblioteke</w:t>
+      </w:r>
+      <w:r>
+        <w:t xml:space="preserve"> </w:t>
+      </w:r>
+      <w:r>
+        <w:rPr>
+          <w:rStyle w:val="VerbatimChar"/>
+        </w:rPr>
+        <w:t xml:space="preserve">semisync_source.dll</w:t>
+      </w:r>
+      <w:r>
+        <w:t xml:space="preserve"> </w:t>
+      </w:r>
+      <w:r>
+        <w:t xml:space="preserve">i</w:t>
+      </w:r>
+      <w:r>
+        <w:t xml:space="preserve"> </w:t>
+      </w:r>
+      <w:r>
+        <w:rPr>
+          <w:rStyle w:val="VerbatimChar"/>
+        </w:rPr>
+        <w:t xml:space="preserve">semisync_replica.dll</w:t>
+      </w:r>
+      <w:r>
+        <w:t xml:space="preserve">, a na sistemima Unix odgovarajuće datoteke sa</w:t>
+      </w:r>
+      <w:r>
+        <w:t xml:space="preserve"> </w:t>
+      </w:r>
+      <w:r>
+        <w:t xml:space="preserve">nastavkom</w:t>
+      </w:r>
+      <w:r>
+        <w:t xml:space="preserve"> </w:t>
+      </w:r>
+      <w:r>
+        <w:rPr>
+          <w:rStyle w:val="VerbatimChar"/>
+        </w:rPr>
+        <w:t xml:space="preserve">.so</w:t>
+      </w:r>
+      <w:r>
+        <w:t xml:space="preserve">. Dodaci su podrazumevano isključeni i uključuju se promenljivama</w:t>
+      </w:r>
+      <w:r>
+        <w:t xml:space="preserve"> </w:t>
+      </w:r>
+      <w:r>
+        <w:rPr>
+          <w:rStyle w:val="VerbatimChar"/>
+        </w:rPr>
+        <w:t xml:space="preserve">rpl_semi_sync_source_enabled</w:t>
+      </w:r>
+      <w:r>
+        <w:t xml:space="preserve"> </w:t>
+      </w:r>
+      <w:r>
+        <w:t xml:space="preserve">i</w:t>
+      </w:r>
+      <w:r>
+        <w:t xml:space="preserve"> </w:t>
+      </w:r>
+      <w:r>
+        <w:rPr>
+          <w:rStyle w:val="VerbatimChar"/>
+        </w:rPr>
+        <w:t xml:space="preserve">rpl_semi_sync_replica_enabled</w:t>
+      </w:r>
+      <w:r>
+        <w:t xml:space="preserve">. Izvor podrazumevano čeka potvrdu jedne</w:t>
+      </w:r>
+      <w:r>
+        <w:t xml:space="preserve"> </w:t>
+      </w:r>
+      <w:r>
+        <w:t xml:space="preserve">replike</w:t>
+      </w:r>
+      <w:r>
+        <w:t xml:space="preserve"> </w:t>
+      </w:r>
+      <w:r>
+        <w:t xml:space="preserve">[11]</w:t>
+      </w:r>
+      <w:r>
+        <w:t xml:space="preserve">.</w:t>
+      </w:r>
+    </w:p>
+    <w:bookmarkStart w:id="45" w:name="tačka-čekanja-after_sync-i-after_commit"/>
+    <w:p>
+      <w:pPr>
+        <w:pStyle w:val="Heading2"/>
+      </w:pPr>
+      <w:r>
+        <w:t xml:space="preserve">Tačka čekanja: AFTER_SYNC i AFTER_COMMIT</w:t>
+      </w:r>
+    </w:p>
+    <w:p>
+      <w:pPr>
+        <w:pStyle w:val="FirstParagraph"/>
+      </w:pPr>
+      <w:r>
+        <w:t xml:space="preserve">Treće poglavlje pokazalo je da o ishodu transakcije odlučuje upis u binarni log. Šta drugi klijenti</w:t>
+      </w:r>
+      <w:r>
+        <w:t xml:space="preserve"> </w:t>
+      </w:r>
+      <w:r>
+        <w:t xml:space="preserve">vide, međutim, ne određuje binarni log, već komitovanje u InnoDB-u, koje u dvofaznom komitovanju</w:t>
+      </w:r>
+      <w:r>
+        <w:t xml:space="preserve"> </w:t>
+      </w:r>
+      <w:r>
+        <w:t xml:space="preserve">dolazi posle njega. Odluka i vidljivost su dva različita trenutka, pa izvor potvrdu može da čeka na</w:t>
+      </w:r>
+      <w:r>
+        <w:t xml:space="preserve"> </w:t>
+      </w:r>
+      <w:r>
+        <w:t xml:space="preserve">dva mesta, prikazana na slici 4.1. Tačku čekanja (wait point) bira promenljiva</w:t>
+      </w:r>
+      <w:r>
+        <w:t xml:space="preserve"> </w:t>
+      </w:r>
+      <w:r>
+        <w:rPr>
+          <w:rStyle w:val="VerbatimChar"/>
+        </w:rPr>
+        <w:t xml:space="preserve">rpl_semi_sync_source_wait_point</w:t>
+      </w:r>
+      <w:r>
+        <w:t xml:space="preserve">. Uz podrazumevanu vrednost</w:t>
+      </w:r>
+      <w:r>
+        <w:t xml:space="preserve"> </w:t>
+      </w:r>
+      <w:r>
+        <w:rPr>
+          <w:rStyle w:val="VerbatimChar"/>
+        </w:rPr>
+        <w:t xml:space="preserve">AFTER_SYNC</w:t>
+      </w:r>
+      <w:r>
+        <w:t xml:space="preserve"> </w:t>
+      </w:r>
+      <w:r>
+        <w:t xml:space="preserve">izvor čeka posle</w:t>
+      </w:r>
+      <w:r>
+        <w:t xml:space="preserve"> </w:t>
+      </w:r>
+      <w:r>
+        <w:t xml:space="preserve">sinhronizacije binarnog loga, a pre komitovanja u InnoDB-u, pa svi klijenti transakciju vide</w:t>
+      </w:r>
+      <w:r>
+        <w:t xml:space="preserve"> </w:t>
+      </w:r>
+      <w:r>
+        <w:t xml:space="preserve">istovremeno, tek pošto ju je replika potvrdila. Uz</w:t>
+      </w:r>
+      <w:r>
+        <w:t xml:space="preserve"> </w:t>
+      </w:r>
+      <w:r>
+        <w:rPr>
+          <w:rStyle w:val="VerbatimChar"/>
+        </w:rPr>
+        <w:t xml:space="preserve">AFTER_COMMIT</w:t>
+      </w:r>
+      <w:r>
+        <w:t xml:space="preserve"> </w:t>
+      </w:r>
+      <w:r>
+        <w:t xml:space="preserve">izvor čeka posle komitovanja u</w:t>
+      </w:r>
+      <w:r>
+        <w:t xml:space="preserve"> </w:t>
+      </w:r>
+      <w:r>
+        <w:t xml:space="preserve">InnoDB-u, pa drugi klijenti transakciju vide pre klijenta koji ju je upisao</w:t>
+      </w:r>
+      <w:r>
+        <w:t xml:space="preserve"> </w:t>
+      </w:r>
+      <w:r>
+        <w:t xml:space="preserve">[11]</w:t>
+      </w:r>
+      <w:r>
+        <w:t xml:space="preserve">. Verzije</w:t>
+      </w:r>
+      <w:r>
+        <w:t xml:space="preserve"> </w:t>
+      </w:r>
+      <w:r>
+        <w:t xml:space="preserve">starije od 5.7.2, u kojoj je izbor uveden, ponašale su se kao</w:t>
+      </w:r>
+      <w:r>
+        <w:t xml:space="preserve"> </w:t>
+      </w:r>
+      <w:r>
+        <w:rPr>
+          <w:rStyle w:val="VerbatimChar"/>
+        </w:rPr>
+        <w:t xml:space="preserve">AFTER_COMMIT</w:t>
+      </w:r>
+      <w:r>
+        <w:t xml:space="preserve"> </w:t>
+      </w:r>
+      <w:r>
+        <w:t xml:space="preserve">[17]</w:t>
+      </w:r>
+      <w:r>
+        <w:t xml:space="preserve">.</w:t>
+      </w:r>
+    </w:p>
+    <w:p>
+      <w:pPr>
+        <w:pStyle w:val="CaptionedFigure"/>
+      </w:pPr>
+      <w:r>
+        <w:drawing>
+          <wp:inline>
+            <wp:extent cx="5753100" cy="2098707"/>
+            <wp:effectExtent b="0" l="0" r="0" t="0"/>
+            <wp:docPr descr="Slika 4.1: Koraci komitovanja transakcije T na izvoru pri semisinhronoj replikaciji i dve tačke na kojima izvor može da čeka potvrdu replike. Aktivna je samo jedna, zavisno od vrednosti promenljive rpl_semi_sync_source_wait_point." title="" id="43" name="Picture"/>
+            <a:graphic>
+              <a:graphicData uri="http://schemas.openxmlformats.org/drawingml/2006/picture">
+                <pic:pic>
+                  <pic:nvPicPr>
+                    <pic:cNvPr descr="figures/04-semisync-01-tacke-cekanja.png" id="44" name="Picture"/>
+                    <pic:cNvPicPr>
+                      <a:picLocks noChangeArrowheads="1" noChangeAspect="1"/>
+                    </pic:cNvPicPr>
+                  </pic:nvPicPr>
+                  <pic:blipFill>
+                    <a:blip r:embed="rId42"/>
+                    <a:stretch>
+                      <a:fillRect/>
+                    </a:stretch>
+                  </pic:blipFill>
+                  <pic:spPr bwMode="auto">
+                    <a:xfrm>
+                      <a:off x="0" y="0"/>
+                      <a:ext cx="5753100" cy="2098707"/>
+                    </a:xfrm>
+                    <a:prstGeom prst="rect">
+                      <a:avLst/>
+                    </a:prstGeom>
+                    <a:noFill/>
+                    <a:ln w="9525">
+                      <a:noFill/>
+                      <a:headEnd/>
+                      <a:tailEnd/>
+                    </a:ln>
+                  </pic:spPr>
+                </pic:pic>
+              </a:graphicData>
+            </a:graphic>
+          </wp:inline>
+        </w:drawing>
+      </w:r>
+    </w:p>
+    <w:p>
+      <w:pPr>
+        <w:pStyle w:val="ImageCaption"/>
+      </w:pPr>
+      <w:r>
+        <w:t xml:space="preserve">Slika 4.1: Koraci komitovanja transakcije T na izvoru pri semisinhronoj replikaciji i dve tačke na kojima izvor može da čeka potvrdu replike. Aktivna je samo jedna, zavisno od vrednosti promenljive rpl_semi_sync_source_wait_point.</w:t>
+      </w:r>
+    </w:p>
+    <w:p>
+      <w:pPr>
+        <w:pStyle w:val="BodyText"/>
+      </w:pPr>
+      <w:r>
+        <w:t xml:space="preserve">Interval u kome drugi klijenti vide transakciju, a nijedna replika je nema, u ovom radu naziva se</w:t>
+      </w:r>
+      <w:r>
+        <w:t xml:space="preserve"> </w:t>
+      </w:r>
+      <w:r>
+        <w:t xml:space="preserve">prozor vidljivosti. Na jednom računaru on traje koliko povratno putovanje (round-trip time) do</w:t>
+      </w:r>
+      <w:r>
+        <w:t xml:space="preserve"> </w:t>
+      </w:r>
+      <w:r>
+        <w:t xml:space="preserve">replike, prekratak da bi se pouzdano izmerio, pa je u merenju veštački produžen: na obe replike</w:t>
+      </w:r>
+      <w:r>
+        <w:t xml:space="preserve"> </w:t>
+      </w:r>
+      <w:r>
+        <w:t xml:space="preserve">zaustavljena je nit prijema, tako da potvrda nije stizala, a istek vremena postavljen je na tri</w:t>
+      </w:r>
+      <w:r>
+        <w:t xml:space="preserve"> </w:t>
+      </w:r>
+      <w:r>
+        <w:t xml:space="preserve">sekunde. Druga sesija na izvoru proveravala je postojanje novog reda u razmacima kraćim od jedne</w:t>
+      </w:r>
+      <w:r>
+        <w:t xml:space="preserve"> </w:t>
+      </w:r>
+      <w:r>
+        <w:t xml:space="preserve">milisekunde. Uz</w:t>
+      </w:r>
+      <w:r>
+        <w:t xml:space="preserve"> </w:t>
+      </w:r>
+      <w:r>
+        <w:rPr>
+          <w:rStyle w:val="VerbatimChar"/>
+        </w:rPr>
+        <w:t xml:space="preserve">AFTER_SYNC</w:t>
+      </w:r>
+      <w:r>
+        <w:t xml:space="preserve"> </w:t>
+      </w:r>
+      <w:r>
+        <w:t xml:space="preserve">red je postao vidljiv u istom trenutku u kome je pisac dobio</w:t>
+      </w:r>
+      <w:r>
+        <w:t xml:space="preserve"> </w:t>
+      </w:r>
+      <w:r>
+        <w:t xml:space="preserve">potvrdu, pa prozora nije bilo. Uz</w:t>
+      </w:r>
+      <w:r>
+        <w:t xml:space="preserve"> </w:t>
+      </w:r>
+      <w:r>
+        <w:rPr>
+          <w:rStyle w:val="VerbatimChar"/>
+        </w:rPr>
+        <w:t xml:space="preserve">AFTER_COMMIT</w:t>
+      </w:r>
+      <w:r>
+        <w:t xml:space="preserve"> </w:t>
+      </w:r>
+      <w:r>
+        <w:t xml:space="preserve">druga sesija videla je red posle pet milisekundi,</w:t>
+      </w:r>
+      <w:r>
+        <w:t xml:space="preserve"> </w:t>
+      </w:r>
+      <w:r>
+        <w:t xml:space="preserve">tri sekunde pre pisca, dok ga nijedna replika nije imala.</w:t>
+      </w:r>
+    </w:p>
+    <w:bookmarkEnd w:id="45"/>
+    <w:bookmarkStart w:id="46" w:name="čitanje-koje-failover-poništava"/>
+    <w:p>
+      <w:pPr>
+        <w:pStyle w:val="Heading2"/>
+      </w:pPr>
+      <w:r>
+        <w:t xml:space="preserve">Čitanje koje failover poništava</w:t>
+      </w:r>
+    </w:p>
+    <w:p>
+      <w:pPr>
+        <w:pStyle w:val="FirstParagraph"/>
+      </w:pPr>
+      <w:r>
+        <w:t xml:space="preserve">Prozor postaje anomalija kada izvor u njemu otkaže. U drugom merenju, uz</w:t>
+      </w:r>
+      <w:r>
+        <w:t xml:space="preserve"> </w:t>
+      </w:r>
+      <w:r>
+        <w:rPr>
+          <w:rStyle w:val="VerbatimChar"/>
+        </w:rPr>
+        <w:t xml:space="preserve">AFTER_COMMIT</w:t>
+      </w:r>
+      <w:r>
+        <w:t xml:space="preserve">, druga</w:t>
+      </w:r>
+      <w:r>
+        <w:t xml:space="preserve"> </w:t>
+      </w:r>
+      <w:r>
+        <w:t xml:space="preserve">sesija pročitala je novi red dok je pisac još čekao potvrdu. Proces izvora zatim je prinudno</w:t>
+      </w:r>
+      <w:r>
+        <w:t xml:space="preserve"> </w:t>
+      </w:r>
+      <w:r>
+        <w:t xml:space="preserve">zaustavljen, a node2 unapređen u izvor. Pisac je dobio grešku o prekinutoj vezi, ali reda nema ni</w:t>
+      </w:r>
+      <w:r>
+        <w:t xml:space="preserve"> </w:t>
+      </w:r>
+      <w:r>
+        <w:t xml:space="preserve">na node2 ni na node3: klijent je pročitao podatak koji je sistem posle failovera izgubio. Anomaliju,</w:t>
+      </w:r>
+      <w:r>
+        <w:t xml:space="preserve"> </w:t>
+      </w:r>
+      <w:r>
+        <w:t xml:space="preserve">dakle, ne trpi pisac, već čitalac. Ona krši strogu konzistentnost, ali i znatno slabija monotona</w:t>
+      </w:r>
+      <w:r>
+        <w:t xml:space="preserve"> </w:t>
+      </w:r>
+      <w:r>
+        <w:t xml:space="preserve">čitanja, jer čitalac koji se posle failovera poveže na novi izvor vidi stanje starije od već</w:t>
+      </w:r>
+      <w:r>
+        <w:t xml:space="preserve"> </w:t>
+      </w:r>
+      <w:r>
+        <w:t xml:space="preserve">viđenog. Priručnik ovu mogućnost navodi izričito: uz</w:t>
+      </w:r>
+      <w:r>
+        <w:t xml:space="preserve"> </w:t>
+      </w:r>
+      <w:r>
+        <w:rPr>
+          <w:rStyle w:val="VerbatimChar"/>
+        </w:rPr>
+        <w:t xml:space="preserve">AFTER_COMMIT</w:t>
+      </w:r>
+      <w:r>
+        <w:t xml:space="preserve"> </w:t>
+      </w:r>
+      <w:r>
+        <w:t xml:space="preserve">klijenti mogu da uoče gubitak</w:t>
+      </w:r>
+      <w:r>
+        <w:t xml:space="preserve"> </w:t>
+      </w:r>
+      <w:r>
+        <w:t xml:space="preserve">podataka u odnosu na ono što su videli na izvoru</w:t>
+      </w:r>
+      <w:r>
+        <w:t xml:space="preserve"> </w:t>
+      </w:r>
+      <w:r>
+        <w:t xml:space="preserve">[11]</w:t>
+      </w:r>
+      <w:r>
+        <w:t xml:space="preserve">. Razlika između dve tačke čekanja</w:t>
+      </w:r>
+      <w:r>
+        <w:t xml:space="preserve"> </w:t>
+      </w:r>
+      <w:r>
+        <w:t xml:space="preserve">zato nije razlika u brzini, već u tome da li sistem sme da pokaže ono što ne može da sačuva.</w:t>
+      </w:r>
+    </w:p>
+    <w:p>
+      <w:pPr>
+        <w:pStyle w:val="BodyText"/>
+      </w:pPr>
+      <w:r>
+        <w:t xml:space="preserve">Failover je u trećem poglavlju definisan kao preuzimanje uloge izvora nakon otkaza, a njegova</w:t>
+      </w:r>
+      <w:r>
+        <w:t xml:space="preserve"> </w:t>
+      </w:r>
+      <w:r>
+        <w:t xml:space="preserve">suprotnost je switchover (planirana promena uloga). Pri switchoveru stari izvor je dostupan, pa se</w:t>
+      </w:r>
+      <w:r>
+        <w:t xml:space="preserve"> </w:t>
+      </w:r>
+      <w:r>
+        <w:t xml:space="preserve">pre promene usklađuje sa novim i postaje replika, dok failover unapređuje repliku bez usklađivanja</w:t>
+      </w:r>
+      <w:r>
+        <w:t xml:space="preserve"> </w:t>
+      </w:r>
+      <w:r>
+        <w:t xml:space="preserve">sa starim izvorom</w:t>
+      </w:r>
+      <w:r>
+        <w:t xml:space="preserve"> </w:t>
+      </w:r>
+      <w:r>
+        <w:t xml:space="preserve">[12]</w:t>
+      </w:r>
+      <w:r>
+        <w:t xml:space="preserve">. Zato priručnik propisuje da otkazali semisinhroni izvor ne treba</w:t>
+      </w:r>
+      <w:r>
+        <w:t xml:space="preserve"> </w:t>
+      </w:r>
+      <w:r>
+        <w:t xml:space="preserve">ponovo koristiti, već ga treba odbaciti, jer može da sadrži transakcije koje nijedna replika nije</w:t>
+      </w:r>
+      <w:r>
+        <w:t xml:space="preserve"> </w:t>
+      </w:r>
+      <w:r>
+        <w:t xml:space="preserve">potvrdila</w:t>
+      </w:r>
+      <w:r>
+        <w:t xml:space="preserve"> </w:t>
+      </w:r>
+      <w:r>
+        <w:t xml:space="preserve">[11]</w:t>
+      </w:r>
+      <w:r>
+        <w:t xml:space="preserve">.</w:t>
+      </w:r>
+    </w:p>
+    <w:p>
+      <w:pPr>
+        <w:pStyle w:val="BodyText"/>
+      </w:pPr>
+      <w:r>
+        <w:t xml:space="preserve">Merenje pokazuje da ovo važi i uz</w:t>
+      </w:r>
+      <w:r>
+        <w:t xml:space="preserve"> </w:t>
+      </w:r>
+      <w:r>
+        <w:rPr>
+          <w:rStyle w:val="VerbatimChar"/>
+        </w:rPr>
+        <w:t xml:space="preserve">AFTER_SYNC</w:t>
+      </w:r>
+      <w:r>
+        <w:t xml:space="preserve">. Ponovo pokrenut node1 imao je izgubljeni red pri</w:t>
+      </w:r>
+      <w:r>
+        <w:t xml:space="preserve"> </w:t>
+      </w:r>
+      <w:r>
+        <w:t xml:space="preserve">obe tačke čekanja. Uz</w:t>
+      </w:r>
+      <w:r>
+        <w:t xml:space="preserve"> </w:t>
+      </w:r>
+      <w:r>
+        <w:rPr>
+          <w:rStyle w:val="VerbatimChar"/>
+        </w:rPr>
+        <w:t xml:space="preserve">AFTER_SYNC</w:t>
+      </w:r>
+      <w:r>
+        <w:t xml:space="preserve"> </w:t>
+      </w:r>
+      <w:r>
+        <w:t xml:space="preserve">transakcija je u trenutku pada bila pripremljena i upisana u</w:t>
+      </w:r>
+      <w:r>
+        <w:t xml:space="preserve"> </w:t>
+      </w:r>
+      <w:r>
+        <w:t xml:space="preserve">binarni log, pa ju je oporavak, po pravilu dvofaznog komitovanja, komitovao, iako je nijedna</w:t>
+      </w:r>
+      <w:r>
+        <w:t xml:space="preserve"> </w:t>
+      </w:r>
+      <w:r>
+        <w:t xml:space="preserve">replika nije potvrdila niti ju je iko video. Stari izvor tako ima višak transakcija (errant</w:t>
+      </w:r>
+      <w:r>
+        <w:t xml:space="preserve"> </w:t>
+      </w:r>
+      <w:r>
+        <w:t xml:space="preserve">transactions), sa GTID-om koji novi izvor nema. Povezan zatim kao replika na node2 uz automatsko</w:t>
+      </w:r>
+      <w:r>
+        <w:t xml:space="preserve"> </w:t>
+      </w:r>
+      <w:r>
+        <w:t xml:space="preserve">pozicioniranje, node1 je pokrenuo obe niti bez ijedne greške, a kontrolni zbirovi tabele na dva</w:t>
+      </w:r>
+      <w:r>
+        <w:t xml:space="preserve"> </w:t>
+      </w:r>
+      <w:r>
+        <w:t xml:space="preserve">čvora su se razlikovali. MySQL odbija repliku koja ima više transakcija od izvora samo kada te</w:t>
+      </w:r>
+      <w:r>
+        <w:t xml:space="preserve"> </w:t>
+      </w:r>
+      <w:r>
+        <w:t xml:space="preserve">transakcije nose identifikator samog izvora</w:t>
+      </w:r>
+      <w:r>
+        <w:t xml:space="preserve"> </w:t>
+      </w:r>
+      <w:r>
+        <w:t xml:space="preserve">[11]</w:t>
+      </w:r>
+      <w:r>
+        <w:t xml:space="preserve">, a ovaj višak nosi identifikator</w:t>
+      </w:r>
+      <w:r>
+        <w:t xml:space="preserve"> </w:t>
+      </w:r>
+      <w:r>
+        <w:t xml:space="preserve">starog izvora, pa je razilaženje tiho. Višak nije moguće ni jednostavno proslediti novom izvoru:</w:t>
+      </w:r>
+      <w:r>
+        <w:t xml:space="preserve"> </w:t>
+      </w:r>
+      <w:r>
+        <w:t xml:space="preserve">dva čvora čiji su se logovi razišli postaju dva izvora upisa, odnosno multi-leader replikacija iz</w:t>
+      </w:r>
+      <w:r>
+        <w:t xml:space="preserve"> </w:t>
+      </w:r>
+      <w:r>
+        <w:t xml:space="preserve">drugog poglavlja, sa sukobom koji niko ne razrešava.</w:t>
+      </w:r>
+    </w:p>
+    <w:bookmarkEnd w:id="46"/>
+    <w:bookmarkStart w:id="47" w:name="istek-vremena-i-tiha-degradacija"/>
+    <w:p>
+      <w:pPr>
+        <w:pStyle w:val="Heading2"/>
+      </w:pPr>
+      <w:r>
+        <w:t xml:space="preserve">Istek vremena i tiha degradacija</w:t>
+      </w:r>
+    </w:p>
+    <w:p>
+      <w:pPr>
+        <w:pStyle w:val="FirstParagraph"/>
+      </w:pPr>
+      <w:r>
+        <w:t xml:space="preserve">Izvor ne čeka potvrdu neograničeno. Ako je nijedna replika ne pošalje u roku</w:t>
+      </w:r>
+      <w:r>
+        <w:t xml:space="preserve"> </w:t>
+      </w:r>
+      <w:r>
+        <w:rPr>
+          <w:rStyle w:val="VerbatimChar"/>
+        </w:rPr>
+        <w:t xml:space="preserve">rpl_semi_sync_source_timeout</w:t>
+      </w:r>
+      <w:r>
+        <w:t xml:space="preserve">, podrazumevano deset sekundi, izvor se vraća na asinhronu</w:t>
+      </w:r>
+      <w:r>
+        <w:t xml:space="preserve"> </w:t>
+      </w:r>
+      <w:r>
+        <w:t xml:space="preserve">replikaciju, a semisinhronoj se vraća tek kada ga neka replika sustigne</w:t>
+      </w:r>
+      <w:r>
+        <w:t xml:space="preserve"> </w:t>
+      </w:r>
+      <w:r>
+        <w:t xml:space="preserve">[11]</w:t>
+      </w:r>
+      <w:r>
+        <w:t xml:space="preserve">. Klijent</w:t>
+      </w:r>
+      <w:r>
+        <w:t xml:space="preserve"> </w:t>
+      </w:r>
+      <w:r>
+        <w:t xml:space="preserve">pri tome ne dobija grešku, već uobičajenu potvrdu. Na topologiji ovog rada, uz istek vremena od</w:t>
+      </w:r>
+      <w:r>
+        <w:t xml:space="preserve"> </w:t>
+      </w:r>
+      <w:r>
+        <w:t xml:space="preserve">jedne sekunde i zaustavljene niti prijema, prvo komitovanje čekalo je punu sekundu i uspelo, a već</w:t>
+      </w:r>
+      <w:r>
+        <w:t xml:space="preserve"> </w:t>
+      </w:r>
+      <w:r>
+        <w:t xml:space="preserve">drugo trajalo je manje od milisekunde, kao asinhrono. Tiha degradacija nije kvar, već podrazumevani</w:t>
+      </w:r>
+      <w:r>
+        <w:t xml:space="preserve"> </w:t>
+      </w:r>
+      <w:r>
+        <w:t xml:space="preserve">izbor: kada replike nisu dostupne, izvor bira dostupnost, a ne konzistentnost.</w:t>
+      </w:r>
+    </w:p>
+    <w:p>
+      <w:pPr>
+        <w:pStyle w:val="BodyText"/>
+      </w:pPr>
+      <w:r>
+        <w:t xml:space="preserve">Pošto klijent degradaciju ne vidi, uočavanje je posao operatera. U merenjima su je pokazali</w:t>
+      </w:r>
+      <w:r>
+        <w:t xml:space="preserve"> </w:t>
+      </w:r>
+      <w:r>
+        <w:t xml:space="preserve">sledeći znaci: promenljiva statusa</w:t>
+      </w:r>
+      <w:r>
+        <w:t xml:space="preserve"> </w:t>
+      </w:r>
+      <w:r>
+        <w:rPr>
+          <w:rStyle w:val="VerbatimChar"/>
+        </w:rPr>
+        <w:t xml:space="preserve">Rpl_semi_sync_source_status</w:t>
+      </w:r>
+      <w:r>
+        <w:t xml:space="preserve"> </w:t>
+      </w:r>
+      <w:r>
+        <w:t xml:space="preserve">prelazi sa</w:t>
+      </w:r>
+      <w:r>
+        <w:t xml:space="preserve"> </w:t>
+      </w:r>
+      <w:r>
+        <w:rPr>
+          <w:rStyle w:val="VerbatimChar"/>
+        </w:rPr>
+        <w:t xml:space="preserve">ON</w:t>
+      </w:r>
+      <w:r>
+        <w:t xml:space="preserve"> </w:t>
+      </w:r>
+      <w:r>
+        <w:t xml:space="preserve">na</w:t>
+      </w:r>
+      <w:r>
+        <w:t xml:space="preserve"> </w:t>
+      </w:r>
+      <w:r>
+        <w:rPr>
+          <w:rStyle w:val="VerbatimChar"/>
+        </w:rPr>
+        <w:t xml:space="preserve">OFF</w:t>
+      </w:r>
+      <w:r>
+        <w:t xml:space="preserve">;</w:t>
+      </w:r>
+      <w:r>
+        <w:t xml:space="preserve"> </w:t>
+      </w:r>
+      <w:r>
+        <w:t xml:space="preserve">rastu</w:t>
+      </w:r>
+      <w:r>
+        <w:t xml:space="preserve"> </w:t>
+      </w:r>
+      <w:r>
+        <w:rPr>
+          <w:rStyle w:val="VerbatimChar"/>
+        </w:rPr>
+        <w:t xml:space="preserve">Rpl_semi_sync_source_no_tx</w:t>
+      </w:r>
+      <w:r>
+        <w:t xml:space="preserve">, broj nepotvrđenih transakcija, i</w:t>
+      </w:r>
+      <w:r>
+        <w:t xml:space="preserve"> </w:t>
+      </w:r>
+      <w:r>
+        <w:rPr>
+          <w:rStyle w:val="VerbatimChar"/>
+        </w:rPr>
+        <w:t xml:space="preserve">Rpl_semi_sync_source_no_times</w:t>
+      </w:r>
+      <w:r>
+        <w:t xml:space="preserve">, broj isključivanja semisinhrone replikacije; brojač potvrđenih</w:t>
+      </w:r>
+      <w:r>
+        <w:t xml:space="preserve"> </w:t>
+      </w:r>
+      <w:r>
+        <w:t xml:space="preserve">transakcija</w:t>
+      </w:r>
+      <w:r>
+        <w:t xml:space="preserve"> </w:t>
+      </w:r>
+      <w:r>
+        <w:rPr>
+          <w:rStyle w:val="VerbatimChar"/>
+        </w:rPr>
+        <w:t xml:space="preserve">Rpl_semi_sync_source_yes_tx</w:t>
+      </w:r>
+      <w:r>
+        <w:t xml:space="preserve"> </w:t>
+      </w:r>
+      <w:r>
+        <w:t xml:space="preserve">prestaje da raste; u logu grešaka pojavljuje se</w:t>
+      </w:r>
+      <w:r>
+        <w:t xml:space="preserve"> </w:t>
+      </w:r>
+      <w:r>
+        <w:t xml:space="preserve">upozorenje MY-011153 o isteku vremena; a jedno komitovanje traje koliko ceo istek vremena. Broj</w:t>
+      </w:r>
+      <w:r>
+        <w:t xml:space="preserve"> </w:t>
+      </w:r>
+      <w:r>
+        <w:t xml:space="preserve">povezanih semisinhronih replika,</w:t>
+      </w:r>
+      <w:r>
+        <w:t xml:space="preserve"> </w:t>
+      </w:r>
+      <w:r>
+        <w:rPr>
+          <w:rStyle w:val="VerbatimChar"/>
+        </w:rPr>
+        <w:t xml:space="preserve">Rpl_semi_sync_source_clients</w:t>
+      </w:r>
+      <w:r>
+        <w:t xml:space="preserve">, nije pouzdan znak: u jednom</w:t>
+      </w:r>
+      <w:r>
+        <w:t xml:space="preserve"> </w:t>
+      </w:r>
+      <w:r>
+        <w:t xml:space="preserve">merenju pao je na nulu, a u drugom je ostao 2, iako su obe niti prijema bile zaustavljene.</w:t>
+      </w:r>
+    </w:p>
+    <w:bookmarkEnd w:id="47"/>
+    <w:bookmarkStart w:id="48" w:name="cena-potvrde"/>
+    <w:p>
+      <w:pPr>
+        <w:pStyle w:val="Heading2"/>
+      </w:pPr>
+      <w:r>
+        <w:t xml:space="preserve">Cena potvrde</w:t>
+      </w:r>
+    </w:p>
+    <w:p>
+      <w:pPr>
+        <w:pStyle w:val="FirstParagraph"/>
+      </w:pPr>
+      <w:r>
+        <w:t xml:space="preserve">Prema priručniku, semisinhrona replikacija komitovanje produžava najmanje za jedno povratno</w:t>
+      </w:r>
+      <w:r>
+        <w:t xml:space="preserve"> </w:t>
+      </w:r>
+      <w:r>
+        <w:t xml:space="preserve">putovanje do replike po protokolu TCP/IP</w:t>
+      </w:r>
+      <w:r>
+        <w:t xml:space="preserve"> </w:t>
+      </w:r>
+      <w:r>
+        <w:t xml:space="preserve">[11]</w:t>
+      </w:r>
+      <w:r>
+        <w:t xml:space="preserve">. Tabela 4.1 prikazuje prosečno trajanje</w:t>
+      </w:r>
+      <w:r>
+        <w:t xml:space="preserve"> </w:t>
+      </w:r>
+      <w:r>
+        <w:t xml:space="preserve">komitovanja za četiri kombinacije postojanosti iz tabele 3.1, bez semisinhrone replikacije i sa</w:t>
+      </w:r>
+      <w:r>
+        <w:t xml:space="preserve"> </w:t>
+      </w:r>
+      <w:r>
+        <w:t xml:space="preserve">njom. U prva tri reda razlika je mala i nema stalan smer, a ponovljena merenja za prvi red</w:t>
+      </w:r>
+      <w:r>
+        <w:t xml:space="preserve"> </w:t>
+      </w:r>
+      <w:r>
+        <w:t xml:space="preserve">pokazuju da je manja od njihovog rasipanja: povratno putovanje na jednom računaru kraće je od</w:t>
+      </w:r>
+      <w:r>
+        <w:t xml:space="preserve"> </w:t>
+      </w:r>
+      <w:r>
+        <w:t xml:space="preserve">sinhronizacija diska koje komitovanje ionako čeka. Tek kada se obe sinhronizacije isključe, cena</w:t>
+      </w:r>
+      <w:r>
+        <w:t xml:space="preserve"> </w:t>
+      </w:r>
+      <w:r>
+        <w:t xml:space="preserve">potvrde postaje vidljiva i trajanje komitovanja se udvostručuje. Sa rastojanjem između čvorova</w:t>
+      </w:r>
+      <w:r>
+        <w:t xml:space="preserve"> </w:t>
+      </w:r>
+      <w:r>
+        <w:t xml:space="preserve">raste i povratno putovanje, čemu se vraća šesto poglavlje.</w:t>
+      </w:r>
+    </w:p>
+    <w:p>
+      <w:pPr>
+        <w:pStyle w:val="TableCaption"/>
+      </w:pPr>
+      <w:r>
+        <w:t xml:space="preserve">Tabela 4.1: Prosečno trajanje komitovanja jednoredne transakcije na izvoru (node1), sa dve replike na istom računaru, MySQL 8.4.11. Svaka ćelija je prosek 300 komitovanja; prvi red je prosek tri naizmenično ponovljena para merenja.</w:t>
+      </w:r>
+    </w:p>
+    <w:tbl>
+      <w:tblPr>
+        <w:tblStyle w:val="Table"/>
+        <w:tblW w:type="pct" w:w="5000"/>
+        <w:tblLayout w:type="fixed"/>
+        <w:tblLook w:firstRow="1" w:lastRow="0" w:firstColumn="0" w:lastColumn="0" w:noHBand="0" w:noVBand="0" w:val="0020"/>
+        <w:tblCaption w:val="Tabela 4.1: Prosečno trajanje komitovanja jednoredne transakcije na izvoru (node1), sa dve replike na istom računaru, MySQL 8.4.11. Svaka ćelija je prosek 300 komitovanja; prvi red je prosek tri naizmenično ponovljena para merenja."/>
+      </w:tblPr>
+      <w:tblGrid>
+        <w:gridCol w:w="2200"/>
+        <w:gridCol w:w="2200"/>
+        <w:gridCol w:w="1760"/>
+        <w:gridCol w:w="1760"/>
+      </w:tblGrid>
+      <w:tr>
+        <w:trPr>
+          <w:tblHeader w:val="on"/>
+        </w:trPr>
+        <w:tc>
+          <w:tcPr/>
+          <w:p>
+            <w:pPr>
+              <w:pStyle w:val="Compact"/>
+              <w:jc w:val="center"/>
+            </w:pPr>
+            <w:r>
+              <w:rPr>
+                <w:rStyle w:val="VerbatimChar"/>
+              </w:rPr>
+              <w:t xml:space="preserve">sync_binlog</w:t>
+            </w:r>
+          </w:p>
+        </w:tc>
+        <w:tc>
+          <w:tcPr/>
+          <w:p>
+            <w:pPr>
+              <w:pStyle w:val="Compact"/>
+              <w:jc w:val="center"/>
+            </w:pPr>
+            <w:r>
+              <w:rPr>
+                <w:rStyle w:val="VerbatimChar"/>
+              </w:rPr>
+              <w:t xml:space="preserve">innodb_flush_log_at_trx_commit</w:t>
+            </w:r>
+          </w:p>
+        </w:tc>
+        <w:tc>
+          <w:tcPr/>
+          <w:p>
+            <w:pPr>
+              <w:pStyle w:val="Compact"/>
+              <w:jc w:val="right"/>
+            </w:pPr>
+            <w:r>
+              <w:t xml:space="preserve">Asinhrona (µs)</w:t>
+            </w:r>
+          </w:p>
+        </w:tc>
+        <w:tc>
+          <w:tcPr/>
+          <w:p>
+            <w:pPr>
+              <w:pStyle w:val="Compact"/>
+              <w:jc w:val="right"/>
+            </w:pPr>
+            <w:r>
+              <w:t xml:space="preserve">Semisinhrona,</w:t>
+            </w:r>
+            <w:r>
+              <w:t xml:space="preserve"> </w:t>
+            </w:r>
+            <w:r>
+              <w:rPr>
+                <w:rStyle w:val="VerbatimChar"/>
+              </w:rPr>
+              <w:t xml:space="preserve">AFTER_SYNC</w:t>
+            </w:r>
+            <w:r>
+              <w:t xml:space="preserve"> </w:t>
+            </w:r>
+            <w:r>
+              <w:t xml:space="preserve">(µs)</w:t>
+            </w:r>
+          </w:p>
+        </w:tc>
+      </w:tr>
+      <w:tr>
+        <w:tc>
+          <w:tcPr/>
+          <w:p>
+            <w:pPr>
+              <w:pStyle w:val="Compact"/>
+              <w:jc w:val="center"/>
+            </w:pPr>
+            <w:r>
+              <w:t xml:space="preserve">1</w:t>
+            </w:r>
+          </w:p>
+        </w:tc>
+        <w:tc>
+          <w:tcPr/>
+          <w:p>
+            <w:pPr>
+              <w:pStyle w:val="Compact"/>
+              <w:jc w:val="center"/>
+            </w:pPr>
+            <w:r>
+              <w:t xml:space="preserve">1</w:t>
+            </w:r>
+          </w:p>
+        </w:tc>
+        <w:tc>
+          <w:tcPr/>
+          <w:p>
+            <w:pPr>
+              <w:pStyle w:val="Compact"/>
+              <w:jc w:val="right"/>
+            </w:pPr>
+            <w:r>
+              <w:t xml:space="preserve">913</w:t>
+            </w:r>
+          </w:p>
+        </w:tc>
+        <w:tc>
+          <w:tcPr/>
+          <w:p>
+            <w:pPr>
+              <w:pStyle w:val="Compact"/>
+              <w:jc w:val="right"/>
+            </w:pPr>
+            <w:r>
+              <w:t xml:space="preserve">914</w:t>
+            </w:r>
+          </w:p>
+        </w:tc>
+      </w:tr>
+      <w:tr>
+        <w:tc>
+          <w:tcPr/>
+          <w:p>
+            <w:pPr>
+              <w:pStyle w:val="Compact"/>
+              <w:jc w:val="center"/>
+            </w:pPr>
+            <w:r>
+              <w:t xml:space="preserve">1</w:t>
+            </w:r>
+          </w:p>
+        </w:tc>
+        <w:tc>
+          <w:tcPr/>
+          <w:p>
+            <w:pPr>
+              <w:pStyle w:val="Compact"/>
+              <w:jc w:val="center"/>
+            </w:pPr>
+            <w:r>
+              <w:t xml:space="preserve">2</w:t>
+            </w:r>
+          </w:p>
+        </w:tc>
+        <w:tc>
+          <w:tcPr/>
+          <w:p>
+            <w:pPr>
+              <w:pStyle w:val="Compact"/>
+              <w:jc w:val="right"/>
+            </w:pPr>
+            <w:r>
+              <w:t xml:space="preserve">355</w:t>
+            </w:r>
+          </w:p>
+        </w:tc>
+        <w:tc>
+          <w:tcPr/>
+          <w:p>
+            <w:pPr>
+              <w:pStyle w:val="Compact"/>
+              <w:jc w:val="right"/>
+            </w:pPr>
+            <w:r>
+              <w:t xml:space="preserve">406</w:t>
+            </w:r>
+          </w:p>
+        </w:tc>
+      </w:tr>
+      <w:tr>
+        <w:tc>
+          <w:tcPr/>
+          <w:p>
+            <w:pPr>
+              <w:pStyle w:val="Compact"/>
+              <w:jc w:val="center"/>
+            </w:pPr>
+            <w:r>
+              <w:t xml:space="preserve">0</w:t>
+            </w:r>
+          </w:p>
+        </w:tc>
+        <w:tc>
+          <w:tcPr/>
+          <w:p>
+            <w:pPr>
+              <w:pStyle w:val="Compact"/>
+              <w:jc w:val="center"/>
+            </w:pPr>
+            <w:r>
+              <w:t xml:space="preserve">1</w:t>
+            </w:r>
+          </w:p>
+        </w:tc>
+        <w:tc>
+          <w:tcPr/>
+          <w:p>
+            <w:pPr>
+              <w:pStyle w:val="Compact"/>
+              <w:jc w:val="right"/>
+            </w:pPr>
+            <w:r>
+              <w:t xml:space="preserve">634</w:t>
+            </w:r>
+          </w:p>
+        </w:tc>
+        <w:tc>
+          <w:tcPr/>
+          <w:p>
+            <w:pPr>
+              <w:pStyle w:val="Compact"/>
+              <w:jc w:val="right"/>
+            </w:pPr>
+            <w:r>
+              <w:t xml:space="preserve">533</w:t>
+            </w:r>
+          </w:p>
+        </w:tc>
+      </w:tr>
+      <w:tr>
+        <w:tc>
+          <w:tcPr/>
+          <w:p>
+            <w:pPr>
+              <w:pStyle w:val="Compact"/>
+              <w:jc w:val="center"/>
+            </w:pPr>
+            <w:r>
+              <w:t xml:space="preserve">0</w:t>
+            </w:r>
+          </w:p>
+        </w:tc>
+        <w:tc>
+          <w:tcPr/>
+          <w:p>
+            <w:pPr>
+              <w:pStyle w:val="Compact"/>
+              <w:jc w:val="center"/>
+            </w:pPr>
+            <w:r>
+              <w:t xml:space="preserve">2</w:t>
+            </w:r>
+          </w:p>
+        </w:tc>
+        <w:tc>
+          <w:tcPr/>
+          <w:p>
+            <w:pPr>
+              <w:pStyle w:val="Compact"/>
+              <w:jc w:val="right"/>
+            </w:pPr>
+            <w:r>
+              <w:t xml:space="preserve">61</w:t>
+            </w:r>
+          </w:p>
+        </w:tc>
+        <w:tc>
+          <w:tcPr/>
+          <w:p>
+            <w:pPr>
+              <w:pStyle w:val="Compact"/>
+              <w:jc w:val="right"/>
+            </w:pPr>
+            <w:r>
+              <w:t xml:space="preserve">124</w:t>
+            </w:r>
+          </w:p>
+        </w:tc>
+      </w:tr>
+    </w:tbl>
+    <w:p>
+      <w:pPr>
+        <w:pStyle w:val="BodyText"/>
+      </w:pPr>
+      <w:r>
+        <w:t xml:space="preserve">Semisinhrona replikacija na drugo pitanje PACELC-a odgovara drugačije od asinhrone: komitovanje</w:t>
+      </w:r>
+      <w:r>
+        <w:t xml:space="preserve"> </w:t>
+      </w:r>
+      <w:r>
+        <w:t xml:space="preserve">čeka jedan drugi čvor. Garancija koju time dobija uža je, međutim, nego što naziv sugeriše.</w:t>
+      </w:r>
+      <w:r>
+        <w:t xml:space="preserve"> </w:t>
+      </w:r>
+      <w:r>
+        <w:t xml:space="preserve">Potvrda znači da je transakcija na disku jedne replike, a ne da je primenjena; važi samo dok ne</w:t>
+      </w:r>
+      <w:r>
+        <w:t xml:space="preserve"> </w:t>
+      </w:r>
+      <w:r>
+        <w:t xml:space="preserve">istekne vreme čekanja; uz</w:t>
+      </w:r>
+      <w:r>
+        <w:t xml:space="preserve"> </w:t>
+      </w:r>
+      <w:r>
+        <w:rPr>
+          <w:rStyle w:val="VerbatimChar"/>
+        </w:rPr>
+        <w:t xml:space="preserve">AFTER_COMMIT</w:t>
+      </w:r>
+      <w:r>
+        <w:t xml:space="preserve"> </w:t>
+      </w:r>
+      <w:r>
+        <w:t xml:space="preserve">ne sprečava čitanje koje failover poništava; i ni uz</w:t>
+      </w:r>
+      <w:r>
+        <w:t xml:space="preserve"> </w:t>
+      </w:r>
+      <w:r>
+        <w:t xml:space="preserve">jednu tačku čekanja ne čini otkazali izvor ponovo upotrebljivim. Tačku čekanja, broj potvrda i</w:t>
+      </w:r>
+      <w:r>
+        <w:t xml:space="preserve"> </w:t>
+      </w:r>
+      <w:r>
+        <w:t xml:space="preserve">istek vremena bira operater, a od tog izbora, i od toga da li prati znake degradacije, zavisi koju</w:t>
+      </w:r>
+      <w:r>
+        <w:t xml:space="preserve"> </w:t>
+      </w:r>
+      <w:r>
+        <w:t xml:space="preserve">konzistentnost sistem zaista pruža. Peto poglavlje prelazi na Group Replication, u kojoj komitovanje</w:t>
+      </w:r>
+      <w:r>
+        <w:t xml:space="preserve"> </w:t>
+      </w:r>
+      <w:r>
+        <w:t xml:space="preserve">znači da se o mestu transakcije u redosledu složila većina grupe.</w:t>
+      </w:r>
+    </w:p>
+    <w:bookmarkEnd w:id="48"/>
+    <w:bookmarkEnd w:id="49"/>
+    <w:bookmarkStart w:id="81" w:name="bibliography"/>
+    <w:p>
+      <w:pPr>
+        <w:pStyle w:val="Heading1"/>
+      </w:pPr>
+      <w:r>
         <w:t xml:space="preserve">Reference</w:t>
       </w:r>
     </w:p>
-    <w:bookmarkStart w:id="70" w:name="refs"/>
-    <w:bookmarkStart w:id="43" w:name="ref-lamport1978"/>
+    <w:bookmarkStart w:id="80" w:name="refs"/>
+    <w:bookmarkStart w:id="51" w:name="ref-lamport1978"/>
     <w:p>
       <w:pPr>
         <w:pStyle w:val="Bibliography"/>
@@ -3112,7 +4460,7 @@
       <w:r>
         <w:t xml:space="preserve"> </w:t>
       </w:r>
-      <w:hyperlink r:id="rId42">
+      <w:hyperlink r:id="rId50">
         <w:r>
           <w:rPr>
             <w:rStyle w:val="Hyperlink"/>
@@ -3124,8 +4472,8 @@
         <w:t xml:space="preserve">.</w:t>
       </w:r>
     </w:p>
-    <w:bookmarkEnd w:id="43"/>
-    <w:bookmarkStart w:id="45" w:name="ref-gilbert2002"/>
+    <w:bookmarkEnd w:id="51"/>
+    <w:bookmarkStart w:id="53" w:name="ref-gilbert2002"/>
     <w:p>
       <w:pPr>
         <w:pStyle w:val="Bibliography"/>
@@ -3164,7 +4512,7 @@
       <w:r>
         <w:t xml:space="preserve"> </w:t>
       </w:r>
-      <w:hyperlink r:id="rId44">
+      <w:hyperlink r:id="rId52">
         <w:r>
           <w:rPr>
             <w:rStyle w:val="Hyperlink"/>
@@ -3176,8 +4524,8 @@
         <w:t xml:space="preserve">.</w:t>
       </w:r>
     </w:p>
-    <w:bookmarkEnd w:id="45"/>
-    <w:bookmarkStart w:id="47" w:name="ref-herlihy1990"/>
+    <w:bookmarkEnd w:id="53"/>
+    <w:bookmarkStart w:id="55" w:name="ref-herlihy1990"/>
     <w:p>
       <w:pPr>
         <w:pStyle w:val="Bibliography"/>
@@ -3216,7 +4564,7 @@
       <w:r>
         <w:t xml:space="preserve"> </w:t>
       </w:r>
-      <w:hyperlink r:id="rId46">
+      <w:hyperlink r:id="rId54">
         <w:r>
           <w:rPr>
             <w:rStyle w:val="Hyperlink"/>
@@ -3228,8 +4576,8 @@
         <w:t xml:space="preserve">.</w:t>
       </w:r>
     </w:p>
-    <w:bookmarkEnd w:id="47"/>
-    <w:bookmarkStart w:id="49" w:name="ref-vogels2008"/>
+    <w:bookmarkEnd w:id="55"/>
+    <w:bookmarkStart w:id="57" w:name="ref-vogels2008"/>
     <w:p>
       <w:pPr>
         <w:pStyle w:val="Bibliography"/>
@@ -3268,7 +4616,7 @@
       <w:r>
         <w:t xml:space="preserve"> </w:t>
       </w:r>
-      <w:hyperlink r:id="rId48">
+      <w:hyperlink r:id="rId56">
         <w:r>
           <w:rPr>
             <w:rStyle w:val="Hyperlink"/>
@@ -3280,8 +4628,8 @@
         <w:t xml:space="preserve">.</w:t>
       </w:r>
     </w:p>
-    <w:bookmarkEnd w:id="49"/>
-    <w:bookmarkStart w:id="51" w:name="ref-terry1994"/>
+    <w:bookmarkEnd w:id="57"/>
+    <w:bookmarkStart w:id="59" w:name="ref-terry1994"/>
     <w:p>
       <w:pPr>
         <w:pStyle w:val="Bibliography"/>
@@ -3326,7 +4674,7 @@
       <w:r>
         <w:t xml:space="preserve"> </w:t>
       </w:r>
-      <w:hyperlink r:id="rId50">
+      <w:hyperlink r:id="rId58">
         <w:r>
           <w:rPr>
             <w:rStyle w:val="Hyperlink"/>
@@ -3338,8 +4686,8 @@
         <w:t xml:space="preserve">.</w:t>
       </w:r>
     </w:p>
-    <w:bookmarkEnd w:id="51"/>
-    <w:bookmarkStart w:id="52" w:name="ref-brewer2000"/>
+    <w:bookmarkEnd w:id="59"/>
+    <w:bookmarkStart w:id="60" w:name="ref-brewer2000"/>
     <w:p>
       <w:pPr>
         <w:pStyle w:val="Bibliography"/>
@@ -3382,8 +4730,8 @@
         <w:t xml:space="preserve">, Jul. 2000.</w:t>
       </w:r>
     </w:p>
-    <w:bookmarkEnd w:id="52"/>
-    <w:bookmarkStart w:id="54" w:name="ref-brewer2012"/>
+    <w:bookmarkEnd w:id="60"/>
+    <w:bookmarkStart w:id="62" w:name="ref-brewer2012"/>
     <w:p>
       <w:pPr>
         <w:pStyle w:val="Bibliography"/>
@@ -3443,7 +4791,7 @@
       <w:r>
         <w:t xml:space="preserve"> </w:t>
       </w:r>
-      <w:hyperlink r:id="rId53">
+      <w:hyperlink r:id="rId61">
         <w:r>
           <w:rPr>
             <w:rStyle w:val="Hyperlink"/>
@@ -3455,8 +4803,8 @@
         <w:t xml:space="preserve">.</w:t>
       </w:r>
     </w:p>
-    <w:bookmarkEnd w:id="54"/>
-    <w:bookmarkStart w:id="56" w:name="ref-abadi2012"/>
+    <w:bookmarkEnd w:id="62"/>
+    <w:bookmarkStart w:id="64" w:name="ref-abadi2012"/>
     <w:p>
       <w:pPr>
         <w:pStyle w:val="Bibliography"/>
@@ -3507,7 +4855,7 @@
       <w:r>
         <w:t xml:space="preserve"> </w:t>
       </w:r>
-      <w:hyperlink r:id="rId55">
+      <w:hyperlink r:id="rId63">
         <w:r>
           <w:rPr>
             <w:rStyle w:val="Hyperlink"/>
@@ -3519,8 +4867,8 @@
         <w:t xml:space="preserve">.</w:t>
       </w:r>
     </w:p>
-    <w:bookmarkEnd w:id="56"/>
-    <w:bookmarkStart w:id="57" w:name="ref-kleppmann2017"/>
+    <w:bookmarkEnd w:id="64"/>
+    <w:bookmarkStart w:id="65" w:name="ref-kleppmann2017"/>
     <w:p>
       <w:pPr>
         <w:pStyle w:val="Bibliography"/>
@@ -3551,8 +4899,8 @@
         <w:t xml:space="preserve">. Sebastopol, CA, USA: O’Reilly Media, 2017.</w:t>
       </w:r>
     </w:p>
-    <w:bookmarkEnd w:id="57"/>
-    <w:bookmarkStart w:id="59" w:name="ref-decandia2007"/>
+    <w:bookmarkEnd w:id="65"/>
+    <w:bookmarkStart w:id="67" w:name="ref-decandia2007"/>
     <w:p>
       <w:pPr>
         <w:pStyle w:val="Bibliography"/>
@@ -3610,7 +4958,7 @@
       <w:r>
         <w:t xml:space="preserve"> </w:t>
       </w:r>
-      <w:hyperlink r:id="rId58">
+      <w:hyperlink r:id="rId66">
         <w:r>
           <w:rPr>
             <w:rStyle w:val="Hyperlink"/>
@@ -3622,8 +4970,8 @@
         <w:t xml:space="preserve">.</w:t>
       </w:r>
     </w:p>
-    <w:bookmarkEnd w:id="59"/>
-    <w:bookmarkStart w:id="61" w:name="ref-mysql84refman"/>
+    <w:bookmarkEnd w:id="67"/>
+    <w:bookmarkStart w:id="69" w:name="ref-mysql84refman"/>
     <w:p>
       <w:pPr>
         <w:pStyle w:val="Bibliography"/>
@@ -3658,7 +5006,7 @@
       <w:r>
         <w:t xml:space="preserve"> </w:t>
       </w:r>
-      <w:hyperlink r:id="rId60">
+      <w:hyperlink r:id="rId68">
         <w:r>
           <w:rPr>
             <w:rStyle w:val="Hyperlink"/>
@@ -3670,8 +5018,8 @@
         <w:t xml:space="preserve">, 2024.</w:t>
       </w:r>
     </w:p>
-    <w:bookmarkEnd w:id="61"/>
-    <w:bookmarkStart w:id="63" w:name="ref-mysqlshell84"/>
+    <w:bookmarkEnd w:id="69"/>
+    <w:bookmarkStart w:id="71" w:name="ref-mysqlshell84"/>
     <w:p>
       <w:pPr>
         <w:pStyle w:val="Bibliography"/>
@@ -3706,7 +5054,7 @@
       <w:r>
         <w:t xml:space="preserve"> </w:t>
       </w:r>
-      <w:hyperlink r:id="rId62">
+      <w:hyperlink r:id="rId70">
         <w:r>
           <w:rPr>
             <w:rStyle w:val="Hyperlink"/>
@@ -3718,8 +5066,8 @@
         <w:t xml:space="preserve">, 2024.</w:t>
       </w:r>
     </w:p>
-    <w:bookmarkEnd w:id="63"/>
-    <w:bookmarkStart w:id="64" w:name="ref-lamport2001"/>
+    <w:bookmarkEnd w:id="71"/>
+    <w:bookmarkStart w:id="72" w:name="ref-lamport2001"/>
     <w:p>
       <w:pPr>
         <w:pStyle w:val="Bibliography"/>
@@ -3756,8 +5104,8 @@
         <w:t xml:space="preserve">, vol. 32, no. 4, pp. 51–58, Dec. 2001.</w:t>
       </w:r>
     </w:p>
-    <w:bookmarkEnd w:id="64"/>
-    <w:bookmarkStart w:id="65" w:name="ref-ongaro2014"/>
+    <w:bookmarkEnd w:id="72"/>
+    <w:bookmarkStart w:id="73" w:name="ref-ongaro2014"/>
     <w:p>
       <w:pPr>
         <w:pStyle w:val="Bibliography"/>
@@ -3800,8 +5148,8 @@
         <w:t xml:space="preserve">, Philadelphia, PA, USA: USENIX Association, Jun. 2014, pp. 305–320.</w:t>
       </w:r>
     </w:p>
-    <w:bookmarkEnd w:id="65"/>
-    <w:bookmarkStart w:id="67" w:name="ref-gryp2020"/>
+    <w:bookmarkEnd w:id="73"/>
+    <w:bookmarkStart w:id="75" w:name="ref-gryp2020"/>
     <w:p>
       <w:pPr>
         <w:pStyle w:val="Bibliography"/>
@@ -3842,7 +5190,7 @@
       <w:r>
         <w:t xml:space="preserve"> </w:t>
       </w:r>
-      <w:hyperlink r:id="rId66">
+      <w:hyperlink r:id="rId74">
         <w:r>
           <w:rPr>
             <w:rStyle w:val="Hyperlink"/>
@@ -3854,8 +5202,8 @@
         <w:t xml:space="preserve">, Jul. 2020.</w:t>
       </w:r>
     </w:p>
-    <w:bookmarkEnd w:id="67"/>
-    <w:bookmarkStart w:id="69" w:name="ref-mysql84relnotes"/>
+    <w:bookmarkEnd w:id="75"/>
+    <w:bookmarkStart w:id="77" w:name="ref-mysql84relnotes"/>
     <w:p>
       <w:pPr>
         <w:pStyle w:val="Bibliography"/>
@@ -3911,7 +5259,7 @@
       <w:r>
         <w:t xml:space="preserve"> </w:t>
       </w:r>
-      <w:hyperlink r:id="rId68">
+      <w:hyperlink r:id="rId76">
         <w:r>
           <w:rPr>
             <w:rStyle w:val="Hyperlink"/>
@@ -3923,9 +5271,66 @@
         <w:t xml:space="preserve">, 2024.</w:t>
       </w:r>
     </w:p>
-    <w:bookmarkEnd w:id="69"/>
-    <w:bookmarkEnd w:id="70"/>
-    <w:bookmarkEnd w:id="71"/>
+    <w:bookmarkEnd w:id="77"/>
+    <w:bookmarkStart w:id="79" w:name="ref-mysql572relnotes"/>
+    <w:p>
+      <w:pPr>
+        <w:pStyle w:val="Bibliography"/>
+      </w:pPr>
+      <w:r>
+        <w:t xml:space="preserve">[17]</w:t>
+      </w:r>
+      <w:r>
+        <w:t xml:space="preserve"> </w:t>
+      </w:r>
+      <w:r>
+        <w:t xml:space="preserve">	</w:t>
+      </w:r>
+      <w:r>
+        <w:t xml:space="preserve">Oracle Corporation,</w:t>
+      </w:r>
+      <w:r>
+        <w:t xml:space="preserve"> </w:t>
+      </w:r>
+      <w:r>
+        <w:t xml:space="preserve">“Changes in</w:t>
+      </w:r>
+      <w:r>
+        <w:t xml:space="preserve"> </w:t>
+      </w:r>
+      <w:r>
+        <w:t xml:space="preserve">MySQL</w:t>
+      </w:r>
+      <w:r>
+        <w:t xml:space="preserve"> </w:t>
+      </w:r>
+      <w:r>
+        <w:t xml:space="preserve">5.7.2.”</w:t>
+      </w:r>
+      <w:r>
+        <w:t xml:space="preserve"> </w:t>
+      </w:r>
+      <w:r>
+        <w:t xml:space="preserve">MySQL 5.7 Release Notes,</w:t>
+      </w:r>
+      <w:r>
+        <w:t xml:space="preserve"> </w:t>
+      </w:r>
+      <w:hyperlink r:id="rId78">
+        <w:r>
+          <w:rPr>
+            <w:rStyle w:val="Hyperlink"/>
+          </w:rPr>
+          <w:t xml:space="preserve">https://dev.mysql.com/doc/relnotes/mysql/5.7/en/news-5-7-2.html</w:t>
+        </w:r>
+      </w:hyperlink>
+      <w:r>
+        <w:t xml:space="preserve">, 2013.</w:t>
+      </w:r>
+    </w:p>
+    <w:bookmarkEnd w:id="79"/>
+    <w:bookmarkEnd w:id="80"/>
+    <w:bookmarkEnd w:id="81"/>
     <w:sectPr>
       <w:pgSz w:h="16838" w:w="11906"/>
       <w:pgMar w:bottom="1417" w:footer="708" w:gutter="0" w:header="708" w:left="1417" w:right="1417" w:top="1417"/>

</xml_diff>

<commit_message>
Ticket 17 closed: chapter 5 (Group Replication) in rad.md, Slika 5.1, Tabele 5.1-5.2; measured ~4.4 pp
</commit_message>
<xml_diff>
--- a/Tema 3. - Replikacija i distribuirana konzistentnost u MySQL/rad.docx
+++ b/Tema 3. - Replikacija i distribuirana konzistentnost u MySQL/rad.docx
@@ -4411,17 +4411,1954 @@
     </w:p>
     <w:bookmarkEnd w:id="48"/>
     <w:bookmarkEnd w:id="49"/>
-    <w:bookmarkStart w:id="81" w:name="bibliography"/>
+    <w:bookmarkStart w:id="57" w:name="X5decc4196fd749ecf9c0d33d03e9c5be35bbd39"/>
     <w:p>
       <w:pPr>
         <w:pStyle w:val="Heading1"/>
       </w:pPr>
       <w:r>
+        <w:t xml:space="preserve">5. Group Replication: kvorum, certification i multi-primary</w:t>
+      </w:r>
+    </w:p>
+    <w:p>
+      <w:pPr>
+        <w:pStyle w:val="FirstParagraph"/>
+      </w:pPr>
+      <w:r>
+        <w:t xml:space="preserve">Na jednom serveru redosled sukobljenih upisa određuje zaključavanje reda: od dve transakcije koje</w:t>
+      </w:r>
+      <w:r>
+        <w:t xml:space="preserve"> </w:t>
+      </w:r>
+      <w:r>
+        <w:t xml:space="preserve">menjaju isti red, druga čeka prvu, pa redosled postoji pre nego što ijedna dobije potvrdu. Kada</w:t>
+      </w:r>
+      <w:r>
+        <w:t xml:space="preserve"> </w:t>
+      </w:r>
+      <w:r>
+        <w:t xml:space="preserve">upise primaju dva čvora koji odlučuju nezavisno, oba mogu da potvrde upis u isti red, a kopije</w:t>
+      </w:r>
+      <w:r>
+        <w:t xml:space="preserve"> </w:t>
+      </w:r>
+      <w:r>
+        <w:t xml:space="preserve">podataka se razilaze; to je sukob multi-leader replikacije iz drugog poglavlja. Group Replication</w:t>
+      </w:r>
+      <w:r>
+        <w:t xml:space="preserve"> </w:t>
+      </w:r>
+      <w:r>
+        <w:t xml:space="preserve">ovaj problem rešava tako što se čvorovi grupe dogovore o redosledu pre nego što klijent dobije</w:t>
+      </w:r>
+      <w:r>
+        <w:t xml:space="preserve"> </w:t>
+      </w:r>
+      <w:r>
+        <w:t xml:space="preserve">potvrdu. Članovi grupe poruke razmenjuju preko sistema za grupnu komunikaciju XCom, varijante</w:t>
+      </w:r>
+      <w:r>
+        <w:t xml:space="preserve"> </w:t>
+      </w:r>
+      <w:r>
+        <w:t xml:space="preserve">algoritma Paxos, koji svim članovima isporučuje sve poruke istim redosledom</w:t>
+      </w:r>
+      <w:r>
+        <w:t xml:space="preserve"> </w:t>
+      </w:r>
+      <w:r>
+        <w:t xml:space="preserve">[11]</w:t>
+      </w:r>
+      <w:r>
+        <w:t xml:space="preserve">. Taj</w:t>
+      </w:r>
+      <w:r>
+        <w:t xml:space="preserve"> </w:t>
+      </w:r>
+      <w:r>
+        <w:t xml:space="preserve">redosled se u ovom radu naziva zajednički niz (total order). Na topologiji ovog rada grupa od tri</w:t>
+      </w:r>
+      <w:r>
+        <w:t xml:space="preserve"> </w:t>
+      </w:r>
+      <w:r>
+        <w:t xml:space="preserve">člana podignuta je pomoću alata MySQL Shell, kao InnoDB Cluster, čiju osnovu čini Group Replication</w:t>
+      </w:r>
+      <w:r>
+        <w:t xml:space="preserve"> </w:t>
+      </w:r>
+      <w:r>
+        <w:t xml:space="preserve">[12]</w:t>
+      </w:r>
+      <w:r>
+        <w:t xml:space="preserve">.</w:t>
+      </w:r>
+    </w:p>
+    <w:bookmarkStart w:id="53" w:name="certification-jedan-niz-ista-presuda"/>
+    <w:p>
+      <w:pPr>
+        <w:pStyle w:val="Heading2"/>
+      </w:pPr>
+      <w:r>
+        <w:t xml:space="preserve">Certification: jedan niz, ista presuda</w:t>
+      </w:r>
+    </w:p>
+    <w:p>
+      <w:pPr>
+        <w:pStyle w:val="FirstParagraph"/>
+      </w:pPr>
+      <w:r>
+        <w:t xml:space="preserve">Transakcija se najpre izvršava lokalno, na članu koji ju je primio, bez koordinacije sa ostalim</w:t>
+      </w:r>
+      <w:r>
+        <w:t xml:space="preserve"> </w:t>
+      </w:r>
+      <w:r>
+        <w:t xml:space="preserve">članovima. Tek pri komitovanju član grupi šalje izmenjene redove i skup upisa (write-set), odnosno</w:t>
+      </w:r>
+      <w:r>
+        <w:t xml:space="preserve"> </w:t>
+      </w:r>
+      <w:r>
+        <w:t xml:space="preserve">jedinstvene identifikatore redova koje je transakcija izmenila</w:t>
+      </w:r>
+      <w:r>
+        <w:t xml:space="preserve"> </w:t>
+      </w:r>
+      <w:r>
+        <w:t xml:space="preserve">[11]</w:t>
+      </w:r>
+      <w:r>
+        <w:t xml:space="preserve">. Zajednički niz</w:t>
+      </w:r>
+      <w:r>
+        <w:t xml:space="preserve"> </w:t>
+      </w:r>
+      <w:r>
+        <w:t xml:space="preserve">zatim svakom članu isporučuje transakcije istim redosledom, a svaki član za sebe proverava da li</w:t>
+      </w:r>
+      <w:r>
+        <w:t xml:space="preserve"> </w:t>
+      </w:r>
+      <w:r>
+        <w:t xml:space="preserve">transakcija menja red koji je već izmenila neka transakcija ispred nje u nizu, a koju ona nije</w:t>
+      </w:r>
+      <w:r>
+        <w:t xml:space="preserve"> </w:t>
+      </w:r>
+      <w:r>
+        <w:t xml:space="preserve">videla. Taj korak MySQL naziva certification (provera saglasnosti transakcija). Kod sukoba</w:t>
+      </w:r>
+      <w:r>
+        <w:t xml:space="preserve"> </w:t>
+      </w:r>
+      <w:r>
+        <w:t xml:space="preserve">komituje transakcija koja je u nizu prva, a druga se odbacuje na svim članovima; priručnik ovo</w:t>
+      </w:r>
+      <w:r>
+        <w:t xml:space="preserve"> </w:t>
+      </w:r>
+      <w:r>
+        <w:t xml:space="preserve">naziva distribuiranim pravilom first commit wins</w:t>
+      </w:r>
+      <w:r>
+        <w:t xml:space="preserve"> </w:t>
+      </w:r>
+      <w:r>
+        <w:t xml:space="preserve">[11]</w:t>
+      </w:r>
+      <w:r>
+        <w:t xml:space="preserve">, koje se u ovom radu prevodi kao</w:t>
+      </w:r>
+      <w:r>
+        <w:t xml:space="preserve"> </w:t>
+      </w:r>
+      <w:r>
+        <w:t xml:space="preserve">prvi po redosledu pobeđuje. „Prvi“ pri tome znači prvi u nizu, a ne prvi po satu nekog čvora.</w:t>
+      </w:r>
+      <w:r>
+        <w:t xml:space="preserve"> </w:t>
+      </w:r>
+      <w:r>
+        <w:t xml:space="preserve">Glasanja nema: svi članovi vide isti niz i iste podatke, pa samostalno donose istu presudu, kao na</w:t>
+      </w:r>
+      <w:r>
+        <w:t xml:space="preserve"> </w:t>
+      </w:r>
+      <w:r>
+        <w:t xml:space="preserve">slici 5.1.</w:t>
+      </w:r>
+    </w:p>
+    <w:p>
+      <w:pPr>
+        <w:pStyle w:val="CaptionedFigure"/>
+      </w:pPr>
+      <w:r>
+        <w:drawing>
+          <wp:inline>
+            <wp:extent cx="5753100" cy="3441586"/>
+            <wp:effectExtent b="0" l="0" r="0" t="0"/>
+            <wp:docPr descr="Slika 5.1: Certification dve sukobljene transakcije. Obe menjaju isti red, zajednički niz ih svim članovima isporučuje istim redosledom, pa svaki član samostalno komituje T_B i odbacuje T_A. Klijent A dobija grešku, a klijent B potvrdu." title="" id="51" name="Picture"/>
+            <a:graphic>
+              <a:graphicData uri="http://schemas.openxmlformats.org/drawingml/2006/picture">
+                <pic:pic>
+                  <pic:nvPicPr>
+                    <pic:cNvPr descr="figures/05-gr-01-certification.png" id="52" name="Picture"/>
+                    <pic:cNvPicPr>
+                      <a:picLocks noChangeArrowheads="1" noChangeAspect="1"/>
+                    </pic:cNvPicPr>
+                  </pic:nvPicPr>
+                  <pic:blipFill>
+                    <a:blip r:embed="rId50"/>
+                    <a:stretch>
+                      <a:fillRect/>
+                    </a:stretch>
+                  </pic:blipFill>
+                  <pic:spPr bwMode="auto">
+                    <a:xfrm>
+                      <a:off x="0" y="0"/>
+                      <a:ext cx="5753100" cy="3441586"/>
+                    </a:xfrm>
+                    <a:prstGeom prst="rect">
+                      <a:avLst/>
+                    </a:prstGeom>
+                    <a:noFill/>
+                    <a:ln w="9525">
+                      <a:noFill/>
+                      <a:headEnd/>
+                      <a:tailEnd/>
+                    </a:ln>
+                  </pic:spPr>
+                </pic:pic>
+              </a:graphicData>
+            </a:graphic>
+          </wp:inline>
+        </w:drawing>
+      </w:r>
+    </w:p>
+    <w:p>
+      <w:pPr>
+        <w:pStyle w:val="ImageCaption"/>
+      </w:pPr>
+      <w:r>
+        <w:t xml:space="preserve">Slika 5.1: Certification dve sukobljene transakcije. Obe menjaju isti red, zajednički niz ih svim članovima isporučuje istim redosledom, pa svaki član samostalno komituje T_B i odbacuje T_A. Klijent A dobija grešku, a klijent B potvrdu.</w:t>
+      </w:r>
+    </w:p>
+    <w:p>
+      <w:pPr>
+        <w:pStyle w:val="BodyText"/>
+      </w:pPr>
+      <w:r>
+        <w:t xml:space="preserve">Pošto se sukob prepoznaje po identifikatoru reda, svaka tabela mora da ima primarni ključ ili</w:t>
+      </w:r>
+      <w:r>
+        <w:t xml:space="preserve"> </w:t>
+      </w:r>
+      <w:r>
+        <w:t xml:space="preserve">njegov ekvivalent, jedinstveni ključ čije kolone ne dozvoljavaju vrednost NULL</w:t>
+      </w:r>
+      <w:r>
+        <w:t xml:space="preserve"> </w:t>
+      </w:r>
+      <w:r>
+        <w:t xml:space="preserve">[11]</w:t>
+      </w:r>
+      <w:r>
+        <w:t xml:space="preserve">. Na</w:t>
+      </w:r>
+      <w:r>
+        <w:t xml:space="preserve"> </w:t>
+      </w:r>
+      <w:r>
+        <w:t xml:space="preserve">topologiji je to provereno pomoćnom tabelom</w:t>
+      </w:r>
+      <w:r>
+        <w:t xml:space="preserve"> </w:t>
+      </w:r>
+      <w:r>
+        <w:rPr>
+          <w:rStyle w:val="VerbatimChar"/>
+        </w:rPr>
+        <w:t xml:space="preserve">no_pk_demo</w:t>
+      </w:r>
+      <w:r>
+        <w:t xml:space="preserve"> </w:t>
+      </w:r>
+      <w:r>
+        <w:t xml:space="preserve">bez primarnog ključa: grupa je prihvatila</w:t>
+      </w:r>
+      <w:r>
+        <w:t xml:space="preserve"> </w:t>
+      </w:r>
+      <w:r>
+        <w:t xml:space="preserve">naredbu</w:t>
+      </w:r>
+      <w:r>
+        <w:t xml:space="preserve"> </w:t>
+      </w:r>
+      <w:r>
+        <w:rPr>
+          <w:rStyle w:val="VerbatimChar"/>
+        </w:rPr>
+        <w:t xml:space="preserve">CREATE TABLE</w:t>
+      </w:r>
+      <w:r>
+        <w:t xml:space="preserve">, ali je prvi</w:t>
+      </w:r>
+      <w:r>
+        <w:t xml:space="preserve"> </w:t>
+      </w:r>
+      <w:r>
+        <w:rPr>
+          <w:rStyle w:val="VerbatimChar"/>
+        </w:rPr>
+        <w:t xml:space="preserve">INSERT</w:t>
+      </w:r>
+      <w:r>
+        <w:t xml:space="preserve"> </w:t>
+      </w:r>
+      <w:r>
+        <w:t xml:space="preserve">odbijen greškom 3098, a provera instance u MySQL Shellu</w:t>
+      </w:r>
+      <w:r>
+        <w:t xml:space="preserve"> </w:t>
+      </w:r>
+      <w:r>
+        <w:t xml:space="preserve">upozorila je da se tabela može čitati, ali ne i menjati. Tabela je zatim uklonjena.</w:t>
+      </w:r>
+    </w:p>
+    <w:p>
+      <w:pPr>
+        <w:pStyle w:val="BodyText"/>
+      </w:pPr>
+      <w:r>
+        <w:t xml:space="preserve">Sukob je izazvan u režimu sa više primarnih čvorova (multi-primary), u kome upise primaju svi</w:t>
+      </w:r>
+      <w:r>
+        <w:t xml:space="preserve"> </w:t>
+      </w:r>
+      <w:r>
+        <w:t xml:space="preserve">članovi. Dve transakcije, na članovima 3307 i 3308, menjale su isti red tabele</w:t>
+      </w:r>
+      <w:r>
+        <w:t xml:space="preserve"> </w:t>
+      </w:r>
+      <w:r>
+        <w:rPr>
+          <w:rStyle w:val="VerbatimChar"/>
+        </w:rPr>
+        <w:t xml:space="preserve">invoices</w:t>
+      </w:r>
+      <w:r>
+        <w:t xml:space="preserve">. Komitovala</w:t>
+      </w:r>
+      <w:r>
+        <w:t xml:space="preserve"> </w:t>
+      </w:r>
+      <w:r>
+        <w:t xml:space="preserve">je ona koja je prva stigla u niz, iako je otvorena kasnije, a druga je pri komitovanju dobila grešku</w:t>
+      </w:r>
+      <w:r>
+        <w:t xml:space="preserve"> </w:t>
+      </w:r>
+      <w:r>
+        <w:rPr>
+          <w:rStyle w:val="VerbatimChar"/>
+        </w:rPr>
+        <w:t xml:space="preserve">ERROR 1180</w:t>
+      </w:r>
+      <w:r>
+        <w:t xml:space="preserve"> </w:t>
+      </w:r>
+      <w:r>
+        <w:t xml:space="preserve">sa porukom „Lock deadlock; Retry transaction“. Sva tri člana završila su sa vrednošću</w:t>
+      </w:r>
+      <w:r>
+        <w:t xml:space="preserve"> </w:t>
+      </w:r>
+      <w:r>
+        <w:t xml:space="preserve">pobednika. Kada su dve transakcije, sa istim vremenskim rasporedom, menjale dva različita reda iste</w:t>
+      </w:r>
+      <w:r>
+        <w:t xml:space="preserve"> </w:t>
+      </w:r>
+      <w:r>
+        <w:t xml:space="preserve">tabele, komitovale su obe, pa se sukob utvrđuje po redu, a ne po tabeli. Gubitnik pri tome ne dobija</w:t>
+      </w:r>
+      <w:r>
+        <w:t xml:space="preserve"> </w:t>
+      </w:r>
+      <w:r>
+        <w:t xml:space="preserve">posebnu grešku sukoba, već opštu grešku pri komitovanju, pa aplikacija mora da je prepozna i da</w:t>
+      </w:r>
+      <w:r>
+        <w:t xml:space="preserve"> </w:t>
+      </w:r>
+      <w:r>
+        <w:t xml:space="preserve">transakciju ponovi.</w:t>
+      </w:r>
+    </w:p>
+    <w:bookmarkEnd w:id="53"/>
+    <w:bookmarkStart w:id="54" w:name="kvorum-manjina-čeka-ne-razilazi-se"/>
+    <w:p>
+      <w:pPr>
+        <w:pStyle w:val="Heading2"/>
+      </w:pPr>
+      <w:r>
+        <w:t xml:space="preserve">Kvorum: manjina čeka, ne razilazi se</w:t>
+      </w:r>
+    </w:p>
+    <w:p>
+      <w:pPr>
+        <w:pStyle w:val="FirstParagraph"/>
+      </w:pPr>
+      <w:r>
+        <w:t xml:space="preserve">Transakcija dobija mesto u nizu tek kada se o njemu složi većina grupe, pa grupa od tri člana</w:t>
+      </w:r>
+      <w:r>
+        <w:t xml:space="preserve"> </w:t>
+      </w:r>
+      <w:r>
+        <w:t xml:space="preserve">podnosi otkaz jednog</w:t>
+      </w:r>
+      <w:r>
+        <w:t xml:space="preserve"> </w:t>
+      </w:r>
+      <w:r>
+        <w:t xml:space="preserve">[11]</w:t>
+      </w:r>
+      <w:r>
+        <w:t xml:space="preserve">. Ponašanje bez većine izmereno je tako što su procesi članova</w:t>
+      </w:r>
+      <w:r>
+        <w:t xml:space="preserve"> </w:t>
+      </w:r>
+      <w:r>
+        <w:t xml:space="preserve">3308 i 3309 prinudno zaustavljeni; uredno gašenje servera nije moglo da posluži, jer uredno</w:t>
+      </w:r>
+      <w:r>
+        <w:t xml:space="preserve"> </w:t>
+      </w:r>
+      <w:r>
+        <w:t xml:space="preserve">napuštanje grupe uklanja člana iz grupe, pa se većina računa nad preostalim članovima. Ishod na</w:t>
+      </w:r>
+      <w:r>
+        <w:t xml:space="preserve"> </w:t>
+      </w:r>
+      <w:r>
+        <w:t xml:space="preserve">preživelom članu 3307, koji je i dalje bio primarni, prikazuje tabela 5.1. Čitanje je vraćeno za</w:t>
+      </w:r>
+      <w:r>
+        <w:t xml:space="preserve"> </w:t>
+      </w:r>
+      <w:r>
+        <w:t xml:space="preserve">nekoliko desetina milisekundi, ali upis nije bio ni komitovan, ni odbijen, ni vidljiv drugim</w:t>
+      </w:r>
+      <w:r>
+        <w:t xml:space="preserve"> </w:t>
+      </w:r>
+      <w:r>
+        <w:t xml:space="preserve">sesijama. Priručnik ovo stanje opisuje rečima da grupa ne može da napreduje i da se blokira, jer ne</w:t>
+      </w:r>
+      <w:r>
+        <w:t xml:space="preserve"> </w:t>
+      </w:r>
+      <w:r>
+        <w:t xml:space="preserve">može da obezbedi većinu, odnosno kvorum</w:t>
+      </w:r>
+      <w:r>
+        <w:t xml:space="preserve"> </w:t>
+      </w:r>
+      <w:r>
+        <w:t xml:space="preserve">[11]</w:t>
+      </w:r>
+      <w:r>
+        <w:t xml:space="preserve">. Uloga primarnog člana određuje samo gde se</w:t>
+      </w:r>
+      <w:r>
+        <w:t xml:space="preserve"> </w:t>
+      </w:r>
+      <w:r>
+        <w:t xml:space="preserve">upisi primaju, a o njihovom ishodu odlučuje većina.</w:t>
+      </w:r>
+    </w:p>
+    <w:p>
+      <w:pPr>
+        <w:pStyle w:val="TableCaption"/>
+      </w:pPr>
+      <w:r>
+        <w:t xml:space="preserve">Tabela 5.1: Gubitak kvoruma u grupi od tri člana. Procesi članova 3308 i 3309 prinudno su zaustavljeni, a merenje je izvedeno na preživelom članu 3307 (MySQL 8.4.11,</w:t>
+      </w:r>
+      <w:r>
+        <w:t xml:space="preserve"> </w:t>
+      </w:r>
+      <w:r>
+        <w:rPr>
+          <w:rStyle w:val="VerbatimChar"/>
+        </w:rPr>
+        <w:t xml:space="preserve">group_replication_unreachable_majority_timeout = 0</w:t>
+      </w:r>
+      <w:r>
+        <w:t xml:space="preserve">).</w:t>
+      </w:r>
+    </w:p>
+    <w:tbl>
+      <w:tblPr>
+        <w:tblStyle w:val="Table"/>
+        <w:tblW w:type="pct" w:w="5000"/>
+        <w:tblLayout w:type="fixed"/>
+        <w:tblLook w:firstRow="1" w:lastRow="0" w:firstColumn="0" w:lastColumn="0" w:noHBand="0" w:noVBand="0" w:val="0020"/>
+        <w:tblCaption w:val="Tabela 5.1: Gubitak kvoruma u grupi od tri člana. Procesi članova 3308 i 3309 prinudno su zaustavljeni, a merenje je izvedeno na preživelom članu 3307 (MySQL 8.4.11, group_replication_unreachable_majority_timeout = 0)."/>
+      </w:tblPr>
+      <w:tblGrid>
+        <w:gridCol w:w="3960"/>
+        <w:gridCol w:w="3960"/>
+      </w:tblGrid>
+      <w:tr>
+        <w:trPr>
+          <w:tblHeader w:val="on"/>
+        </w:trPr>
+        <w:tc>
+          <w:tcPr/>
+          <w:p>
+            <w:pPr>
+              <w:pStyle w:val="Compact"/>
+            </w:pPr>
+            <w:r>
+              <w:t xml:space="preserve">Korak na članu 3307</w:t>
+            </w:r>
+          </w:p>
+        </w:tc>
+        <w:tc>
+          <w:tcPr/>
+          <w:p>
+            <w:pPr>
+              <w:pStyle w:val="Compact"/>
+            </w:pPr>
+            <w:r>
+              <w:t xml:space="preserve">Ishod</w:t>
+            </w:r>
+          </w:p>
+        </w:tc>
+      </w:tr>
+      <w:tr>
+        <w:tc>
+          <w:tcPr/>
+          <w:p>
+            <w:pPr>
+              <w:pStyle w:val="Compact"/>
+            </w:pPr>
+            <w:r>
+              <w:rPr>
+                <w:rStyle w:val="VerbatimChar"/>
+              </w:rPr>
+              <w:t xml:space="preserve">SELECT COUNT(*)</w:t>
+            </w:r>
+            <w:r>
+              <w:t xml:space="preserve"> </w:t>
+            </w:r>
+            <w:r>
+              <w:t xml:space="preserve">nad tabelom</w:t>
+            </w:r>
+            <w:r>
+              <w:t xml:space="preserve"> </w:t>
+            </w:r>
+            <w:r>
+              <w:rPr>
+                <w:rStyle w:val="VerbatimChar"/>
+              </w:rPr>
+              <w:t xml:space="preserve">patients</w:t>
+            </w:r>
+          </w:p>
+        </w:tc>
+        <w:tc>
+          <w:tcPr/>
+          <w:p>
+            <w:pPr>
+              <w:pStyle w:val="Compact"/>
+            </w:pPr>
+            <w:r>
+              <w:t xml:space="preserve">vraćeno posle 39 ms</w:t>
+            </w:r>
+          </w:p>
+        </w:tc>
+      </w:tr>
+      <w:tr>
+        <w:tc>
+          <w:tcPr/>
+          <w:p>
+            <w:pPr>
+              <w:pStyle w:val="Compact"/>
+            </w:pPr>
+            <w:r>
+              <w:rPr>
+                <w:rStyle w:val="VerbatimChar"/>
+              </w:rPr>
+              <w:t xml:space="preserve">INSERT</w:t>
+            </w:r>
+            <w:r>
+              <w:t xml:space="preserve"> </w:t>
+            </w:r>
+            <w:r>
+              <w:t xml:space="preserve">u tabelu</w:t>
+            </w:r>
+            <w:r>
+              <w:t xml:space="preserve"> </w:t>
+            </w:r>
+            <w:r>
+              <w:rPr>
+                <w:rStyle w:val="VerbatimChar"/>
+              </w:rPr>
+              <w:t xml:space="preserve">heartbeat</w:t>
+            </w:r>
+          </w:p>
+        </w:tc>
+        <w:tc>
+          <w:tcPr/>
+          <w:p>
+            <w:pPr>
+              <w:pStyle w:val="Compact"/>
+            </w:pPr>
+            <w:r>
+              <w:t xml:space="preserve">blokirano i posle 30 s, klijent prekinut</w:t>
+            </w:r>
+          </w:p>
+        </w:tc>
+      </w:tr>
+      <w:tr>
+        <w:tc>
+          <w:tcPr/>
+          <w:p>
+            <w:pPr>
+              <w:pStyle w:val="Compact"/>
+            </w:pPr>
+            <w:r>
+              <w:t xml:space="preserve">čitanje tog reda iz druge sesije</w:t>
+            </w:r>
+          </w:p>
+        </w:tc>
+        <w:tc>
+          <w:tcPr/>
+          <w:p>
+            <w:pPr>
+              <w:pStyle w:val="Compact"/>
+            </w:pPr>
+            <w:r>
+              <w:t xml:space="preserve">0 redova, posle 28 ms</w:t>
+            </w:r>
+          </w:p>
+        </w:tc>
+      </w:tr>
+      <w:tr>
+        <w:tc>
+          <w:tcPr/>
+          <w:p>
+            <w:pPr>
+              <w:pStyle w:val="Compact"/>
+            </w:pPr>
+            <w:r>
+              <w:rPr>
+                <w:rStyle w:val="VerbatimChar"/>
+              </w:rPr>
+              <w:t xml:space="preserve">forceQuorumUsingPartitionOf()</w:t>
+            </w:r>
+            <w:r>
+              <w:t xml:space="preserve"> </w:t>
+            </w:r>
+            <w:r>
+              <w:t xml:space="preserve">u MySQL Shellu</w:t>
+            </w:r>
+          </w:p>
+        </w:tc>
+        <w:tc>
+          <w:tcPr/>
+          <w:p>
+            <w:pPr>
+              <w:pStyle w:val="Compact"/>
+            </w:pPr>
+            <w:r>
+              <w:t xml:space="preserve">kvorum obnovljen nad jednim članom</w:t>
+            </w:r>
+          </w:p>
+        </w:tc>
+      </w:tr>
+      <w:tr>
+        <w:tc>
+          <w:tcPr/>
+          <w:p>
+            <w:pPr>
+              <w:pStyle w:val="Compact"/>
+            </w:pPr>
+            <w:r>
+              <w:t xml:space="preserve">isti red, posle obnove kvoruma</w:t>
+            </w:r>
+          </w:p>
+        </w:tc>
+        <w:tc>
+          <w:tcPr/>
+          <w:p>
+            <w:pPr>
+              <w:pStyle w:val="Compact"/>
+            </w:pPr>
+            <w:r>
+              <w:t xml:space="preserve">komitovan, oko dva minuta posle slanja</w:t>
+            </w:r>
+          </w:p>
+        </w:tc>
+      </w:tr>
+    </w:tbl>
+    <w:p>
+      <w:pPr>
+        <w:pStyle w:val="BodyText"/>
+      </w:pPr>
+      <w:r>
+        <w:t xml:space="preserve">Ovo je ponašanje koje drugo poglavlje očekuje od konsenzusa. Manjina koja bi nastavila da prima</w:t>
+      </w:r>
+      <w:r>
+        <w:t xml:space="preserve"> </w:t>
+      </w:r>
+      <w:r>
+        <w:t xml:space="preserve">upise izazvala bi split brain (razdvajanje grupe na dve nezavisne celine), odnosno dve grupe članova</w:t>
+      </w:r>
+      <w:r>
+        <w:t xml:space="preserve"> </w:t>
+      </w:r>
+      <w:r>
+        <w:t xml:space="preserve">čiji se logovi razilaze. Član bez većine, međutim, ne može da dobije mesto u nizu, pa ne može ni da</w:t>
+      </w:r>
+      <w:r>
+        <w:t xml:space="preserve"> </w:t>
+      </w:r>
+      <w:r>
+        <w:t xml:space="preserve">komituje upis koji bi se razišao sa većinom. U terminima teoreme CAP grupa za upise bira</w:t>
+      </w:r>
+      <w:r>
+        <w:t xml:space="preserve"> </w:t>
+      </w:r>
+      <w:r>
+        <w:t xml:space="preserve">konzistentnost, a ne dostupnost, dok čitanja i dalje opslužuje, i to stanjem koje je imala pre</w:t>
+      </w:r>
+      <w:r>
+        <w:t xml:space="preserve"> </w:t>
+      </w:r>
+      <w:r>
+        <w:t xml:space="preserve">gubitka većine. Podrazumevana vrednost promenljive</w:t>
+      </w:r>
+      <w:r>
+        <w:t xml:space="preserve"> </w:t>
+      </w:r>
+      <w:r>
+        <w:rPr>
+          <w:rStyle w:val="VerbatimChar"/>
+        </w:rPr>
+        <w:t xml:space="preserve">group_replication_unreachable_majority_timeout</w:t>
+      </w:r>
+      <w:r>
+        <w:t xml:space="preserve"> </w:t>
+      </w:r>
+      <w:r>
+        <w:t xml:space="preserve">je nula, pa član čeka neograničeno; uz pozitivnu vrednost član po isteku tog vremena poništava</w:t>
+      </w:r>
+      <w:r>
+        <w:t xml:space="preserve"> </w:t>
+      </w:r>
+      <w:r>
+        <w:t xml:space="preserve">transakcije na čekanju i prelazi u stanje greške</w:t>
+      </w:r>
+      <w:r>
+        <w:t xml:space="preserve"> </w:t>
+      </w:r>
+      <w:r>
+        <w:t xml:space="preserve">[11]</w:t>
+      </w:r>
+      <w:r>
+        <w:t xml:space="preserve">.</w:t>
+      </w:r>
+    </w:p>
+    <w:p>
+      <w:pPr>
+        <w:pStyle w:val="BodyText"/>
+      </w:pPr>
+      <w:r>
+        <w:t xml:space="preserve">Izlaz iz ovog stanja je odluka operatera. Naredba</w:t>
+      </w:r>
+      <w:r>
+        <w:t xml:space="preserve"> </w:t>
+      </w:r>
+      <w:r>
+        <w:rPr>
+          <w:rStyle w:val="VerbatimChar"/>
+        </w:rPr>
+        <w:t xml:space="preserve">forceQuorumUsingPartitionOf()</w:t>
+      </w:r>
+      <w:r>
+        <w:t xml:space="preserve"> </w:t>
+      </w:r>
+      <w:r>
+        <w:t xml:space="preserve">proglašava</w:t>
+      </w:r>
+      <w:r>
+        <w:t xml:space="preserve"> </w:t>
+      </w:r>
+      <w:r>
+        <w:t xml:space="preserve">preživele članove novom grupom</w:t>
+      </w:r>
+      <w:r>
+        <w:t xml:space="preserve"> </w:t>
+      </w:r>
+      <w:r>
+        <w:t xml:space="preserve">[12]</w:t>
+      </w:r>
+      <w:r>
+        <w:t xml:space="preserve">, a sam alat pri tome upozorava da ostale članove</w:t>
+      </w:r>
+      <w:r>
+        <w:t xml:space="preserve"> </w:t>
+      </w:r>
+      <w:r>
+        <w:t xml:space="preserve">treba ukloniti ili vratiti u obnovljenu grupu kako bi se izbegao split brain. Posle prisilnog</w:t>
+      </w:r>
+      <w:r>
+        <w:t xml:space="preserve"> </w:t>
+      </w:r>
+      <w:r>
+        <w:t xml:space="preserve">obnavljanja kvoruma upis koji je čekao komitovan je, iako je njegov klijent odavno bio prekinut:</w:t>
+      </w:r>
+      <w:r>
+        <w:t xml:space="preserve"> </w:t>
+      </w:r>
+      <w:r>
+        <w:t xml:space="preserve">transakcija nije bila poništena, već zadržana u komitovanju. Grupa, dakle, sama ne bira dostupnost,</w:t>
+      </w:r>
+      <w:r>
+        <w:t xml:space="preserve"> </w:t>
+      </w:r>
+      <w:r>
+        <w:t xml:space="preserve">ali operater može da je izabere, i tada preuzima rizik koji je grupa odbijala da preuzme.</w:t>
+      </w:r>
+    </w:p>
+    <w:bookmarkEnd w:id="54"/>
+    <w:bookmarkStart w:id="55" w:name="jedan-ili-više-primarnih-čvorova"/>
+    <w:p>
+      <w:pPr>
+        <w:pStyle w:val="Heading2"/>
+      </w:pPr>
+      <w:r>
+        <w:t xml:space="preserve">Jedan ili više primarnih čvorova</w:t>
+      </w:r>
+    </w:p>
+    <w:p>
+      <w:pPr>
+        <w:pStyle w:val="FirstParagraph"/>
+      </w:pPr>
+      <w:r>
+        <w:t xml:space="preserve">Podrazumevani režim je režim sa jednim primarnim čvorom (single-primary): grupa automatski bira</w:t>
+      </w:r>
+      <w:r>
+        <w:t xml:space="preserve"> </w:t>
+      </w:r>
+      <w:r>
+        <w:t xml:space="preserve">jednog člana koji prima upise, a ostali rade samo za čitanje, uz</w:t>
+      </w:r>
+      <w:r>
+        <w:t xml:space="preserve"> </w:t>
+      </w:r>
+      <w:r>
+        <w:rPr>
+          <w:rStyle w:val="VerbatimChar"/>
+        </w:rPr>
+        <w:t xml:space="preserve">super_read_only = ON</w:t>
+      </w:r>
+      <w:r>
+        <w:t xml:space="preserve"> </w:t>
+      </w:r>
+      <w:r>
+        <w:t xml:space="preserve">[11]</w:t>
+      </w:r>
+      <w:r>
+        <w:t xml:space="preserve">. Na topologiji je pokušaj upisa na sekundarnom članu 3308 odbijen greškom 1290.</w:t>
+      </w:r>
+      <w:r>
+        <w:t xml:space="preserve"> </w:t>
+      </w:r>
+      <w:r>
+        <w:t xml:space="preserve">Kada primarni član otkaže, grupa sama bira novog</w:t>
+      </w:r>
+      <w:r>
+        <w:t xml:space="preserve"> </w:t>
+      </w:r>
+      <w:r>
+        <w:t xml:space="preserve">[11]</w:t>
+      </w:r>
+      <w:r>
+        <w:t xml:space="preserve">. Razlika u odnosu na asinhronu</w:t>
+      </w:r>
+      <w:r>
+        <w:t xml:space="preserve"> </w:t>
+      </w:r>
+      <w:r>
+        <w:t xml:space="preserve">replikaciju nije u tome da li se veze automatski preusmeravaju, jer i replika u asinhronoj</w:t>
+      </w:r>
+      <w:r>
+        <w:t xml:space="preserve"> </w:t>
+      </w:r>
+      <w:r>
+        <w:t xml:space="preserve">replikaciji može sama da se poveže na drugi izvor sa unapred zadatog spiska (Asynchronous</w:t>
+      </w:r>
+      <w:r>
+        <w:t xml:space="preserve"> </w:t>
+      </w:r>
+      <w:r>
+        <w:t xml:space="preserve">Connection Failover)</w:t>
+      </w:r>
+      <w:r>
+        <w:t xml:space="preserve"> </w:t>
+      </w:r>
+      <w:r>
+        <w:t xml:space="preserve">[11]</w:t>
+      </w:r>
+      <w:r>
+        <w:t xml:space="preserve">. Razlika je u tome ko unapređuje novi izvor: u asinhronoj</w:t>
+      </w:r>
+      <w:r>
+        <w:t xml:space="preserve"> </w:t>
+      </w:r>
+      <w:r>
+        <w:t xml:space="preserve">replikaciji to čini operater ili spoljni alat, a u Group Replication sama grupa.</w:t>
+      </w:r>
+    </w:p>
+    <w:p>
+      <w:pPr>
+        <w:pStyle w:val="BodyText"/>
+      </w:pPr>
+      <w:r>
+        <w:t xml:space="preserve">U režimu multi-primary sukobe razrešava certification, a sam režim ima ograničenja: odbija nivo</w:t>
+      </w:r>
+      <w:r>
+        <w:t xml:space="preserve"> </w:t>
+      </w:r>
+      <w:r>
+        <w:t xml:space="preserve">izolovanosti</w:t>
+      </w:r>
+      <w:r>
+        <w:t xml:space="preserve"> </w:t>
+      </w:r>
+      <w:r>
+        <w:rPr>
+          <w:rStyle w:val="VerbatimChar"/>
+        </w:rPr>
+        <w:t xml:space="preserve">SERIALIZABLE</w:t>
+      </w:r>
+      <w:r>
+        <w:t xml:space="preserve">, ne podržava strane ključeve sa kaskadnim akcijama i ne podržava</w:t>
+      </w:r>
+      <w:r>
+        <w:t xml:space="preserve"> </w:t>
+      </w:r>
+      <w:r>
+        <w:t xml:space="preserve">istovremene DDL i DML naredbe nad istim objektom sa različitih članova</w:t>
+      </w:r>
+      <w:r>
+        <w:t xml:space="preserve"> </w:t>
+      </w:r>
+      <w:r>
+        <w:t xml:space="preserve">[11]</w:t>
+      </w:r>
+      <w:r>
+        <w:t xml:space="preserve">. Primer</w:t>
+      </w:r>
+      <w:r>
+        <w:t xml:space="preserve"> </w:t>
+      </w:r>
+      <w:r>
+        <w:rPr>
+          <w:rStyle w:val="VerbatimChar"/>
+        </w:rPr>
+        <w:t xml:space="preserve">poliklinika</w:t>
+      </w:r>
+      <w:r>
+        <w:t xml:space="preserve"> </w:t>
+      </w:r>
+      <w:r>
+        <w:t xml:space="preserve">nema kaskadnih stranih ključeva, pa je režim na njemu bio dostupan. Više primarnih</w:t>
+      </w:r>
+      <w:r>
+        <w:t xml:space="preserve"> </w:t>
+      </w:r>
+      <w:r>
+        <w:t xml:space="preserve">čvorova, međutim, ne umnožava kapacitet upisa: svaki član čuva sve podatke, pa primenjuje svaki</w:t>
+      </w:r>
+      <w:r>
+        <w:t xml:space="preserve"> </w:t>
+      </w:r>
+      <w:r>
+        <w:t xml:space="preserve">komitovan red, i svoj i tuđ, a među članovima se raspoređuje samo izvršavanje naredbi. Ovaj</w:t>
+      </w:r>
+      <w:r>
+        <w:t xml:space="preserve"> </w:t>
+      </w:r>
+      <w:r>
+        <w:t xml:space="preserve">zaključak izveden je iz načina rada, a ne izmeren. Multi-primary je zato opravdan samo kada upise</w:t>
+      </w:r>
+      <w:r>
+        <w:t xml:space="preserve"> </w:t>
+      </w:r>
+      <w:r>
+        <w:t xml:space="preserve">mora da prima više članova istovremeno, a sukoba je malo; u ostalim slučajevima single-primary</w:t>
+      </w:r>
+      <w:r>
+        <w:t xml:space="preserve"> </w:t>
+      </w:r>
+      <w:r>
+        <w:t xml:space="preserve">pruža istu zaštitu od razilaženja, bez odbačenih transakcija koje aplikacija mora da ponavlja.</w:t>
+      </w:r>
+    </w:p>
+    <w:bookmarkEnd w:id="55"/>
+    <w:bookmarkStart w:id="56" w:name="nivo-konzistentnosti-ko-čeka"/>
+    <w:p>
+      <w:pPr>
+        <w:pStyle w:val="Heading2"/>
+      </w:pPr>
+      <w:r>
+        <w:t xml:space="preserve">Nivo konzistentnosti: ko čeka</w:t>
+      </w:r>
+    </w:p>
+    <w:p>
+      <w:pPr>
+        <w:pStyle w:val="FirstParagraph"/>
+      </w:pPr>
+      <w:r>
+        <w:t xml:space="preserve">Komitovanje u grupi znači da je većina primila transakciju i da je transakcija dobila mesto u nizu,</w:t>
+      </w:r>
+      <w:r>
+        <w:t xml:space="preserve"> </w:t>
+      </w:r>
+      <w:r>
+        <w:t xml:space="preserve">a ne da su je svi članovi primenili. Odluka i vidljivost su ponovo dva različita trenutka, kao u</w:t>
+      </w:r>
+      <w:r>
+        <w:t xml:space="preserve"> </w:t>
+      </w:r>
+      <w:r>
+        <w:t xml:space="preserve">četvrtom poglavlju, pa čitanje sa sekundarnog člana i posle potvrde može da vrati staru vrednost.</w:t>
+      </w:r>
+      <w:r>
+        <w:t xml:space="preserve"> </w:t>
+      </w:r>
+      <w:r>
+        <w:t xml:space="preserve">Promenljiva</w:t>
+      </w:r>
+      <w:r>
+        <w:t xml:space="preserve"> </w:t>
+      </w:r>
+      <w:r>
+        <w:rPr>
+          <w:rStyle w:val="VerbatimChar"/>
+        </w:rPr>
+        <w:t xml:space="preserve">group_replication_consistency</w:t>
+      </w:r>
+      <w:r>
+        <w:t xml:space="preserve"> </w:t>
+      </w:r>
+      <w:r>
+        <w:t xml:space="preserve">određuje ko čeka da se taj razmak zatvori, a može se</w:t>
+      </w:r>
+      <w:r>
+        <w:t xml:space="preserve"> </w:t>
+      </w:r>
+      <w:r>
+        <w:t xml:space="preserve">postaviti globalno ili za pojedinačnu sesiju</w:t>
+      </w:r>
+      <w:r>
+        <w:t xml:space="preserve"> </w:t>
+      </w:r>
+      <w:r>
+        <w:t xml:space="preserve">[11]</w:t>
+      </w:r>
+      <w:r>
+        <w:t xml:space="preserve">. Uz</w:t>
+      </w:r>
+      <w:r>
+        <w:t xml:space="preserve"> </w:t>
+      </w:r>
+      <w:r>
+        <w:rPr>
+          <w:rStyle w:val="VerbatimChar"/>
+        </w:rPr>
+        <w:t xml:space="preserve">EVENTUAL</w:t>
+      </w:r>
+      <w:r>
+        <w:t xml:space="preserve"> </w:t>
+      </w:r>
+      <w:r>
+        <w:t xml:space="preserve">ne čeka niko. Uz</w:t>
+      </w:r>
+      <w:r>
+        <w:t xml:space="preserve"> </w:t>
+      </w:r>
+      <w:r>
+        <w:rPr>
+          <w:rStyle w:val="VerbatimChar"/>
+        </w:rPr>
+        <w:t xml:space="preserve">BEFORE</w:t>
+      </w:r>
+      <w:r>
+        <w:t xml:space="preserve"> </w:t>
+      </w:r>
+      <w:r>
+        <w:t xml:space="preserve">transakcija sesije koja ga je postavila pre izvršavanja čeka da se primene sve transakcije</w:t>
+      </w:r>
+      <w:r>
+        <w:t xml:space="preserve"> </w:t>
+      </w:r>
+      <w:r>
+        <w:t xml:space="preserve">ispred nje u nizu. Uz</w:t>
+      </w:r>
+      <w:r>
+        <w:t xml:space="preserve"> </w:t>
+      </w:r>
+      <w:r>
+        <w:rPr>
+          <w:rStyle w:val="VerbatimChar"/>
+        </w:rPr>
+        <w:t xml:space="preserve">AFTER</w:t>
+      </w:r>
+      <w:r>
+        <w:t xml:space="preserve"> </w:t>
+      </w:r>
+      <w:r>
+        <w:t xml:space="preserve">transakcija koja upisuje završava komitovanje tek kada je primene svi</w:t>
+      </w:r>
+      <w:r>
+        <w:t xml:space="preserve"> </w:t>
+      </w:r>
+      <w:r>
+        <w:t xml:space="preserve">ostali članovi, a na transakcije koje samo čitaju ne utiče.</w:t>
+      </w:r>
+      <w:r>
+        <w:t xml:space="preserve"> </w:t>
+      </w:r>
+      <w:r>
+        <w:rPr>
+          <w:rStyle w:val="VerbatimChar"/>
+        </w:rPr>
+        <w:t xml:space="preserve">BEFORE_AND_AFTER</w:t>
+      </w:r>
+      <w:r>
+        <w:t xml:space="preserve"> </w:t>
+      </w:r>
+      <w:r>
+        <w:t xml:space="preserve">spaja oba čekanja</w:t>
+      </w:r>
+      <w:r>
+        <w:t xml:space="preserve"> </w:t>
+      </w:r>
+      <w:r>
+        <w:t xml:space="preserve">[11]</w:t>
+      </w:r>
+      <w:r>
+        <w:t xml:space="preserve">. Podrazumevana vrednost u verziji 8.4 je</w:t>
+      </w:r>
+      <w:r>
+        <w:t xml:space="preserve"> </w:t>
+      </w:r>
+      <w:r>
+        <w:rPr>
+          <w:rStyle w:val="VerbatimChar"/>
+        </w:rPr>
+        <w:t xml:space="preserve">BEFORE_ON_PRIMARY_FAILOVER</w:t>
+      </w:r>
+      <w:r>
+        <w:t xml:space="preserve"> </w:t>
+      </w:r>
+      <w:r>
+        <w:t xml:space="preserve">[16]</w:t>
+      </w:r>
+      <w:r>
+        <w:t xml:space="preserve">, koja zadržava nove transakcije samo na novoizabranom primarnom članu, dok ne</w:t>
+      </w:r>
+      <w:r>
+        <w:t xml:space="preserve"> </w:t>
+      </w:r>
+      <w:r>
+        <w:t xml:space="preserve">primeni transakcije zaostale od prethodnog</w:t>
+      </w:r>
+      <w:r>
+        <w:t xml:space="preserve"> </w:t>
+      </w:r>
+      <w:r>
+        <w:t xml:space="preserve">[11]</w:t>
+      </w:r>
+      <w:r>
+        <w:t xml:space="preserve">, pa se u stabilnom radu ponaša kao</w:t>
+      </w:r>
+      <w:r>
+        <w:t xml:space="preserve"> </w:t>
+      </w:r>
+      <w:r>
+        <w:rPr>
+          <w:rStyle w:val="VerbatimChar"/>
+        </w:rPr>
+        <w:t xml:space="preserve">EVENTUAL</w:t>
+      </w:r>
+      <w:r>
+        <w:t xml:space="preserve">.</w:t>
+      </w:r>
+    </w:p>
+    <w:p>
+      <w:pPr>
+        <w:pStyle w:val="TableCaption"/>
+      </w:pPr>
+      <w:r>
+        <w:t xml:space="preserve">Tabela 5.2: Nivoi konzistentnosti u grupi sa jednim primarnim čvorom: upis od 5000 redova na primarnom članu 3307, zatim čitanje njegovog poslednjeg reda na sekundarnom članu 3309 odmah posle potvrde (MySQL 8.4.11). Vremena su medijane. Prva tri reda su dve serije od po 40 ponavljanja, a poslednja dva jedna serija iz ranijeg merenja, u kome vreme čitanja nije mereno. Povezivanje sa modelima izvedeno je u ovom radu.</w:t>
+      </w:r>
+    </w:p>
+    <w:tbl>
+      <w:tblPr>
+        <w:tblStyle w:val="Table"/>
+        <w:tblW w:type="pct" w:w="5000"/>
+        <w:tblLayout w:type="fixed"/>
+        <w:tblLook w:firstRow="1" w:lastRow="0" w:firstColumn="0" w:lastColumn="0" w:noHBand="0" w:noVBand="0" w:val="0020"/>
+        <w:tblCaption w:val="Tabela 5.2: Nivoi konzistentnosti u grupi sa jednim primarnim čvorom: upis od 5000 redova na primarnom članu 3307, zatim čitanje njegovog poslednjeg reda na sekundarnom članu 3309 odmah posle potvrde (MySQL 8.4.11). Vremena su medijane. Prva tri reda su dve serije od po 40 ponavljanja, a poslednja dva jedna serija iz ranijeg merenja, u kome vreme čitanja nije mereno. Povezivanje sa modelima izvedeno je u ovom radu."/>
+      </w:tblPr>
+      <w:tblGrid>
+        <w:gridCol w:w="2352"/>
+        <w:gridCol w:w="1254"/>
+        <w:gridCol w:w="940"/>
+        <w:gridCol w:w="1019"/>
+        <w:gridCol w:w="2352"/>
+      </w:tblGrid>
+      <w:tr>
+        <w:trPr>
+          <w:tblHeader w:val="on"/>
+        </w:trPr>
+        <w:tc>
+          <w:tcPr/>
+          <w:p>
+            <w:pPr>
+              <w:pStyle w:val="Compact"/>
+            </w:pPr>
+            <w:r>
+              <w:t xml:space="preserve">Nivo (sesija na kojoj je postavljen)</w:t>
+            </w:r>
+          </w:p>
+        </w:tc>
+        <w:tc>
+          <w:tcPr/>
+          <w:p>
+            <w:pPr>
+              <w:pStyle w:val="Compact"/>
+              <w:jc w:val="right"/>
+            </w:pPr>
+            <w:r>
+              <w:t xml:space="preserve">Zastarela čitanja</w:t>
+            </w:r>
+          </w:p>
+        </w:tc>
+        <w:tc>
+          <w:tcPr/>
+          <w:p>
+            <w:pPr>
+              <w:pStyle w:val="Compact"/>
+              <w:jc w:val="right"/>
+            </w:pPr>
+            <w:r>
+              <w:t xml:space="preserve">Pisac (ms)</w:t>
+            </w:r>
+          </w:p>
+        </w:tc>
+        <w:tc>
+          <w:tcPr/>
+          <w:p>
+            <w:pPr>
+              <w:pStyle w:val="Compact"/>
+              <w:jc w:val="right"/>
+            </w:pPr>
+            <w:r>
+              <w:t xml:space="preserve">Čitalac (ms)</w:t>
+            </w:r>
+          </w:p>
+        </w:tc>
+        <w:tc>
+          <w:tcPr/>
+          <w:p>
+            <w:pPr>
+              <w:pStyle w:val="Compact"/>
+            </w:pPr>
+            <w:r>
+              <w:t xml:space="preserve">Model iz 2. poglavlja (izvedeno)</w:t>
+            </w:r>
+          </w:p>
+        </w:tc>
+      </w:tr>
+      <w:tr>
+        <w:tc>
+          <w:tcPr/>
+          <w:p>
+            <w:pPr>
+              <w:pStyle w:val="Compact"/>
+            </w:pPr>
+            <w:r>
+              <w:rPr>
+                <w:rStyle w:val="VerbatimChar"/>
+              </w:rPr>
+              <w:t xml:space="preserve">BEFORE_ON_PRIMARY_FAILOVER</w:t>
+            </w:r>
+            <w:r>
+              <w:t xml:space="preserve"> </w:t>
+            </w:r>
+            <w:r>
+              <w:t xml:space="preserve">(podrazumevani)</w:t>
+            </w:r>
+          </w:p>
+        </w:tc>
+        <w:tc>
+          <w:tcPr/>
+          <w:p>
+            <w:pPr>
+              <w:pStyle w:val="Compact"/>
+              <w:jc w:val="right"/>
+            </w:pPr>
+            <w:r>
+              <w:t xml:space="preserve">80/80</w:t>
+            </w:r>
+          </w:p>
+        </w:tc>
+        <w:tc>
+          <w:tcPr/>
+          <w:p>
+            <w:pPr>
+              <w:pStyle w:val="Compact"/>
+              <w:jc w:val="right"/>
+            </w:pPr>
+            <w:r>
+              <w:t xml:space="preserve">16</w:t>
+            </w:r>
+          </w:p>
+        </w:tc>
+        <w:tc>
+          <w:tcPr/>
+          <w:p>
+            <w:pPr>
+              <w:pStyle w:val="Compact"/>
+              <w:jc w:val="right"/>
+            </w:pPr>
+            <w:r>
+              <w:t xml:space="preserve">0</w:t>
+            </w:r>
+          </w:p>
+        </w:tc>
+        <w:tc>
+          <w:tcPr/>
+          <w:p>
+            <w:pPr>
+              <w:pStyle w:val="Compact"/>
+            </w:pPr>
+            <w:r>
+              <w:t xml:space="preserve">konačna</w:t>
+            </w:r>
+          </w:p>
+        </w:tc>
+      </w:tr>
+      <w:tr>
+        <w:tc>
+          <w:tcPr/>
+          <w:p>
+            <w:pPr>
+              <w:pStyle w:val="Compact"/>
+            </w:pPr>
+            <w:r>
+              <w:rPr>
+                <w:rStyle w:val="VerbatimChar"/>
+              </w:rPr>
+              <w:t xml:space="preserve">EVENTUAL</w:t>
+            </w:r>
+            <w:r>
+              <w:t xml:space="preserve"> </w:t>
+            </w:r>
+            <w:r>
+              <w:t xml:space="preserve">(čitalac)</w:t>
+            </w:r>
+          </w:p>
+        </w:tc>
+        <w:tc>
+          <w:tcPr/>
+          <w:p>
+            <w:pPr>
+              <w:pStyle w:val="Compact"/>
+              <w:jc w:val="right"/>
+            </w:pPr>
+            <w:r>
+              <w:t xml:space="preserve">79/80</w:t>
+            </w:r>
+          </w:p>
+        </w:tc>
+        <w:tc>
+          <w:tcPr/>
+          <w:p>
+            <w:pPr>
+              <w:pStyle w:val="Compact"/>
+              <w:jc w:val="right"/>
+            </w:pPr>
+            <w:r>
+              <w:t xml:space="preserve">15–16</w:t>
+            </w:r>
+          </w:p>
+        </w:tc>
+        <w:tc>
+          <w:tcPr/>
+          <w:p>
+            <w:pPr>
+              <w:pStyle w:val="Compact"/>
+              <w:jc w:val="right"/>
+            </w:pPr>
+            <w:r>
+              <w:t xml:space="preserve">0</w:t>
+            </w:r>
+          </w:p>
+        </w:tc>
+        <w:tc>
+          <w:tcPr/>
+          <w:p>
+            <w:pPr>
+              <w:pStyle w:val="Compact"/>
+            </w:pPr>
+            <w:r>
+              <w:t xml:space="preserve">konačna</w:t>
+            </w:r>
+          </w:p>
+        </w:tc>
+      </w:tr>
+      <w:tr>
+        <w:tc>
+          <w:tcPr/>
+          <w:p>
+            <w:pPr>
+              <w:pStyle w:val="Compact"/>
+            </w:pPr>
+            <w:r>
+              <w:rPr>
+                <w:rStyle w:val="VerbatimChar"/>
+              </w:rPr>
+              <w:t xml:space="preserve">BEFORE</w:t>
+            </w:r>
+            <w:r>
+              <w:t xml:space="preserve"> </w:t>
+            </w:r>
+            <w:r>
+              <w:t xml:space="preserve">(čitalac)</w:t>
+            </w:r>
+          </w:p>
+        </w:tc>
+        <w:tc>
+          <w:tcPr/>
+          <w:p>
+            <w:pPr>
+              <w:pStyle w:val="Compact"/>
+              <w:jc w:val="right"/>
+            </w:pPr>
+            <w:r>
+              <w:t xml:space="preserve">0/80</w:t>
+            </w:r>
+          </w:p>
+        </w:tc>
+        <w:tc>
+          <w:tcPr/>
+          <w:p>
+            <w:pPr>
+              <w:pStyle w:val="Compact"/>
+              <w:jc w:val="right"/>
+            </w:pPr>
+            <w:r>
+              <w:t xml:space="preserve">16</w:t>
+            </w:r>
+          </w:p>
+        </w:tc>
+        <w:tc>
+          <w:tcPr/>
+          <w:p>
+            <w:pPr>
+              <w:pStyle w:val="Compact"/>
+              <w:jc w:val="right"/>
+            </w:pPr>
+            <w:r>
+              <w:t xml:space="preserve">14–16</w:t>
+            </w:r>
+          </w:p>
+        </w:tc>
+        <w:tc>
+          <w:tcPr/>
+          <w:p>
+            <w:pPr>
+              <w:pStyle w:val="Compact"/>
+            </w:pPr>
+            <w:r>
+              <w:t xml:space="preserve">stroga, za to čitanje</w:t>
+            </w:r>
+          </w:p>
+        </w:tc>
+      </w:tr>
+      <w:tr>
+        <w:tc>
+          <w:tcPr/>
+          <w:p>
+            <w:pPr>
+              <w:pStyle w:val="Compact"/>
+            </w:pPr>
+            <w:r>
+              <w:rPr>
+                <w:rStyle w:val="VerbatimChar"/>
+              </w:rPr>
+              <w:t xml:space="preserve">AFTER</w:t>
+            </w:r>
+            <w:r>
+              <w:t xml:space="preserve"> </w:t>
+            </w:r>
+            <w:r>
+              <w:t xml:space="preserve">(pisac)</w:t>
+            </w:r>
+          </w:p>
+        </w:tc>
+        <w:tc>
+          <w:tcPr/>
+          <w:p>
+            <w:pPr>
+              <w:pStyle w:val="Compact"/>
+              <w:jc w:val="right"/>
+            </w:pPr>
+            <w:r>
+              <w:t xml:space="preserve">0/40</w:t>
+            </w:r>
+          </w:p>
+        </w:tc>
+        <w:tc>
+          <w:tcPr/>
+          <w:p>
+            <w:pPr>
+              <w:pStyle w:val="Compact"/>
+              <w:jc w:val="right"/>
+            </w:pPr>
+            <w:r>
+              <w:t xml:space="preserve">29</w:t>
+            </w:r>
+          </w:p>
+        </w:tc>
+        <w:tc>
+          <w:tcPr/>
+          <w:p>
+            <w:pPr>
+              <w:pStyle w:val="Compact"/>
+              <w:jc w:val="right"/>
+            </w:pPr>
+            <w:r>
+              <w:t xml:space="preserve">–</w:t>
+            </w:r>
+          </w:p>
+        </w:tc>
+        <w:tc>
+          <w:tcPr/>
+          <w:p>
+            <w:pPr>
+              <w:pStyle w:val="Compact"/>
+            </w:pPr>
+            <w:r>
+              <w:t xml:space="preserve">read-your-writes za sve čitaoce</w:t>
+            </w:r>
+          </w:p>
+        </w:tc>
+      </w:tr>
+      <w:tr>
+        <w:tc>
+          <w:tcPr/>
+          <w:p>
+            <w:pPr>
+              <w:pStyle w:val="Compact"/>
+            </w:pPr>
+            <w:r>
+              <w:rPr>
+                <w:rStyle w:val="VerbatimChar"/>
+              </w:rPr>
+              <w:t xml:space="preserve">BEFORE_AND_AFTER</w:t>
+            </w:r>
+            <w:r>
+              <w:t xml:space="preserve"> </w:t>
+            </w:r>
+            <w:r>
+              <w:t xml:space="preserve">(pisac)</w:t>
+            </w:r>
+          </w:p>
+        </w:tc>
+        <w:tc>
+          <w:tcPr/>
+          <w:p>
+            <w:pPr>
+              <w:pStyle w:val="Compact"/>
+              <w:jc w:val="right"/>
+            </w:pPr>
+            <w:r>
+              <w:t xml:space="preserve">0/40</w:t>
+            </w:r>
+          </w:p>
+        </w:tc>
+        <w:tc>
+          <w:tcPr/>
+          <w:p>
+            <w:pPr>
+              <w:pStyle w:val="Compact"/>
+              <w:jc w:val="right"/>
+            </w:pPr>
+            <w:r>
+              <w:t xml:space="preserve">31</w:t>
+            </w:r>
+          </w:p>
+        </w:tc>
+        <w:tc>
+          <w:tcPr/>
+          <w:p>
+            <w:pPr>
+              <w:pStyle w:val="Compact"/>
+              <w:jc w:val="right"/>
+            </w:pPr>
+            <w:r>
+              <w:t xml:space="preserve">–</w:t>
+            </w:r>
+          </w:p>
+        </w:tc>
+        <w:tc>
+          <w:tcPr/>
+          <w:p>
+            <w:pPr>
+              <w:pStyle w:val="Compact"/>
+            </w:pPr>
+            <w:r>
+              <w:t xml:space="preserve">stroga</w:t>
+            </w:r>
+          </w:p>
+        </w:tc>
+      </w:tr>
+    </w:tbl>
+    <w:p>
+      <w:pPr>
+        <w:pStyle w:val="BodyText"/>
+      </w:pPr>
+      <w:r>
+        <w:t xml:space="preserve">Tabela 5.2 je mesto na kome se rečnik drugog poglavlja susreće sa jednim podešavanjem MySQL-a. Uz</w:t>
+      </w:r>
+      <w:r>
+        <w:t xml:space="preserve"> </w:t>
+      </w:r>
+      <w:r>
+        <w:t xml:space="preserve">podrazumevani nivo i uz</w:t>
+      </w:r>
+      <w:r>
+        <w:t xml:space="preserve"> </w:t>
+      </w:r>
+      <w:r>
+        <w:rPr>
+          <w:rStyle w:val="VerbatimChar"/>
+        </w:rPr>
+        <w:t xml:space="preserve">EVENTUAL</w:t>
+      </w:r>
+      <w:r>
+        <w:t xml:space="preserve"> </w:t>
+      </w:r>
+      <w:r>
+        <w:t xml:space="preserve">čitanje sa člana 3309, izvršeno odmah posle potvrde upisa na</w:t>
+      </w:r>
+      <w:r>
+        <w:t xml:space="preserve"> </w:t>
+      </w:r>
+      <w:r>
+        <w:t xml:space="preserve">članu 3307, vratilo je staru vrednost u gotovo svim ponavljanjima, što je anomalija read-your-writes</w:t>
+      </w:r>
+      <w:r>
+        <w:t xml:space="preserve"> </w:t>
+      </w:r>
+      <w:r>
+        <w:t xml:space="preserve">(čitanje sopstvenih upisa) iz drugog poglavlja.</w:t>
+      </w:r>
+      <w:r>
+        <w:t xml:space="preserve"> </w:t>
+      </w:r>
+      <w:r>
+        <w:rPr>
+          <w:rStyle w:val="VerbatimChar"/>
+        </w:rPr>
+        <w:t xml:space="preserve">BEFORE</w:t>
+      </w:r>
+      <w:r>
+        <w:t xml:space="preserve">, postavljen samo na sesiji čitaoca,</w:t>
+      </w:r>
+      <w:r>
+        <w:t xml:space="preserve"> </w:t>
+      </w:r>
+      <w:r>
+        <w:t xml:space="preserve">uklonio je sva zastarela čitanja: pisac je potvrdu dobijao jednako brzo kao ranije, a čitanje je,</w:t>
+      </w:r>
+      <w:r>
+        <w:t xml:space="preserve"> </w:t>
+      </w:r>
+      <w:r>
+        <w:t xml:space="preserve">umesto odmah, trajalo približno koliko i primena transakcije.</w:t>
+      </w:r>
+      <w:r>
+        <w:t xml:space="preserve"> </w:t>
+      </w:r>
+      <w:r>
+        <w:rPr>
+          <w:rStyle w:val="VerbatimChar"/>
+        </w:rPr>
+        <w:t xml:space="preserve">AFTER</w:t>
+      </w:r>
+      <w:r>
+        <w:t xml:space="preserve"> </w:t>
+      </w:r>
+      <w:r>
+        <w:t xml:space="preserve">i</w:t>
+      </w:r>
+      <w:r>
+        <w:t xml:space="preserve"> </w:t>
+      </w:r>
+      <w:r>
+        <w:rPr>
+          <w:rStyle w:val="VerbatimChar"/>
+        </w:rPr>
+        <w:t xml:space="preserve">BEFORE_AND_AFTER</w:t>
+      </w:r>
+      <w:r>
+        <w:t xml:space="preserve">,</w:t>
+      </w:r>
+      <w:r>
+        <w:t xml:space="preserve"> </w:t>
+      </w:r>
+      <w:r>
+        <w:t xml:space="preserve">postavljeni na sesiji pisca, takođe su uklonili sva zastarela čitanja, ali je medijana komitovanja</w:t>
+      </w:r>
+      <w:r>
+        <w:t xml:space="preserve"> </w:t>
+      </w:r>
+      <w:r>
+        <w:t xml:space="preserve">porasla sa 16 na oko 30 milisekundi. Zatvaranje razmaka u oba slučaja košta približno jedno vreme</w:t>
+      </w:r>
+      <w:r>
+        <w:t xml:space="preserve"> </w:t>
+      </w:r>
+      <w:r>
+        <w:t xml:space="preserve">primene, a nivo bira samo ko ga plaća. Razlika ima i praktičnu posledicu:</w:t>
+      </w:r>
+      <w:r>
+        <w:t xml:space="preserve"> </w:t>
+      </w:r>
+      <w:r>
+        <w:rPr>
+          <w:rStyle w:val="VerbatimChar"/>
+        </w:rPr>
+        <w:t xml:space="preserve">BEFORE</w:t>
+      </w:r>
+      <w:r>
+        <w:t xml:space="preserve"> </w:t>
+      </w:r>
+      <w:r>
+        <w:t xml:space="preserve">štiti samo sesiju</w:t>
+      </w:r>
+      <w:r>
+        <w:t xml:space="preserve"> </w:t>
+      </w:r>
+      <w:r>
+        <w:t xml:space="preserve">koja ga je postavila, pa zahteva izmenu čitaoca, dok</w:t>
+      </w:r>
+      <w:r>
+        <w:t xml:space="preserve"> </w:t>
+      </w:r>
+      <w:r>
+        <w:rPr>
+          <w:rStyle w:val="VerbatimChar"/>
+        </w:rPr>
+        <w:t xml:space="preserve">AFTER</w:t>
+      </w:r>
+      <w:r>
+        <w:t xml:space="preserve"> </w:t>
+      </w:r>
+      <w:r>
+        <w:t xml:space="preserve">štiti svakog čitaoca tog upisa, pa je</w:t>
+      </w:r>
+      <w:r>
+        <w:t xml:space="preserve"> </w:t>
+      </w:r>
+      <w:r>
+        <w:t xml:space="preserve">jedini izbor kada se čitalac ne može menjati.</w:t>
+      </w:r>
+    </w:p>
+    <w:p>
+      <w:pPr>
+        <w:pStyle w:val="BodyText"/>
+      </w:pPr>
+      <w:r>
+        <w:t xml:space="preserve">Povezivanje nivoa sa modelima izvedeno je u ovom radu, a najviše pažnje traži</w:t>
+      </w:r>
+      <w:r>
+        <w:t xml:space="preserve"> </w:t>
+      </w:r>
+      <w:r>
+        <w:rPr>
+          <w:rStyle w:val="VerbatimChar"/>
+        </w:rPr>
+        <w:t xml:space="preserve">AFTER</w:t>
+      </w:r>
+      <w:r>
+        <w:t xml:space="preserve">. Priručnik</w:t>
+      </w:r>
+      <w:r>
+        <w:t xml:space="preserve"> </w:t>
+      </w:r>
+      <w:r>
+        <w:t xml:space="preserve">ga preporučuje upravo za slučaj u kome je potrebna stroga konzistentnost (strong consistency), na</w:t>
+      </w:r>
+      <w:r>
+        <w:t xml:space="preserve"> </w:t>
+      </w:r>
+      <w:r>
+        <w:t xml:space="preserve">primer pri promeni prava pristupa dokumentima</w:t>
+      </w:r>
+      <w:r>
+        <w:t xml:space="preserve"> </w:t>
+      </w:r>
+      <w:r>
+        <w:t xml:space="preserve">[11]</w:t>
+      </w:r>
+      <w:r>
+        <w:t xml:space="preserve">, ali u smislu drugog poglavlja on to</w:t>
+      </w:r>
+      <w:r>
+        <w:t xml:space="preserve"> </w:t>
+      </w:r>
+      <w:r>
+        <w:t xml:space="preserve">nije. Dok pisac čeka, članovi transakciju primenjuju jedan za drugim, pa čitalac na jednom članu može</w:t>
+      </w:r>
+      <w:r>
+        <w:t xml:space="preserve"> </w:t>
+      </w:r>
+      <w:r>
+        <w:t xml:space="preserve">da vidi novu vrednost, a čitalac koji kasnije pita drugi član staru.</w:t>
+      </w:r>
+      <w:r>
+        <w:t xml:space="preserve"> </w:t>
+      </w:r>
+      <w:r>
+        <w:rPr>
+          <w:rStyle w:val="VerbatimChar"/>
+        </w:rPr>
+        <w:t xml:space="preserve">AFTER</w:t>
+      </w:r>
+      <w:r>
+        <w:t xml:space="preserve"> </w:t>
+      </w:r>
+      <w:r>
+        <w:t xml:space="preserve">garantuje da posle</w:t>
+      </w:r>
+      <w:r>
+        <w:t xml:space="preserve"> </w:t>
+      </w:r>
+      <w:r>
+        <w:t xml:space="preserve">potvrde svako čitanje, na bilo kom članu, vidi upis ili noviju vrednost</w:t>
+      </w:r>
+      <w:r>
+        <w:t xml:space="preserve"> </w:t>
+      </w:r>
+      <w:r>
+        <w:t xml:space="preserve">[11]</w:t>
+      </w:r>
+      <w:r>
+        <w:t xml:space="preserve">, što je</w:t>
+      </w:r>
+      <w:r>
+        <w:t xml:space="preserve"> </w:t>
+      </w:r>
+      <w:r>
+        <w:t xml:space="preserve">read-your-writes proširen na sve klijente, a ne linearizabilnost. Stroga konzistentnost postiže se</w:t>
+      </w:r>
+      <w:r>
+        <w:t xml:space="preserve"> </w:t>
+      </w:r>
+      <w:r>
+        <w:t xml:space="preserve">tek čitanjem uz</w:t>
+      </w:r>
+      <w:r>
+        <w:t xml:space="preserve"> </w:t>
+      </w:r>
+      <w:r>
+        <w:rPr>
+          <w:rStyle w:val="VerbatimChar"/>
+        </w:rPr>
+        <w:t xml:space="preserve">BEFORE</w:t>
+      </w:r>
+      <w:r>
+        <w:t xml:space="preserve">, koje čeka sve transakcije ispred sebe u nizu.</w:t>
+      </w:r>
+    </w:p>
+    <w:p>
+      <w:pPr>
+        <w:pStyle w:val="BodyText"/>
+      </w:pPr>
+      <w:r>
+        <w:t xml:space="preserve">Group Replication na oba pitanja PACELC-a odgovara podesivo. Kada nema većine, grupa bira</w:t>
+      </w:r>
+      <w:r>
+        <w:t xml:space="preserve"> </w:t>
+      </w:r>
+      <w:r>
+        <w:t xml:space="preserve">konzistentnost i blokira upise, a dostupnost može da izabere samo operater, prisilnim obnavljanjem</w:t>
+      </w:r>
+      <w:r>
+        <w:t xml:space="preserve"> </w:t>
+      </w:r>
+      <w:r>
+        <w:t xml:space="preserve">kvoruma. Kada mreža radi, komitovanje uvek čeka da se većina složi o redosledu, a da li neko čeka i</w:t>
+      </w:r>
+      <w:r>
+        <w:t xml:space="preserve"> </w:t>
+      </w:r>
+      <w:r>
+        <w:t xml:space="preserve">na primenu, i ko, bira se za svaku sesiju posebno. Ni ovde, dakle, MySQL ne isporučuje jedan model</w:t>
+      </w:r>
+      <w:r>
+        <w:t xml:space="preserve"> </w:t>
+      </w:r>
+      <w:r>
+        <w:t xml:space="preserve">konzistentnosti, već nivo koji bira operater ili aplikacija, a cena svakog nivoa meri se</w:t>
+      </w:r>
+      <w:r>
+        <w:t xml:space="preserve"> </w:t>
+      </w:r>
+      <w:r>
+        <w:t xml:space="preserve">milisekundama kod pisca ili kod čitaoca. Šesto poglavlje prelazi na InnoDB ClusterSet, skup</w:t>
+      </w:r>
+      <w:r>
+        <w:t xml:space="preserve"> </w:t>
+      </w:r>
+      <w:r>
+        <w:t xml:space="preserve">klastera u kome MySQL između klastera bira suprotno od onoga što Group Replication bira unutar</w:t>
+      </w:r>
+      <w:r>
+        <w:t xml:space="preserve"> </w:t>
+      </w:r>
+      <w:r>
+        <w:t xml:space="preserve">jednog klastera.</w:t>
+      </w:r>
+    </w:p>
+    <w:bookmarkEnd w:id="56"/>
+    <w:bookmarkEnd w:id="57"/>
+    <w:bookmarkStart w:id="89" w:name="bibliography"/>
+    <w:p>
+      <w:pPr>
+        <w:pStyle w:val="Heading1"/>
+      </w:pPr>
+      <w:r>
         <w:t xml:space="preserve">Reference</w:t>
       </w:r>
     </w:p>
-    <w:bookmarkStart w:id="80" w:name="refs"/>
-    <w:bookmarkStart w:id="51" w:name="ref-lamport1978"/>
+    <w:bookmarkStart w:id="88" w:name="refs"/>
+    <w:bookmarkStart w:id="59" w:name="ref-lamport1978"/>
     <w:p>
       <w:pPr>
         <w:pStyle w:val="Bibliography"/>
@@ -4460,7 +6397,7 @@
       <w:r>
         <w:t xml:space="preserve"> </w:t>
       </w:r>
-      <w:hyperlink r:id="rId50">
+      <w:hyperlink r:id="rId58">
         <w:r>
           <w:rPr>
             <w:rStyle w:val="Hyperlink"/>
@@ -4472,8 +6409,8 @@
         <w:t xml:space="preserve">.</w:t>
       </w:r>
     </w:p>
-    <w:bookmarkEnd w:id="51"/>
-    <w:bookmarkStart w:id="53" w:name="ref-gilbert2002"/>
+    <w:bookmarkEnd w:id="59"/>
+    <w:bookmarkStart w:id="61" w:name="ref-gilbert2002"/>
     <w:p>
       <w:pPr>
         <w:pStyle w:val="Bibliography"/>
@@ -4512,7 +6449,7 @@
       <w:r>
         <w:t xml:space="preserve"> </w:t>
       </w:r>
-      <w:hyperlink r:id="rId52">
+      <w:hyperlink r:id="rId60">
         <w:r>
           <w:rPr>
             <w:rStyle w:val="Hyperlink"/>
@@ -4524,8 +6461,8 @@
         <w:t xml:space="preserve">.</w:t>
       </w:r>
     </w:p>
-    <w:bookmarkEnd w:id="53"/>
-    <w:bookmarkStart w:id="55" w:name="ref-herlihy1990"/>
+    <w:bookmarkEnd w:id="61"/>
+    <w:bookmarkStart w:id="63" w:name="ref-herlihy1990"/>
     <w:p>
       <w:pPr>
         <w:pStyle w:val="Bibliography"/>
@@ -4564,7 +6501,7 @@
       <w:r>
         <w:t xml:space="preserve"> </w:t>
       </w:r>
-      <w:hyperlink r:id="rId54">
+      <w:hyperlink r:id="rId62">
         <w:r>
           <w:rPr>
             <w:rStyle w:val="Hyperlink"/>
@@ -4576,8 +6513,8 @@
         <w:t xml:space="preserve">.</w:t>
       </w:r>
     </w:p>
-    <w:bookmarkEnd w:id="55"/>
-    <w:bookmarkStart w:id="57" w:name="ref-vogels2008"/>
+    <w:bookmarkEnd w:id="63"/>
+    <w:bookmarkStart w:id="65" w:name="ref-vogels2008"/>
     <w:p>
       <w:pPr>
         <w:pStyle w:val="Bibliography"/>
@@ -4616,7 +6553,7 @@
       <w:r>
         <w:t xml:space="preserve"> </w:t>
       </w:r>
-      <w:hyperlink r:id="rId56">
+      <w:hyperlink r:id="rId64">
         <w:r>
           <w:rPr>
             <w:rStyle w:val="Hyperlink"/>
@@ -4628,8 +6565,8 @@
         <w:t xml:space="preserve">.</w:t>
       </w:r>
     </w:p>
-    <w:bookmarkEnd w:id="57"/>
-    <w:bookmarkStart w:id="59" w:name="ref-terry1994"/>
+    <w:bookmarkEnd w:id="65"/>
+    <w:bookmarkStart w:id="67" w:name="ref-terry1994"/>
     <w:p>
       <w:pPr>
         <w:pStyle w:val="Bibliography"/>
@@ -4674,7 +6611,7 @@
       <w:r>
         <w:t xml:space="preserve"> </w:t>
       </w:r>
-      <w:hyperlink r:id="rId58">
+      <w:hyperlink r:id="rId66">
         <w:r>
           <w:rPr>
             <w:rStyle w:val="Hyperlink"/>
@@ -4686,8 +6623,8 @@
         <w:t xml:space="preserve">.</w:t>
       </w:r>
     </w:p>
-    <w:bookmarkEnd w:id="59"/>
-    <w:bookmarkStart w:id="60" w:name="ref-brewer2000"/>
+    <w:bookmarkEnd w:id="67"/>
+    <w:bookmarkStart w:id="68" w:name="ref-brewer2000"/>
     <w:p>
       <w:pPr>
         <w:pStyle w:val="Bibliography"/>
@@ -4730,8 +6667,8 @@
         <w:t xml:space="preserve">, Jul. 2000.</w:t>
       </w:r>
     </w:p>
-    <w:bookmarkEnd w:id="60"/>
-    <w:bookmarkStart w:id="62" w:name="ref-brewer2012"/>
+    <w:bookmarkEnd w:id="68"/>
+    <w:bookmarkStart w:id="70" w:name="ref-brewer2012"/>
     <w:p>
       <w:pPr>
         <w:pStyle w:val="Bibliography"/>
@@ -4791,7 +6728,7 @@
       <w:r>
         <w:t xml:space="preserve"> </w:t>
       </w:r>
-      <w:hyperlink r:id="rId61">
+      <w:hyperlink r:id="rId69">
         <w:r>
           <w:rPr>
             <w:rStyle w:val="Hyperlink"/>
@@ -4803,8 +6740,8 @@
         <w:t xml:space="preserve">.</w:t>
       </w:r>
     </w:p>
-    <w:bookmarkEnd w:id="62"/>
-    <w:bookmarkStart w:id="64" w:name="ref-abadi2012"/>
+    <w:bookmarkEnd w:id="70"/>
+    <w:bookmarkStart w:id="72" w:name="ref-abadi2012"/>
     <w:p>
       <w:pPr>
         <w:pStyle w:val="Bibliography"/>
@@ -4855,7 +6792,7 @@
       <w:r>
         <w:t xml:space="preserve"> </w:t>
       </w:r>
-      <w:hyperlink r:id="rId63">
+      <w:hyperlink r:id="rId71">
         <w:r>
           <w:rPr>
             <w:rStyle w:val="Hyperlink"/>
@@ -4867,8 +6804,8 @@
         <w:t xml:space="preserve">.</w:t>
       </w:r>
     </w:p>
-    <w:bookmarkEnd w:id="64"/>
-    <w:bookmarkStart w:id="65" w:name="ref-kleppmann2017"/>
+    <w:bookmarkEnd w:id="72"/>
+    <w:bookmarkStart w:id="73" w:name="ref-kleppmann2017"/>
     <w:p>
       <w:pPr>
         <w:pStyle w:val="Bibliography"/>
@@ -4899,8 +6836,8 @@
         <w:t xml:space="preserve">. Sebastopol, CA, USA: O’Reilly Media, 2017.</w:t>
       </w:r>
     </w:p>
-    <w:bookmarkEnd w:id="65"/>
-    <w:bookmarkStart w:id="67" w:name="ref-decandia2007"/>
+    <w:bookmarkEnd w:id="73"/>
+    <w:bookmarkStart w:id="75" w:name="ref-decandia2007"/>
     <w:p>
       <w:pPr>
         <w:pStyle w:val="Bibliography"/>
@@ -4958,7 +6895,7 @@
       <w:r>
         <w:t xml:space="preserve"> </w:t>
       </w:r>
-      <w:hyperlink r:id="rId66">
+      <w:hyperlink r:id="rId74">
         <w:r>
           <w:rPr>
             <w:rStyle w:val="Hyperlink"/>
@@ -4970,8 +6907,8 @@
         <w:t xml:space="preserve">.</w:t>
       </w:r>
     </w:p>
-    <w:bookmarkEnd w:id="67"/>
-    <w:bookmarkStart w:id="69" w:name="ref-mysql84refman"/>
+    <w:bookmarkEnd w:id="75"/>
+    <w:bookmarkStart w:id="77" w:name="ref-mysql84refman"/>
     <w:p>
       <w:pPr>
         <w:pStyle w:val="Bibliography"/>
@@ -5006,7 +6943,7 @@
       <w:r>
         <w:t xml:space="preserve"> </w:t>
       </w:r>
-      <w:hyperlink r:id="rId68">
+      <w:hyperlink r:id="rId76">
         <w:r>
           <w:rPr>
             <w:rStyle w:val="Hyperlink"/>
@@ -5018,8 +6955,8 @@
         <w:t xml:space="preserve">, 2024.</w:t>
       </w:r>
     </w:p>
-    <w:bookmarkEnd w:id="69"/>
-    <w:bookmarkStart w:id="71" w:name="ref-mysqlshell84"/>
+    <w:bookmarkEnd w:id="77"/>
+    <w:bookmarkStart w:id="79" w:name="ref-mysqlshell84"/>
     <w:p>
       <w:pPr>
         <w:pStyle w:val="Bibliography"/>
@@ -5054,7 +6991,7 @@
       <w:r>
         <w:t xml:space="preserve"> </w:t>
       </w:r>
-      <w:hyperlink r:id="rId70">
+      <w:hyperlink r:id="rId78">
         <w:r>
           <w:rPr>
             <w:rStyle w:val="Hyperlink"/>
@@ -5066,8 +7003,8 @@
         <w:t xml:space="preserve">, 2024.</w:t>
       </w:r>
     </w:p>
-    <w:bookmarkEnd w:id="71"/>
-    <w:bookmarkStart w:id="72" w:name="ref-lamport2001"/>
+    <w:bookmarkEnd w:id="79"/>
+    <w:bookmarkStart w:id="80" w:name="ref-lamport2001"/>
     <w:p>
       <w:pPr>
         <w:pStyle w:val="Bibliography"/>
@@ -5104,8 +7041,8 @@
         <w:t xml:space="preserve">, vol. 32, no. 4, pp. 51–58, Dec. 2001.</w:t>
       </w:r>
     </w:p>
-    <w:bookmarkEnd w:id="72"/>
-    <w:bookmarkStart w:id="73" w:name="ref-ongaro2014"/>
+    <w:bookmarkEnd w:id="80"/>
+    <w:bookmarkStart w:id="81" w:name="ref-ongaro2014"/>
     <w:p>
       <w:pPr>
         <w:pStyle w:val="Bibliography"/>
@@ -5148,8 +7085,8 @@
         <w:t xml:space="preserve">, Philadelphia, PA, USA: USENIX Association, Jun. 2014, pp. 305–320.</w:t>
       </w:r>
     </w:p>
-    <w:bookmarkEnd w:id="73"/>
-    <w:bookmarkStart w:id="75" w:name="ref-gryp2020"/>
+    <w:bookmarkEnd w:id="81"/>
+    <w:bookmarkStart w:id="83" w:name="ref-gryp2020"/>
     <w:p>
       <w:pPr>
         <w:pStyle w:val="Bibliography"/>
@@ -5190,7 +7127,7 @@
       <w:r>
         <w:t xml:space="preserve"> </w:t>
       </w:r>
-      <w:hyperlink r:id="rId74">
+      <w:hyperlink r:id="rId82">
         <w:r>
           <w:rPr>
             <w:rStyle w:val="Hyperlink"/>
@@ -5202,8 +7139,8 @@
         <w:t xml:space="preserve">, Jul. 2020.</w:t>
       </w:r>
     </w:p>
-    <w:bookmarkEnd w:id="75"/>
-    <w:bookmarkStart w:id="77" w:name="ref-mysql84relnotes"/>
+    <w:bookmarkEnd w:id="83"/>
+    <w:bookmarkStart w:id="85" w:name="ref-mysql84relnotes"/>
     <w:p>
       <w:pPr>
         <w:pStyle w:val="Bibliography"/>
@@ -5259,7 +7196,7 @@
       <w:r>
         <w:t xml:space="preserve"> </w:t>
       </w:r>
-      <w:hyperlink r:id="rId76">
+      <w:hyperlink r:id="rId84">
         <w:r>
           <w:rPr>
             <w:rStyle w:val="Hyperlink"/>
@@ -5271,8 +7208,8 @@
         <w:t xml:space="preserve">, 2024.</w:t>
       </w:r>
     </w:p>
-    <w:bookmarkEnd w:id="77"/>
-    <w:bookmarkStart w:id="79" w:name="ref-mysql572relnotes"/>
+    <w:bookmarkEnd w:id="85"/>
+    <w:bookmarkStart w:id="87" w:name="ref-mysql572relnotes"/>
     <w:p>
       <w:pPr>
         <w:pStyle w:val="Bibliography"/>
@@ -5316,7 +7253,7 @@
       <w:r>
         <w:t xml:space="preserve"> </w:t>
       </w:r>
-      <w:hyperlink r:id="rId78">
+      <w:hyperlink r:id="rId86">
         <w:r>
           <w:rPr>
             <w:rStyle w:val="Hyperlink"/>
@@ -5328,9 +7265,9 @@
         <w:t xml:space="preserve">, 2013.</w:t>
       </w:r>
     </w:p>
-    <w:bookmarkEnd w:id="79"/>
-    <w:bookmarkEnd w:id="80"/>
-    <w:bookmarkEnd w:id="81"/>
+    <w:bookmarkEnd w:id="87"/>
+    <w:bookmarkEnd w:id="88"/>
+    <w:bookmarkEnd w:id="89"/>
     <w:sectPr>
       <w:pgSz w:h="16838" w:w="11906"/>
       <w:pgMar w:bottom="1417" w:footer="708" w:gutter="0" w:header="708" w:left="1417" w:right="1417" w:top="1417"/>

</xml_diff>

<commit_message>
Ticket 18 closed: chapter 6 (geo/ClusterSet) in rad.md, Slika 6.1, Tabela 6.1, itug114 bib entry; measured ~3.15 pp
</commit_message>
<xml_diff>
--- a/Tema 3. - Replikacija i distribuirana konzistentnost u MySQL/rad.docx
+++ b/Tema 3. - Replikacija i distribuirana konzistentnost u MySQL/rad.docx
@@ -6348,17 +6348,1174 @@
     </w:p>
     <w:bookmarkEnd w:id="56"/>
     <w:bookmarkEnd w:id="57"/>
-    <w:bookmarkStart w:id="89" w:name="bibliography"/>
+    <w:bookmarkStart w:id="65" w:name="Xb2edd1293ba2a2ad2a6ef6dbdb9d14d97aa000f"/>
     <w:p>
       <w:pPr>
         <w:pStyle w:val="Heading1"/>
       </w:pPr>
       <w:r>
+        <w:t xml:space="preserve">6. Geo-distribuirana replikacija i InnoDB ClusterSet</w:t>
+      </w:r>
+    </w:p>
+    <w:p>
+      <w:pPr>
+        <w:pStyle w:val="FirstParagraph"/>
+      </w:pPr>
+      <w:r>
+        <w:t xml:space="preserve">Topologije iz prethodnih poglavlja preživljavaju otkaz pojedinačnog servera, ali ne i gubitak cele</w:t>
+      </w:r>
+      <w:r>
+        <w:t xml:space="preserve"> </w:t>
+      </w:r>
+      <w:r>
+        <w:t xml:space="preserve">lokacije, na primer centra podataka bez napajanja ili mreže. Geo-distribuirana replikacija čuva</w:t>
+      </w:r>
+      <w:r>
+        <w:t xml:space="preserve"> </w:t>
+      </w:r>
+      <w:r>
+        <w:t xml:space="preserve">kopije podataka na udaljenim lokacijama upravo zbog takvog otkaza. MySQL za nju ne nudi grupu iz</w:t>
+      </w:r>
+      <w:r>
+        <w:t xml:space="preserve"> </w:t>
+      </w:r>
+      <w:r>
+        <w:t xml:space="preserve">petog poglavlja raširenu preko lokacija, već InnoDB ClusterSet, dokumentovan u priručniku alata</w:t>
+      </w:r>
+      <w:r>
+        <w:t xml:space="preserve"> </w:t>
+      </w:r>
+      <w:r>
+        <w:t xml:space="preserve">MySQL Shell</w:t>
+      </w:r>
+      <w:r>
+        <w:t xml:space="preserve"> </w:t>
+      </w:r>
+      <w:r>
+        <w:t xml:space="preserve">[12]</w:t>
+      </w:r>
+      <w:r>
+        <w:t xml:space="preserve">.</w:t>
+      </w:r>
+    </w:p>
+    <w:bookmarkStart w:id="58" w:name="Xb58bd608dd0932bfe473e5364e1f8cff542a6c6"/>
+    <w:p>
+      <w:pPr>
+        <w:pStyle w:val="Heading2"/>
+      </w:pPr>
+      <w:r>
+        <w:t xml:space="preserve">Zašto se grupa ne razvlači preko lokacija</w:t>
+      </w:r>
+    </w:p>
+    <w:p>
+      <w:pPr>
+        <w:pStyle w:val="FirstParagraph"/>
+      </w:pPr>
+      <w:r>
+        <w:t xml:space="preserve">Udaljenost ima cenu koju nijedno podešavanje ne uklanja. Preporuka ITU-T G.114 pri planiranju</w:t>
+      </w:r>
+      <w:r>
+        <w:t xml:space="preserve"> </w:t>
+      </w:r>
+      <w:r>
+        <w:t xml:space="preserve">kašnjenja u optičkim kablovskim sistemima računa sa nekoliko mikrosekundi po kilometru</w:t>
+      </w:r>
+      <w:r>
+        <w:t xml:space="preserve"> </w:t>
+      </w:r>
+      <w:r>
+        <w:t xml:space="preserve">[18]</w:t>
+      </w:r>
+      <w:r>
+        <w:t xml:space="preserve">, pa povratno putovanje između lokacija udaljenih hiljadu kilometara traje najmanje</w:t>
+      </w:r>
+      <w:r>
+        <w:t xml:space="preserve"> </w:t>
+      </w:r>
+      <w:r>
+        <w:t xml:space="preserve">desetak milisekundi, pre bilo kakve obrade. Komitovanje u grupi čeka da se većina složi o mestu</w:t>
+      </w:r>
+      <w:r>
+        <w:t xml:space="preserve"> </w:t>
+      </w:r>
+      <w:r>
+        <w:t xml:space="preserve">transakcije u zajedničkom nizu, pa grupa čija se većina ne može sastaviti na jednoj lokaciji svako</w:t>
+      </w:r>
+      <w:r>
+        <w:t xml:space="preserve"> </w:t>
+      </w:r>
+      <w:r>
+        <w:t xml:space="preserve">komitovanje plaća bar jednim povratnim putovanjem između lokacija. Primena kod ostalih članova i</w:t>
+      </w:r>
+      <w:r>
+        <w:t xml:space="preserve"> </w:t>
+      </w:r>
+      <w:r>
+        <w:t xml:space="preserve">dalje je asinhrona, ali dogovor o redosledu nije. Ako se, naprotiv, većina smesti na jednu lokaciju,</w:t>
+      </w:r>
+      <w:r>
+        <w:t xml:space="preserve"> </w:t>
+      </w:r>
+      <w:r>
+        <w:t xml:space="preserve">komitovanje je brzo, ali gubitak te lokacije ostavlja ostatak grupe bez kvoruma, pa on blokira</w:t>
+      </w:r>
+      <w:r>
+        <w:t xml:space="preserve"> </w:t>
+      </w:r>
+      <w:r>
+        <w:t xml:space="preserve">upise, kao u tabeli 5.1. Ova dilema izvedena je iz načina rada grupe, a ne izmerena.</w:t>
+      </w:r>
+    </w:p>
+    <w:p>
+      <w:pPr>
+        <w:pStyle w:val="BodyText"/>
+      </w:pPr>
+      <w:r>
+        <w:t xml:space="preserve">Druga cena je stabilnost. Priručnik navodi da je Group Replication projektovan za okruženje u kome</w:t>
+      </w:r>
+      <w:r>
+        <w:t xml:space="preserve"> </w:t>
+      </w:r>
+      <w:r>
+        <w:t xml:space="preserve">su instance veoma blizu jedna drugoj, i da latencija i propusni opseg mreže utiču na performanse i</w:t>
+      </w:r>
+      <w:r>
+        <w:t xml:space="preserve"> </w:t>
+      </w:r>
+      <w:r>
+        <w:t xml:space="preserve">na stabilnost grupe</w:t>
+      </w:r>
+      <w:r>
+        <w:t xml:space="preserve"> </w:t>
+      </w:r>
+      <w:r>
+        <w:t xml:space="preserve">[11]</w:t>
+      </w:r>
+      <w:r>
+        <w:t xml:space="preserve">. Mehanizam nestabilnosti je izbacivanje člana iz grupe</w:t>
+      </w:r>
+      <w:r>
+        <w:t xml:space="preserve"> </w:t>
+      </w:r>
+      <w:r>
+        <w:t xml:space="preserve">(expel): posle početnog perioda detekcije od 5 s član postaje sumnjiv (suspicion), a ako se ne javi</w:t>
+      </w:r>
+      <w:r>
+        <w:t xml:space="preserve"> </w:t>
+      </w:r>
+      <w:r>
+        <w:t xml:space="preserve">ni tokom narednih</w:t>
+      </w:r>
+      <w:r>
+        <w:t xml:space="preserve"> </w:t>
+      </w:r>
+      <w:r>
+        <w:rPr>
+          <w:rStyle w:val="VerbatimChar"/>
+        </w:rPr>
+        <w:t xml:space="preserve">group_replication_member_expel_timeout</w:t>
+      </w:r>
+      <w:r>
+        <w:t xml:space="preserve"> </w:t>
+      </w:r>
+      <w:r>
+        <w:t xml:space="preserve">sekundi, podrazumevano 5, grupa ga</w:t>
+      </w:r>
+      <w:r>
+        <w:t xml:space="preserve"> </w:t>
+      </w:r>
+      <w:r>
+        <w:t xml:space="preserve">izbacuje</w:t>
+      </w:r>
+      <w:r>
+        <w:t xml:space="preserve"> </w:t>
+      </w:r>
+      <w:r>
+        <w:t xml:space="preserve">[11]</w:t>
+      </w:r>
+      <w:r>
+        <w:t xml:space="preserve">. Na vezi između lokacija kratak prekid ili zagušenje može tako da izbaci ispravan</w:t>
+      </w:r>
+      <w:r>
+        <w:t xml:space="preserve"> </w:t>
+      </w:r>
+      <w:r>
+        <w:t xml:space="preserve">član, koji se zatim vraća u grupu i nadoknađuje propušteno. Na topologiji ovog rada, čija su sva tri</w:t>
+      </w:r>
+      <w:r>
+        <w:t xml:space="preserve"> </w:t>
+      </w:r>
+      <w:r>
+        <w:t xml:space="preserve">čvora na istom računaru, to se ne može pokazati, pa se odeljak oslanja na priručnik, a ne na merenje.</w:t>
+      </w:r>
+    </w:p>
+    <w:bookmarkEnd w:id="58"/>
+    <w:bookmarkStart w:id="62" w:name="Xbb651aec57a7709f776bd58b4127f0f4f4b32b2"/>
+    <w:p>
+      <w:pPr>
+        <w:pStyle w:val="Heading2"/>
+      </w:pPr>
+      <w:r>
+        <w:t xml:space="preserve">InnoDB ClusterSet: grupa unutar lokacije, asinhrono između</w:t>
+      </w:r>
+    </w:p>
+    <w:p>
+      <w:pPr>
+        <w:pStyle w:val="FirstParagraph"/>
+      </w:pPr>
+      <w:r>
+        <w:t xml:space="preserve">MySQL ovaj problem ne rešava razvlačenjem grupe, već povezivanjem više grupa. InnoDB ClusterSet,</w:t>
+      </w:r>
+      <w:r>
+        <w:t xml:space="preserve"> </w:t>
+      </w:r>
+      <w:r>
+        <w:t xml:space="preserve">prema priručniku, pruža otpornost na katastrofu (disaster tolerance) tako što primarni InnoDB Cluster</w:t>
+      </w:r>
+      <w:r>
+        <w:t xml:space="preserve"> </w:t>
+      </w:r>
+      <w:r>
+        <w:t xml:space="preserve">povezuje sa jednom ili više njegovih replika na drugim lokacijama, na primer u drugim centrima</w:t>
+      </w:r>
+      <w:r>
+        <w:t xml:space="preserve"> </w:t>
+      </w:r>
+      <w:r>
+        <w:t xml:space="preserve">podataka</w:t>
+      </w:r>
+      <w:r>
+        <w:t xml:space="preserve"> </w:t>
+      </w:r>
+      <w:r>
+        <w:t xml:space="preserve">[12]</w:t>
+      </w:r>
+      <w:r>
+        <w:t xml:space="preserve">. Svaka lokacija ima sopstveni klaster sa Group Replication, a između</w:t>
+      </w:r>
+      <w:r>
+        <w:t xml:space="preserve"> </w:t>
+      </w:r>
+      <w:r>
+        <w:t xml:space="preserve">klastera radi asinhroni kanal</w:t>
+      </w:r>
+      <w:r>
+        <w:t xml:space="preserve"> </w:t>
+      </w:r>
+      <w:r>
+        <w:rPr>
+          <w:rStyle w:val="VerbatimChar"/>
+        </w:rPr>
+        <w:t xml:space="preserve">clusterset_replication</w:t>
+      </w:r>
+      <w:r>
+        <w:t xml:space="preserve">, kojim primarni klaster (primary cluster)</w:t>
+      </w:r>
+      <w:r>
+        <w:t xml:space="preserve"> </w:t>
+      </w:r>
+      <w:r>
+        <w:t xml:space="preserve">šalje transakcije replika-klasterima (replica clusters). Upise prima samo primarni server primarnog</w:t>
+      </w:r>
+      <w:r>
+        <w:t xml:space="preserve"> </w:t>
+      </w:r>
+      <w:r>
+        <w:t xml:space="preserve">klastera, a svi klasteri moraju da rade u režimu single-primary</w:t>
+      </w:r>
+      <w:r>
+        <w:t xml:space="preserve"> </w:t>
+      </w:r>
+      <w:r>
+        <w:t xml:space="preserve">[12]</w:t>
+      </w:r>
+      <w:r>
+        <w:t xml:space="preserve">. U celom skupu</w:t>
+      </w:r>
+      <w:r>
+        <w:t xml:space="preserve"> </w:t>
+      </w:r>
+      <w:r>
+        <w:t xml:space="preserve">postoji, dakle, jedan pisac, pa sukob između lokacija nije potrebno razrešavati: arhitektura ga</w:t>
+      </w:r>
+      <w:r>
+        <w:t xml:space="preserve"> </w:t>
+      </w:r>
+      <w:r>
+        <w:t xml:space="preserve">sprečava, umesto da ga posle razrešava, kao što unutar grupe čini certification.</w:t>
+      </w:r>
+    </w:p>
+    <w:p>
+      <w:pPr>
+        <w:pStyle w:val="BodyText"/>
+      </w:pPr>
+      <w:r>
+        <w:t xml:space="preserve">Na topologiji ovog rada ClusterSet je podignut alatom MySQL Shell, naredbama</w:t>
+      </w:r>
+      <w:r>
+        <w:t xml:space="preserve"> </w:t>
+      </w:r>
+      <w:r>
+        <w:rPr>
+          <w:rStyle w:val="VerbatimChar"/>
+        </w:rPr>
+        <w:t xml:space="preserve">createClusterSet()</w:t>
+      </w:r>
+      <w:r>
+        <w:t xml:space="preserve"> </w:t>
+      </w:r>
+      <w:r>
+        <w:t xml:space="preserve">i</w:t>
+      </w:r>
+      <w:r>
+        <w:t xml:space="preserve"> </w:t>
+      </w:r>
+      <w:r>
+        <w:rPr>
+          <w:rStyle w:val="VerbatimChar"/>
+        </w:rPr>
+        <w:t xml:space="preserve">createReplicaCluster()</w:t>
+      </w:r>
+      <w:r>
+        <w:t xml:space="preserve">. Klaster sme da ima i samo jednog člana, pa primarni klaster</w:t>
+      </w:r>
+      <w:r>
+        <w:t xml:space="preserve"> </w:t>
+      </w:r>
+      <w:r>
+        <w:rPr>
+          <w:rStyle w:val="VerbatimChar"/>
+        </w:rPr>
+        <w:t xml:space="preserve">poliklinikaCluster</w:t>
+      </w:r>
+      <w:r>
+        <w:t xml:space="preserve"> </w:t>
+      </w:r>
+      <w:r>
+        <w:t xml:space="preserve">čine članovi 3307 i 3308, a replika-klaster</w:t>
+      </w:r>
+      <w:r>
+        <w:t xml:space="preserve"> </w:t>
+      </w:r>
+      <w:r>
+        <w:rPr>
+          <w:rStyle w:val="VerbatimChar"/>
+        </w:rPr>
+        <w:t xml:space="preserve">drCluster</w:t>
+      </w:r>
+      <w:r>
+        <w:t xml:space="preserve"> </w:t>
+      </w:r>
+      <w:r>
+        <w:t xml:space="preserve">član 3309 (slika 6.1).</w:t>
+      </w:r>
+      <w:r>
+        <w:t xml:space="preserve"> </w:t>
+      </w:r>
+      <w:r>
+        <w:t xml:space="preserve">Pokušaj upisa odbijen je i na 3308 i na 3309 greškom 1290, jer oba rade uz</w:t>
+      </w:r>
+      <w:r>
+        <w:t xml:space="preserve"> </w:t>
+      </w:r>
+      <w:r>
+        <w:rPr>
+          <w:rStyle w:val="VerbatimChar"/>
+        </w:rPr>
+        <w:t xml:space="preserve">super_read_only = ON</w:t>
+      </w:r>
+      <w:r>
+        <w:t xml:space="preserve">.</w:t>
+      </w:r>
+      <w:r>
+        <w:t xml:space="preserve"> </w:t>
+      </w:r>
+      <w:r>
+        <w:t xml:space="preserve">Potvrda koju klijent dobija znači da je transakciju primila većina primarnog klastera, a kanal ka</w:t>
+      </w:r>
+      <w:r>
+        <w:t xml:space="preserve"> </w:t>
+      </w:r>
+      <w:r>
+        <w:t xml:space="preserve">replika-klasteru ona ne čeka. Transakcije koje se u tom</w:t>
+      </w:r>
+      <w:r>
+        <w:t xml:space="preserve"> </w:t>
+      </w:r>
+      <w:r>
+        <w:t xml:space="preserve">trenutku nalaze u kanalu postoje samo na lokaciji A, što je prozor gubitka asinhrone replikacije iz</w:t>
+      </w:r>
+      <w:r>
+        <w:t xml:space="preserve"> </w:t>
+      </w:r>
+      <w:r>
+        <w:t xml:space="preserve">trećeg poglavlja, ovog puta na nivou cele lokacije.</w:t>
+      </w:r>
+    </w:p>
+    <w:p>
+      <w:pPr>
+        <w:pStyle w:val="CaptionedFigure"/>
+      </w:pPr>
+      <w:r>
+        <w:drawing>
+          <wp:inline>
+            <wp:extent cx="5753100" cy="2876550"/>
+            <wp:effectExtent b="0" l="0" r="0" t="0"/>
+            <wp:docPr descr="Slika 6.1: InnoDB ClusterSet na topologiji ovog rada. Unutar primarnog klastera potvrda čeka većinu, a kanal clusterset_replication ka replika-klasteru je asinhron, pa transakcije u kanalu čine prozor gubitka. Obe lokacije nalaze se na istom računaru, pa između njih nema stvarne udaljenosti." title="" id="60" name="Picture"/>
+            <a:graphic>
+              <a:graphicData uri="http://schemas.openxmlformats.org/drawingml/2006/picture">
+                <pic:pic>
+                  <pic:nvPicPr>
+                    <pic:cNvPr descr="figures/06-geo-01-clusterset.png" id="61" name="Picture"/>
+                    <pic:cNvPicPr>
+                      <a:picLocks noChangeArrowheads="1" noChangeAspect="1"/>
+                    </pic:cNvPicPr>
+                  </pic:nvPicPr>
+                  <pic:blipFill>
+                    <a:blip r:embed="rId59"/>
+                    <a:stretch>
+                      <a:fillRect/>
+                    </a:stretch>
+                  </pic:blipFill>
+                  <pic:spPr bwMode="auto">
+                    <a:xfrm>
+                      <a:off x="0" y="0"/>
+                      <a:ext cx="5753100" cy="2876550"/>
+                    </a:xfrm>
+                    <a:prstGeom prst="rect">
+                      <a:avLst/>
+                    </a:prstGeom>
+                    <a:noFill/>
+                    <a:ln w="9525">
+                      <a:noFill/>
+                      <a:headEnd/>
+                      <a:tailEnd/>
+                    </a:ln>
+                  </pic:spPr>
+                </pic:pic>
+              </a:graphicData>
+            </a:graphic>
+          </wp:inline>
+        </w:drawing>
+      </w:r>
+    </w:p>
+    <w:p>
+      <w:pPr>
+        <w:pStyle w:val="ImageCaption"/>
+      </w:pPr>
+      <w:r>
+        <w:t xml:space="preserve">Slika 6.1: InnoDB ClusterSet na topologiji ovog rada. Unutar primarnog klastera potvrda čeka većinu, a kanal</w:t>
+      </w:r>
+      <w:r>
+        <w:t xml:space="preserve"> </w:t>
+      </w:r>
+      <w:r>
+        <w:rPr>
+          <w:rStyle w:val="VerbatimChar"/>
+        </w:rPr>
+        <w:t xml:space="preserve">clusterset_replication</w:t>
+      </w:r>
+      <w:r>
+        <w:t xml:space="preserve"> </w:t>
+      </w:r>
+      <w:r>
+        <w:t xml:space="preserve">ka replika-klasteru je asinhron, pa transakcije u kanalu čine prozor gubitka. Obe lokacije nalaze se na istom računaru, pa između njih nema stvarne udaljenosti.</w:t>
+      </w:r>
+    </w:p>
+    <w:bookmarkEnd w:id="62"/>
+    <w:bookmarkStart w:id="63" w:name="switchover-i-prinudni-failover"/>
+    <w:p>
+      <w:pPr>
+        <w:pStyle w:val="Heading2"/>
+      </w:pPr>
+      <w:r>
+        <w:t xml:space="preserve">Switchover i prinudni failover</w:t>
+      </w:r>
+    </w:p>
+    <w:p>
+      <w:pPr>
+        <w:pStyle w:val="FirstParagraph"/>
+      </w:pPr>
+      <w:r>
+        <w:t xml:space="preserve">Četvrto poglavlje razlikuje switchover, planiranu promenu uloga dok je stari izvor dostupan, od</w:t>
+      </w:r>
+      <w:r>
+        <w:t xml:space="preserve"> </w:t>
+      </w:r>
+      <w:r>
+        <w:t xml:space="preserve">failovera posle otkaza. ClusterSet ima obe operacije, a priručnik switchover opisuje kao promenu</w:t>
+      </w:r>
+      <w:r>
+        <w:t xml:space="preserve"> </w:t>
+      </w:r>
+      <w:r>
+        <w:t xml:space="preserve">koja se izvodi dok je primarni klaster još dostupan, na primer radi održavanja</w:t>
+      </w:r>
+      <w:r>
+        <w:t xml:space="preserve"> </w:t>
+      </w:r>
+      <w:r>
+        <w:t xml:space="preserve">[12]</w:t>
+      </w:r>
+      <w:r>
+        <w:t xml:space="preserve">. Pri</w:t>
+      </w:r>
+      <w:r>
+        <w:t xml:space="preserve"> </w:t>
+      </w:r>
+      <w:r>
+        <w:t xml:space="preserve">switchoveru, naredbom</w:t>
+      </w:r>
+      <w:r>
+        <w:t xml:space="preserve"> </w:t>
+      </w:r>
+      <w:r>
+        <w:rPr>
+          <w:rStyle w:val="VerbatimChar"/>
+        </w:rPr>
+        <w:t xml:space="preserve">setPrimaryCluster()</w:t>
+      </w:r>
+      <w:r>
+        <w:t xml:space="preserve">, alat je ispisao svoje korake: replika-klaster najpre</w:t>
+      </w:r>
+      <w:r>
+        <w:t xml:space="preserve"> </w:t>
+      </w:r>
+      <w:r>
+        <w:t xml:space="preserve">primenjuje sve primljene transakcije, zatim se zaključavaju članovi starog primarnog klastera, a</w:t>
+      </w:r>
+      <w:r>
+        <w:t xml:space="preserve"> </w:t>
+      </w:r>
+      <w:r>
+        <w:t xml:space="preserve">na kraju se preostale transakcije sinhronizuju na novom primarnom članu. Stari primarni klaster je</w:t>
+      </w:r>
+      <w:r>
+        <w:t xml:space="preserve"> </w:t>
+      </w:r>
+      <w:r>
+        <w:t xml:space="preserve">dostupan i zaključan, pa može da preda sve, i nijedna transakcija se ne gubi.</w:t>
+      </w:r>
+    </w:p>
+    <w:p>
+      <w:pPr>
+        <w:pStyle w:val="BodyText"/>
+      </w:pPr>
+      <w:r>
+        <w:t xml:space="preserve">Prinudni failover (emergency failover) izazvan je tako što su procesi članova 3307 i 3308 prinudno</w:t>
+      </w:r>
+      <w:r>
+        <w:t xml:space="preserve"> </w:t>
+      </w:r>
+      <w:r>
+        <w:t xml:space="preserve">zaustavljeni, čime je nestala cela lokacija A. Replika-klaster se nije sam unapredio: član 3309 je</w:t>
+      </w:r>
+      <w:r>
+        <w:t xml:space="preserve"> </w:t>
+      </w:r>
+      <w:r>
+        <w:t xml:space="preserve">i posle 20 s radio uz</w:t>
+      </w:r>
+      <w:r>
+        <w:t xml:space="preserve"> </w:t>
+      </w:r>
+      <w:r>
+        <w:rPr>
+          <w:rStyle w:val="VerbatimChar"/>
+        </w:rPr>
+        <w:t xml:space="preserve">super_read_only = ON</w:t>
+      </w:r>
+      <w:r>
+        <w:t xml:space="preserve"> </w:t>
+      </w:r>
+      <w:r>
+        <w:t xml:space="preserve">i odbijao upise, a MySQL Shell je primarni klaster</w:t>
+      </w:r>
+      <w:r>
+        <w:t xml:space="preserve"> </w:t>
+      </w:r>
+      <w:r>
+        <w:t xml:space="preserve">prijavio kao nedostupan. Priručnik prinudni failover i opisuje kao postupak operatera, naredbom</w:t>
+      </w:r>
+      <w:r>
+        <w:t xml:space="preserve"> </w:t>
+      </w:r>
+      <w:r>
+        <w:rPr>
+          <w:rStyle w:val="VerbatimChar"/>
+        </w:rPr>
+        <w:t xml:space="preserve">forcePrimaryCluster()</w:t>
+      </w:r>
+      <w:r>
+        <w:t xml:space="preserve"> </w:t>
+      </w:r>
+      <w:r>
+        <w:t xml:space="preserve">[12]</w:t>
+      </w:r>
+      <w:r>
+        <w:t xml:space="preserve">. Posle te naredbe 3309 je primao upise, a alat je upozorio</w:t>
+      </w:r>
+      <w:r>
+        <w:t xml:space="preserve"> </w:t>
+      </w:r>
+      <w:r>
+        <w:t xml:space="preserve">da je stari primarni klaster označen kao</w:t>
+      </w:r>
+      <w:r>
+        <w:t xml:space="preserve"> </w:t>
+      </w:r>
+      <w:r>
+        <w:rPr>
+          <w:rStyle w:val="VerbatimChar"/>
+        </w:rPr>
+        <w:t xml:space="preserve">INVALIDATED</w:t>
+      </w:r>
+      <w:r>
+        <w:t xml:space="preserve">, da transakcije koje nisu stigle da se</w:t>
+      </w:r>
+      <w:r>
+        <w:t xml:space="preserve"> </w:t>
+      </w:r>
+      <w:r>
+        <w:t xml:space="preserve">repliciraju mogu biti izgubljene i da je moguć split brain ako je stari klaster i dalje aktivan, pa</w:t>
+      </w:r>
+      <w:r>
+        <w:t xml:space="preserve"> </w:t>
+      </w:r>
+      <w:r>
+        <w:t xml:space="preserve">ga treba ograditi od upisa ili od celog saobraćaja (fencing). Priručnik kaže isto: tokom prinudnog</w:t>
+      </w:r>
+      <w:r>
+        <w:t xml:space="preserve"> </w:t>
+      </w:r>
+      <w:r>
+        <w:t xml:space="preserve">failovera konzistentnost podataka nije obezbeđena i nema garancije da će podaci biti sačuvani</w:t>
+      </w:r>
+      <w:r>
+        <w:t xml:space="preserve"> </w:t>
+      </w:r>
+      <w:r>
+        <w:t xml:space="preserve">[12]</w:t>
+      </w:r>
+      <w:r>
+        <w:t xml:space="preserve">. Ponovo pokrenut, stari klaster nije se sam vratio u skup, već tek naredbom</w:t>
+      </w:r>
+      <w:r>
+        <w:t xml:space="preserve"> </w:t>
+      </w:r>
+      <w:r>
+        <w:rPr>
+          <w:rStyle w:val="VerbatimChar"/>
+        </w:rPr>
+        <w:t xml:space="preserve">rejoinCluster()</w:t>
+      </w:r>
+      <w:r>
+        <w:t xml:space="preserve">, posle koje je preuzeo istoriju novog primarnog klastera. Tabela 6.1 poredi dve</w:t>
+      </w:r>
+      <w:r>
+        <w:t xml:space="preserve"> </w:t>
+      </w:r>
+      <w:r>
+        <w:t xml:space="preserve">operacije. Switchover je desetine puta brži, ali razlika koja odlučuje</w:t>
+      </w:r>
+      <w:r>
+        <w:t xml:space="preserve"> </w:t>
+      </w:r>
+      <w:r>
+        <w:t xml:space="preserve">nije u trajanju, već u tome ko može da preda transakcije.</w:t>
+      </w:r>
+    </w:p>
+    <w:p>
+      <w:pPr>
+        <w:pStyle w:val="TableCaption"/>
+      </w:pPr>
+      <w:r>
+        <w:t xml:space="preserve">Tabela 6.1: Switchover i prinudni failover u ClusterSet-u na topologiji ovog rada (MySQL 8.4.11, MySQL Shell 8.4.10, jedan računar, bez opterećenja). Switchover je izveden u oba smera, a failover jednom; ranije merenje na istoj topologiji dalo je 0,48 s i 23 s.</w:t>
+      </w:r>
+    </w:p>
+    <w:tbl>
+      <w:tblPr>
+        <w:tblStyle w:val="Table"/>
+        <w:tblW w:type="pct" w:w="5000"/>
+        <w:tblLayout w:type="fixed"/>
+        <w:tblLook w:firstRow="1" w:lastRow="0" w:firstColumn="0" w:lastColumn="0" w:noHBand="0" w:noVBand="0" w:val="0020"/>
+        <w:tblCaption w:val="Tabela 6.1: Switchover i prinudni failover u ClusterSet-u na topologiji ovog rada (MySQL 8.4.11, MySQL Shell 8.4.10, jedan računar, bez opterećenja). Switchover je izveden u oba smera, a failover jednom; ranije merenje na istoj topologiji dalo je 0,48 s i 23 s."/>
+      </w:tblPr>
+      <w:tblGrid>
+        <w:gridCol w:w="2640"/>
+        <w:gridCol w:w="2640"/>
+        <w:gridCol w:w="2640"/>
+      </w:tblGrid>
+      <w:tr>
+        <w:trPr>
+          <w:tblHeader w:val="on"/>
+        </w:trPr>
+        <w:tc>
+          <w:tcPr/>
+          <w:p>
+            <w:pPr>
+              <w:pStyle w:val="Compact"/>
+            </w:pPr>
+          </w:p>
+        </w:tc>
+        <w:tc>
+          <w:tcPr/>
+          <w:p>
+            <w:pPr>
+              <w:pStyle w:val="Compact"/>
+            </w:pPr>
+            <w:r>
+              <w:t xml:space="preserve">Switchover</w:t>
+            </w:r>
+          </w:p>
+        </w:tc>
+        <w:tc>
+          <w:tcPr/>
+          <w:p>
+            <w:pPr>
+              <w:pStyle w:val="Compact"/>
+            </w:pPr>
+            <w:r>
+              <w:t xml:space="preserve">Prinudni failover</w:t>
+            </w:r>
+          </w:p>
+        </w:tc>
+      </w:tr>
+      <w:tr>
+        <w:tc>
+          <w:tcPr/>
+          <w:p>
+            <w:pPr>
+              <w:pStyle w:val="Compact"/>
+            </w:pPr>
+            <w:r>
+              <w:t xml:space="preserve">Naredba u alatu MySQL Shell</w:t>
+            </w:r>
+          </w:p>
+        </w:tc>
+        <w:tc>
+          <w:tcPr/>
+          <w:p>
+            <w:pPr>
+              <w:pStyle w:val="Compact"/>
+            </w:pPr>
+            <w:r>
+              <w:rPr>
+                <w:rStyle w:val="VerbatimChar"/>
+              </w:rPr>
+              <w:t xml:space="preserve">setPrimaryCluster()</w:t>
+            </w:r>
+          </w:p>
+        </w:tc>
+        <w:tc>
+          <w:tcPr/>
+          <w:p>
+            <w:pPr>
+              <w:pStyle w:val="Compact"/>
+            </w:pPr>
+            <w:r>
+              <w:rPr>
+                <w:rStyle w:val="VerbatimChar"/>
+              </w:rPr>
+              <w:t xml:space="preserve">forcePrimaryCluster()</w:t>
+            </w:r>
+          </w:p>
+        </w:tc>
+      </w:tr>
+      <w:tr>
+        <w:tc>
+          <w:tcPr/>
+          <w:p>
+            <w:pPr>
+              <w:pStyle w:val="Compact"/>
+            </w:pPr>
+            <w:r>
+              <w:t xml:space="preserve">Stari primarni klaster</w:t>
+            </w:r>
+          </w:p>
+        </w:tc>
+        <w:tc>
+          <w:tcPr/>
+          <w:p>
+            <w:pPr>
+              <w:pStyle w:val="Compact"/>
+            </w:pPr>
+            <w:r>
+              <w:t xml:space="preserve">dostupan, zaključan i ispražnjen</w:t>
+            </w:r>
+          </w:p>
+        </w:tc>
+        <w:tc>
+          <w:tcPr/>
+          <w:p>
+            <w:pPr>
+              <w:pStyle w:val="Compact"/>
+            </w:pPr>
+            <w:r>
+              <w:t xml:space="preserve">procesi 3307 i 3308 zaustavljeni</w:t>
+            </w:r>
+          </w:p>
+        </w:tc>
+      </w:tr>
+      <w:tr>
+        <w:tc>
+          <w:tcPr/>
+          <w:p>
+            <w:pPr>
+              <w:pStyle w:val="Compact"/>
+            </w:pPr>
+            <w:r>
+              <w:t xml:space="preserve">Ko pokreće promenu</w:t>
+            </w:r>
+          </w:p>
+        </w:tc>
+        <w:tc>
+          <w:tcPr/>
+          <w:p>
+            <w:pPr>
+              <w:pStyle w:val="Compact"/>
+            </w:pPr>
+            <w:r>
+              <w:t xml:space="preserve">operater</w:t>
+            </w:r>
+          </w:p>
+        </w:tc>
+        <w:tc>
+          <w:tcPr/>
+          <w:p>
+            <w:pPr>
+              <w:pStyle w:val="Compact"/>
+            </w:pPr>
+            <w:r>
+              <w:t xml:space="preserve">operater; 3309 se nije sam unapredio</w:t>
+            </w:r>
+          </w:p>
+        </w:tc>
+      </w:tr>
+      <w:tr>
+        <w:tc>
+          <w:tcPr/>
+          <w:p>
+            <w:pPr>
+              <w:pStyle w:val="Compact"/>
+            </w:pPr>
+            <w:r>
+              <w:t xml:space="preserve">Trajanje naredbe</w:t>
+            </w:r>
+          </w:p>
+        </w:tc>
+        <w:tc>
+          <w:tcPr/>
+          <w:p>
+            <w:pPr>
+              <w:pStyle w:val="Compact"/>
+            </w:pPr>
+            <w:r>
+              <w:t xml:space="preserve">0,44 s i 0,54 s</w:t>
+            </w:r>
+          </w:p>
+        </w:tc>
+        <w:tc>
+          <w:tcPr/>
+          <w:p>
+            <w:pPr>
+              <w:pStyle w:val="Compact"/>
+            </w:pPr>
+            <w:r>
+              <w:t xml:space="preserve">21,6 s</w:t>
+            </w:r>
+          </w:p>
+        </w:tc>
+      </w:tr>
+      <w:tr>
+        <w:tc>
+          <w:tcPr/>
+          <w:p>
+            <w:pPr>
+              <w:pStyle w:val="Compact"/>
+            </w:pPr>
+            <w:r>
+              <w:t xml:space="preserve">Transakcije u kanalu</w:t>
+            </w:r>
+          </w:p>
+        </w:tc>
+        <w:tc>
+          <w:tcPr/>
+          <w:p>
+            <w:pPr>
+              <w:pStyle w:val="Compact"/>
+            </w:pPr>
+            <w:r>
+              <w:t xml:space="preserve">predate novom primarnom</w:t>
+            </w:r>
+          </w:p>
+        </w:tc>
+        <w:tc>
+          <w:tcPr/>
+          <w:p>
+            <w:pPr>
+              <w:pStyle w:val="Compact"/>
+            </w:pPr>
+            <w:r>
+              <w:t xml:space="preserve">mogu biti izgubljene</w:t>
+            </w:r>
+          </w:p>
+        </w:tc>
+      </w:tr>
+      <w:tr>
+        <w:tc>
+          <w:tcPr/>
+          <w:p>
+            <w:pPr>
+              <w:pStyle w:val="Compact"/>
+            </w:pPr>
+            <w:r>
+              <w:t xml:space="preserve">Stari klaster posle promene</w:t>
+            </w:r>
+          </w:p>
+        </w:tc>
+        <w:tc>
+          <w:tcPr/>
+          <w:p>
+            <w:pPr>
+              <w:pStyle w:val="Compact"/>
+            </w:pPr>
+            <w:r>
+              <w:t xml:space="preserve">replika-klaster, radi odmah</w:t>
+            </w:r>
+          </w:p>
+        </w:tc>
+        <w:tc>
+          <w:tcPr/>
+          <w:p>
+            <w:pPr>
+              <w:pStyle w:val="Compact"/>
+            </w:pPr>
+            <w:r>
+              <w:rPr>
+                <w:rStyle w:val="VerbatimChar"/>
+              </w:rPr>
+              <w:t xml:space="preserve">INVALIDATED</w:t>
+            </w:r>
+            <w:r>
+              <w:t xml:space="preserve">, vraća se naredbom</w:t>
+            </w:r>
+            <w:r>
+              <w:t xml:space="preserve"> </w:t>
+            </w:r>
+            <w:r>
+              <w:rPr>
+                <w:rStyle w:val="VerbatimChar"/>
+              </w:rPr>
+              <w:t xml:space="preserve">rejoinCluster()</w:t>
+            </w:r>
+          </w:p>
+        </w:tc>
+      </w:tr>
+    </w:tbl>
+    <w:p>
+      <w:pPr>
+        <w:pStyle w:val="BodyText"/>
+      </w:pPr>
+      <w:r>
+        <w:t xml:space="preserve">MySQL Router, podešen da prati primarni klaster, posle failovera za nekoliko sekundi sam preusmerava</w:t>
+      </w:r>
+      <w:r>
+        <w:t xml:space="preserve"> </w:t>
+      </w:r>
+      <w:r>
+        <w:t xml:space="preserve">saobraćaj na novi primarni klaster</w:t>
+      </w:r>
+      <w:r>
+        <w:t xml:space="preserve"> </w:t>
+      </w:r>
+      <w:r>
+        <w:t xml:space="preserve">[12]</w:t>
+      </w:r>
+      <w:r>
+        <w:t xml:space="preserve">. Automatsko je, dakle, preusmeravanje veza, a ne</w:t>
+      </w:r>
+      <w:r>
+        <w:t xml:space="preserve"> </w:t>
+      </w:r>
+      <w:r>
+        <w:t xml:space="preserve">odluka o unapređenju.</w:t>
+      </w:r>
+    </w:p>
+    <w:bookmarkEnd w:id="63"/>
+    <w:bookmarkStart w:id="64" w:name="dva-nivoa-dva-cap-izbora"/>
+    <w:p>
+      <w:pPr>
+        <w:pStyle w:val="Heading2"/>
+      </w:pPr>
+      <w:r>
+        <w:t xml:space="preserve">Dva nivoa, dva CAP izbora</w:t>
+      </w:r>
+    </w:p>
+    <w:p>
+      <w:pPr>
+        <w:pStyle w:val="FirstParagraph"/>
+      </w:pPr>
+      <w:r>
+        <w:t xml:space="preserve">Priručnik alata MySQL Shell oba izbora navodi u dve uzastopne rečenice: „InnoDB ClusterSet</w:t>
+      </w:r>
+      <w:r>
+        <w:t xml:space="preserve"> </w:t>
+      </w:r>
+      <w:r>
+        <w:t xml:space="preserve">prioritizes availability over data consistency in order to maximize disaster tolerance. Consistency</w:t>
+      </w:r>
+      <w:r>
+        <w:t xml:space="preserve"> </w:t>
+      </w:r>
+      <w:r>
+        <w:t xml:space="preserve">within each individual InnoDB Cluster is guaranteed by the underlying Group Replication technology.“</w:t>
+      </w:r>
+      <w:r>
+        <w:t xml:space="preserve"> </w:t>
+      </w:r>
+      <w:r>
+        <w:t xml:space="preserve">[12]</w:t>
+      </w:r>
+      <w:r>
+        <w:t xml:space="preserve">. Između klastera ClusterSet, dakle, daje prednost dostupnosti nad konzistentnošću</w:t>
+      </w:r>
+      <w:r>
+        <w:t xml:space="preserve"> </w:t>
+      </w:r>
+      <w:r>
+        <w:t xml:space="preserve">podataka, a unutar svakog klastera konzistentnost obezbeđuje Group Replication. Unutar klastera to</w:t>
+      </w:r>
+      <w:r>
+        <w:t xml:space="preserve"> </w:t>
+      </w:r>
+      <w:r>
+        <w:t xml:space="preserve">je izmereno u petom poglavlju: grupa bez većine blokira upis, a referentni priručnik kaže da sistem</w:t>
+      </w:r>
+      <w:r>
+        <w:t xml:space="preserve"> </w:t>
+      </w:r>
+      <w:r>
+        <w:t xml:space="preserve">tada ne napreduje dok se problem ne reši</w:t>
+      </w:r>
+      <w:r>
+        <w:t xml:space="preserve"> </w:t>
+      </w:r>
+      <w:r>
+        <w:t xml:space="preserve">[11]</w:t>
+      </w:r>
+      <w:r>
+        <w:t xml:space="preserve">. Između klastera važi suprotno: kanal je</w:t>
+      </w:r>
+      <w:r>
+        <w:t xml:space="preserve"> </w:t>
+      </w:r>
+      <w:r>
+        <w:t xml:space="preserve">asinhron, replika-klasteri mogu da zaostaju, a prinudni failover prihvata gubitak transakcija da</w:t>
+      </w:r>
+      <w:r>
+        <w:t xml:space="preserve"> </w:t>
+      </w:r>
+      <w:r>
+        <w:t xml:space="preserve">bi preživela lokacija mogla da prima upise. Isti proizvod tako na dva nivoa zauzima suprotne</w:t>
+      </w:r>
+      <w:r>
+        <w:t xml:space="preserve"> </w:t>
+      </w:r>
+      <w:r>
+        <w:t xml:space="preserve">pozicije teoreme CAP, i to sopstvenim rečima.</w:t>
+      </w:r>
+    </w:p>
+    <w:p>
+      <w:pPr>
+        <w:pStyle w:val="BodyText"/>
+      </w:pPr>
+      <w:r>
+        <w:t xml:space="preserve">Merenje dodaje pojedinost važniju od same izjave. Do naredbe</w:t>
+      </w:r>
+      <w:r>
+        <w:t xml:space="preserve"> </w:t>
+      </w:r>
+      <w:r>
+        <w:rPr>
+          <w:rStyle w:val="VerbatimChar"/>
+        </w:rPr>
+        <w:t xml:space="preserve">forcePrimaryCluster()</w:t>
+      </w:r>
+      <w:r>
+        <w:t xml:space="preserve"> </w:t>
+      </w:r>
+      <w:r>
+        <w:t xml:space="preserve">replika-klaster</w:t>
+      </w:r>
+      <w:r>
+        <w:t xml:space="preserve"> </w:t>
+      </w:r>
+      <w:r>
+        <w:t xml:space="preserve">je odbijao upise, odnosno ponašao se kao sistem koji bira konzistentnost. Dostupnost između klastera</w:t>
+      </w:r>
+      <w:r>
+        <w:t xml:space="preserve"> </w:t>
+      </w:r>
+      <w:r>
+        <w:t xml:space="preserve">nije svojstvo koje ClusterSet sam ostvaruje, već odluka koju operater donosi jednom naredbom,</w:t>
+      </w:r>
+      <w:r>
+        <w:t xml:space="preserve"> </w:t>
+      </w:r>
+      <w:r>
+        <w:t xml:space="preserve">prihvatajući prozor gubitka i rizik da nastane split brain. Na drugo pitanje PACELC-a, kada mreža radi,</w:t>
+      </w:r>
+      <w:r>
+        <w:t xml:space="preserve"> </w:t>
+      </w:r>
+      <w:r>
+        <w:t xml:space="preserve">ClusterSet bira nisku latenciju umesto konzistentnosti: komitovanje čeka samo većinu na jednoj</w:t>
+      </w:r>
+      <w:r>
+        <w:t xml:space="preserve"> </w:t>
+      </w:r>
+      <w:r>
+        <w:t xml:space="preserve">lokaciji, a replika-klasteri zaostaju onoliko koliko iznosi kašnjenje replikacije. Geo-distribucija</w:t>
+      </w:r>
+      <w:r>
+        <w:t xml:space="preserve"> </w:t>
+      </w:r>
+      <w:r>
+        <w:t xml:space="preserve">tako potvrđuje osnovnu tezu ovog rada u najjasnijem obliku: MySQL ne isporučuje jedan model</w:t>
+      </w:r>
+      <w:r>
+        <w:t xml:space="preserve"> </w:t>
+      </w:r>
+      <w:r>
+        <w:t xml:space="preserve">konzistentnosti, već na svakom nivou drugačiju podrazumevanu odluku i naredbu kojom je operater</w:t>
+      </w:r>
+      <w:r>
+        <w:t xml:space="preserve"> </w:t>
+      </w:r>
+      <w:r>
+        <w:t xml:space="preserve">menja. Sedmo poglavlje vraća se na replike unutar jedne lokacije, koje služe za skaliranje čitanja,</w:t>
+      </w:r>
+      <w:r>
+        <w:t xml:space="preserve"> </w:t>
+      </w:r>
+      <w:r>
+        <w:t xml:space="preserve">i na kašnjenje replikacije koje pri tome vide čitaoci.</w:t>
+      </w:r>
+    </w:p>
+    <w:bookmarkEnd w:id="64"/>
+    <w:bookmarkEnd w:id="65"/>
+    <w:bookmarkStart w:id="99" w:name="bibliography"/>
+    <w:p>
+      <w:pPr>
+        <w:pStyle w:val="Heading1"/>
+      </w:pPr>
+      <w:r>
         <w:t xml:space="preserve">Reference</w:t>
       </w:r>
     </w:p>
-    <w:bookmarkStart w:id="88" w:name="refs"/>
-    <w:bookmarkStart w:id="59" w:name="ref-lamport1978"/>
+    <w:bookmarkStart w:id="98" w:name="refs"/>
+    <w:bookmarkStart w:id="67" w:name="ref-lamport1978"/>
     <w:p>
       <w:pPr>
         <w:pStyle w:val="Bibliography"/>
@@ -6397,7 +7554,7 @@
       <w:r>
         <w:t xml:space="preserve"> </w:t>
       </w:r>
-      <w:hyperlink r:id="rId58">
+      <w:hyperlink r:id="rId66">
         <w:r>
           <w:rPr>
             <w:rStyle w:val="Hyperlink"/>
@@ -6409,8 +7566,8 @@
         <w:t xml:space="preserve">.</w:t>
       </w:r>
     </w:p>
-    <w:bookmarkEnd w:id="59"/>
-    <w:bookmarkStart w:id="61" w:name="ref-gilbert2002"/>
+    <w:bookmarkEnd w:id="67"/>
+    <w:bookmarkStart w:id="69" w:name="ref-gilbert2002"/>
     <w:p>
       <w:pPr>
         <w:pStyle w:val="Bibliography"/>
@@ -6449,7 +7606,7 @@
       <w:r>
         <w:t xml:space="preserve"> </w:t>
       </w:r>
-      <w:hyperlink r:id="rId60">
+      <w:hyperlink r:id="rId68">
         <w:r>
           <w:rPr>
             <w:rStyle w:val="Hyperlink"/>
@@ -6461,8 +7618,8 @@
         <w:t xml:space="preserve">.</w:t>
       </w:r>
     </w:p>
-    <w:bookmarkEnd w:id="61"/>
-    <w:bookmarkStart w:id="63" w:name="ref-herlihy1990"/>
+    <w:bookmarkEnd w:id="69"/>
+    <w:bookmarkStart w:id="71" w:name="ref-herlihy1990"/>
     <w:p>
       <w:pPr>
         <w:pStyle w:val="Bibliography"/>
@@ -6501,7 +7658,7 @@
       <w:r>
         <w:t xml:space="preserve"> </w:t>
       </w:r>
-      <w:hyperlink r:id="rId62">
+      <w:hyperlink r:id="rId70">
         <w:r>
           <w:rPr>
             <w:rStyle w:val="Hyperlink"/>
@@ -6513,8 +7670,8 @@
         <w:t xml:space="preserve">.</w:t>
       </w:r>
     </w:p>
-    <w:bookmarkEnd w:id="63"/>
-    <w:bookmarkStart w:id="65" w:name="ref-vogels2008"/>
+    <w:bookmarkEnd w:id="71"/>
+    <w:bookmarkStart w:id="73" w:name="ref-vogels2008"/>
     <w:p>
       <w:pPr>
         <w:pStyle w:val="Bibliography"/>
@@ -6553,7 +7710,7 @@
       <w:r>
         <w:t xml:space="preserve"> </w:t>
       </w:r>
-      <w:hyperlink r:id="rId64">
+      <w:hyperlink r:id="rId72">
         <w:r>
           <w:rPr>
             <w:rStyle w:val="Hyperlink"/>
@@ -6565,8 +7722,8 @@
         <w:t xml:space="preserve">.</w:t>
       </w:r>
     </w:p>
-    <w:bookmarkEnd w:id="65"/>
-    <w:bookmarkStart w:id="67" w:name="ref-terry1994"/>
+    <w:bookmarkEnd w:id="73"/>
+    <w:bookmarkStart w:id="75" w:name="ref-terry1994"/>
     <w:p>
       <w:pPr>
         <w:pStyle w:val="Bibliography"/>
@@ -6611,7 +7768,7 @@
       <w:r>
         <w:t xml:space="preserve"> </w:t>
       </w:r>
-      <w:hyperlink r:id="rId66">
+      <w:hyperlink r:id="rId74">
         <w:r>
           <w:rPr>
             <w:rStyle w:val="Hyperlink"/>
@@ -6623,8 +7780,8 @@
         <w:t xml:space="preserve">.</w:t>
       </w:r>
     </w:p>
-    <w:bookmarkEnd w:id="67"/>
-    <w:bookmarkStart w:id="68" w:name="ref-brewer2000"/>
+    <w:bookmarkEnd w:id="75"/>
+    <w:bookmarkStart w:id="76" w:name="ref-brewer2000"/>
     <w:p>
       <w:pPr>
         <w:pStyle w:val="Bibliography"/>
@@ -6667,8 +7824,8 @@
         <w:t xml:space="preserve">, Jul. 2000.</w:t>
       </w:r>
     </w:p>
-    <w:bookmarkEnd w:id="68"/>
-    <w:bookmarkStart w:id="70" w:name="ref-brewer2012"/>
+    <w:bookmarkEnd w:id="76"/>
+    <w:bookmarkStart w:id="78" w:name="ref-brewer2012"/>
     <w:p>
       <w:pPr>
         <w:pStyle w:val="Bibliography"/>
@@ -6728,7 +7885,7 @@
       <w:r>
         <w:t xml:space="preserve"> </w:t>
       </w:r>
-      <w:hyperlink r:id="rId69">
+      <w:hyperlink r:id="rId77">
         <w:r>
           <w:rPr>
             <w:rStyle w:val="Hyperlink"/>
@@ -6740,8 +7897,8 @@
         <w:t xml:space="preserve">.</w:t>
       </w:r>
     </w:p>
-    <w:bookmarkEnd w:id="70"/>
-    <w:bookmarkStart w:id="72" w:name="ref-abadi2012"/>
+    <w:bookmarkEnd w:id="78"/>
+    <w:bookmarkStart w:id="80" w:name="ref-abadi2012"/>
     <w:p>
       <w:pPr>
         <w:pStyle w:val="Bibliography"/>
@@ -6792,7 +7949,7 @@
       <w:r>
         <w:t xml:space="preserve"> </w:t>
       </w:r>
-      <w:hyperlink r:id="rId71">
+      <w:hyperlink r:id="rId79">
         <w:r>
           <w:rPr>
             <w:rStyle w:val="Hyperlink"/>
@@ -6804,8 +7961,8 @@
         <w:t xml:space="preserve">.</w:t>
       </w:r>
     </w:p>
-    <w:bookmarkEnd w:id="72"/>
-    <w:bookmarkStart w:id="73" w:name="ref-kleppmann2017"/>
+    <w:bookmarkEnd w:id="80"/>
+    <w:bookmarkStart w:id="81" w:name="ref-kleppmann2017"/>
     <w:p>
       <w:pPr>
         <w:pStyle w:val="Bibliography"/>
@@ -6836,8 +7993,8 @@
         <w:t xml:space="preserve">. Sebastopol, CA, USA: O’Reilly Media, 2017.</w:t>
       </w:r>
     </w:p>
-    <w:bookmarkEnd w:id="73"/>
-    <w:bookmarkStart w:id="75" w:name="ref-decandia2007"/>
+    <w:bookmarkEnd w:id="81"/>
+    <w:bookmarkStart w:id="83" w:name="ref-decandia2007"/>
     <w:p>
       <w:pPr>
         <w:pStyle w:val="Bibliography"/>
@@ -6895,7 +8052,7 @@
       <w:r>
         <w:t xml:space="preserve"> </w:t>
       </w:r>
-      <w:hyperlink r:id="rId74">
+      <w:hyperlink r:id="rId82">
         <w:r>
           <w:rPr>
             <w:rStyle w:val="Hyperlink"/>
@@ -6907,8 +8064,8 @@
         <w:t xml:space="preserve">.</w:t>
       </w:r>
     </w:p>
-    <w:bookmarkEnd w:id="75"/>
-    <w:bookmarkStart w:id="77" w:name="ref-mysql84refman"/>
+    <w:bookmarkEnd w:id="83"/>
+    <w:bookmarkStart w:id="85" w:name="ref-mysql84refman"/>
     <w:p>
       <w:pPr>
         <w:pStyle w:val="Bibliography"/>
@@ -6943,7 +8100,7 @@
       <w:r>
         <w:t xml:space="preserve"> </w:t>
       </w:r>
-      <w:hyperlink r:id="rId76">
+      <w:hyperlink r:id="rId84">
         <w:r>
           <w:rPr>
             <w:rStyle w:val="Hyperlink"/>
@@ -6955,8 +8112,8 @@
         <w:t xml:space="preserve">, 2024.</w:t>
       </w:r>
     </w:p>
-    <w:bookmarkEnd w:id="77"/>
-    <w:bookmarkStart w:id="79" w:name="ref-mysqlshell84"/>
+    <w:bookmarkEnd w:id="85"/>
+    <w:bookmarkStart w:id="87" w:name="ref-mysqlshell84"/>
     <w:p>
       <w:pPr>
         <w:pStyle w:val="Bibliography"/>
@@ -6991,7 +8148,7 @@
       <w:r>
         <w:t xml:space="preserve"> </w:t>
       </w:r>
-      <w:hyperlink r:id="rId78">
+      <w:hyperlink r:id="rId86">
         <w:r>
           <w:rPr>
             <w:rStyle w:val="Hyperlink"/>
@@ -7003,8 +8160,8 @@
         <w:t xml:space="preserve">, 2024.</w:t>
       </w:r>
     </w:p>
-    <w:bookmarkEnd w:id="79"/>
-    <w:bookmarkStart w:id="80" w:name="ref-lamport2001"/>
+    <w:bookmarkEnd w:id="87"/>
+    <w:bookmarkStart w:id="88" w:name="ref-lamport2001"/>
     <w:p>
       <w:pPr>
         <w:pStyle w:val="Bibliography"/>
@@ -7041,8 +8198,8 @@
         <w:t xml:space="preserve">, vol. 32, no. 4, pp. 51–58, Dec. 2001.</w:t>
       </w:r>
     </w:p>
-    <w:bookmarkEnd w:id="80"/>
-    <w:bookmarkStart w:id="81" w:name="ref-ongaro2014"/>
+    <w:bookmarkEnd w:id="88"/>
+    <w:bookmarkStart w:id="89" w:name="ref-ongaro2014"/>
     <w:p>
       <w:pPr>
         <w:pStyle w:val="Bibliography"/>
@@ -7085,8 +8242,8 @@
         <w:t xml:space="preserve">, Philadelphia, PA, USA: USENIX Association, Jun. 2014, pp. 305–320.</w:t>
       </w:r>
     </w:p>
-    <w:bookmarkEnd w:id="81"/>
-    <w:bookmarkStart w:id="83" w:name="ref-gryp2020"/>
+    <w:bookmarkEnd w:id="89"/>
+    <w:bookmarkStart w:id="91" w:name="ref-gryp2020"/>
     <w:p>
       <w:pPr>
         <w:pStyle w:val="Bibliography"/>
@@ -7127,7 +8284,7 @@
       <w:r>
         <w:t xml:space="preserve"> </w:t>
       </w:r>
-      <w:hyperlink r:id="rId82">
+      <w:hyperlink r:id="rId90">
         <w:r>
           <w:rPr>
             <w:rStyle w:val="Hyperlink"/>
@@ -7139,8 +8296,8 @@
         <w:t xml:space="preserve">, Jul. 2020.</w:t>
       </w:r>
     </w:p>
-    <w:bookmarkEnd w:id="83"/>
-    <w:bookmarkStart w:id="85" w:name="ref-mysql84relnotes"/>
+    <w:bookmarkEnd w:id="91"/>
+    <w:bookmarkStart w:id="93" w:name="ref-mysql84relnotes"/>
     <w:p>
       <w:pPr>
         <w:pStyle w:val="Bibliography"/>
@@ -7196,7 +8353,7 @@
       <w:r>
         <w:t xml:space="preserve"> </w:t>
       </w:r>
-      <w:hyperlink r:id="rId84">
+      <w:hyperlink r:id="rId92">
         <w:r>
           <w:rPr>
             <w:rStyle w:val="Hyperlink"/>
@@ -7208,8 +8365,8 @@
         <w:t xml:space="preserve">, 2024.</w:t>
       </w:r>
     </w:p>
-    <w:bookmarkEnd w:id="85"/>
-    <w:bookmarkStart w:id="87" w:name="ref-mysql572relnotes"/>
+    <w:bookmarkEnd w:id="93"/>
+    <w:bookmarkStart w:id="95" w:name="ref-mysql572relnotes"/>
     <w:p>
       <w:pPr>
         <w:pStyle w:val="Bibliography"/>
@@ -7253,7 +8410,7 @@
       <w:r>
         <w:t xml:space="preserve"> </w:t>
       </w:r>
-      <w:hyperlink r:id="rId86">
+      <w:hyperlink r:id="rId94">
         <w:r>
           <w:rPr>
             <w:rStyle w:val="Hyperlink"/>
@@ -7265,9 +8422,66 @@
         <w:t xml:space="preserve">, 2013.</w:t>
       </w:r>
     </w:p>
-    <w:bookmarkEnd w:id="87"/>
-    <w:bookmarkEnd w:id="88"/>
-    <w:bookmarkEnd w:id="89"/>
+    <w:bookmarkEnd w:id="95"/>
+    <w:bookmarkStart w:id="97" w:name="ref-itug114"/>
+    <w:p>
+      <w:pPr>
+        <w:pStyle w:val="Bibliography"/>
+      </w:pPr>
+      <w:r>
+        <w:t xml:space="preserve">[18]</w:t>
+      </w:r>
+      <w:r>
+        <w:t xml:space="preserve"> </w:t>
+      </w:r>
+      <w:r>
+        <w:t xml:space="preserve">	</w:t>
+      </w:r>
+      <w:r>
+        <w:t xml:space="preserve">International Telecommunication Union,</w:t>
+      </w:r>
+      <w:r>
+        <w:t xml:space="preserve"> </w:t>
+      </w:r>
+      <w:r>
+        <w:t xml:space="preserve">“</w:t>
+      </w:r>
+      <w:r>
+        <w:t xml:space="preserve">ITU-T</w:t>
+      </w:r>
+      <w:r>
+        <w:t xml:space="preserve"> </w:t>
+      </w:r>
+      <w:r>
+        <w:t xml:space="preserve">recommendation</w:t>
+      </w:r>
+      <w:r>
+        <w:t xml:space="preserve"> </w:t>
+      </w:r>
+      <w:r>
+        <w:t xml:space="preserve">G.114</w:t>
+      </w:r>
+      <w:r>
+        <w:t xml:space="preserve">: One-way transmission time.”</w:t>
+      </w:r>
+      <w:r>
+        <w:t xml:space="preserve"> </w:t>
+      </w:r>
+      <w:hyperlink r:id="rId96">
+        <w:r>
+          <w:rPr>
+            <w:rStyle w:val="Hyperlink"/>
+          </w:rPr>
+          <w:t xml:space="preserve">https://www.itu.int/rec/T-REC-G.114/en</w:t>
+        </w:r>
+      </w:hyperlink>
+      <w:r>
+        <w:t xml:space="preserve">, May 2003.</w:t>
+      </w:r>
+    </w:p>
+    <w:bookmarkEnd w:id="97"/>
+    <w:bookmarkEnd w:id="98"/>
+    <w:bookmarkEnd w:id="99"/>
     <w:sectPr>
       <w:pgSz w:h="16838" w:w="11906"/>
       <w:pgMar w:bottom="1417" w:footer="708" w:gutter="0" w:header="708" w:left="1417" w:right="1417" w:top="1417"/>

</xml_diff>

<commit_message>
Ticket 19 closed: chapter 7 (read scaling, lag) in rad.md, Slika 7.1, Tabela 7.1, mysqlrouter84 bib entry; measured ~3.5 pp
</commit_message>
<xml_diff>
--- a/Tema 3. - Replikacija i distribuirana konzistentnost u MySQL/rad.docx
+++ b/Tema 3. - Replikacija i distribuirana konzistentnost u MySQL/rad.docx
@@ -7505,17 +7505,1543 @@
     </w:p>
     <w:bookmarkEnd w:id="64"/>
     <w:bookmarkEnd w:id="65"/>
-    <w:bookmarkStart w:id="99" w:name="bibliography"/>
+    <w:bookmarkStart w:id="74" w:name="X5195cba4f36551ab2d12c23321a792c827bee79"/>
     <w:p>
       <w:pPr>
         <w:pStyle w:val="Heading1"/>
       </w:pPr>
       <w:r>
+        <w:t xml:space="preserve">7. Skaliranje čitanja i kašnjenje replikacije</w:t>
+      </w:r>
+    </w:p>
+    <w:p>
+      <w:pPr>
+        <w:pStyle w:val="FirstParagraph"/>
+      </w:pPr>
+      <w:r>
+        <w:t xml:space="preserve">Prethodna poglavlja koristila su replike da bi podaci preživeli otkaz, a ovo ih koristi da preuzmu</w:t>
+      </w:r>
+      <w:r>
+        <w:t xml:space="preserve"> </w:t>
+      </w:r>
+      <w:r>
+        <w:t xml:space="preserve">deo čitanja. Priručnik takvo skaliranje (scale-out) preporučuje kada čitanja ima mnogo, a upisa</w:t>
+      </w:r>
+      <w:r>
+        <w:t xml:space="preserve"> </w:t>
+      </w:r>
+      <w:r>
+        <w:t xml:space="preserve">malo, i od aplikacije traži da sve upise šalje izvoru, a čitanja izvoru ili replici</w:t>
+      </w:r>
+      <w:r>
+        <w:t xml:space="preserve"> </w:t>
+      </w:r>
+      <w:r>
+        <w:t xml:space="preserve">[11]</w:t>
+      </w:r>
+      <w:r>
+        <w:t xml:space="preserve">. Replika za čitanje (read replica) tako dodaje kapacitet za čitanje, ali je</w:t>
+      </w:r>
+      <w:r>
+        <w:t xml:space="preserve"> </w:t>
+      </w:r>
+      <w:r>
+        <w:t xml:space="preserve">replikacija podrazumevano asinhrona, pa čitalac na replici može da ne vidi upis koji je izvor već</w:t>
+      </w:r>
+      <w:r>
+        <w:t xml:space="preserve"> </w:t>
+      </w:r>
+      <w:r>
+        <w:t xml:space="preserve">potvrdio.</w:t>
+      </w:r>
+    </w:p>
+    <w:bookmarkStart w:id="66" w:name="kašnjenje-jedne-transakcije"/>
+    <w:p>
+      <w:pPr>
+        <w:pStyle w:val="Heading2"/>
+      </w:pPr>
+      <w:r>
+        <w:t xml:space="preserve">Kašnjenje jedne transakcije</w:t>
+      </w:r>
+    </w:p>
+    <w:p>
+      <w:pPr>
+        <w:pStyle w:val="FirstParagraph"/>
+      </w:pPr>
+      <w:r>
+        <w:t xml:space="preserve">Kašnjenje replikacije ovde se definiše za pojedinačnu transakciju, preko tri vremenske oznake</w:t>
+      </w:r>
+      <w:r>
+        <w:t xml:space="preserve"> </w:t>
+      </w:r>
+      <w:r>
+        <w:t xml:space="preserve">(timestamps) koje MySQL beleži u tabelama šeme</w:t>
+      </w:r>
+      <w:r>
+        <w:t xml:space="preserve"> </w:t>
+      </w:r>
+      <w:r>
+        <w:rPr>
+          <w:rStyle w:val="VerbatimChar"/>
+        </w:rPr>
+        <w:t xml:space="preserve">performance_schema</w:t>
+      </w:r>
+      <w:r>
+        <w:t xml:space="preserve">: t0, trenutak komitovanja na</w:t>
+      </w:r>
+      <w:r>
+        <w:t xml:space="preserve"> </w:t>
+      </w:r>
+      <w:r>
+        <w:t xml:space="preserve">izvornom serveru, t1, trenutak upisa u relay log replike, i t2, trenutak u kome je nit primene</w:t>
+      </w:r>
+      <w:r>
+        <w:t xml:space="preserve"> </w:t>
+      </w:r>
+      <w:r>
+        <w:t xml:space="preserve">završila primenu</w:t>
+      </w:r>
+      <w:r>
+        <w:t xml:space="preserve"> </w:t>
+      </w:r>
+      <w:r>
+        <w:t xml:space="preserve">[11]</w:t>
+      </w:r>
+      <w:r>
+        <w:t xml:space="preserve">. Kašnjenje je razlika t2 − t0 i obuhvata obe faze, fazu prijema</w:t>
+      </w:r>
+      <w:r>
+        <w:t xml:space="preserve"> </w:t>
+      </w:r>
+      <w:r>
+        <w:t xml:space="preserve">(od t0 do t1) i fazu primene (od t1 do t2). Koja faza preovlađuje pitanje je merenja, a ne</w:t>
+      </w:r>
+      <w:r>
+        <w:t xml:space="preserve"> </w:t>
+      </w:r>
+      <w:r>
+        <w:t xml:space="preserve">definicije. Na topologiji ovog rada jedan upis u tabelu</w:t>
+      </w:r>
+      <w:r>
+        <w:t xml:space="preserve"> </w:t>
+      </w:r>
+      <w:r>
+        <w:rPr>
+          <w:rStyle w:val="VerbatimChar"/>
+        </w:rPr>
+        <w:t xml:space="preserve">heartbeat</w:t>
+      </w:r>
+      <w:r>
+        <w:t xml:space="preserve"> </w:t>
+      </w:r>
+      <w:r>
+        <w:t xml:space="preserve">stigao je u relay log replike</w:t>
+      </w:r>
+      <w:r>
+        <w:t xml:space="preserve"> </w:t>
+      </w:r>
+      <w:r>
+        <w:t xml:space="preserve">3309 za manje od milisekunde, a primenjen je približno pet milisekundi kasnije, pa je faza primene</w:t>
+      </w:r>
+      <w:r>
+        <w:t xml:space="preserve"> </w:t>
+      </w:r>
+      <w:r>
+        <w:t xml:space="preserve">činila gotovo devet desetina kašnjenja.</w:t>
+      </w:r>
+    </w:p>
+    <w:p>
+      <w:pPr>
+        <w:pStyle w:val="BodyText"/>
+      </w:pPr>
+      <w:r>
+        <w:t xml:space="preserve">Isto važi i pod opterećenjem, kao što je treće poglavlje najavilo. Izvor 3307 je iz četiri sesije,</w:t>
+      </w:r>
+      <w:r>
+        <w:t xml:space="preserve"> </w:t>
+      </w:r>
+      <w:r>
+        <w:t xml:space="preserve">za manje od sekunde, komitovao dve hiljade jednorednih upisa u tabelu</w:t>
+      </w:r>
+      <w:r>
+        <w:t xml:space="preserve"> </w:t>
+      </w:r>
+      <w:r>
+        <w:rPr>
+          <w:rStyle w:val="VerbatimChar"/>
+        </w:rPr>
+        <w:t xml:space="preserve">visits</w:t>
+      </w:r>
+      <w:r>
+        <w:t xml:space="preserve">, a replika 3309</w:t>
+      </w:r>
+      <w:r>
+        <w:t xml:space="preserve"> </w:t>
+      </w:r>
+      <w:r>
+        <w:t xml:space="preserve">imala je samo jednu nit primene. Relay log je dostigao konačnu veličinu za manje od sekunde, a</w:t>
+      </w:r>
+      <w:r>
+        <w:t xml:space="preserve"> </w:t>
+      </w:r>
+      <w:r>
+        <w:t xml:space="preserve">kašnjenje je raslo još tridesetak sekundi, koliko je jednoj niti trebalo da sve primeni (slika</w:t>
+      </w:r>
+      <w:r>
+        <w:t xml:space="preserve"> </w:t>
+      </w:r>
+      <w:r>
+        <w:t xml:space="preserve">7.1). Zaostatak se, dakle, gomila iza relay loga, a ne u mreži.</w:t>
+      </w:r>
+    </w:p>
+    <w:bookmarkEnd w:id="66"/>
+    <w:bookmarkStart w:id="70" w:name="seconds_behind_source-i-vremenske-oznake"/>
+    <w:p>
+      <w:pPr>
+        <w:pStyle w:val="Heading2"/>
+      </w:pPr>
+      <w:r>
+        <w:t xml:space="preserve">Seconds_Behind_Source i vremenske oznake</w:t>
+      </w:r>
+    </w:p>
+    <w:p>
+      <w:pPr>
+        <w:pStyle w:val="FirstParagraph"/>
+      </w:pPr>
+      <w:r>
+        <w:t xml:space="preserve">Uobičajena mera kašnjenja je polje</w:t>
+      </w:r>
+      <w:r>
+        <w:t xml:space="preserve"> </w:t>
+      </w:r>
+      <w:r>
+        <w:rPr>
+          <w:rStyle w:val="VerbatimChar"/>
+        </w:rPr>
+        <w:t xml:space="preserve">Seconds_Behind_Source</w:t>
+      </w:r>
+      <w:r>
+        <w:t xml:space="preserve"> </w:t>
+      </w:r>
+      <w:r>
+        <w:t xml:space="preserve">naredbe</w:t>
+      </w:r>
+      <w:r>
+        <w:t xml:space="preserve"> </w:t>
+      </w:r>
+      <w:r>
+        <w:rPr>
+          <w:rStyle w:val="VerbatimChar"/>
+        </w:rPr>
+        <w:t xml:space="preserve">SHOW REPLICA STATUS</w:t>
+      </w:r>
+      <w:r>
+        <w:t xml:space="preserve">. Prema</w:t>
+      </w:r>
+      <w:r>
+        <w:t xml:space="preserve"> </w:t>
+      </w:r>
+      <w:r>
+        <w:t xml:space="preserve">priručniku, dok replika obrađuje izmene, ono prikazuje razliku između trenutnog vremena na replici i</w:t>
+      </w:r>
+      <w:r>
+        <w:t xml:space="preserve"> </w:t>
+      </w:r>
+      <w:r>
+        <w:t xml:space="preserve">vremenske oznake koju je izvor zabeležio za događaj koji replika upravo obrađuje</w:t>
+      </w:r>
+      <w:r>
+        <w:t xml:space="preserve"> </w:t>
+      </w:r>
+      <w:r>
+        <w:t xml:space="preserve">[11]</w:t>
+      </w:r>
+      <w:r>
+        <w:t xml:space="preserve">.</w:t>
+      </w:r>
+      <w:r>
+        <w:t xml:space="preserve"> </w:t>
+      </w:r>
+      <w:r>
+        <w:t xml:space="preserve">Iz te rečenice slede tri slabosti. Prvo, polje posmatra samo događaj u niti primene, pa fazu prijema</w:t>
+      </w:r>
+      <w:r>
+        <w:t xml:space="preserve"> </w:t>
+      </w:r>
+      <w:r>
+        <w:t xml:space="preserve">ne vidi: priručnik upozorava da je ono korisno samo na brzoj mreži, jer na sporoj nit primene često</w:t>
+      </w:r>
+      <w:r>
+        <w:t xml:space="preserve"> </w:t>
+      </w:r>
+      <w:r>
+        <w:t xml:space="preserve">sustigne nit prijema, pa polje pokazuje nulu iako nit prijema kasni za izvorom</w:t>
+      </w:r>
+      <w:r>
+        <w:t xml:space="preserve"> </w:t>
+      </w:r>
+      <w:r>
+        <w:t xml:space="preserve">[11]</w:t>
+      </w:r>
+      <w:r>
+        <w:t xml:space="preserve">.</w:t>
+      </w:r>
+      <w:r>
+        <w:t xml:space="preserve"> </w:t>
+      </w:r>
+      <w:r>
+        <w:t xml:space="preserve">Drugo, vreme replike i oznaka izvora potiču sa dva različita sata, pa se razlika satova (clock skew)</w:t>
+      </w:r>
+      <w:r>
+        <w:t xml:space="preserve"> </w:t>
+      </w:r>
+      <w:r>
+        <w:t xml:space="preserve">računa jednom, pri pokretanju niti prijema, uz pretpostavku da posle toga ostaje stalna. Treće, kod</w:t>
+      </w:r>
+      <w:r>
+        <w:t xml:space="preserve"> </w:t>
+      </w:r>
+      <w:r>
+        <w:t xml:space="preserve">replike sa više niti primene vrednost se zasniva na jednoj poziciji u logu izvora, pa ne mora da</w:t>
+      </w:r>
+      <w:r>
+        <w:t xml:space="preserve"> </w:t>
+      </w:r>
+      <w:r>
+        <w:t xml:space="preserve">odgovara poslednjoj komitovanoj transakciji</w:t>
+      </w:r>
+      <w:r>
+        <w:t xml:space="preserve"> </w:t>
+      </w:r>
+      <w:r>
+        <w:t xml:space="preserve">[11]</w:t>
+      </w:r>
+      <w:r>
+        <w:t xml:space="preserve">. Uz to, polje kašnjenje izražava u</w:t>
+      </w:r>
+      <w:r>
+        <w:t xml:space="preserve"> </w:t>
+      </w:r>
+      <w:r>
+        <w:t xml:space="preserve">celim sekundama.</w:t>
+      </w:r>
+    </w:p>
+    <w:p>
+      <w:pPr>
+        <w:pStyle w:val="BodyText"/>
+      </w:pPr>
+      <w:r>
+        <w:t xml:space="preserve">Kao preporučeni način praćenja kašnjenja priručnik navodi upravo tabele šeme</w:t>
+      </w:r>
+      <w:r>
+        <w:t xml:space="preserve"> </w:t>
+      </w:r>
+      <w:r>
+        <w:rPr>
+          <w:rStyle w:val="VerbatimChar"/>
+        </w:rPr>
+        <w:t xml:space="preserve">performance_schema</w:t>
+      </w:r>
+      <w:r>
+        <w:t xml:space="preserve"> </w:t>
+      </w:r>
+      <w:r>
+        <w:t xml:space="preserve">[11]</w:t>
+      </w:r>
+      <w:r>
+        <w:t xml:space="preserve">. U njima su t0, t1 i t2 zasebne kolone sa delovima sekunde, a tabela</w:t>
+      </w:r>
+      <w:r>
+        <w:t xml:space="preserve"> </w:t>
+      </w:r>
+      <w:r>
+        <w:rPr>
+          <w:rStyle w:val="VerbatimChar"/>
+        </w:rPr>
+        <w:t xml:space="preserve">replication_applier_status_by_worker</w:t>
+      </w:r>
+      <w:r>
+        <w:t xml:space="preserve"> </w:t>
+      </w:r>
+      <w:r>
+        <w:t xml:space="preserve">ima po jedan red za svaku nit primene, sa poslednjom</w:t>
+      </w:r>
+      <w:r>
+        <w:t xml:space="preserve"> </w:t>
+      </w:r>
+      <w:r>
+        <w:t xml:space="preserve">transakcijom koju je ta nit primenila</w:t>
+      </w:r>
+      <w:r>
+        <w:t xml:space="preserve"> </w:t>
+      </w:r>
+      <w:r>
+        <w:t xml:space="preserve">[11]</w:t>
+      </w:r>
+      <w:r>
+        <w:t xml:space="preserve">. Time su otklonjene prva i treća slabost:</w:t>
+      </w:r>
+      <w:r>
+        <w:t xml:space="preserve"> </w:t>
+      </w:r>
+      <w:r>
+        <w:t xml:space="preserve">faza prijema vidi se kao razlika t1 − t0, a kašnjenje se računa za konkretnu transakciju, a ne za</w:t>
+      </w:r>
+      <w:r>
+        <w:t xml:space="preserve"> </w:t>
+      </w:r>
+      <w:r>
+        <w:t xml:space="preserve">jednu poziciju u logu. Druga slabost ostaje. Oznaku t0 beleži sat izvora, a t2 sat replike, pa</w:t>
+      </w:r>
+      <w:r>
+        <w:t xml:space="preserve"> </w:t>
+      </w:r>
+      <w:r>
+        <w:t xml:space="preserve">razlika t2 − t0 sadrži i razliku satova dva računara. Više decimala čini merenje preciznijim, ali ne</w:t>
+      </w:r>
+      <w:r>
+        <w:t xml:space="preserve"> </w:t>
+      </w:r>
+      <w:r>
+        <w:t xml:space="preserve">i tačnijim. Na topologiji ovog rada sve tri instance rade na istom računaru, pa je razlika satova</w:t>
+      </w:r>
+      <w:r>
+        <w:t xml:space="preserve"> </w:t>
+      </w:r>
+      <w:r>
+        <w:t xml:space="preserve">nula po konstrukciji, a ne zato što ju je MySQL ispravio.</w:t>
+      </w:r>
+    </w:p>
+    <w:p>
+      <w:pPr>
+        <w:pStyle w:val="CaptionedFigure"/>
+      </w:pPr>
+      <w:r>
+        <w:drawing>
+          <wp:inline>
+            <wp:extent cx="5753100" cy="2588895"/>
+            <wp:effectExtent b="0" l="0" r="0" t="0"/>
+            <wp:docPr descr="Slika 7.1: Prirodno kašnjenje replike 3309 pri naletu od 2000 jednorednih upisa u tabelu visits na izvoru 3307, uz jednu nit primene na replici (MySQL 8.4.11, uzorak na svakih 250 ms). Kašnjenje nije izazvano podešavanjem SOURCE_DELAY. Plava linija je stvarno kašnjenje iz tabela performance_schema (t2 − t0), a crvena polje Seconds_Behind_Source. Sve tri instance rade na istom računaru, pa razlika satova ne utiče na merenje." title="" id="68" name="Picture"/>
+            <a:graphic>
+              <a:graphicData uri="http://schemas.openxmlformats.org/drawingml/2006/picture">
+                <pic:pic>
+                  <pic:nvPicPr>
+                    <pic:cNvPr descr="figures/07-skaliranje-01-kasnjenje.png" id="69" name="Picture"/>
+                    <pic:cNvPicPr>
+                      <a:picLocks noChangeArrowheads="1" noChangeAspect="1"/>
+                    </pic:cNvPicPr>
+                  </pic:nvPicPr>
+                  <pic:blipFill>
+                    <a:blip r:embed="rId67"/>
+                    <a:stretch>
+                      <a:fillRect/>
+                    </a:stretch>
+                  </pic:blipFill>
+                  <pic:spPr bwMode="auto">
+                    <a:xfrm>
+                      <a:off x="0" y="0"/>
+                      <a:ext cx="5753100" cy="2588895"/>
+                    </a:xfrm>
+                    <a:prstGeom prst="rect">
+                      <a:avLst/>
+                    </a:prstGeom>
+                    <a:noFill/>
+                    <a:ln w="9525">
+                      <a:noFill/>
+                      <a:headEnd/>
+                      <a:tailEnd/>
+                    </a:ln>
+                  </pic:spPr>
+                </pic:pic>
+              </a:graphicData>
+            </a:graphic>
+          </wp:inline>
+        </w:drawing>
+      </w:r>
+    </w:p>
+    <w:p>
+      <w:pPr>
+        <w:pStyle w:val="ImageCaption"/>
+      </w:pPr>
+      <w:r>
+        <w:t xml:space="preserve">Slika 7.1: Prirodno kašnjenje replike 3309 pri naletu od 2000 jednorednih upisa u tabelu</w:t>
+      </w:r>
+      <w:r>
+        <w:t xml:space="preserve"> </w:t>
+      </w:r>
+      <w:r>
+        <w:rPr>
+          <w:rStyle w:val="VerbatimChar"/>
+        </w:rPr>
+        <w:t xml:space="preserve">visits</w:t>
+      </w:r>
+      <w:r>
+        <w:t xml:space="preserve"> </w:t>
+      </w:r>
+      <w:r>
+        <w:t xml:space="preserve">na izvoru 3307, uz jednu nit primene na replici (MySQL 8.4.11, uzorak na svakih 250 ms). Kašnjenje nije izazvano podešavanjem</w:t>
+      </w:r>
+      <w:r>
+        <w:t xml:space="preserve"> </w:t>
+      </w:r>
+      <w:r>
+        <w:rPr>
+          <w:rStyle w:val="VerbatimChar"/>
+        </w:rPr>
+        <w:t xml:space="preserve">SOURCE_DELAY</w:t>
+      </w:r>
+      <w:r>
+        <w:t xml:space="preserve">. Plava linija je stvarno kašnjenje iz tabela</w:t>
+      </w:r>
+      <w:r>
+        <w:t xml:space="preserve"> </w:t>
+      </w:r>
+      <w:r>
+        <w:rPr>
+          <w:rStyle w:val="VerbatimChar"/>
+        </w:rPr>
+        <w:t xml:space="preserve">performance_schema</w:t>
+      </w:r>
+      <w:r>
+        <w:t xml:space="preserve"> </w:t>
+      </w:r>
+      <w:r>
+        <w:t xml:space="preserve">(t2 − t0), a crvena polje</w:t>
+      </w:r>
+      <w:r>
+        <w:t xml:space="preserve"> </w:t>
+      </w:r>
+      <w:r>
+        <w:rPr>
+          <w:rStyle w:val="VerbatimChar"/>
+        </w:rPr>
+        <w:t xml:space="preserve">Seconds_Behind_Source</w:t>
+      </w:r>
+      <w:r>
+        <w:t xml:space="preserve">. Sve tri instance rade na istom računaru, pa razlika satova ne utiče na merenje.</w:t>
+      </w:r>
+    </w:p>
+    <w:p>
+      <w:pPr>
+        <w:pStyle w:val="BodyText"/>
+      </w:pPr>
+      <w:r>
+        <w:t xml:space="preserve">Dok kašnjenje raste,</w:t>
+      </w:r>
+      <w:r>
+        <w:t xml:space="preserve"> </w:t>
+      </w:r>
+      <w:r>
+        <w:rPr>
+          <w:rStyle w:val="VerbatimChar"/>
+        </w:rPr>
+        <w:t xml:space="preserve">Seconds_Behind_Source</w:t>
+      </w:r>
+      <w:r>
+        <w:t xml:space="preserve"> </w:t>
+      </w:r>
+      <w:r>
+        <w:t xml:space="preserve">ga prati sa odstupanjem do jedne sekunde, što</w:t>
+      </w:r>
+      <w:r>
+        <w:t xml:space="preserve"> </w:t>
+      </w:r>
+      <w:r>
+        <w:t xml:space="preserve">odgovara zaokruživanju (slika 7.1). Dok se zaostatak prazni, polje zaostaje za stvarnim padom i</w:t>
+      </w:r>
+      <w:r>
+        <w:t xml:space="preserve"> </w:t>
+      </w:r>
+      <w:r>
+        <w:t xml:space="preserve">precenjuje kašnjenje za više od četiri sekunde, a na replici koja je sve primenila, sa stvarnim</w:t>
+      </w:r>
+      <w:r>
+        <w:t xml:space="preserve"> </w:t>
+      </w:r>
+      <w:r>
+        <w:t xml:space="preserve">kašnjenjem od oko dve milisekunde, u 31 od 360 uzoraka pokazivalo je jednu sekundu. Uzrok te</w:t>
+      </w:r>
+      <w:r>
+        <w:t xml:space="preserve"> </w:t>
+      </w:r>
+      <w:r>
+        <w:t xml:space="preserve">jedinice nije utvrđen, pa se navodi samo izmereno ponašanje. Ni nula ni jedinica u ovom polju,</w:t>
+      </w:r>
+      <w:r>
+        <w:t xml:space="preserve"> </w:t>
+      </w:r>
+      <w:r>
+        <w:t xml:space="preserve">dakle, nisu pouzdan znak stanja replike.</w:t>
+      </w:r>
+    </w:p>
+    <w:bookmarkEnd w:id="70"/>
+    <w:bookmarkStart w:id="71" w:name="šta-čitalac-vidi-na-replici-koja-kasni"/>
+    <w:p>
+      <w:pPr>
+        <w:pStyle w:val="Heading2"/>
+      </w:pPr>
+      <w:r>
+        <w:t xml:space="preserve">Šta čitalac vidi na replici koja kasni</w:t>
+      </w:r>
+    </w:p>
+    <w:p>
+      <w:pPr>
+        <w:pStyle w:val="FirstParagraph"/>
+      </w:pPr>
+      <w:r>
+        <w:t xml:space="preserve">Za prikaz anomalija kašnjenje je izazvano: replici 3309 postavljeno je</w:t>
+      </w:r>
+      <w:r>
+        <w:t xml:space="preserve"> </w:t>
+      </w:r>
+      <w:r>
+        <w:rPr>
+          <w:rStyle w:val="VerbatimChar"/>
+        </w:rPr>
+        <w:t xml:space="preserve">SOURCE_DELAY = 3</w:t>
+      </w:r>
+      <w:r>
+        <w:t xml:space="preserve">, uz koje</w:t>
+      </w:r>
+      <w:r>
+        <w:t xml:space="preserve"> </w:t>
+      </w:r>
+      <w:r>
+        <w:t xml:space="preserve">se transakcija primenjuje najmanje tri sekunde posle komitovanja na izvoru</w:t>
+      </w:r>
+      <w:r>
+        <w:t xml:space="preserve"> </w:t>
+      </w:r>
+      <w:r>
+        <w:t xml:space="preserve">[11]</w:t>
+      </w:r>
+      <w:r>
+        <w:t xml:space="preserve">, dok je</w:t>
+      </w:r>
+      <w:r>
+        <w:t xml:space="preserve"> </w:t>
+      </w:r>
+      <w:r>
+        <w:t xml:space="preserve">replika 3308 radila bez odlaganja. Klijent je na izvoru 3307 upisao novu vrednost, a</w:t>
+      </w:r>
+      <w:r>
+        <w:t xml:space="preserve"> </w:t>
+      </w:r>
+      <w:r>
+        <w:t xml:space="preserve">čitanje na replici 3309 odmah posle toga vratilo je staru. Transakcija je u tom trenutku bila primljena, jer</w:t>
+      </w:r>
+      <w:r>
+        <w:t xml:space="preserve"> </w:t>
+      </w:r>
+      <w:r>
+        <w:t xml:space="preserve">je njen GTID bio u skupu primljenih transakcija replike, ali nije bila primenjena. To je anomalija</w:t>
+      </w:r>
+      <w:r>
+        <w:t xml:space="preserve"> </w:t>
+      </w:r>
+      <w:r>
+        <w:t xml:space="preserve">read-your-writes iz drugog poglavlja</w:t>
+      </w:r>
+      <w:r>
+        <w:t xml:space="preserve"> </w:t>
+      </w:r>
+      <w:r>
+        <w:t xml:space="preserve">[5]</w:t>
+      </w:r>
+      <w:r>
+        <w:t xml:space="preserve">. Zatim je isti klijent, posle novog upisa, čitao</w:t>
+      </w:r>
+      <w:r>
+        <w:t xml:space="preserve"> </w:t>
+      </w:r>
+      <w:r>
+        <w:t xml:space="preserve">najpre sa replike 3308, koja je vratila novu vrednost, pa sa replike 3309, koja je vratila</w:t>
+      </w:r>
+      <w:r>
+        <w:t xml:space="preserve"> </w:t>
+      </w:r>
+      <w:r>
+        <w:t xml:space="preserve">prethodnu. Ako aplikacija čitanja raspoređuje na više replika, klijent tako vidi stanje koje se</w:t>
+      </w:r>
+      <w:r>
+        <w:t xml:space="preserve"> </w:t>
+      </w:r>
+      <w:r>
+        <w:t xml:space="preserve">vraća unazad, što krši i monotona čitanja</w:t>
+      </w:r>
+      <w:r>
+        <w:t xml:space="preserve"> </w:t>
+      </w:r>
+      <w:r>
+        <w:t xml:space="preserve">[5]</w:t>
+      </w:r>
+      <w:r>
+        <w:t xml:space="preserve">.</w:t>
+      </w:r>
+    </w:p>
+    <w:bookmarkEnd w:id="71"/>
+    <w:bookmarkStart w:id="72" w:name="čekanje-na-sopstveni-upis"/>
+    <w:p>
+      <w:pPr>
+        <w:pStyle w:val="Heading2"/>
+      </w:pPr>
+      <w:r>
+        <w:t xml:space="preserve">Čekanje na sopstveni upis</w:t>
+      </w:r>
+    </w:p>
+    <w:p>
+      <w:pPr>
+        <w:pStyle w:val="FirstParagraph"/>
+      </w:pPr>
+      <w:r>
+        <w:t xml:space="preserve">Anomaliju ne uklanja replika, već čitalac koji pre čitanja sačeka svoj upis. MySQL za to nudi dve</w:t>
+      </w:r>
+      <w:r>
+        <w:t xml:space="preserve"> </w:t>
+      </w:r>
+      <w:r>
+        <w:t xml:space="preserve">funkcije.</w:t>
+      </w:r>
+      <w:r>
+        <w:t xml:space="preserve"> </w:t>
+      </w:r>
+      <w:r>
+        <w:rPr>
+          <w:rStyle w:val="VerbatimChar"/>
+        </w:rPr>
+        <w:t xml:space="preserve">WAIT_FOR_EXECUTED_GTID_SET(g, timeout)</w:t>
+      </w:r>
+      <w:r>
+        <w:t xml:space="preserve"> </w:t>
+      </w:r>
+      <w:r>
+        <w:t xml:space="preserve">čeka dok server ne primeni sve transakcije čiji</w:t>
+      </w:r>
+      <w:r>
+        <w:t xml:space="preserve"> </w:t>
+      </w:r>
+      <w:r>
+        <w:t xml:space="preserve">su GTID-ovi u skupu g i vraća 0 pri uspehu, a 1 kada istekne vreme. Podrazumevani istek vremena je</w:t>
+      </w:r>
+      <w:r>
+        <w:t xml:space="preserve"> </w:t>
+      </w:r>
+      <w:r>
+        <w:t xml:space="preserve">nula, a nula ovde znači da funkcija čeka bez ograničenja</w:t>
+      </w:r>
+      <w:r>
+        <w:t xml:space="preserve"> </w:t>
+      </w:r>
+      <w:r>
+        <w:t xml:space="preserve">[11]</w:t>
+      </w:r>
+      <w:r>
+        <w:t xml:space="preserve">.</w:t>
+      </w:r>
+      <w:r>
+        <w:t xml:space="preserve"> </w:t>
+      </w:r>
+      <w:r>
+        <w:rPr>
+          <w:rStyle w:val="VerbatimChar"/>
+        </w:rPr>
+        <w:t xml:space="preserve">SOURCE_POS_WAIT()</w:t>
+      </w:r>
+      <w:r>
+        <w:t xml:space="preserve"> </w:t>
+      </w:r>
+      <w:r>
+        <w:t xml:space="preserve">čeka</w:t>
+      </w:r>
+      <w:r>
+        <w:t xml:space="preserve"> </w:t>
+      </w:r>
+      <w:r>
+        <w:t xml:space="preserve">da replika primeni sve izmene do zadate datoteke i pozicije u binarnom logu izvora i vraća broj</w:t>
+      </w:r>
+      <w:r>
+        <w:t xml:space="preserve"> </w:t>
+      </w:r>
+      <w:r>
+        <w:t xml:space="preserve">događaja na koje je čekala,</w:t>
+      </w:r>
+      <w:r>
+        <w:t xml:space="preserve"> </w:t>
+      </w:r>
+      <w:r>
+        <w:rPr>
+          <w:rStyle w:val="VerbatimChar"/>
+        </w:rPr>
+        <w:t xml:space="preserve">-1</w:t>
+      </w:r>
+      <w:r>
+        <w:t xml:space="preserve"> </w:t>
+      </w:r>
+      <w:r>
+        <w:t xml:space="preserve">kada istekne vreme, a NULL ako nit primene ne radi ili se zaustavi</w:t>
+      </w:r>
+      <w:r>
+        <w:t xml:space="preserve"> </w:t>
+      </w:r>
+      <w:r>
+        <w:t xml:space="preserve">tokom čekanja</w:t>
+      </w:r>
+      <w:r>
+        <w:t xml:space="preserve"> </w:t>
+      </w:r>
+      <w:r>
+        <w:t xml:space="preserve">[11]</w:t>
+      </w:r>
+      <w:r>
+        <w:t xml:space="preserve">. Razlika je ista kao u trećem poglavlju: prva funkcija čeka</w:t>
+      </w:r>
+      <w:r>
+        <w:t xml:space="preserve"> </w:t>
+      </w:r>
+      <w:r>
+        <w:t xml:space="preserve">transakciju po imenu, a druga po adresi u logu jednog izvora.</w:t>
+      </w:r>
+    </w:p>
+    <w:p>
+      <w:pPr>
+        <w:pStyle w:val="TableCaption"/>
+      </w:pPr>
+      <w:r>
+        <w:t xml:space="preserve">Tabela 7.1: Čitanje sopstvenog upisa na replici 3309 (MySQL 8.4.11). U prva četiri reda replika je asinhrona, a kašnjenje je izazvano podešavanjem</w:t>
+      </w:r>
+      <w:r>
+        <w:t xml:space="preserve"> </w:t>
+      </w:r>
+      <w:r>
+        <w:rPr>
+          <w:rStyle w:val="VerbatimChar"/>
+        </w:rPr>
+        <w:t xml:space="preserve">SOURCE_DELAY = 3</w:t>
+      </w:r>
+      <w:r>
+        <w:t xml:space="preserve">, dok su f i p datoteka i pozicija upisa u binarnom logu izvora; svaki red je izvršen dva puta, sa istim ishodom i vremenima koja se razlikuju za manje od 10 ms. Poslednji red je iz grupe sa jednim primarnim čvorom iz petog poglavlja, bez izazvanog kašnjenja, sa nivoom</w:t>
+      </w:r>
+      <w:r>
+        <w:t xml:space="preserve"> </w:t>
+      </w:r>
+      <w:r>
+        <w:rPr>
+          <w:rStyle w:val="VerbatimChar"/>
+        </w:rPr>
+        <w:t xml:space="preserve">BEFORE</w:t>
+      </w:r>
+      <w:r>
+        <w:t xml:space="preserve"> </w:t>
+      </w:r>
+      <w:r>
+        <w:t xml:space="preserve">na sesiji čitaoca i medijanom vremena čitanja.</w:t>
+      </w:r>
+    </w:p>
+    <w:tbl>
+      <w:tblPr>
+        <w:tblStyle w:val="Table"/>
+        <w:tblW w:type="pct" w:w="5000"/>
+        <w:tblLayout w:type="fixed"/>
+        <w:tblLook w:firstRow="1" w:lastRow="0" w:firstColumn="0" w:lastColumn="0" w:noHBand="0" w:noVBand="0" w:val="0020"/>
+        <w:tblCaption w:val="Tabela 7.1: Čitanje sopstvenog upisa na replici 3309 (MySQL 8.4.11). U prva četiri reda replika je asinhrona, a kašnjenje je izazvano podešavanjem SOURCE_DELAY = 3, dok su f i p datoteka i pozicija upisa u binarnom logu izvora; svaki red je izvršen dva puta, sa istim ishodom i vremenima koja se razlikuju za manje od 10 ms. Poslednji red je iz grupe sa jednim primarnim čvorom iz petog poglavlja, bez izazvanog kašnjenja, sa nivoom BEFORE na sesiji čitaoca i medijanom vremena čitanja."/>
+      </w:tblPr>
+      <w:tblGrid>
+        <w:gridCol w:w="3520"/>
+        <w:gridCol w:w="1271"/>
+        <w:gridCol w:w="1955"/>
+        <w:gridCol w:w="1173"/>
+      </w:tblGrid>
+      <w:tr>
+        <w:trPr>
+          <w:tblHeader w:val="on"/>
+        </w:trPr>
+        <w:tc>
+          <w:tcPr/>
+          <w:p>
+            <w:pPr>
+              <w:pStyle w:val="Compact"/>
+            </w:pPr>
+            <w:r>
+              <w:t xml:space="preserve">Čitanje na replici 3309</w:t>
+            </w:r>
+          </w:p>
+        </w:tc>
+        <w:tc>
+          <w:tcPr/>
+          <w:p>
+            <w:pPr>
+              <w:pStyle w:val="Compact"/>
+            </w:pPr>
+            <w:r>
+              <w:t xml:space="preserve">Kašnjenje</w:t>
+            </w:r>
+          </w:p>
+        </w:tc>
+        <w:tc>
+          <w:tcPr/>
+          <w:p>
+            <w:pPr>
+              <w:pStyle w:val="Compact"/>
+            </w:pPr>
+            <w:r>
+              <w:t xml:space="preserve">Vraćeno; pročitano</w:t>
+            </w:r>
+          </w:p>
+        </w:tc>
+        <w:tc>
+          <w:tcPr/>
+          <w:p>
+            <w:pPr>
+              <w:pStyle w:val="Compact"/>
+              <w:jc w:val="right"/>
+            </w:pPr>
+            <w:r>
+              <w:t xml:space="preserve">Čekanje</w:t>
+            </w:r>
+          </w:p>
+        </w:tc>
+      </w:tr>
+      <w:tr>
+        <w:tc>
+          <w:tcPr/>
+          <w:p>
+            <w:pPr>
+              <w:pStyle w:val="Compact"/>
+            </w:pPr>
+            <w:r>
+              <w:t xml:space="preserve">odmah posle upisa</w:t>
+            </w:r>
+          </w:p>
+        </w:tc>
+        <w:tc>
+          <w:tcPr/>
+          <w:p>
+            <w:pPr>
+              <w:pStyle w:val="Compact"/>
+            </w:pPr>
+            <w:r>
+              <w:t xml:space="preserve">izazvano</w:t>
+            </w:r>
+          </w:p>
+        </w:tc>
+        <w:tc>
+          <w:tcPr/>
+          <w:p>
+            <w:pPr>
+              <w:pStyle w:val="Compact"/>
+            </w:pPr>
+            <w:r>
+              <w:t xml:space="preserve">stara vrednost</w:t>
+            </w:r>
+          </w:p>
+        </w:tc>
+        <w:tc>
+          <w:tcPr/>
+          <w:p>
+            <w:pPr>
+              <w:pStyle w:val="Compact"/>
+              <w:jc w:val="right"/>
+            </w:pPr>
+            <w:r>
+              <w:t xml:space="preserve">0</w:t>
+            </w:r>
+          </w:p>
+        </w:tc>
+      </w:tr>
+      <w:tr>
+        <w:tc>
+          <w:tcPr/>
+          <w:p>
+            <w:pPr>
+              <w:pStyle w:val="Compact"/>
+            </w:pPr>
+            <w:r>
+              <w:t xml:space="preserve">posle</w:t>
+            </w:r>
+            <w:r>
+              <w:t xml:space="preserve"> </w:t>
+            </w:r>
+            <w:r>
+              <w:rPr>
+                <w:rStyle w:val="VerbatimChar"/>
+              </w:rPr>
+              <w:t xml:space="preserve">WAIT_FOR_EXECUTED_GTID_SET(g, 1)</w:t>
+            </w:r>
+          </w:p>
+        </w:tc>
+        <w:tc>
+          <w:tcPr/>
+          <w:p>
+            <w:pPr>
+              <w:pStyle w:val="Compact"/>
+            </w:pPr>
+            <w:r>
+              <w:t xml:space="preserve">izazvano</w:t>
+            </w:r>
+          </w:p>
+        </w:tc>
+        <w:tc>
+          <w:tcPr/>
+          <w:p>
+            <w:pPr>
+              <w:pStyle w:val="Compact"/>
+            </w:pPr>
+            <w:r>
+              <w:t xml:space="preserve">1; stara vrednost</w:t>
+            </w:r>
+          </w:p>
+        </w:tc>
+        <w:tc>
+          <w:tcPr/>
+          <w:p>
+            <w:pPr>
+              <w:pStyle w:val="Compact"/>
+              <w:jc w:val="right"/>
+            </w:pPr>
+            <w:r>
+              <w:t xml:space="preserve">1,0 s</w:t>
+            </w:r>
+          </w:p>
+        </w:tc>
+      </w:tr>
+      <w:tr>
+        <w:tc>
+          <w:tcPr/>
+          <w:p>
+            <w:pPr>
+              <w:pStyle w:val="Compact"/>
+            </w:pPr>
+            <w:r>
+              <w:t xml:space="preserve">posle</w:t>
+            </w:r>
+            <w:r>
+              <w:t xml:space="preserve"> </w:t>
+            </w:r>
+            <w:r>
+              <w:rPr>
+                <w:rStyle w:val="VerbatimChar"/>
+              </w:rPr>
+              <w:t xml:space="preserve">WAIT_FOR_EXECUTED_GTID_SET(g, 10)</w:t>
+            </w:r>
+          </w:p>
+        </w:tc>
+        <w:tc>
+          <w:tcPr/>
+          <w:p>
+            <w:pPr>
+              <w:pStyle w:val="Compact"/>
+            </w:pPr>
+            <w:r>
+              <w:t xml:space="preserve">izazvano</w:t>
+            </w:r>
+          </w:p>
+        </w:tc>
+        <w:tc>
+          <w:tcPr/>
+          <w:p>
+            <w:pPr>
+              <w:pStyle w:val="Compact"/>
+            </w:pPr>
+            <w:r>
+              <w:t xml:space="preserve">0; nova vrednost</w:t>
+            </w:r>
+          </w:p>
+        </w:tc>
+        <w:tc>
+          <w:tcPr/>
+          <w:p>
+            <w:pPr>
+              <w:pStyle w:val="Compact"/>
+              <w:jc w:val="right"/>
+            </w:pPr>
+            <w:r>
+              <w:t xml:space="preserve">4,0 s</w:t>
+            </w:r>
+          </w:p>
+        </w:tc>
+      </w:tr>
+      <w:tr>
+        <w:tc>
+          <w:tcPr/>
+          <w:p>
+            <w:pPr>
+              <w:pStyle w:val="Compact"/>
+            </w:pPr>
+            <w:r>
+              <w:t xml:space="preserve">posle</w:t>
+            </w:r>
+            <w:r>
+              <w:t xml:space="preserve"> </w:t>
+            </w:r>
+            <w:r>
+              <w:rPr>
+                <w:rStyle w:val="VerbatimChar"/>
+              </w:rPr>
+              <w:t xml:space="preserve">SOURCE_POS_WAIT(f, p, 10)</w:t>
+            </w:r>
+          </w:p>
+        </w:tc>
+        <w:tc>
+          <w:tcPr/>
+          <w:p>
+            <w:pPr>
+              <w:pStyle w:val="Compact"/>
+            </w:pPr>
+            <w:r>
+              <w:t xml:space="preserve">izazvano</w:t>
+            </w:r>
+          </w:p>
+        </w:tc>
+        <w:tc>
+          <w:tcPr/>
+          <w:p>
+            <w:pPr>
+              <w:pStyle w:val="Compact"/>
+            </w:pPr>
+            <w:r>
+              <w:t xml:space="preserve">1; nova vrednost</w:t>
+            </w:r>
+          </w:p>
+        </w:tc>
+        <w:tc>
+          <w:tcPr/>
+          <w:p>
+            <w:pPr>
+              <w:pStyle w:val="Compact"/>
+              <w:jc w:val="right"/>
+            </w:pPr>
+            <w:r>
+              <w:t xml:space="preserve">4,3 s</w:t>
+            </w:r>
+          </w:p>
+        </w:tc>
+      </w:tr>
+      <w:tr>
+        <w:tc>
+          <w:tcPr/>
+          <w:p>
+            <w:pPr>
+              <w:pStyle w:val="Compact"/>
+            </w:pPr>
+            <w:r>
+              <w:t xml:space="preserve">član grupe uz</w:t>
+            </w:r>
+            <w:r>
+              <w:t xml:space="preserve"> </w:t>
+            </w:r>
+            <w:r>
+              <w:rPr>
+                <w:rStyle w:val="VerbatimChar"/>
+              </w:rPr>
+              <w:t xml:space="preserve">BEFORE</w:t>
+            </w:r>
+            <w:r>
+              <w:t xml:space="preserve"> </w:t>
+            </w:r>
+            <w:r>
+              <w:t xml:space="preserve">(tabela 5.2)</w:t>
+            </w:r>
+          </w:p>
+        </w:tc>
+        <w:tc>
+          <w:tcPr/>
+          <w:p>
+            <w:pPr>
+              <w:pStyle w:val="Compact"/>
+            </w:pPr>
+            <w:r>
+              <w:t xml:space="preserve">prirodno</w:t>
+            </w:r>
+          </w:p>
+        </w:tc>
+        <w:tc>
+          <w:tcPr/>
+          <w:p>
+            <w:pPr>
+              <w:pStyle w:val="Compact"/>
+            </w:pPr>
+            <w:r>
+              <w:t xml:space="preserve">0/80 zastarelih</w:t>
+            </w:r>
+          </w:p>
+        </w:tc>
+        <w:tc>
+          <w:tcPr/>
+          <w:p>
+            <w:pPr>
+              <w:pStyle w:val="Compact"/>
+              <w:jc w:val="right"/>
+            </w:pPr>
+            <w:r>
+              <w:t xml:space="preserve">14–16 ms</w:t>
+            </w:r>
+          </w:p>
+        </w:tc>
+      </w:tr>
+    </w:tbl>
+    <w:p>
+      <w:pPr>
+        <w:pStyle w:val="BodyText"/>
+      </w:pPr>
+      <w:r>
+        <w:t xml:space="preserve">Uspešno čekanje u tabeli 7.1 trajalo je oko četiri sekunde, onoliko koliko je replika kasnila, u</w:t>
+      </w:r>
+      <w:r>
+        <w:t xml:space="preserve"> </w:t>
+      </w:r>
+      <w:r>
+        <w:t xml:space="preserve">skladu sa formulacijom „najmanje N sekundi“ iz priručnika. Važniji je drugi red: uz istek vremena</w:t>
+      </w:r>
+      <w:r>
+        <w:t xml:space="preserve"> </w:t>
+      </w:r>
+      <w:r>
+        <w:t xml:space="preserve">kraći od kašnjenja funkcija je vratila 1, a čitanje koje je usledilo bilo je zastarelo. Funkcija,</w:t>
+      </w:r>
+      <w:r>
+        <w:t xml:space="preserve"> </w:t>
+      </w:r>
+      <w:r>
+        <w:t xml:space="preserve">dakle, ne garantuje svežinu, već o njoj obaveštava, pa aplikacija mora da proveri povratnu</w:t>
+      </w:r>
+      <w:r>
+        <w:t xml:space="preserve"> </w:t>
+      </w:r>
+      <w:r>
+        <w:t xml:space="preserve">vrednost i, kada je ona 1, pročita sa izvora ili prijavi grešku. Kada je nit primene zaustavljena,</w:t>
+      </w:r>
+      <w:r>
+        <w:t xml:space="preserve"> </w:t>
+      </w:r>
+      <w:r>
+        <w:rPr>
+          <w:rStyle w:val="VerbatimChar"/>
+        </w:rPr>
+        <w:t xml:space="preserve">SOURCE_POS_WAIT()</w:t>
+      </w:r>
+      <w:r>
+        <w:t xml:space="preserve"> </w:t>
+      </w:r>
+      <w:r>
+        <w:t xml:space="preserve">je odmah vratila NULL, a</w:t>
+      </w:r>
+      <w:r>
+        <w:t xml:space="preserve"> </w:t>
+      </w:r>
+      <w:r>
+        <w:rPr>
+          <w:rStyle w:val="VerbatimChar"/>
+        </w:rPr>
+        <w:t xml:space="preserve">WAIT_FOR_EXECUTED_GTID_SET()</w:t>
+      </w:r>
+      <w:r>
+        <w:t xml:space="preserve"> </w:t>
+      </w:r>
+      <w:r>
+        <w:t xml:space="preserve">je čekala do isteka</w:t>
+      </w:r>
+      <w:r>
+        <w:t xml:space="preserve"> </w:t>
+      </w:r>
+      <w:r>
+        <w:t xml:space="preserve">vremena i vratila 1; uz nulti istek vremena čekala bi bez kraja (izvedeno iz priručnika, ne</w:t>
+      </w:r>
+      <w:r>
+        <w:t xml:space="preserve"> </w:t>
+      </w:r>
+      <w:r>
+        <w:t xml:space="preserve">izmereno). U grupi iz petog poglavlja isto čekanje obavlja server, uz nivo</w:t>
+      </w:r>
+      <w:r>
+        <w:t xml:space="preserve"> </w:t>
+      </w:r>
+      <w:r>
+        <w:rPr>
+          <w:rStyle w:val="VerbatimChar"/>
+        </w:rPr>
+        <w:t xml:space="preserve">BEFORE</w:t>
+      </w:r>
+      <w:r>
+        <w:t xml:space="preserve">.</w:t>
+      </w:r>
+    </w:p>
+    <w:p>
+      <w:pPr>
+        <w:pStyle w:val="BodyText"/>
+      </w:pPr>
+      <w:r>
+        <w:t xml:space="preserve">Isto čekanje može da preuzme i MySQL Router, koji podržava razdvajanje čitanja i upisa (read/write</w:t>
+      </w:r>
+      <w:r>
+        <w:t xml:space="preserve"> </w:t>
+      </w:r>
+      <w:r>
+        <w:t xml:space="preserve">splitting): čitanja usmerava na instance samo za čitanje, na primer sekundarne članove InnoDB</w:t>
+      </w:r>
+      <w:r>
+        <w:t xml:space="preserve"> </w:t>
+      </w:r>
+      <w:r>
+        <w:t xml:space="preserve">Cluster-a, a upise na primarnu instancu. Uz opciju</w:t>
+      </w:r>
+      <w:r>
+        <w:t xml:space="preserve"> </w:t>
+      </w:r>
+      <w:r>
+        <w:rPr>
+          <w:rStyle w:val="VerbatimChar"/>
+        </w:rPr>
+        <w:t xml:space="preserve">wait_for_my_writes</w:t>
+      </w:r>
+      <w:r>
+        <w:t xml:space="preserve"> </w:t>
+      </w:r>
+      <w:r>
+        <w:t xml:space="preserve">čitanje čeka poslednju</w:t>
+      </w:r>
+      <w:r>
+        <w:t xml:space="preserve"> </w:t>
+      </w:r>
+      <w:r>
+        <w:t xml:space="preserve">transakciju koju je sesija upisala, najviše</w:t>
+      </w:r>
+      <w:r>
+        <w:t xml:space="preserve"> </w:t>
+      </w:r>
+      <w:r>
+        <w:rPr>
+          <w:rStyle w:val="VerbatimChar"/>
+        </w:rPr>
+        <w:t xml:space="preserve">wait_for_my_writes_timeout</w:t>
+      </w:r>
+      <w:r>
+        <w:t xml:space="preserve"> </w:t>
+      </w:r>
+      <w:r>
+        <w:t xml:space="preserve">sekundi (podrazumevano</w:t>
+      </w:r>
+      <w:r>
+        <w:t xml:space="preserve"> </w:t>
+      </w:r>
+      <w:r>
+        <w:t xml:space="preserve">jednu), a ako transakcija do tada nije primenjena, Router ga šalje instanci za upis</w:t>
+      </w:r>
+      <w:r>
+        <w:t xml:space="preserve"> </w:t>
+      </w:r>
+      <w:r>
+        <w:t xml:space="preserve">[19]</w:t>
+      </w:r>
+      <w:r>
+        <w:t xml:space="preserve">. To je ista provera povratne</w:t>
+      </w:r>
+      <w:r>
+        <w:t xml:space="preserve"> </w:t>
+      </w:r>
+      <w:r>
+        <w:t xml:space="preserve">vrednosti, premeštena u posrednika. Router nije pokretan na topologiji ovog rada, pa se ovaj pasus</w:t>
+      </w:r>
+      <w:r>
+        <w:t xml:space="preserve"> </w:t>
+      </w:r>
+      <w:r>
+        <w:t xml:space="preserve">oslanja samo na priručnik.</w:t>
+      </w:r>
+    </w:p>
+    <w:bookmarkEnd w:id="72"/>
+    <w:bookmarkStart w:id="73" w:name="šta-skaliranje-čitanja-ne-skalira"/>
+    <w:p>
+      <w:pPr>
+        <w:pStyle w:val="Heading2"/>
+      </w:pPr>
+      <w:r>
+        <w:t xml:space="preserve">Šta skaliranje čitanja ne skalira</w:t>
+      </w:r>
+    </w:p>
+    <w:p>
+      <w:pPr>
+        <w:pStyle w:val="FirstParagraph"/>
+      </w:pPr>
+      <w:r>
+        <w:t xml:space="preserve">Svi upisi idu izvoru, a svaka replika primenjuje svaki upis</w:t>
+      </w:r>
+      <w:r>
+        <w:t xml:space="preserve"> </w:t>
+      </w:r>
+      <w:r>
+        <w:t xml:space="preserve">[11]</w:t>
+      </w:r>
+      <w:r>
+        <w:t xml:space="preserve">. Dodavanje replika</w:t>
+      </w:r>
+      <w:r>
+        <w:t xml:space="preserve"> </w:t>
+      </w:r>
+      <w:r>
+        <w:t xml:space="preserve">zato povećava kapacitet za čitanje, ali ne menja ni kapacitet za upis ni posao primene na pojedinoj</w:t>
+      </w:r>
+      <w:r>
+        <w:t xml:space="preserve"> </w:t>
+      </w:r>
+      <w:r>
+        <w:t xml:space="preserve">replici. Ako izvor trajno komituje W transakcija u sekundi, a nit primene jedne replike stiže da</w:t>
+      </w:r>
+      <w:r>
+        <w:t xml:space="preserve"> </w:t>
+      </w:r>
+      <w:r>
+        <w:t xml:space="preserve">primeni A, zaostatak te replike raste za W − A transakcija u sekundi kad god je W veće od A, i to</w:t>
+      </w:r>
+      <w:r>
+        <w:t xml:space="preserve"> </w:t>
+      </w:r>
+      <w:r>
+        <w:t xml:space="preserve">na svakoj replici nezavisno, jer svaka primenjuje isti tok. Deset replika tada ima deset jednako</w:t>
+      </w:r>
+      <w:r>
+        <w:t xml:space="preserve"> </w:t>
+      </w:r>
+      <w:r>
+        <w:t xml:space="preserve">rastućih zaostataka, a ne jedan deset puta manji. Ovaj zaključak je izveden, ali ga nalet sa slike</w:t>
+      </w:r>
+      <w:r>
+        <w:t xml:space="preserve"> </w:t>
+      </w:r>
+      <w:r>
+        <w:t xml:space="preserve">7.1 pokazuje u malom: izvor je komitovao nekoliko hiljada transakcija u sekundi, a jedna nit</w:t>
+      </w:r>
+      <w:r>
+        <w:t xml:space="preserve"> </w:t>
+      </w:r>
+      <w:r>
+        <w:t xml:space="preserve">primene šezdesetak, pa je nalet kraći od sekunde ostavio zaostatak od pola minuta.</w:t>
+      </w:r>
+    </w:p>
+    <w:p>
+      <w:pPr>
+        <w:pStyle w:val="BodyText"/>
+      </w:pPr>
+      <w:r>
+        <w:t xml:space="preserve">Replika propusnost primene može da poveća samo paralelnom primenom. U verziji 8.4 replika</w:t>
+      </w:r>
+      <w:r>
+        <w:t xml:space="preserve"> </w:t>
+      </w:r>
+      <w:r>
+        <w:t xml:space="preserve">podrazumevano ima četiri niti primene, a izvor u binarni log upisuje zavisnosti između transakcija</w:t>
+      </w:r>
+      <w:r>
+        <w:t xml:space="preserve"> </w:t>
+      </w:r>
+      <w:r>
+        <w:t xml:space="preserve">izvedene iz skupova upisa, pa se paralelno primenjuju transakcije koje ne zavise jedna od druge</w:t>
+      </w:r>
+      <w:r>
+        <w:t xml:space="preserve"> </w:t>
+      </w:r>
+      <w:r>
+        <w:t xml:space="preserve">[11], [16]</w:t>
+      </w:r>
+      <w:r>
+        <w:t xml:space="preserve">. Transakcije koje menjaju iste redove ipak zavise jedna od</w:t>
+      </w:r>
+      <w:r>
+        <w:t xml:space="preserve"> </w:t>
+      </w:r>
+      <w:r>
+        <w:t xml:space="preserve">druge i primenjuju se redom, pa paralelna primena podiže propusnost samo onoliko koliko to radno</w:t>
+      </w:r>
+      <w:r>
+        <w:t xml:space="preserve"> </w:t>
+      </w:r>
+      <w:r>
+        <w:t xml:space="preserve">opterećenje dopušta.</w:t>
+      </w:r>
+    </w:p>
+    <w:p>
+      <w:pPr>
+        <w:pStyle w:val="BodyText"/>
+      </w:pPr>
+      <w:r>
+        <w:t xml:space="preserve">U terminima PACELC-a replika za čitanje bira latenciju: čitanje je brzo i lokalno, a cenu,</w:t>
+      </w:r>
+      <w:r>
+        <w:t xml:space="preserve"> </w:t>
+      </w:r>
+      <w:r>
+        <w:t xml:space="preserve">zastarelost podataka, plaća čitalac. MySQL repliku ne čini konzistentnom, već daje alate kojima se</w:t>
+      </w:r>
+      <w:r>
+        <w:t xml:space="preserve"> </w:t>
+      </w:r>
+      <w:r>
+        <w:t xml:space="preserve">ta cena plaća kada je potrebno: funkciju koja čeka sopstveni upis, opciju posrednika i nivo</w:t>
+      </w:r>
+      <w:r>
+        <w:t xml:space="preserve"> </w:t>
+      </w:r>
+      <w:r>
+        <w:rPr>
+          <w:rStyle w:val="VerbatimChar"/>
+        </w:rPr>
+        <w:t xml:space="preserve">BEFORE</w:t>
+      </w:r>
+      <w:r>
+        <w:t xml:space="preserve"> </w:t>
+      </w:r>
+      <w:r>
+        <w:t xml:space="preserve">unutar grupe. Svaki od njih svežinu jednog čitanja kupuje vremenom čekanja čitaoca, a</w:t>
+      </w:r>
+      <w:r>
+        <w:t xml:space="preserve"> </w:t>
+      </w:r>
+      <w:r>
+        <w:t xml:space="preserve">dužinu tog čekanja određuje kašnjenje, koje se meri tabelama šeme</w:t>
+      </w:r>
+      <w:r>
+        <w:t xml:space="preserve"> </w:t>
+      </w:r>
+      <w:r>
+        <w:rPr>
+          <w:rStyle w:val="VerbatimChar"/>
+        </w:rPr>
+        <w:t xml:space="preserve">performance_schema</w:t>
+      </w:r>
+      <w:r>
+        <w:t xml:space="preserve">, a ne</w:t>
+      </w:r>
+      <w:r>
+        <w:t xml:space="preserve"> </w:t>
+      </w:r>
+      <w:r>
+        <w:t xml:space="preserve">poljem</w:t>
+      </w:r>
+      <w:r>
+        <w:t xml:space="preserve"> </w:t>
+      </w:r>
+      <w:r>
+        <w:rPr>
+          <w:rStyle w:val="VerbatimChar"/>
+        </w:rPr>
+        <w:t xml:space="preserve">Seconds_Behind_Source</w:t>
+      </w:r>
+      <w:r>
+        <w:t xml:space="preserve">. I ovde je konzistentnost odluka onoga ko čita, a ne svojstvo replike.</w:t>
+      </w:r>
+    </w:p>
+    <w:bookmarkEnd w:id="73"/>
+    <w:bookmarkEnd w:id="74"/>
+    <w:bookmarkStart w:id="110" w:name="bibliography"/>
+    <w:p>
+      <w:pPr>
+        <w:pStyle w:val="Heading1"/>
+      </w:pPr>
+      <w:r>
         <w:t xml:space="preserve">Reference</w:t>
       </w:r>
     </w:p>
-    <w:bookmarkStart w:id="98" w:name="refs"/>
-    <w:bookmarkStart w:id="67" w:name="ref-lamport1978"/>
+    <w:bookmarkStart w:id="109" w:name="refs"/>
+    <w:bookmarkStart w:id="76" w:name="ref-lamport1978"/>
     <w:p>
       <w:pPr>
         <w:pStyle w:val="Bibliography"/>
@@ -7554,7 +9080,7 @@
       <w:r>
         <w:t xml:space="preserve"> </w:t>
       </w:r>
-      <w:hyperlink r:id="rId66">
+      <w:hyperlink r:id="rId75">
         <w:r>
           <w:rPr>
             <w:rStyle w:val="Hyperlink"/>
@@ -7566,8 +9092,8 @@
         <w:t xml:space="preserve">.</w:t>
       </w:r>
     </w:p>
-    <w:bookmarkEnd w:id="67"/>
-    <w:bookmarkStart w:id="69" w:name="ref-gilbert2002"/>
+    <w:bookmarkEnd w:id="76"/>
+    <w:bookmarkStart w:id="78" w:name="ref-gilbert2002"/>
     <w:p>
       <w:pPr>
         <w:pStyle w:val="Bibliography"/>
@@ -7606,7 +9132,7 @@
       <w:r>
         <w:t xml:space="preserve"> </w:t>
       </w:r>
-      <w:hyperlink r:id="rId68">
+      <w:hyperlink r:id="rId77">
         <w:r>
           <w:rPr>
             <w:rStyle w:val="Hyperlink"/>
@@ -7618,8 +9144,8 @@
         <w:t xml:space="preserve">.</w:t>
       </w:r>
     </w:p>
-    <w:bookmarkEnd w:id="69"/>
-    <w:bookmarkStart w:id="71" w:name="ref-herlihy1990"/>
+    <w:bookmarkEnd w:id="78"/>
+    <w:bookmarkStart w:id="80" w:name="ref-herlihy1990"/>
     <w:p>
       <w:pPr>
         <w:pStyle w:val="Bibliography"/>
@@ -7658,7 +9184,7 @@
       <w:r>
         <w:t xml:space="preserve"> </w:t>
       </w:r>
-      <w:hyperlink r:id="rId70">
+      <w:hyperlink r:id="rId79">
         <w:r>
           <w:rPr>
             <w:rStyle w:val="Hyperlink"/>
@@ -7670,8 +9196,8 @@
         <w:t xml:space="preserve">.</w:t>
       </w:r>
     </w:p>
-    <w:bookmarkEnd w:id="71"/>
-    <w:bookmarkStart w:id="73" w:name="ref-vogels2008"/>
+    <w:bookmarkEnd w:id="80"/>
+    <w:bookmarkStart w:id="82" w:name="ref-vogels2008"/>
     <w:p>
       <w:pPr>
         <w:pStyle w:val="Bibliography"/>
@@ -7710,7 +9236,7 @@
       <w:r>
         <w:t xml:space="preserve"> </w:t>
       </w:r>
-      <w:hyperlink r:id="rId72">
+      <w:hyperlink r:id="rId81">
         <w:r>
           <w:rPr>
             <w:rStyle w:val="Hyperlink"/>
@@ -7722,8 +9248,8 @@
         <w:t xml:space="preserve">.</w:t>
       </w:r>
     </w:p>
-    <w:bookmarkEnd w:id="73"/>
-    <w:bookmarkStart w:id="75" w:name="ref-terry1994"/>
+    <w:bookmarkEnd w:id="82"/>
+    <w:bookmarkStart w:id="84" w:name="ref-terry1994"/>
     <w:p>
       <w:pPr>
         <w:pStyle w:val="Bibliography"/>
@@ -7768,7 +9294,7 @@
       <w:r>
         <w:t xml:space="preserve"> </w:t>
       </w:r>
-      <w:hyperlink r:id="rId74">
+      <w:hyperlink r:id="rId83">
         <w:r>
           <w:rPr>
             <w:rStyle w:val="Hyperlink"/>
@@ -7780,8 +9306,8 @@
         <w:t xml:space="preserve">.</w:t>
       </w:r>
     </w:p>
-    <w:bookmarkEnd w:id="75"/>
-    <w:bookmarkStart w:id="76" w:name="ref-brewer2000"/>
+    <w:bookmarkEnd w:id="84"/>
+    <w:bookmarkStart w:id="85" w:name="ref-brewer2000"/>
     <w:p>
       <w:pPr>
         <w:pStyle w:val="Bibliography"/>
@@ -7824,8 +9350,8 @@
         <w:t xml:space="preserve">, Jul. 2000.</w:t>
       </w:r>
     </w:p>
-    <w:bookmarkEnd w:id="76"/>
-    <w:bookmarkStart w:id="78" w:name="ref-brewer2012"/>
+    <w:bookmarkEnd w:id="85"/>
+    <w:bookmarkStart w:id="87" w:name="ref-brewer2012"/>
     <w:p>
       <w:pPr>
         <w:pStyle w:val="Bibliography"/>
@@ -7885,7 +9411,7 @@
       <w:r>
         <w:t xml:space="preserve"> </w:t>
       </w:r>
-      <w:hyperlink r:id="rId77">
+      <w:hyperlink r:id="rId86">
         <w:r>
           <w:rPr>
             <w:rStyle w:val="Hyperlink"/>
@@ -7897,8 +9423,8 @@
         <w:t xml:space="preserve">.</w:t>
       </w:r>
     </w:p>
-    <w:bookmarkEnd w:id="78"/>
-    <w:bookmarkStart w:id="80" w:name="ref-abadi2012"/>
+    <w:bookmarkEnd w:id="87"/>
+    <w:bookmarkStart w:id="89" w:name="ref-abadi2012"/>
     <w:p>
       <w:pPr>
         <w:pStyle w:val="Bibliography"/>
@@ -7949,7 +9475,7 @@
       <w:r>
         <w:t xml:space="preserve"> </w:t>
       </w:r>
-      <w:hyperlink r:id="rId79">
+      <w:hyperlink r:id="rId88">
         <w:r>
           <w:rPr>
             <w:rStyle w:val="Hyperlink"/>
@@ -7961,8 +9487,8 @@
         <w:t xml:space="preserve">.</w:t>
       </w:r>
     </w:p>
-    <w:bookmarkEnd w:id="80"/>
-    <w:bookmarkStart w:id="81" w:name="ref-kleppmann2017"/>
+    <w:bookmarkEnd w:id="89"/>
+    <w:bookmarkStart w:id="90" w:name="ref-kleppmann2017"/>
     <w:p>
       <w:pPr>
         <w:pStyle w:val="Bibliography"/>
@@ -7993,8 +9519,8 @@
         <w:t xml:space="preserve">. Sebastopol, CA, USA: O’Reilly Media, 2017.</w:t>
       </w:r>
     </w:p>
-    <w:bookmarkEnd w:id="81"/>
-    <w:bookmarkStart w:id="83" w:name="ref-decandia2007"/>
+    <w:bookmarkEnd w:id="90"/>
+    <w:bookmarkStart w:id="92" w:name="ref-decandia2007"/>
     <w:p>
       <w:pPr>
         <w:pStyle w:val="Bibliography"/>
@@ -8052,7 +9578,7 @@
       <w:r>
         <w:t xml:space="preserve"> </w:t>
       </w:r>
-      <w:hyperlink r:id="rId82">
+      <w:hyperlink r:id="rId91">
         <w:r>
           <w:rPr>
             <w:rStyle w:val="Hyperlink"/>
@@ -8064,8 +9590,8 @@
         <w:t xml:space="preserve">.</w:t>
       </w:r>
     </w:p>
-    <w:bookmarkEnd w:id="83"/>
-    <w:bookmarkStart w:id="85" w:name="ref-mysql84refman"/>
+    <w:bookmarkEnd w:id="92"/>
+    <w:bookmarkStart w:id="94" w:name="ref-mysql84refman"/>
     <w:p>
       <w:pPr>
         <w:pStyle w:val="Bibliography"/>
@@ -8100,7 +9626,7 @@
       <w:r>
         <w:t xml:space="preserve"> </w:t>
       </w:r>
-      <w:hyperlink r:id="rId84">
+      <w:hyperlink r:id="rId93">
         <w:r>
           <w:rPr>
             <w:rStyle w:val="Hyperlink"/>
@@ -8112,8 +9638,8 @@
         <w:t xml:space="preserve">, 2024.</w:t>
       </w:r>
     </w:p>
-    <w:bookmarkEnd w:id="85"/>
-    <w:bookmarkStart w:id="87" w:name="ref-mysqlshell84"/>
+    <w:bookmarkEnd w:id="94"/>
+    <w:bookmarkStart w:id="96" w:name="ref-mysqlshell84"/>
     <w:p>
       <w:pPr>
         <w:pStyle w:val="Bibliography"/>
@@ -8148,7 +9674,7 @@
       <w:r>
         <w:t xml:space="preserve"> </w:t>
       </w:r>
-      <w:hyperlink r:id="rId86">
+      <w:hyperlink r:id="rId95">
         <w:r>
           <w:rPr>
             <w:rStyle w:val="Hyperlink"/>
@@ -8160,8 +9686,8 @@
         <w:t xml:space="preserve">, 2024.</w:t>
       </w:r>
     </w:p>
-    <w:bookmarkEnd w:id="87"/>
-    <w:bookmarkStart w:id="88" w:name="ref-lamport2001"/>
+    <w:bookmarkEnd w:id="96"/>
+    <w:bookmarkStart w:id="97" w:name="ref-lamport2001"/>
     <w:p>
       <w:pPr>
         <w:pStyle w:val="Bibliography"/>
@@ -8198,8 +9724,8 @@
         <w:t xml:space="preserve">, vol. 32, no. 4, pp. 51–58, Dec. 2001.</w:t>
       </w:r>
     </w:p>
-    <w:bookmarkEnd w:id="88"/>
-    <w:bookmarkStart w:id="89" w:name="ref-ongaro2014"/>
+    <w:bookmarkEnd w:id="97"/>
+    <w:bookmarkStart w:id="98" w:name="ref-ongaro2014"/>
     <w:p>
       <w:pPr>
         <w:pStyle w:val="Bibliography"/>
@@ -8242,8 +9768,8 @@
         <w:t xml:space="preserve">, Philadelphia, PA, USA: USENIX Association, Jun. 2014, pp. 305–320.</w:t>
       </w:r>
     </w:p>
-    <w:bookmarkEnd w:id="89"/>
-    <w:bookmarkStart w:id="91" w:name="ref-gryp2020"/>
+    <w:bookmarkEnd w:id="98"/>
+    <w:bookmarkStart w:id="100" w:name="ref-gryp2020"/>
     <w:p>
       <w:pPr>
         <w:pStyle w:val="Bibliography"/>
@@ -8284,7 +9810,7 @@
       <w:r>
         <w:t xml:space="preserve"> </w:t>
       </w:r>
-      <w:hyperlink r:id="rId90">
+      <w:hyperlink r:id="rId99">
         <w:r>
           <w:rPr>
             <w:rStyle w:val="Hyperlink"/>
@@ -8296,8 +9822,8 @@
         <w:t xml:space="preserve">, Jul. 2020.</w:t>
       </w:r>
     </w:p>
-    <w:bookmarkEnd w:id="91"/>
-    <w:bookmarkStart w:id="93" w:name="ref-mysql84relnotes"/>
+    <w:bookmarkEnd w:id="100"/>
+    <w:bookmarkStart w:id="102" w:name="ref-mysql84relnotes"/>
     <w:p>
       <w:pPr>
         <w:pStyle w:val="Bibliography"/>
@@ -8353,7 +9879,7 @@
       <w:r>
         <w:t xml:space="preserve"> </w:t>
       </w:r>
-      <w:hyperlink r:id="rId92">
+      <w:hyperlink r:id="rId101">
         <w:r>
           <w:rPr>
             <w:rStyle w:val="Hyperlink"/>
@@ -8365,8 +9891,8 @@
         <w:t xml:space="preserve">, 2024.</w:t>
       </w:r>
     </w:p>
-    <w:bookmarkEnd w:id="93"/>
-    <w:bookmarkStart w:id="95" w:name="ref-mysql572relnotes"/>
+    <w:bookmarkEnd w:id="102"/>
+    <w:bookmarkStart w:id="104" w:name="ref-mysql572relnotes"/>
     <w:p>
       <w:pPr>
         <w:pStyle w:val="Bibliography"/>
@@ -8410,7 +9936,7 @@
       <w:r>
         <w:t xml:space="preserve"> </w:t>
       </w:r>
-      <w:hyperlink r:id="rId94">
+      <w:hyperlink r:id="rId103">
         <w:r>
           <w:rPr>
             <w:rStyle w:val="Hyperlink"/>
@@ -8422,8 +9948,8 @@
         <w:t xml:space="preserve">, 2013.</w:t>
       </w:r>
     </w:p>
-    <w:bookmarkEnd w:id="95"/>
-    <w:bookmarkStart w:id="97" w:name="ref-itug114"/>
+    <w:bookmarkEnd w:id="104"/>
+    <w:bookmarkStart w:id="106" w:name="ref-itug114"/>
     <w:p>
       <w:pPr>
         <w:pStyle w:val="Bibliography"/>
@@ -8467,7 +9993,7 @@
       <w:r>
         <w:t xml:space="preserve"> </w:t>
       </w:r>
-      <w:hyperlink r:id="rId96">
+      <w:hyperlink r:id="rId105">
         <w:r>
           <w:rPr>
             <w:rStyle w:val="Hyperlink"/>
@@ -8479,9 +10005,57 @@
         <w:t xml:space="preserve">, May 2003.</w:t>
       </w:r>
     </w:p>
-    <w:bookmarkEnd w:id="97"/>
-    <w:bookmarkEnd w:id="98"/>
-    <w:bookmarkEnd w:id="99"/>
+    <w:bookmarkEnd w:id="106"/>
+    <w:bookmarkStart w:id="108" w:name="ref-mysqlrouter84"/>
+    <w:p>
+      <w:pPr>
+        <w:pStyle w:val="Bibliography"/>
+      </w:pPr>
+      <w:r>
+        <w:t xml:space="preserve">[19]</w:t>
+      </w:r>
+      <w:r>
+        <w:t xml:space="preserve"> </w:t>
+      </w:r>
+      <w:r>
+        <w:t xml:space="preserve">	</w:t>
+      </w:r>
+      <w:r>
+        <w:t xml:space="preserve">Oracle Corporation,</w:t>
+      </w:r>
+      <w:r>
+        <w:t xml:space="preserve"> </w:t>
+      </w:r>
+      <w:r>
+        <w:t xml:space="preserve">“</w:t>
+      </w:r>
+      <w:r>
+        <w:t xml:space="preserve">MySQL</w:t>
+      </w:r>
+      <w:r>
+        <w:t xml:space="preserve"> </w:t>
+      </w:r>
+      <w:r>
+        <w:t xml:space="preserve">router 8.4.”</w:t>
+      </w:r>
+      <w:r>
+        <w:t xml:space="preserve"> </w:t>
+      </w:r>
+      <w:hyperlink r:id="rId107">
+        <w:r>
+          <w:rPr>
+            <w:rStyle w:val="Hyperlink"/>
+          </w:rPr>
+          <w:t xml:space="preserve">https://dev.mysql.com/doc/mysql-router/8.4/en/</w:t>
+        </w:r>
+      </w:hyperlink>
+      <w:r>
+        <w:t xml:space="preserve">, 2024.</w:t>
+      </w:r>
+    </w:p>
+    <w:bookmarkEnd w:id="108"/>
+    <w:bookmarkEnd w:id="109"/>
+    <w:bookmarkEnd w:id="110"/>
     <w:sectPr>
       <w:pgSz w:h="16838" w:w="11906"/>
       <w:pgMar w:bottom="1417" w:footer="708" w:gutter="0" w:header="708" w:left="1417" w:right="1417" w:top="1417"/>

</xml_diff>

<commit_message>
Ticket 20 (session 1/2): chapter 8 Zakljucak in rad.md with Tabela 8.1; measured ~1.08 pp; GLOSSARY spine aligned to 'operatera'
</commit_message>
<xml_diff>
--- a/Tema 3. - Replikacija i distribuirana konzistentnost u MySQL/rad.docx
+++ b/Tema 3. - Replikacija i distribuirana konzistentnost u MySQL/rad.docx
@@ -9031,17 +9031,532 @@
     </w:p>
     <w:bookmarkEnd w:id="73"/>
     <w:bookmarkEnd w:id="74"/>
-    <w:bookmarkStart w:id="110" w:name="bibliography"/>
+    <w:bookmarkStart w:id="75" w:name="zaključak"/>
     <w:p>
       <w:pPr>
         <w:pStyle w:val="Heading1"/>
       </w:pPr>
       <w:r>
+        <w:t xml:space="preserve">8. Zaključak</w:t>
+      </w:r>
+    </w:p>
+    <w:p>
+      <w:pPr>
+        <w:pStyle w:val="FirstParagraph"/>
+      </w:pPr>
+      <w:r>
+        <w:t xml:space="preserve">U poglavljima od trećeg do sedmog ono što se prenosi nije se menjalo: komitovane transakcije</w:t>
+      </w:r>
+      <w:r>
+        <w:t xml:space="preserve"> </w:t>
+      </w:r>
+      <w:r>
+        <w:t xml:space="preserve">upisuju se u binarni log, a ostali čvorovi taj log primenjuju. Menjali su se samo trenutak u kome</w:t>
+      </w:r>
+      <w:r>
+        <w:t xml:space="preserve"> </w:t>
+      </w:r>
+      <w:r>
+        <w:t xml:space="preserve">pisac dobija potvrdu i odgovor na pitanje ko čeka da se razmak između odluke i vidljivosti zatvori.</w:t>
+      </w:r>
+      <w:r>
+        <w:t xml:space="preserve"> </w:t>
+      </w:r>
+      <w:r>
+        <w:t xml:space="preserve">Tabela 8.1 sabira podešavanja kojima se to bira.</w:t>
+      </w:r>
+    </w:p>
+    <w:p>
+      <w:pPr>
+        <w:pStyle w:val="TableCaption"/>
+      </w:pPr>
+      <w:r>
+        <w:t xml:space="preserve">Tabela 8.1: Podešavanja iz poglavlja 3 do 7, šta svako od njih obezbeđuje i ko to plaća. Tabela sažima prethodna poglavlja i ne uvodi nove rezultate.</w:t>
+      </w:r>
+    </w:p>
+    <w:tbl>
+      <w:tblPr>
+        <w:tblStyle w:val="Table"/>
+        <w:tblW w:type="pct" w:w="5000"/>
+        <w:tblLayout w:type="fixed"/>
+        <w:tblLook w:firstRow="1" w:lastRow="0" w:firstColumn="0" w:lastColumn="0" w:noHBand="0" w:noVBand="0" w:val="0020"/>
+        <w:tblCaption w:val="Tabela 8.1: Podešavanja iz poglavlja 3 do 7, šta svako od njih obezbeđuje i ko to plaća. Tabela sažima prethodna poglavlja i ne uvodi nove rezultate."/>
+      </w:tblPr>
+      <w:tblGrid>
+        <w:gridCol w:w="1980"/>
+        <w:gridCol w:w="1980"/>
+        <w:gridCol w:w="1980"/>
+        <w:gridCol w:w="1980"/>
+      </w:tblGrid>
+      <w:tr>
+        <w:trPr>
+          <w:tblHeader w:val="on"/>
+        </w:trPr>
+        <w:tc>
+          <w:tcPr/>
+          <w:p>
+            <w:pPr>
+              <w:pStyle w:val="Compact"/>
+            </w:pPr>
+            <w:r>
+              <w:t xml:space="preserve">Poglavlje</w:t>
+            </w:r>
+          </w:p>
+        </w:tc>
+        <w:tc>
+          <w:tcPr/>
+          <w:p>
+            <w:pPr>
+              <w:pStyle w:val="Compact"/>
+            </w:pPr>
+            <w:r>
+              <w:t xml:space="preserve">Podešavanje</w:t>
+            </w:r>
+          </w:p>
+        </w:tc>
+        <w:tc>
+          <w:tcPr/>
+          <w:p>
+            <w:pPr>
+              <w:pStyle w:val="Compact"/>
+            </w:pPr>
+            <w:r>
+              <w:t xml:space="preserve">Dobija se</w:t>
+            </w:r>
+          </w:p>
+        </w:tc>
+        <w:tc>
+          <w:tcPr/>
+          <w:p>
+            <w:pPr>
+              <w:pStyle w:val="Compact"/>
+            </w:pPr>
+            <w:r>
+              <w:t xml:space="preserve">Ko plaća i čime</w:t>
+            </w:r>
+          </w:p>
+        </w:tc>
+      </w:tr>
+      <w:tr>
+        <w:tc>
+          <w:tcPr/>
+          <w:p>
+            <w:pPr>
+              <w:pStyle w:val="Compact"/>
+            </w:pPr>
+            <w:r>
+              <w:t xml:space="preserve">3. Asinhrona</w:t>
+            </w:r>
+          </w:p>
+        </w:tc>
+        <w:tc>
+          <w:tcPr/>
+          <w:p>
+            <w:pPr>
+              <w:pStyle w:val="Compact"/>
+            </w:pPr>
+            <w:r>
+              <w:t xml:space="preserve">podrazumevano, bez čekanja replika</w:t>
+            </w:r>
+          </w:p>
+        </w:tc>
+        <w:tc>
+          <w:tcPr/>
+          <w:p>
+            <w:pPr>
+              <w:pStyle w:val="Compact"/>
+            </w:pPr>
+            <w:r>
+              <w:t xml:space="preserve">najmanja latencija</w:t>
+            </w:r>
+          </w:p>
+        </w:tc>
+        <w:tc>
+          <w:tcPr/>
+          <w:p>
+            <w:pPr>
+              <w:pStyle w:val="Compact"/>
+            </w:pPr>
+            <w:r>
+              <w:t xml:space="preserve">čitalac zastarelošću; potvrđeni upis pri otkazu izvora</w:t>
+            </w:r>
+          </w:p>
+        </w:tc>
+      </w:tr>
+      <w:tr>
+        <w:tc>
+          <w:tcPr/>
+          <w:p>
+            <w:pPr>
+              <w:pStyle w:val="Compact"/>
+            </w:pPr>
+            <w:r>
+              <w:t xml:space="preserve">4. Semisinhrona</w:t>
+            </w:r>
+          </w:p>
+        </w:tc>
+        <w:tc>
+          <w:tcPr/>
+          <w:p>
+            <w:pPr>
+              <w:pStyle w:val="Compact"/>
+            </w:pPr>
+            <w:r>
+              <w:t xml:space="preserve">tačka čekanja, istek vremena</w:t>
+            </w:r>
+          </w:p>
+        </w:tc>
+        <w:tc>
+          <w:tcPr/>
+          <w:p>
+            <w:pPr>
+              <w:pStyle w:val="Compact"/>
+            </w:pPr>
+            <w:r>
+              <w:t xml:space="preserve">transakcija na disku još jednog čvora</w:t>
+            </w:r>
+          </w:p>
+        </w:tc>
+        <w:tc>
+          <w:tcPr/>
+          <w:p>
+            <w:pPr>
+              <w:pStyle w:val="Compact"/>
+            </w:pPr>
+            <w:r>
+              <w:t xml:space="preserve">pisac, jednim povratnim putovanjem</w:t>
+            </w:r>
+          </w:p>
+        </w:tc>
+      </w:tr>
+      <w:tr>
+        <w:tc>
+          <w:tcPr/>
+          <w:p>
+            <w:pPr>
+              <w:pStyle w:val="Compact"/>
+            </w:pPr>
+            <w:r>
+              <w:t xml:space="preserve">5. Group Replication</w:t>
+            </w:r>
+          </w:p>
+        </w:tc>
+        <w:tc>
+          <w:tcPr/>
+          <w:p>
+            <w:pPr>
+              <w:pStyle w:val="Compact"/>
+            </w:pPr>
+            <w:r>
+              <w:t xml:space="preserve">kvorum,</w:t>
+            </w:r>
+            <w:r>
+              <w:t xml:space="preserve"> </w:t>
+            </w:r>
+            <w:r>
+              <w:rPr>
+                <w:rStyle w:val="VerbatimChar"/>
+              </w:rPr>
+              <w:t xml:space="preserve">group_replication_consistency</w:t>
+            </w:r>
+          </w:p>
+        </w:tc>
+        <w:tc>
+          <w:tcPr/>
+          <w:p>
+            <w:pPr>
+              <w:pStyle w:val="Compact"/>
+            </w:pPr>
+            <w:r>
+              <w:t xml:space="preserve">nema razilaženja; sveža čitanja</w:t>
+            </w:r>
+          </w:p>
+        </w:tc>
+        <w:tc>
+          <w:tcPr/>
+          <w:p>
+            <w:pPr>
+              <w:pStyle w:val="Compact"/>
+            </w:pPr>
+            <w:r>
+              <w:t xml:space="preserve">upisi kada nema većine; pisac (</w:t>
+            </w:r>
+            <w:r>
+              <w:rPr>
+                <w:rStyle w:val="VerbatimChar"/>
+              </w:rPr>
+              <w:t xml:space="preserve">AFTER</w:t>
+            </w:r>
+            <w:r>
+              <w:t xml:space="preserve">) ili čitalac (</w:t>
+            </w:r>
+            <w:r>
+              <w:rPr>
+                <w:rStyle w:val="VerbatimChar"/>
+              </w:rPr>
+              <w:t xml:space="preserve">BEFORE</w:t>
+            </w:r>
+            <w:r>
+              <w:t xml:space="preserve">)</w:t>
+            </w:r>
+          </w:p>
+        </w:tc>
+      </w:tr>
+      <w:tr>
+        <w:tc>
+          <w:tcPr/>
+          <w:p>
+            <w:pPr>
+              <w:pStyle w:val="Compact"/>
+            </w:pPr>
+            <w:r>
+              <w:t xml:space="preserve">6. ClusterSet</w:t>
+            </w:r>
+          </w:p>
+        </w:tc>
+        <w:tc>
+          <w:tcPr/>
+          <w:p>
+            <w:pPr>
+              <w:pStyle w:val="Compact"/>
+            </w:pPr>
+            <w:r>
+              <w:rPr>
+                <w:rStyle w:val="VerbatimChar"/>
+              </w:rPr>
+              <w:t xml:space="preserve">forcePrimaryCluster()</w:t>
+            </w:r>
+          </w:p>
+        </w:tc>
+        <w:tc>
+          <w:tcPr/>
+          <w:p>
+            <w:pPr>
+              <w:pStyle w:val="Compact"/>
+            </w:pPr>
+            <w:r>
+              <w:t xml:space="preserve">upisi posle gubitka lokacije</w:t>
+            </w:r>
+          </w:p>
+        </w:tc>
+        <w:tc>
+          <w:tcPr/>
+          <w:p>
+            <w:pPr>
+              <w:pStyle w:val="Compact"/>
+            </w:pPr>
+            <w:r>
+              <w:t xml:space="preserve">transakcije u kanalu, rizik da nastane split brain</w:t>
+            </w:r>
+          </w:p>
+        </w:tc>
+      </w:tr>
+      <w:tr>
+        <w:tc>
+          <w:tcPr/>
+          <w:p>
+            <w:pPr>
+              <w:pStyle w:val="Compact"/>
+            </w:pPr>
+            <w:r>
+              <w:t xml:space="preserve">7. Replike za čitanje</w:t>
+            </w:r>
+          </w:p>
+        </w:tc>
+        <w:tc>
+          <w:tcPr/>
+          <w:p>
+            <w:pPr>
+              <w:pStyle w:val="Compact"/>
+            </w:pPr>
+            <w:r>
+              <w:rPr>
+                <w:rStyle w:val="VerbatimChar"/>
+              </w:rPr>
+              <w:t xml:space="preserve">WAIT_FOR_EXECUTED_GTID_SET()</w:t>
+            </w:r>
+          </w:p>
+        </w:tc>
+        <w:tc>
+          <w:tcPr/>
+          <w:p>
+            <w:pPr>
+              <w:pStyle w:val="Compact"/>
+            </w:pPr>
+            <w:r>
+              <w:t xml:space="preserve">čitanje sopstvenog upisa</w:t>
+            </w:r>
+          </w:p>
+        </w:tc>
+        <w:tc>
+          <w:tcPr/>
+          <w:p>
+            <w:pPr>
+              <w:pStyle w:val="Compact"/>
+            </w:pPr>
+            <w:r>
+              <w:t xml:space="preserve">čitalac, čekanjem koliko replika kasni</w:t>
+            </w:r>
+          </w:p>
+        </w:tc>
+      </w:tr>
+    </w:tbl>
+    <w:p>
+      <w:pPr>
+        <w:pStyle w:val="BodyText"/>
+      </w:pPr>
+      <w:r>
+        <w:t xml:space="preserve">Svaka jača garancija plaća se čekanjem, a podešavanje određuje samo ko čeka: pisac, čitalac ili,</w:t>
+      </w:r>
+      <w:r>
+        <w:t xml:space="preserve"> </w:t>
+      </w:r>
+      <w:r>
+        <w:t xml:space="preserve">pri otkazu, operater. Garancije su pri tome uže od svojih naziva. Semisinhrona potvrda ne znači da</w:t>
+      </w:r>
+      <w:r>
+        <w:t xml:space="preserve"> </w:t>
+      </w:r>
+      <w:r>
+        <w:t xml:space="preserve">je transakcija primenjena, a po isteku vremena tiho nestaje. Nivo</w:t>
+      </w:r>
+      <w:r>
+        <w:t xml:space="preserve"> </w:t>
+      </w:r>
+      <w:r>
+        <w:rPr>
+          <w:rStyle w:val="VerbatimChar"/>
+        </w:rPr>
+        <w:t xml:space="preserve">AFTER</w:t>
+      </w:r>
+      <w:r>
+        <w:t xml:space="preserve">, koji priručnik</w:t>
+      </w:r>
+      <w:r>
+        <w:t xml:space="preserve"> </w:t>
+      </w:r>
+      <w:r>
+        <w:t xml:space="preserve">preporučuje kada je potrebna stroga konzistentnost</w:t>
+      </w:r>
+      <w:r>
+        <w:t xml:space="preserve"> </w:t>
+      </w:r>
+      <w:r>
+        <w:t xml:space="preserve">[11]</w:t>
+      </w:r>
+      <w:r>
+        <w:t xml:space="preserve">, daje read-your-writes za sve</w:t>
+      </w:r>
+      <w:r>
+        <w:t xml:space="preserve"> </w:t>
+      </w:r>
+      <w:r>
+        <w:t xml:space="preserve">čitaoce, a ne linearizabilnost.</w:t>
+      </w:r>
+    </w:p>
+    <w:p>
+      <w:pPr>
+        <w:pStyle w:val="BodyText"/>
+      </w:pPr>
+      <w:r>
+        <w:t xml:space="preserve">Najjači dokaz za tezu rada jeste to što isti proizvod na dva nivoa zauzima suprotne pozicije</w:t>
+      </w:r>
+      <w:r>
+        <w:t xml:space="preserve"> </w:t>
+      </w:r>
+      <w:r>
+        <w:t xml:space="preserve">teoreme CAP. Unutar klastera grupa bez većine blokira upise, a između klastera InnoDB ClusterSet,</w:t>
+      </w:r>
+      <w:r>
+        <w:t xml:space="preserve"> </w:t>
+      </w:r>
+      <w:r>
+        <w:t xml:space="preserve">prema sopstvenom priručniku, daje prednost dostupnosti nad konzistentnošću</w:t>
+      </w:r>
+      <w:r>
+        <w:t xml:space="preserve"> </w:t>
+      </w:r>
+      <w:r>
+        <w:t xml:space="preserve">[12]</w:t>
+      </w:r>
+      <w:r>
+        <w:t xml:space="preserve">. Ipak,</w:t>
+      </w:r>
+      <w:r>
+        <w:t xml:space="preserve"> </w:t>
+      </w:r>
+      <w:r>
+        <w:t xml:space="preserve">replika-klaster posle gubitka primarne lokacije nije sam počeo da prima upise, već tek posle naredbe</w:t>
+      </w:r>
+      <w:r>
+        <w:t xml:space="preserve"> </w:t>
+      </w:r>
+      <w:r>
+        <w:rPr>
+          <w:rStyle w:val="VerbatimChar"/>
+        </w:rPr>
+        <w:t xml:space="preserve">forcePrimaryCluster()</w:t>
+      </w:r>
+      <w:r>
+        <w:t xml:space="preserve">, kao što i u grupi upise vraća tek prisilno obnavljanje kvoruma. Dostupnost,</w:t>
+      </w:r>
+      <w:r>
+        <w:t xml:space="preserve"> </w:t>
+      </w:r>
+      <w:r>
+        <w:t xml:space="preserve">dakle, ni na jednom nivou nije svojstvo sistema, već odluka koju operater donosi jednom naredbom,</w:t>
+      </w:r>
+      <w:r>
+        <w:t xml:space="preserve"> </w:t>
+      </w:r>
+      <w:r>
+        <w:t xml:space="preserve">prihvatajući gubitak transakcija i rizik da nastane split brain.</w:t>
+      </w:r>
+    </w:p>
+    <w:p>
+      <w:pPr>
+        <w:pStyle w:val="BodyText"/>
+      </w:pPr>
+      <w:r>
+        <w:t xml:space="preserve">MySQL ne isporučuje model konzistentnosti, već log i skup podesivih tačaka potvrde, pa je</w:t>
+      </w:r>
+      <w:r>
+        <w:t xml:space="preserve"> </w:t>
+      </w:r>
+      <w:r>
+        <w:t xml:space="preserve">konzistentnost odluka operatera, a ne svojstvo sistema. Sva merenja u ovom radu izvedena su na tri</w:t>
+      </w:r>
+      <w:r>
+        <w:t xml:space="preserve"> </w:t>
+      </w:r>
+      <w:r>
+        <w:t xml:space="preserve">instance na jednom računaru, pa je uticaj stvarne udaljenosti između lokacija izveden iz</w:t>
+      </w:r>
+      <w:r>
+        <w:t xml:space="preserve"> </w:t>
+      </w:r>
+      <w:r>
+        <w:t xml:space="preserve">priručnika, a ne izmeren. Njegova provera na mreži sa stvarnim rastojanjima prirodan je nastavak</w:t>
+      </w:r>
+      <w:r>
+        <w:t xml:space="preserve"> </w:t>
+      </w:r>
+      <w:r>
+        <w:t xml:space="preserve">ovog rada.</w:t>
+      </w:r>
+    </w:p>
+    <w:bookmarkEnd w:id="75"/>
+    <w:bookmarkStart w:id="111" w:name="bibliography"/>
+    <w:p>
+      <w:pPr>
+        <w:pStyle w:val="Heading1"/>
+      </w:pPr>
+      <w:r>
         <w:t xml:space="preserve">Reference</w:t>
       </w:r>
     </w:p>
-    <w:bookmarkStart w:id="109" w:name="refs"/>
-    <w:bookmarkStart w:id="76" w:name="ref-lamport1978"/>
+    <w:bookmarkStart w:id="110" w:name="refs"/>
+    <w:bookmarkStart w:id="77" w:name="ref-lamport1978"/>
     <w:p>
       <w:pPr>
         <w:pStyle w:val="Bibliography"/>
@@ -9080,7 +9595,7 @@
       <w:r>
         <w:t xml:space="preserve"> </w:t>
       </w:r>
-      <w:hyperlink r:id="rId75">
+      <w:hyperlink r:id="rId76">
         <w:r>
           <w:rPr>
             <w:rStyle w:val="Hyperlink"/>
@@ -9092,8 +9607,8 @@
         <w:t xml:space="preserve">.</w:t>
       </w:r>
     </w:p>
-    <w:bookmarkEnd w:id="76"/>
-    <w:bookmarkStart w:id="78" w:name="ref-gilbert2002"/>
+    <w:bookmarkEnd w:id="77"/>
+    <w:bookmarkStart w:id="79" w:name="ref-gilbert2002"/>
     <w:p>
       <w:pPr>
         <w:pStyle w:val="Bibliography"/>
@@ -9132,7 +9647,7 @@
       <w:r>
         <w:t xml:space="preserve"> </w:t>
       </w:r>
-      <w:hyperlink r:id="rId77">
+      <w:hyperlink r:id="rId78">
         <w:r>
           <w:rPr>
             <w:rStyle w:val="Hyperlink"/>
@@ -9144,8 +9659,8 @@
         <w:t xml:space="preserve">.</w:t>
       </w:r>
     </w:p>
-    <w:bookmarkEnd w:id="78"/>
-    <w:bookmarkStart w:id="80" w:name="ref-herlihy1990"/>
+    <w:bookmarkEnd w:id="79"/>
+    <w:bookmarkStart w:id="81" w:name="ref-herlihy1990"/>
     <w:p>
       <w:pPr>
         <w:pStyle w:val="Bibliography"/>
@@ -9184,7 +9699,7 @@
       <w:r>
         <w:t xml:space="preserve"> </w:t>
       </w:r>
-      <w:hyperlink r:id="rId79">
+      <w:hyperlink r:id="rId80">
         <w:r>
           <w:rPr>
             <w:rStyle w:val="Hyperlink"/>
@@ -9196,8 +9711,8 @@
         <w:t xml:space="preserve">.</w:t>
       </w:r>
     </w:p>
-    <w:bookmarkEnd w:id="80"/>
-    <w:bookmarkStart w:id="82" w:name="ref-vogels2008"/>
+    <w:bookmarkEnd w:id="81"/>
+    <w:bookmarkStart w:id="83" w:name="ref-vogels2008"/>
     <w:p>
       <w:pPr>
         <w:pStyle w:val="Bibliography"/>
@@ -9236,7 +9751,7 @@
       <w:r>
         <w:t xml:space="preserve"> </w:t>
       </w:r>
-      <w:hyperlink r:id="rId81">
+      <w:hyperlink r:id="rId82">
         <w:r>
           <w:rPr>
             <w:rStyle w:val="Hyperlink"/>
@@ -9248,8 +9763,8 @@
         <w:t xml:space="preserve">.</w:t>
       </w:r>
     </w:p>
-    <w:bookmarkEnd w:id="82"/>
-    <w:bookmarkStart w:id="84" w:name="ref-terry1994"/>
+    <w:bookmarkEnd w:id="83"/>
+    <w:bookmarkStart w:id="85" w:name="ref-terry1994"/>
     <w:p>
       <w:pPr>
         <w:pStyle w:val="Bibliography"/>
@@ -9294,7 +9809,7 @@
       <w:r>
         <w:t xml:space="preserve"> </w:t>
       </w:r>
-      <w:hyperlink r:id="rId83">
+      <w:hyperlink r:id="rId84">
         <w:r>
           <w:rPr>
             <w:rStyle w:val="Hyperlink"/>
@@ -9306,8 +9821,8 @@
         <w:t xml:space="preserve">.</w:t>
       </w:r>
     </w:p>
-    <w:bookmarkEnd w:id="84"/>
-    <w:bookmarkStart w:id="85" w:name="ref-brewer2000"/>
+    <w:bookmarkEnd w:id="85"/>
+    <w:bookmarkStart w:id="86" w:name="ref-brewer2000"/>
     <w:p>
       <w:pPr>
         <w:pStyle w:val="Bibliography"/>
@@ -9350,8 +9865,8 @@
         <w:t xml:space="preserve">, Jul. 2000.</w:t>
       </w:r>
     </w:p>
-    <w:bookmarkEnd w:id="85"/>
-    <w:bookmarkStart w:id="87" w:name="ref-brewer2012"/>
+    <w:bookmarkEnd w:id="86"/>
+    <w:bookmarkStart w:id="88" w:name="ref-brewer2012"/>
     <w:p>
       <w:pPr>
         <w:pStyle w:val="Bibliography"/>
@@ -9411,7 +9926,7 @@
       <w:r>
         <w:t xml:space="preserve"> </w:t>
       </w:r>
-      <w:hyperlink r:id="rId86">
+      <w:hyperlink r:id="rId87">
         <w:r>
           <w:rPr>
             <w:rStyle w:val="Hyperlink"/>
@@ -9423,8 +9938,8 @@
         <w:t xml:space="preserve">.</w:t>
       </w:r>
     </w:p>
-    <w:bookmarkEnd w:id="87"/>
-    <w:bookmarkStart w:id="89" w:name="ref-abadi2012"/>
+    <w:bookmarkEnd w:id="88"/>
+    <w:bookmarkStart w:id="90" w:name="ref-abadi2012"/>
     <w:p>
       <w:pPr>
         <w:pStyle w:val="Bibliography"/>
@@ -9475,7 +9990,7 @@
       <w:r>
         <w:t xml:space="preserve"> </w:t>
       </w:r>
-      <w:hyperlink r:id="rId88">
+      <w:hyperlink r:id="rId89">
         <w:r>
           <w:rPr>
             <w:rStyle w:val="Hyperlink"/>
@@ -9487,8 +10002,8 @@
         <w:t xml:space="preserve">.</w:t>
       </w:r>
     </w:p>
-    <w:bookmarkEnd w:id="89"/>
-    <w:bookmarkStart w:id="90" w:name="ref-kleppmann2017"/>
+    <w:bookmarkEnd w:id="90"/>
+    <w:bookmarkStart w:id="91" w:name="ref-kleppmann2017"/>
     <w:p>
       <w:pPr>
         <w:pStyle w:val="Bibliography"/>
@@ -9519,8 +10034,8 @@
         <w:t xml:space="preserve">. Sebastopol, CA, USA: O’Reilly Media, 2017.</w:t>
       </w:r>
     </w:p>
-    <w:bookmarkEnd w:id="90"/>
-    <w:bookmarkStart w:id="92" w:name="ref-decandia2007"/>
+    <w:bookmarkEnd w:id="91"/>
+    <w:bookmarkStart w:id="93" w:name="ref-decandia2007"/>
     <w:p>
       <w:pPr>
         <w:pStyle w:val="Bibliography"/>
@@ -9578,7 +10093,7 @@
       <w:r>
         <w:t xml:space="preserve"> </w:t>
       </w:r>
-      <w:hyperlink r:id="rId91">
+      <w:hyperlink r:id="rId92">
         <w:r>
           <w:rPr>
             <w:rStyle w:val="Hyperlink"/>
@@ -9590,8 +10105,8 @@
         <w:t xml:space="preserve">.</w:t>
       </w:r>
     </w:p>
-    <w:bookmarkEnd w:id="92"/>
-    <w:bookmarkStart w:id="94" w:name="ref-mysql84refman"/>
+    <w:bookmarkEnd w:id="93"/>
+    <w:bookmarkStart w:id="95" w:name="ref-mysql84refman"/>
     <w:p>
       <w:pPr>
         <w:pStyle w:val="Bibliography"/>
@@ -9626,7 +10141,7 @@
       <w:r>
         <w:t xml:space="preserve"> </w:t>
       </w:r>
-      <w:hyperlink r:id="rId93">
+      <w:hyperlink r:id="rId94">
         <w:r>
           <w:rPr>
             <w:rStyle w:val="Hyperlink"/>
@@ -9638,8 +10153,8 @@
         <w:t xml:space="preserve">, 2024.</w:t>
       </w:r>
     </w:p>
-    <w:bookmarkEnd w:id="94"/>
-    <w:bookmarkStart w:id="96" w:name="ref-mysqlshell84"/>
+    <w:bookmarkEnd w:id="95"/>
+    <w:bookmarkStart w:id="97" w:name="ref-mysqlshell84"/>
     <w:p>
       <w:pPr>
         <w:pStyle w:val="Bibliography"/>
@@ -9674,7 +10189,7 @@
       <w:r>
         <w:t xml:space="preserve"> </w:t>
       </w:r>
-      <w:hyperlink r:id="rId95">
+      <w:hyperlink r:id="rId96">
         <w:r>
           <w:rPr>
             <w:rStyle w:val="Hyperlink"/>
@@ -9686,8 +10201,8 @@
         <w:t xml:space="preserve">, 2024.</w:t>
       </w:r>
     </w:p>
-    <w:bookmarkEnd w:id="96"/>
-    <w:bookmarkStart w:id="97" w:name="ref-lamport2001"/>
+    <w:bookmarkEnd w:id="97"/>
+    <w:bookmarkStart w:id="98" w:name="ref-lamport2001"/>
     <w:p>
       <w:pPr>
         <w:pStyle w:val="Bibliography"/>
@@ -9724,8 +10239,8 @@
         <w:t xml:space="preserve">, vol. 32, no. 4, pp. 51–58, Dec. 2001.</w:t>
       </w:r>
     </w:p>
-    <w:bookmarkEnd w:id="97"/>
-    <w:bookmarkStart w:id="98" w:name="ref-ongaro2014"/>
+    <w:bookmarkEnd w:id="98"/>
+    <w:bookmarkStart w:id="99" w:name="ref-ongaro2014"/>
     <w:p>
       <w:pPr>
         <w:pStyle w:val="Bibliography"/>
@@ -9768,8 +10283,8 @@
         <w:t xml:space="preserve">, Philadelphia, PA, USA: USENIX Association, Jun. 2014, pp. 305–320.</w:t>
       </w:r>
     </w:p>
-    <w:bookmarkEnd w:id="98"/>
-    <w:bookmarkStart w:id="100" w:name="ref-gryp2020"/>
+    <w:bookmarkEnd w:id="99"/>
+    <w:bookmarkStart w:id="101" w:name="ref-gryp2020"/>
     <w:p>
       <w:pPr>
         <w:pStyle w:val="Bibliography"/>
@@ -9810,7 +10325,7 @@
       <w:r>
         <w:t xml:space="preserve"> </w:t>
       </w:r>
-      <w:hyperlink r:id="rId99">
+      <w:hyperlink r:id="rId100">
         <w:r>
           <w:rPr>
             <w:rStyle w:val="Hyperlink"/>
@@ -9822,8 +10337,8 @@
         <w:t xml:space="preserve">, Jul. 2020.</w:t>
       </w:r>
     </w:p>
-    <w:bookmarkEnd w:id="100"/>
-    <w:bookmarkStart w:id="102" w:name="ref-mysql84relnotes"/>
+    <w:bookmarkEnd w:id="101"/>
+    <w:bookmarkStart w:id="103" w:name="ref-mysql84relnotes"/>
     <w:p>
       <w:pPr>
         <w:pStyle w:val="Bibliography"/>
@@ -9879,7 +10394,7 @@
       <w:r>
         <w:t xml:space="preserve"> </w:t>
       </w:r>
-      <w:hyperlink r:id="rId101">
+      <w:hyperlink r:id="rId102">
         <w:r>
           <w:rPr>
             <w:rStyle w:val="Hyperlink"/>
@@ -9891,8 +10406,8 @@
         <w:t xml:space="preserve">, 2024.</w:t>
       </w:r>
     </w:p>
-    <w:bookmarkEnd w:id="102"/>
-    <w:bookmarkStart w:id="104" w:name="ref-mysql572relnotes"/>
+    <w:bookmarkEnd w:id="103"/>
+    <w:bookmarkStart w:id="105" w:name="ref-mysql572relnotes"/>
     <w:p>
       <w:pPr>
         <w:pStyle w:val="Bibliography"/>
@@ -9936,7 +10451,7 @@
       <w:r>
         <w:t xml:space="preserve"> </w:t>
       </w:r>
-      <w:hyperlink r:id="rId103">
+      <w:hyperlink r:id="rId104">
         <w:r>
           <w:rPr>
             <w:rStyle w:val="Hyperlink"/>
@@ -9948,8 +10463,8 @@
         <w:t xml:space="preserve">, 2013.</w:t>
       </w:r>
     </w:p>
-    <w:bookmarkEnd w:id="104"/>
-    <w:bookmarkStart w:id="106" w:name="ref-itug114"/>
+    <w:bookmarkEnd w:id="105"/>
+    <w:bookmarkStart w:id="107" w:name="ref-itug114"/>
     <w:p>
       <w:pPr>
         <w:pStyle w:val="Bibliography"/>
@@ -9993,7 +10508,7 @@
       <w:r>
         <w:t xml:space="preserve"> </w:t>
       </w:r>
-      <w:hyperlink r:id="rId105">
+      <w:hyperlink r:id="rId106">
         <w:r>
           <w:rPr>
             <w:rStyle w:val="Hyperlink"/>
@@ -10005,8 +10520,8 @@
         <w:t xml:space="preserve">, May 2003.</w:t>
       </w:r>
     </w:p>
-    <w:bookmarkEnd w:id="106"/>
-    <w:bookmarkStart w:id="108" w:name="ref-mysqlrouter84"/>
+    <w:bookmarkEnd w:id="107"/>
+    <w:bookmarkStart w:id="109" w:name="ref-mysqlrouter84"/>
     <w:p>
       <w:pPr>
         <w:pStyle w:val="Bibliography"/>
@@ -10041,7 +10556,7 @@
       <w:r>
         <w:t xml:space="preserve"> </w:t>
       </w:r>
-      <w:hyperlink r:id="rId107">
+      <w:hyperlink r:id="rId108">
         <w:r>
           <w:rPr>
             <w:rStyle w:val="Hyperlink"/>
@@ -10053,9 +10568,9 @@
         <w:t xml:space="preserve">, 2024.</w:t>
       </w:r>
     </w:p>
-    <w:bookmarkEnd w:id="108"/>
     <w:bookmarkEnd w:id="109"/>
     <w:bookmarkEnd w:id="110"/>
+    <w:bookmarkEnd w:id="111"/>
     <w:sectPr>
       <w:pgSz w:h="16838" w:w="11906"/>
       <w:pgMar w:bottom="1417" w:footer="708" w:gutter="0" w:header="708" w:left="1417" w:right="1417" w:top="1417"/>

</xml_diff>

<commit_message>
Ticket 20 closed: chapter 1 Uvod in rad.md (386 words, ~0.8 pp), reconciled with ch. 8; ticket 13 unblocked
</commit_message>
<xml_diff>
--- a/Tema 3. - Replikacija i distribuirana konzistentnost u MySQL/rad.docx
+++ b/Tema 3. - Replikacija i distribuirana konzistentnost u MySQL/rad.docx
@@ -252,6 +252,176 @@
       </w:pPr>
       <w:r>
         <w:t xml:space="preserve">1. Uvod</w:t>
+      </w:r>
+    </w:p>
+    <w:p>
+      <w:pPr>
+        <w:pStyle w:val="FirstParagraph"/>
+      </w:pPr>
+      <w:r>
+        <w:t xml:space="preserve">Baza podataka replicira se da bi podaci preživeli otkaz jednog servera, da bi se čitanja</w:t>
+      </w:r>
+      <w:r>
+        <w:t xml:space="preserve"> </w:t>
+      </w:r>
+      <w:r>
+        <w:t xml:space="preserve">raspodelila na više čvorova i da bi kopija postojala i na drugoj lokaciji. Čim ista transakcija</w:t>
+      </w:r>
+      <w:r>
+        <w:t xml:space="preserve"> </w:t>
+      </w:r>
+      <w:r>
+        <w:t xml:space="preserve">postoji na više čvorova, svaki od tih ciljeva otvara isto pitanje: kada klijent sme da dobije</w:t>
+      </w:r>
+      <w:r>
+        <w:t xml:space="preserve"> </w:t>
+      </w:r>
+      <w:r>
+        <w:t xml:space="preserve">potvrdu da je upis uspeo i šta tada vraća čitanje sa neke druge kopije. Teorija distribuiranih</w:t>
+      </w:r>
+      <w:r>
+        <w:t xml:space="preserve"> </w:t>
+      </w:r>
+      <w:r>
+        <w:t xml:space="preserve">sistema na to pitanje odgovara modelima konzistentnosti, teoremom CAP i njenim proširenjem PACELC, a ovaj rad</w:t>
+      </w:r>
+      <w:r>
+        <w:t xml:space="preserve"> </w:t>
+      </w:r>
+      <w:r>
+        <w:t xml:space="preserve">ispituje kako na njega odgovara MySQL 8.4.</w:t>
+      </w:r>
+    </w:p>
+    <w:p>
+      <w:pPr>
+        <w:pStyle w:val="BodyText"/>
+      </w:pPr>
+      <w:r>
+        <w:t xml:space="preserve">Teza rada glasi da MySQL ne isporučuje model konzistentnosti, već log i skup podesivih tačaka</w:t>
+      </w:r>
+      <w:r>
+        <w:t xml:space="preserve"> </w:t>
+      </w:r>
+      <w:r>
+        <w:t xml:space="preserve">potvrde, pa je konzistentnost odluka operatera, a ne svojstvo sistema. U svim oblicima replikacije</w:t>
+      </w:r>
+      <w:r>
+        <w:t xml:space="preserve"> </w:t>
+      </w:r>
+      <w:r>
+        <w:t xml:space="preserve">koje rad razmatra prenosi se isto: komitovane transakcije upisuju se u binarni log, a ostali</w:t>
+      </w:r>
+      <w:r>
+        <w:t xml:space="preserve"> </w:t>
+      </w:r>
+      <w:r>
+        <w:t xml:space="preserve">čvorovi taj log primenjuju. Menja se samo trenutak u kome pisac dobija potvrdu i odgovor na pitanje</w:t>
+      </w:r>
+      <w:r>
+        <w:t xml:space="preserve"> </w:t>
+      </w:r>
+      <w:r>
+        <w:t xml:space="preserve">ko čeka da promena postane vidljiva na ostalim čvorovima. Zato svako poglavlje od trećeg do sedmog</w:t>
+      </w:r>
+      <w:r>
+        <w:t xml:space="preserve"> </w:t>
+      </w:r>
+      <w:r>
+        <w:t xml:space="preserve">izdvaja jedno podešavanje i pita šta se njime dobija, ko to plaća i čime. Da je reč o tvrdnji, a ne o opštem</w:t>
+      </w:r>
+      <w:r>
+        <w:t xml:space="preserve"> </w:t>
+      </w:r>
+      <w:r>
+        <w:t xml:space="preserve">mestu, pokazuje to što isti proizvod na dva nivoa zauzima suprotne pozicije teoreme CAP, čemu vode</w:t>
+      </w:r>
+      <w:r>
+        <w:t xml:space="preserve"> </w:t>
+      </w:r>
+      <w:r>
+        <w:t xml:space="preserve">peto i šesto poglavlje.</w:t>
+      </w:r>
+    </w:p>
+    <w:p>
+      <w:pPr>
+        <w:pStyle w:val="BodyText"/>
+      </w:pPr>
+      <w:r>
+        <w:t xml:space="preserve">Drugo poglavlje uvodi rečnik kojim se rad služi: modele konzistentnosti, CAP i PACELC, modele</w:t>
+      </w:r>
+      <w:r>
+        <w:t xml:space="preserve"> </w:t>
+      </w:r>
+      <w:r>
+        <w:t xml:space="preserve">replikacije single-leader, multi-leader i leaderless, kao i konsenzus, uz razliku između</w:t>
+      </w:r>
+      <w:r>
+        <w:t xml:space="preserve"> </w:t>
+      </w:r>
+      <w:r>
+        <w:t xml:space="preserve">konsenzus-kvoruma i Dynamo-kvoruma. Treće poglavlje opisuje binarni log, GTID i asinhronu</w:t>
+      </w:r>
+      <w:r>
+        <w:t xml:space="preserve"> </w:t>
+      </w:r>
+      <w:r>
+        <w:t xml:space="preserve">replikaciju, u kojoj izvor ne čeka nijednu repliku. Četvrto razmatra semisinhronu replikaciju i</w:t>
+      </w:r>
+      <w:r>
+        <w:t xml:space="preserve"> </w:t>
+      </w:r>
+      <w:r>
+        <w:t xml:space="preserve">ono što potvrda replike zaista garantuje. Peto je posvećeno mehanizmu Group Replication: postupku</w:t>
+      </w:r>
+      <w:r>
+        <w:t xml:space="preserve"> </w:t>
+      </w:r>
+      <w:r>
+        <w:t xml:space="preserve">certification (provera saglasnosti transakcija), kvorumu, radu sa jednim ili više primarnih čvorova i nivoima konzistentnosti. Šesto</w:t>
+      </w:r>
+      <w:r>
+        <w:t xml:space="preserve"> </w:t>
+      </w:r>
+      <w:r>
+        <w:t xml:space="preserve">se bavi geo-distribuiranom replikacijom kroz InnoDB ClusterSet, a sedmo skaliranjem čitanja pomoću</w:t>
+      </w:r>
+      <w:r>
+        <w:t xml:space="preserve"> </w:t>
+      </w:r>
+      <w:r>
+        <w:t xml:space="preserve">replika za čitanje i kašnjenjem replikacije. Osmo poglavlje sabira ta podešavanja na jednom mestu.</w:t>
+      </w:r>
+    </w:p>
+    <w:p>
+      <w:pPr>
+        <w:pStyle w:val="BodyText"/>
+      </w:pPr>
+      <w:r>
+        <w:t xml:space="preserve">Sva merenja u radu izvedena su na tri instance servera MySQL 8.4.11 na jednom računaru, na</w:t>
+      </w:r>
+      <w:r>
+        <w:t xml:space="preserve"> </w:t>
+      </w:r>
+      <w:r>
+        <w:t xml:space="preserve">portovima 3307, 3308 i 3309, a ne na čvorovima razmeštenim po različitim lokacijama. Povratno</w:t>
+      </w:r>
+      <w:r>
+        <w:t xml:space="preserve"> </w:t>
+      </w:r>
+      <w:r>
+        <w:t xml:space="preserve">putovanje između instanci zato je kraće od sinhronizacije diska, pa merenja pokazuju redosled</w:t>
+      </w:r>
+      <w:r>
+        <w:t xml:space="preserve"> </w:t>
+      </w:r>
+      <w:r>
+        <w:t xml:space="preserve">događaja, ishode i odnose cena, a ne vremena kakva bi se dobila na stvarnoj mreži. Gde tvrdnja</w:t>
+      </w:r>
+      <w:r>
+        <w:t xml:space="preserve"> </w:t>
+      </w:r>
+      <w:r>
+        <w:t xml:space="preserve">zavisi od udaljenosti između lokacija, ona je izvedena iz dokumentacije i tako je i označena.</w:t>
       </w:r>
     </w:p>
     <w:bookmarkEnd w:id="9"/>

</xml_diff>